<commit_message>
Gonderim oncesi sertlestirme: gizli veri/kisisel yol taramasi, README/lisans hijyeni, sekil kalitesi, IEEE bicim duzeltmeleri
Repo: results/*.json icindeki rustc hata ciktilarinda sizan kisisel
Windows yolu (kullanici adi) 33 orurulten sanitize edildi (JSON gecerli
kaldi, tani degeri korundu); calisan agac + git gecmisinde API anahtari
taramasi temiz cikti. README, guncel 57/229/Gemini-57-57 durumunu
yansitacak sekilde yeniden yazildi ve tek-komut tekrarı gercekten
calistirilip dogrulandi. LICENSE (MIT) ve THIRD_PARTY_LICENSES.md
(Rosetta Code/BSD libc/musl/Redis/cJSON) eklendi.

Sekiller: 300 DPI'ye yukseltildi, gri-tonlama icin desen (hatch)
eklendi. Makale: 6 BUYUK-HARF vurgusu italige cevrildi (add_para_parts
yardimcisiyla), cift iki-nokta-uste-uste duzeltildi, docx metadata
temizlendi. Tum 8 sayfa PDF'e cevrilip gorsel olarak dogrulandi.
</commit_message>
<xml_diff>
--- a/makale_IEEE_v1.docx
+++ b/makale_IEEE_v1.docx
@@ -2208,11 +2208,26 @@
       <w:r>
         <w:rPr>
           <w:rFonts w:ascii="Times New Roman" w:hAnsi="Times New Roman"/>
-          <w:b w:val="0"/>
           <w:i w:val="0"/>
           <w:sz w:val="19"/>
         </w:rPr>
-        <w:t>Hedef dilde önceden yazılmış birim test bulunmadığından, doğruluk kaynak programla aynı girdide çalıştırılıp çıktı karşılaştırılarak (diferansiyel test) ölçülmüştür: C ve Rust ikilileri derlenir (Rust derlenmezse CE); her test girdisi için beklenen/alınan çıktı karşılaştırılır (zaman aşımı → NT, çökme → RE, fark → FE, eşitse PASS; Tablo II); bir örnek yalnızca TÜM girdileri geçerse PASS sayılır.</w:t>
+        <w:t xml:space="preserve">Hedef dilde önceden yazılmış birim test bulunmadığından, doğruluk kaynak programla aynı girdide çalıştırılıp çıktı karşılaştırılarak (diferansiyel test) ölçülmüştür: C ve Rust ikilileri derlenir (Rust derlenmezse CE); her test girdisi için beklenen/alınan çıktı karşılaştırılır (zaman aşımı → NT, çökme → RE, fark → FE, eşitse PASS; Tablo II); bir örnek yalnızca </w:t>
+      </w:r>
+      <w:r>
+        <w:rPr>
+          <w:rFonts w:ascii="Times New Roman" w:hAnsi="Times New Roman"/>
+          <w:i/>
+          <w:sz w:val="19"/>
+        </w:rPr>
+        <w:t>tüm</w:t>
+      </w:r>
+      <w:r>
+        <w:rPr>
+          <w:rFonts w:ascii="Times New Roman" w:hAnsi="Times New Roman"/>
+          <w:i w:val="0"/>
+          <w:sz w:val="19"/>
+        </w:rPr>
+        <w:t xml:space="preserve"> girdileri geçerse PASS sayılır.</w:t>
       </w:r>
     </w:p>
     <w:p>
@@ -2706,11 +2721,26 @@
       <w:r>
         <w:rPr>
           <w:rFonts w:ascii="Times New Roman" w:hAnsi="Times New Roman"/>
-          <w:b w:val="0"/>
           <w:i w:val="0"/>
           <w:sz w:val="19"/>
         </w:rPr>
-        <w:t>Rust'ta tamsayı taşması debug modunda (overflow-checks açık) panik üretirken release modunda (-O) sessizce sarar; bu farkın etkisini göstermek için aynı Round 1 çevirileri her iki modda derlenip test edilmiştir. Round 1'de başarısız olan her örnek için ilgili hata sinyali modele geri verilip düzeltmesi istenmiştir (Round 2). Ayrıca aynı 17 başarısızlık üzerinde, yalnızca modele verilen bilginin kısıtlandığı iki ek geri bildirim seviyesiyle (Seviye B: yalnızca derleyici/panik metni veya başarısız girdi; Seviye C: yalnızca başarısız test sayısı) ayrı ölçüm yapılmıştır. Üç geri bildirim seviyesinin tamamında model başına yalnızca BİR düzeltme turu uygulanmıştır (yakınsayana kadar tekrarlanan bir döngü değil, tek seferlik/single-shot düzeltme); bütçe (1 tur) seviyeler arasında sabit tutulmuştur — bu, Seviye B ve C'de EA'nın %100'e ulaşmamasının (sırasıyla %86.0, %71.9) nedenlerinden biridir: bazı düzeltmeler ilk turda başarısız kalmış ve yeniden denenmemiştir.</w:t>
+        <w:t xml:space="preserve">Rust'ta tamsayı taşması debug modunda (overflow-checks açık) panik üretirken release modunda (-O) sessizce sarar; bu farkın etkisini göstermek için aynı Round 1 çevirileri her iki modda derlenip test edilmiştir. Round 1'de başarısız olan her örnek için ilgili hata sinyali modele geri verilip düzeltmesi istenmiştir (Round 2). Ayrıca aynı 17 başarısızlık üzerinde, yalnızca modele verilen bilginin kısıtlandığı iki ek geri bildirim seviyesiyle (Seviye B: yalnızca derleyici/panik metni veya başarısız girdi; Seviye C: yalnızca başarısız test sayısı) ayrı ölçüm yapılmıştır. Üç geri bildirim seviyesinin tamamında model başına yalnızca </w:t>
+      </w:r>
+      <w:r>
+        <w:rPr>
+          <w:rFonts w:ascii="Times New Roman" w:hAnsi="Times New Roman"/>
+          <w:i/>
+          <w:sz w:val="19"/>
+        </w:rPr>
+        <w:t>bir</w:t>
+      </w:r>
+      <w:r>
+        <w:rPr>
+          <w:rFonts w:ascii="Times New Roman" w:hAnsi="Times New Roman"/>
+          <w:i w:val="0"/>
+          <w:sz w:val="19"/>
+        </w:rPr>
+        <w:t xml:space="preserve"> düzeltme turu uygulanmıştır (yakınsayana kadar tekrarlanan bir döngü değil, tek seferlik/single-shot düzeltme); bütçe (1 tur) seviyeler arasında sabit tutulmuştur — bu, Seviye B ve C'de EA'nın %100'e ulaşmamasının (sırasıyla %86.0, %71.9) nedenlerinden biridir: bazı düzeltmeler ilk turda başarısız kalmış ve yeniden denenmemiştir.</w:t>
       </w:r>
     </w:p>
     <w:p>
@@ -3788,11 +3818,26 @@
       <w:r>
         <w:rPr>
           <w:rFonts w:ascii="Times New Roman" w:hAnsi="Times New Roman"/>
-          <w:b w:val="0"/>
           <w:i w:val="0"/>
           <w:sz w:val="19"/>
         </w:rPr>
-        <w:t>Program düzeyinde %70.18 olan doğruluk, test girdisi düzeyinde %86.3 (195/226 — CE olan tek örneğin girdileri hiç çalıştırılamadığından payda 229 değil 226'dır) olarak ölçülmüştür; bu, program-düzeyi metriğin katı ("tüm girdileri geçmelidir") tanımı nedeniyle beklenen bir farktır. Daha çarpıcı olan: 12 FE örneğinin 6'sı (s06, s13, s15, s20, s27, s38) yalnızca TEK bir sınır girdisinde sapmış, kalan girdilerin tamamında doğru sonuç üretmiştir. Bu, sessiz semantik hataların rastgele seçilmiş bir test girdisiyle yakalanma olasılığının düşük olduğunu ve diferansiyel testin sonucunun girdi çeşitliliğine ne kadar bağımlı olduğunu göstermektedir — hata yalnızca sessiz değil, aynı zamanda seyrek tetiklenir.</w:t>
+        <w:t xml:space="preserve">Program düzeyinde %70.18 olan doğruluk, test girdisi düzeyinde %86.3 (195/226 — CE olan tek örneğin girdileri hiç çalıştırılamadığından payda 229 değil 226'dır) olarak ölçülmüştür; bu, program-düzeyi metriğin katı ("tüm girdileri geçmelidir") tanımı nedeniyle beklenen bir farktır. Daha çarpıcı olan: 12 FE örneğinin 6'sı (s06, s13, s15, s20, s27, s38) yalnızca </w:t>
+      </w:r>
+      <w:r>
+        <w:rPr>
+          <w:rFonts w:ascii="Times New Roman" w:hAnsi="Times New Roman"/>
+          <w:i/>
+          <w:sz w:val="19"/>
+        </w:rPr>
+        <w:t>tek</w:t>
+      </w:r>
+      <w:r>
+        <w:rPr>
+          <w:rFonts w:ascii="Times New Roman" w:hAnsi="Times New Roman"/>
+          <w:i w:val="0"/>
+          <w:sz w:val="19"/>
+        </w:rPr>
+        <w:t xml:space="preserve"> bir sınır girdisinde sapmış, kalan girdilerin tamamında doğru sonuç üretmiştir. Bu, sessiz semantik hataların rastgele seçilmiş bir test girdisiyle yakalanma olasılığının düşük olduğunu ve diferansiyel testin sonucunun girdi çeşitliliğine ne kadar bağımlı olduğunu göstermektedir — hata yalnızca sessiz değil, aynı zamanda seyrek tetiklenir.</w:t>
       </w:r>
     </w:p>
     <w:p>
@@ -3802,7 +3847,7 @@
       <w:r>
         <w:drawing>
           <wp:inline xmlns:a="http://schemas.openxmlformats.org/drawingml/2006/main" xmlns:pic="http://schemas.openxmlformats.org/drawingml/2006/picture">
-            <wp:extent cx="3063240" cy="1928355"/>
+            <wp:extent cx="3063240" cy="1932928"/>
             <wp:docPr id="1" name="Picture 1"/>
             <wp:cNvGraphicFramePr>
               <a:graphicFrameLocks noChangeAspect="1"/>
@@ -3823,7 +3868,7 @@
                   <pic:spPr>
                     <a:xfrm>
                       <a:off x="0" y="0"/>
-                      <a:ext cx="3063240" cy="1928355"/>
+                      <a:ext cx="3063240" cy="1932928"/>
                     </a:xfrm>
                     <a:prstGeom prst="rect"/>
                   </pic:spPr>
@@ -3854,7 +3899,7 @@
       <w:r>
         <w:drawing>
           <wp:inline xmlns:a="http://schemas.openxmlformats.org/drawingml/2006/main" xmlns:pic="http://schemas.openxmlformats.org/drawingml/2006/picture">
-            <wp:extent cx="3063240" cy="1871668"/>
+            <wp:extent cx="3063240" cy="1872214"/>
             <wp:docPr id="2" name="Picture 2"/>
             <wp:cNvGraphicFramePr>
               <a:graphicFrameLocks noChangeAspect="1"/>
@@ -3875,7 +3920,7 @@
                   <pic:spPr>
                     <a:xfrm>
                       <a:off x="0" y="0"/>
-                      <a:ext cx="3063240" cy="1871668"/>
+                      <a:ext cx="3063240" cy="1872214"/>
                     </a:xfrm>
                     <a:prstGeom prst="rect"/>
                   </pic:spPr>
@@ -3935,7 +3980,7 @@
       <w:r>
         <w:drawing>
           <wp:inline xmlns:a="http://schemas.openxmlformats.org/drawingml/2006/main" xmlns:pic="http://schemas.openxmlformats.org/drawingml/2006/picture">
-            <wp:extent cx="3063240" cy="1681164"/>
+            <wp:extent cx="3063240" cy="1682370"/>
             <wp:docPr id="3" name="Picture 3"/>
             <wp:cNvGraphicFramePr>
               <a:graphicFrameLocks noChangeAspect="1"/>
@@ -3956,7 +4001,7 @@
                   <pic:spPr>
                     <a:xfrm>
                       <a:off x="0" y="0"/>
-                      <a:ext cx="3063240" cy="1681164"/>
+                      <a:ext cx="3063240" cy="1682370"/>
                     </a:xfrm>
                     <a:prstGeom prst="rect"/>
                   </pic:spPr>
@@ -3988,11 +4033,26 @@
       <w:r>
         <w:rPr>
           <w:rFonts w:ascii="Times New Roman" w:hAnsi="Times New Roman"/>
-          <w:b w:val="0"/>
           <w:i w:val="0"/>
           <w:sz w:val="19"/>
         </w:rPr>
-        <w:t>İlişkinin etki büyüklüğü rank-biserial korelasyon ile r=0.156'dır (küçük etki). Post-hoc/gözlemlenen güç (achieved power) yerine — bu, p-değerinin tekdüze bir dönüşümüdür ve bağımsız bilgi taşımaz [13] — önerilen duyarlılık analizi uygulanmıştır: n(FAIL)=17, n(PASS)=40, α=0.05 ile %80 güçte saptanabilecek en küçük etki büyüklüğü, anlamlılığı ölçmek için kullanılan AYNI Mann-Whitney U istatistiğinden ampirik rank-biserial formülüyle (r=1-2U/(n1·n2)) hesaplandığında rank-biserial |r|≈0.46'dır (U'nun bağ düzeltmeli standart sapması üzerinden). Gözlemlenen r=0.156 bu eşiğin belirgin altındadır — veri seti bu büyüklükte küçük-orta etkileri saptayacak güce sahip değildir; "anlamlı fark yoktur" sonucu kesin bir ilişkisizlik kanıtı değil, düşük güçle tutarlı bir gözlem olarak okunmalıdır (§V-B). EA'nın kendisi için de bootstrap %95 güven aralığı hesaplanmıştır (Şekil 4): Round 1 debug %70.18 [%57.89, %82.46] — geniş aralık, n=57'nin tek bir nokta tahminine duyulan güveni sınırladığını doğrudan göstermektedir.</w:t>
+        <w:t xml:space="preserve">İlişkinin etki büyüklüğü rank-biserial korelasyon ile r=0.156'dır (küçük etki). Post-hoc/gözlemlenen güç (achieved power) yerine — bu, p-değerinin tekdüze bir dönüşümüdür ve bağımsız bilgi taşımaz [13] — önerilen duyarlılık analizi uygulanmıştır: n(FAIL)=17, n(PASS)=40, α=0.05 ile %80 güçte saptanabilecek en küçük etki büyüklüğü, anlamlılığı ölçmek için kullanılan </w:t>
+      </w:r>
+      <w:r>
+        <w:rPr>
+          <w:rFonts w:ascii="Times New Roman" w:hAnsi="Times New Roman"/>
+          <w:i/>
+          <w:sz w:val="19"/>
+        </w:rPr>
+        <w:t>aynı</w:t>
+      </w:r>
+      <w:r>
+        <w:rPr>
+          <w:rFonts w:ascii="Times New Roman" w:hAnsi="Times New Roman"/>
+          <w:i w:val="0"/>
+          <w:sz w:val="19"/>
+        </w:rPr>
+        <w:t xml:space="preserve"> Mann-Whitney U istatistiğinden ampirik rank-biserial formülüyle (r=1-2U/(n1·n2)) hesaplandığında rank-biserial |r|≈0.46'dır (U'nun bağ düzeltmeli standart sapması üzerinden). Gözlemlenen r=0.156 bu eşiğin belirgin altındadır — veri seti bu büyüklükte küçük-orta etkileri saptayacak güce sahip değildir; "anlamlı fark yoktur" sonucu kesin bir ilişkisizlik kanıtı değil, düşük güçle tutarlı bir gözlem olarak okunmalıdır (§V-B). EA'nın kendisi için de bootstrap %95 güven aralığı hesaplanmıştır (Şekil 4): Round 1 debug %70.18 [%57.89, %82.46] — geniş aralık, n=57'nin tek bir nokta tahminine duyulan güveni sınırladığını doğrudan göstermektedir.</w:t>
       </w:r>
     </w:p>
     <w:p>
@@ -4002,7 +4062,7 @@
       <w:r>
         <w:drawing>
           <wp:inline xmlns:a="http://schemas.openxmlformats.org/drawingml/2006/main" xmlns:pic="http://schemas.openxmlformats.org/drawingml/2006/picture">
-            <wp:extent cx="3063240" cy="2054923"/>
+            <wp:extent cx="3063240" cy="2053853"/>
             <wp:docPr id="4" name="Picture 4"/>
             <wp:cNvGraphicFramePr>
               <a:graphicFrameLocks noChangeAspect="1"/>
@@ -4023,7 +4083,7 @@
                   <pic:spPr>
                     <a:xfrm>
                       <a:off x="0" y="0"/>
-                      <a:ext cx="3063240" cy="2054923"/>
+                      <a:ext cx="3063240" cy="2053853"/>
                     </a:xfrm>
                     <a:prstGeom prst="rect"/>
                   </pic:spPr>
@@ -4690,7 +4750,7 @@
       <w:r>
         <w:drawing>
           <wp:inline xmlns:a="http://schemas.openxmlformats.org/drawingml/2006/main" xmlns:pic="http://schemas.openxmlformats.org/drawingml/2006/picture">
-            <wp:extent cx="3063240" cy="1544938"/>
+            <wp:extent cx="3063240" cy="1545598"/>
             <wp:docPr id="5" name="Picture 5"/>
             <wp:cNvGraphicFramePr>
               <a:graphicFrameLocks noChangeAspect="1"/>
@@ -4711,7 +4771,7 @@
                   <pic:spPr>
                     <a:xfrm>
                       <a:off x="0" y="0"/>
-                      <a:ext cx="3063240" cy="1544938"/>
+                      <a:ext cx="3063240" cy="1545598"/>
                     </a:xfrm>
                     <a:prstGeom prst="rect"/>
                   </pic:spPr>
@@ -6410,11 +6470,26 @@
       <w:r>
         <w:rPr>
           <w:rFonts w:ascii="Times New Roman" w:hAnsi="Times New Roman"/>
-          <w:b w:val="0"/>
           <w:i w:val="0"/>
           <w:sz w:val="19"/>
         </w:rPr>
-        <w:t>13 bağımsız gerçek dünya programının 11'i (%84.6) ilk seferde geçmiştir: Rosetta Code 7/7, BSD libc 2/3, musl/Redis/cJSON 2/3 (Claude). En uzun örnek (522 satır, s47) PASS olurken çok daha kısa s48 (389 satır) başarısız olması, uzunluk değil boşluğun belirleyici olduğunu burada da doğrular. Bellek güvenliği tarafında, Claude'un ürettiği 74 farklı çeviriden (57 Round 1 + Round 2'de yeniden çevrilen 17 örnek; Round 2 yalnızca Round 1'de başarısız olan örnekleri kapsadığından geri kalan 40 "Round 2 dosyası" Round 1'in birebir kopyasıdır) yalnızca 4'ü (%5.4) unsafe içerir: s37_bsd_getopt, s44_fib_memo_static, s46_musl_qsort ve s50_id_generator. Dördü de Round 1'de PASS olduğundan Round 2'de yeniden çevrilmemiştir. Kategori E, aynı model tarafından iki farklı biçimde çözülmüştür: kategorinin ikinci örneği olan s50_id_generator'da model `unsafe` bloğunu doğru biçimde ekleyerek ilk seferde PASS olurken, ilk örnek olan s19_global_counter Round 2'de `unsafe` KULLANMADAN düzeltilmiştir: model, global değiştirilebilir sayaç yerine durumu fonksiyona `&amp;mut i32` parametresi olarak geçen (durum parametreleştirme) idiyomatik/güvenli bir tasarıma geçmiştir. Bu, Kategori E'nin `unsafe` gerektirmeden de çözülebildiğinin somut bir kanıtıdır. Ham işaretçi aritmetiğine yapısal olarak bağımlı heapsort (s39) ve Redis'in SDS string kütüphanesi (s47) bile tamamen güvenli, deyimsel Rust'a çevrilmiştir.</w:t>
+        <w:t xml:space="preserve">13 bağımsız gerçek dünya programının 11'i (%84.6) ilk seferde geçmiştir: Rosetta Code 7/7, BSD libc 2/3, musl/Redis/cJSON 2/3 (Claude). En uzun örnek (522 satır, s47) PASS olurken çok daha kısa s48 (389 satır) başarısız olması, uzunluk değil boşluğun belirleyici olduğunu burada da doğrular. Bellek güvenliği tarafında, Claude'un ürettiği 74 farklı çeviriden (57 Round 1 + Round 2'de yeniden çevrilen 17 örnek; Round 2 yalnızca Round 1'de başarısız olan örnekleri kapsadığından geri kalan 40 "Round 2 dosyası" Round 1'in birebir kopyasıdır) yalnızca 4'ü (%5.4) unsafe içerir: s37_bsd_getopt, s44_fib_memo_static, s46_musl_qsort ve s50_id_generator. Dördü de Round 1'de PASS olduğundan Round 2'de yeniden çevrilmemiştir. Kategori E, aynı model tarafından iki farklı biçimde çözülmüştür: kategorinin ikinci örneği olan s50_id_generator'da model `unsafe` bloğunu doğru biçimde ekleyerek ilk seferde PASS olurken, ilk örnek olan s19_global_counter Round 2'de `unsafe` </w:t>
+      </w:r>
+      <w:r>
+        <w:rPr>
+          <w:rFonts w:ascii="Times New Roman" w:hAnsi="Times New Roman"/>
+          <w:i/>
+          <w:sz w:val="19"/>
+        </w:rPr>
+        <w:t>kullanmadan</w:t>
+      </w:r>
+      <w:r>
+        <w:rPr>
+          <w:rFonts w:ascii="Times New Roman" w:hAnsi="Times New Roman"/>
+          <w:i w:val="0"/>
+          <w:sz w:val="19"/>
+        </w:rPr>
+        <w:t xml:space="preserve"> düzeltilmiştir — model, global değiştirilebilir sayaç yerine durumu fonksiyona `&amp;mut i32` parametresi olarak geçen (durum parametreleştirme) idiyomatik/güvenli bir tasarıma geçmiştir. Bu, Kategori E'nin `unsafe` gerektirmeden de çözülebildiğinin somut bir kanıtıdır. Ham işaretçi aritmetiğine yapısal olarak bağımlı heapsort (s39) ve Redis'in SDS string kütüphanesi (s47) bile tamamen güvenli, deyimsel Rust'a çevrilmiştir.</w:t>
       </w:r>
     </w:p>
     <w:p>
@@ -6439,11 +6514,26 @@
       <w:r>
         <w:rPr>
           <w:rFonts w:ascii="Times New Roman" w:hAnsi="Times New Roman"/>
-          <w:b w:val="0"/>
           <w:i w:val="0"/>
           <w:sz w:val="19"/>
         </w:rPr>
-        <w:t>Gemini ile 57 örneğin tamamı üzerinde gerçek, otomatik ölçüm yapılmıştır: EA=%89.47 (51/57; 4 CE, 2 FE, 0 RE) — ham sayı olarak Claude'dan (%70.18) yüksektir ve bu fark, iki model AYNI 57 program üzerinde ölçüldüğü için eşleştirilmiş (paired) bir tasarıma uygun McNemar testiyle sınandığında istatistiksel olarak anlamlıdır (yalnızca Claude'un başarısız olduğu 14 örnek vs. yalnızca Gemini'nin başarısız olduğu 3 örnek; McNemar kesin iki-yönlü p=0.013). Ancak Tablo VII'deki kategori-bazlı kırılım, bu genel farkın tekdüze değil kategoriye özgü olduğunu ve yön değiştirebildiğini gösterir — genel anlamlılık, model×kategori etkileşiminin yokluğu anlamına gelmez. Ayrıca Gemini'nin 6 başarısızlığının 4'ü (s26, s46, s48'in yanı sıra s27) CE'dir, yani derleyici tarafından yakalanmıştır — Claude'da gözlenen "başarısızlıkların çoğu sessizdir" örüntüsü Gemini için aynı güçte geçerli değildir; sessiz hata oranı modele göre değişir.</w:t>
+        <w:t xml:space="preserve">Gemini ile 57 örneğin tamamı üzerinde gerçek, otomatik ölçüm yapılmıştır: EA=%89.47 (51/57; 4 CE, 2 FE, 0 RE) — ham sayı olarak Claude'dan (%70.18) yüksektir ve bu fark, iki model </w:t>
+      </w:r>
+      <w:r>
+        <w:rPr>
+          <w:rFonts w:ascii="Times New Roman" w:hAnsi="Times New Roman"/>
+          <w:i/>
+          <w:sz w:val="19"/>
+        </w:rPr>
+        <w:t>aynı</w:t>
+      </w:r>
+      <w:r>
+        <w:rPr>
+          <w:rFonts w:ascii="Times New Roman" w:hAnsi="Times New Roman"/>
+          <w:i w:val="0"/>
+          <w:sz w:val="19"/>
+        </w:rPr>
+        <w:t xml:space="preserve"> 57 program üzerinde ölçüldüğü için eşleştirilmiş (paired) bir tasarıma uygun McNemar testiyle sınandığında istatistiksel olarak anlamlıdır (yalnızca Claude'un başarısız olduğu 14 örnek vs. yalnızca Gemini'nin başarısız olduğu 3 örnek; McNemar kesin iki-yönlü p=0.013). Ancak Tablo VII'deki kategori-bazlı kırılım, bu genel farkın tekdüze değil kategoriye özgü olduğunu ve yön değiştirebildiğini gösterir — genel anlamlılık, model×kategori etkileşiminin yokluğu anlamına gelmez. Ayrıca Gemini'nin 6 başarısızlığının 4'ü (s26, s46, s48'in yanı sıra s27) CE'dir, yani derleyici tarafından yakalanmıştır — Claude'da gözlenen "başarısızlıkların çoğu sessizdir" örüntüsü Gemini için aynı güçte geçerli değildir; sessiz hata oranı modele göre değişir.</w:t>
       </w:r>
     </w:p>
     <w:p>

</xml_diff>

<commit_message>
Makaleyi tamamen Turkce'ye cevir, Tablo II sutun genisligi hatasini duzelt
Ingilizce Abstract/Index Terms kaldirildi (hedef yer Turkce-tek istiyor).
Tablo II'nin ilk sutunundaki kirpilma, set_col_widths()'in yalnizca
hucre genisligini ayarlayip tblGrid'i guncellememesinden kaynaklaniyordu;
table.columns[j].width kullanilarak duzeltildi (tum tablolari etkiler).
Oz'deki Docker/Linux tekrar cumlesi ve SS4-F'deki kok-neden cumlesi
netlestirildi, yazar e-postasi kucuk harfe cevrildi, Tablo V dipnotuna
s50 aciklamasi eklendi.
</commit_message>
<xml_diff>
--- a/makale_IEEE_v1.docx
+++ b/makale_IEEE_v1.docx
@@ -110,7 +110,7 @@
                 <w:i w:val="0"/>
                 <w:sz w:val="20"/>
               </w:rPr>
-              <w:t>Mbaykara@firat.edu.tr</w:t>
+              <w:t>mbaykara@firat.edu.tr</w:t>
             </w:r>
           </w:p>
         </w:tc>
@@ -274,7 +274,7 @@
           <w:rFonts w:ascii="Times New Roman" w:hAnsi="Times New Roman"/>
           <w:sz w:val="19"/>
         </w:rPr>
-        <w:t>Büyük dil modellerinin (LLM) ürettiği C→Rust çevirilerinin davranışsal eşdeğerliği yeterince incelenmemiştir. Bu çalışma, 57 C programı ve 229 test girdisinden oluşan özgün bir kıyaslama setinde, Claude Sonnet 5'in zero-shot çevirilerini diferansiyel test ile ölçer: ham yürütme doğruluğu (EA) yalnızca %70.18'dir (40/57); başarısızlıkların %94'ü (16/17) derleme aşamasında hiç yakalanmamış, %70.6'sı (12/17) ise çalışma zamanında da hiçbir sinyal üretmeden yanlış çıktı veren sessiz semantik hatalardır. Hatalar dokuz tekrar eden C↔Rust semantik boşluğuna ayrılmıştır; ortak örüntü, modelin kaynağın özgül davranış sözleşmesi yerine hedef dilin idiyomatik varsayılanını seçmesidir. Kod uzunluğu tek başına açıklayıcı değildir (Mann-Whitney U, p=0.359). Deney dört yönde genişletilmiştir: ikinci bir modelle (Google Gemini, 57/57 örnek üzerinde EA=%89.47) gerçek bir çoklu-model karşılaştırması, çok dosyalı/eşzamanlı C yapıları, Linux/LP64'te (Docker) bir tekrar (55/57), ve sınırlandırılmış geri bildirimle bir iyileştirme deneyi. Model karşılaştırması tek bir modelin "daha iyi" olmadığını gösterir: Gemini, Claude'un tekrarladığı beş kök-neden kategorisinde (5/5) başarılıyken, gerçek üretim kodu üçlüsünde (musl/Redis/cJSON) Claude'un (2/3) aksine sıfır başarı (0/3) göstermiştir — genel EA farkı McNemar testiyle anlamlıdır (p=0.013), ama yön kategoriye göre değişir. Sessiz hata oranı da modele özgüdür: Claude'un 17 başarısızlığının 16'sı (%94) derleyiciden hiç uyarı almazken, Gemini'nin 6 başarısızlığının yalnızca 2'si (%33) sessizdir — kalan 4'ü derleme aşamasında yakalanmıştır. Bulgular, LLM destekli kod çevirisinde asıl riskin sözdizimsel değil sessiz semantik hatalar olduğunu ve (yalnızca Claude üzerinde ölçülen) doğrulama-geri bildirim döngüsünün doğruluğu %100'e taşıdığını, ancak bu rakamın zengin bir geri bildirime dayanan bir üst sınır olduğunu, kısıtlı geri bildirimde %71.9-86.0'a düştüğünü göstermektedir.</w:t>
+        <w:t>Büyük dil modellerinin (LLM) ürettiği C→Rust çevirilerinin davranışsal eşdeğerliği yeterince incelenmemiştir. Bu çalışma, 57 C programı ve 229 test girdisinden oluşan özgün bir kıyaslama setinde, Claude Sonnet 5'in zero-shot çevirilerini diferansiyel test ile ölçer: ham yürütme doğruluğu (EA) yalnızca %70.18'dir (40/57); başarısızlıkların %94'ü (16/17) derleme aşamasında hiç yakalanmamış, %70.6'sı (12/17) ise çalışma zamanında da hiçbir sinyal üretmeden yanlış çıktı veren sessiz semantik hatalardır. Hatalar dokuz tekrar eden C↔Rust semantik boşluğuna ayrılmıştır; ortak örüntü, modelin kaynağın özgül davranış sözleşmesi yerine hedef dilin idiyomatik varsayılanını seçmesidir. Kod uzunluğu tek başına açıklayıcı değildir (Mann-Whitney U, p=0.359). Deney dört yönde genişletilmiştir: ikinci bir modelle (Google Gemini, 57/57 örnek üzerinde EA=%89.47) gerçek bir çoklu-model karşılaştırması, çok dosyalı/eşzamanlı C yapıları, Linux/LP64'te (Docker) 57 örneğin 55'i üzerinde bir tekrar (52/55 PASS), ve sınırlandırılmış geri bildirimle bir iyileştirme deneyi. Model karşılaştırması tek bir modelin "daha iyi" olmadığını gösterir: Gemini, Claude'un tekrarladığı beş kök-neden kategorisinde (5/5) başarılıyken, gerçek üretim kodu üçlüsünde (musl/Redis/cJSON) Claude'un (2/3) aksine sıfır başarı (0/3) göstermiştir — genel EA farkı McNemar testiyle anlamlıdır (p=0.013), ama yön kategoriye göre değişir. Sessiz hata oranı da modele özgüdür: Claude'un 17 başarısızlığının 16'sı (%94) derleyiciden hiç uyarı almazken, Gemini'nin 6 başarısızlığının yalnızca 2'si (%33) sessizdir — kalan 4'ü derleme aşamasında yakalanmıştır. Bulgular, LLM destekli kod çevirisinde asıl riskin sözdizimsel değil sessiz semantik hatalar olduğunu ve (yalnızca Claude üzerinde ölçülen) doğrulama-geri bildirim döngüsünün doğruluğu %100'e taşıdığını, ancak bu rakamın zengin bir geri bildirime dayanan bir üst sınır olduğunu, kısıtlı geri bildirimde %71.9-86.0'a düştüğünü göstermektedir.</w:t>
       </w:r>
     </w:p>
     <w:p>
@@ -298,51 +298,6 @@
           <w:sz w:val="19"/>
         </w:rPr>
         <w:t>kod çevirisi, büyük dil modelleri, Rust, diferansiyel test, semantik hata, çoklu-model karşılaştırma</w:t>
-      </w:r>
-    </w:p>
-    <w:p>
-      <w:pPr>
-        <w:spacing w:after="80"/>
-        <w:jc w:val="both"/>
-      </w:pPr>
-      <w:r>
-        <w:rPr>
-          <w:rFonts w:ascii="Times New Roman" w:hAnsi="Times New Roman"/>
-          <w:b/>
-          <w:i/>
-          <w:sz w:val="19"/>
-        </w:rPr>
-        <w:t>Abstract—</w:t>
-      </w:r>
-      <w:r>
-        <w:rPr>
-          <w:rFonts w:ascii="Times New Roman" w:hAnsi="Times New Roman"/>
-          <w:sz w:val="19"/>
-        </w:rPr>
-        <w:t>The behavioral equivalence of C-to-Rust translations produced by large language models (LLMs) has not been sufficiently studied. On an original benchmark of 57 C programs and 229 test inputs, we measure the execution accuracy (EA) of Claude Sonnet 5's zero-shot translations via differential testing: raw EA is only 70.18% (40/57); 94% of failures (16/17) are not caught at compile time, and 70.6% (12/17) are fully silent semantic errors that also produce no runtime signal. Failures cluster into nine recurring C↔Rust semantic gaps; the common pattern is that the model favors the target language's idiomatic default over the source's specific behavioral contract. Code length alone is not predictive (Mann-Whitney U, p=0.359). The experiment is extended with a second, independent model (Google Gemini, EA=89.47% on all 57 samples): no single model is uniformly “better”—Gemini is robust on five root-cause categories Claude repeats on an independent second instance, yet fails all three of the longest, most complex real-world programs (musl/Redis/cJSON) that Claude passes 2/3 of — the overall EA gap is statistically significant under McNemar's paired test (p=0.013), yet the direction of the effect reverses by category. The silent-failure rate is also model-specific: 16 of Claude's 17 failures (94%) evade the compiler entirely, whereas only 2 of Gemini's 6 (33%) do — the other 4 are caught at compile time. A feedback-driven refinement loop (measured on Claude only) raises accuracy to 100%, but this is an upper bound obtained under rich (oracle) feedback; more realistic, constrained feedback lowers it to 71.9-86.0%.</w:t>
-      </w:r>
-    </w:p>
-    <w:p>
-      <w:pPr>
-        <w:spacing w:after="200"/>
-        <w:jc w:val="both"/>
-      </w:pPr>
-      <w:r>
-        <w:rPr>
-          <w:rFonts w:ascii="Times New Roman" w:hAnsi="Times New Roman"/>
-          <w:b/>
-          <w:i/>
-          <w:sz w:val="19"/>
-        </w:rPr>
-        <w:t>Index Terms—</w:t>
-      </w:r>
-      <w:r>
-        <w:rPr>
-          <w:rFonts w:ascii="Times New Roman" w:hAnsi="Times New Roman"/>
-          <w:i/>
-          <w:sz w:val="19"/>
-        </w:rPr>
-        <w:t>code translation, large language models, Rust, differential testing, semantic bugs, multi-model comparison</w:t>
       </w:r>
     </w:p>
     <w:p>
@@ -686,11 +641,11 @@
         <w:tblLayout w:type="fixed"/>
       </w:tblPr>
       <w:tblGrid>
-        <w:gridCol w:w="2007"/>
-        <w:gridCol w:w="2007"/>
-        <w:gridCol w:w="2007"/>
-        <w:gridCol w:w="2007"/>
-        <w:gridCol w:w="2007"/>
+        <w:gridCol w:w="2160"/>
+        <w:gridCol w:w="1656"/>
+        <w:gridCol w:w="792"/>
+        <w:gridCol w:w="1080"/>
+        <w:gridCol w:w="1944"/>
       </w:tblGrid>
       <w:tr>
         <w:trPr>
@@ -2253,14 +2208,14 @@
         <w:tblLayout w:type="fixed"/>
       </w:tblPr>
       <w:tblGrid>
-        <w:gridCol w:w="3345"/>
-        <w:gridCol w:w="3345"/>
-        <w:gridCol w:w="3345"/>
+        <w:gridCol w:w="864"/>
+        <w:gridCol w:w="1512"/>
+        <w:gridCol w:w="2160"/>
       </w:tblGrid>
       <w:tr>
         <w:tc>
           <w:tcPr>
-            <w:tcW w:type="dxa" w:w="576"/>
+            <w:tcW w:type="dxa" w:w="864"/>
             <w:vAlign w:val="center"/>
             <w:shd w:val="clear" w:color="auto" w:fill="44546A"/>
           </w:tcPr>
@@ -2290,7 +2245,7 @@
         </w:tc>
         <w:tc>
           <w:tcPr>
-            <w:tcW w:type="dxa" w:w="1656"/>
+            <w:tcW w:type="dxa" w:w="1512"/>
             <w:vAlign w:val="center"/>
             <w:shd w:val="clear" w:color="auto" w:fill="44546A"/>
           </w:tcPr>
@@ -2320,7 +2275,7 @@
         </w:tc>
         <w:tc>
           <w:tcPr>
-            <w:tcW w:type="dxa" w:w="2304"/>
+            <w:tcW w:type="dxa" w:w="2160"/>
             <w:vAlign w:val="center"/>
             <w:shd w:val="clear" w:color="auto" w:fill="44546A"/>
           </w:tcPr>
@@ -2352,7 +2307,7 @@
       <w:tr>
         <w:tc>
           <w:tcPr>
-            <w:tcW w:type="dxa" w:w="576"/>
+            <w:tcW w:type="dxa" w:w="864"/>
             <w:vAlign w:val="center"/>
             <w:shd w:val="clear" w:color="auto" w:fill="FFFFFF"/>
           </w:tcPr>
@@ -2380,7 +2335,7 @@
         </w:tc>
         <w:tc>
           <w:tcPr>
-            <w:tcW w:type="dxa" w:w="1656"/>
+            <w:tcW w:type="dxa" w:w="1512"/>
             <w:vAlign w:val="center"/>
             <w:shd w:val="clear" w:color="auto" w:fill="FFFFFF"/>
           </w:tcPr>
@@ -2408,7 +2363,7 @@
         </w:tc>
         <w:tc>
           <w:tcPr>
-            <w:tcW w:type="dxa" w:w="2304"/>
+            <w:tcW w:type="dxa" w:w="2160"/>
             <w:vAlign w:val="center"/>
             <w:shd w:val="clear" w:color="auto" w:fill="FFFFFF"/>
           </w:tcPr>
@@ -2438,7 +2393,7 @@
       <w:tr>
         <w:tc>
           <w:tcPr>
-            <w:tcW w:type="dxa" w:w="576"/>
+            <w:tcW w:type="dxa" w:w="864"/>
             <w:vAlign w:val="center"/>
             <w:shd w:val="clear" w:color="auto" w:fill="F2F2F2"/>
           </w:tcPr>
@@ -2466,7 +2421,7 @@
         </w:tc>
         <w:tc>
           <w:tcPr>
-            <w:tcW w:type="dxa" w:w="1656"/>
+            <w:tcW w:type="dxa" w:w="1512"/>
             <w:vAlign w:val="center"/>
             <w:shd w:val="clear" w:color="auto" w:fill="F2F2F2"/>
           </w:tcPr>
@@ -2494,7 +2449,7 @@
         </w:tc>
         <w:tc>
           <w:tcPr>
-            <w:tcW w:type="dxa" w:w="2304"/>
+            <w:tcW w:type="dxa" w:w="2160"/>
             <w:vAlign w:val="center"/>
             <w:shd w:val="clear" w:color="auto" w:fill="F2F2F2"/>
           </w:tcPr>
@@ -2524,7 +2479,7 @@
       <w:tr>
         <w:tc>
           <w:tcPr>
-            <w:tcW w:type="dxa" w:w="576"/>
+            <w:tcW w:type="dxa" w:w="864"/>
             <w:vAlign w:val="center"/>
             <w:shd w:val="clear" w:color="auto" w:fill="FFFFFF"/>
           </w:tcPr>
@@ -2552,7 +2507,7 @@
         </w:tc>
         <w:tc>
           <w:tcPr>
-            <w:tcW w:type="dxa" w:w="1656"/>
+            <w:tcW w:type="dxa" w:w="1512"/>
             <w:vAlign w:val="center"/>
             <w:shd w:val="clear" w:color="auto" w:fill="FFFFFF"/>
           </w:tcPr>
@@ -2580,7 +2535,7 @@
         </w:tc>
         <w:tc>
           <w:tcPr>
-            <w:tcW w:type="dxa" w:w="2304"/>
+            <w:tcW w:type="dxa" w:w="2160"/>
             <w:vAlign w:val="center"/>
             <w:shd w:val="clear" w:color="auto" w:fill="FFFFFF"/>
           </w:tcPr>
@@ -2610,7 +2565,7 @@
       <w:tr>
         <w:tc>
           <w:tcPr>
-            <w:tcW w:type="dxa" w:w="576"/>
+            <w:tcW w:type="dxa" w:w="864"/>
             <w:vAlign w:val="center"/>
             <w:shd w:val="clear" w:color="auto" w:fill="F2F2F2"/>
           </w:tcPr>
@@ -2638,7 +2593,7 @@
         </w:tc>
         <w:tc>
           <w:tcPr>
-            <w:tcW w:type="dxa" w:w="1656"/>
+            <w:tcW w:type="dxa" w:w="1512"/>
             <w:vAlign w:val="center"/>
             <w:shd w:val="clear" w:color="auto" w:fill="F2F2F2"/>
           </w:tcPr>
@@ -2666,7 +2621,7 @@
         </w:tc>
         <w:tc>
           <w:tcPr>
-            <w:tcW w:type="dxa" w:w="2304"/>
+            <w:tcW w:type="dxa" w:w="2160"/>
             <w:vAlign w:val="center"/>
             <w:shd w:val="clear" w:color="auto" w:fill="F2F2F2"/>
           </w:tcPr>
@@ -2835,14 +2790,14 @@
         <w:tblLayout w:type="fixed"/>
       </w:tblPr>
       <w:tblGrid>
-        <w:gridCol w:w="1254"/>
-        <w:gridCol w:w="1254"/>
-        <w:gridCol w:w="1254"/>
-        <w:gridCol w:w="1254"/>
-        <w:gridCol w:w="1254"/>
-        <w:gridCol w:w="1254"/>
-        <w:gridCol w:w="1254"/>
-        <w:gridCol w:w="1254"/>
+        <w:gridCol w:w="2232"/>
+        <w:gridCol w:w="936"/>
+        <w:gridCol w:w="864"/>
+        <w:gridCol w:w="792"/>
+        <w:gridCol w:w="648"/>
+        <w:gridCol w:w="648"/>
+        <w:gridCol w:w="648"/>
+        <w:gridCol w:w="648"/>
       </w:tblGrid>
       <w:tr>
         <w:tc>
@@ -4156,9 +4111,9 @@
         <w:tblLayout w:type="fixed"/>
       </w:tblPr>
       <w:tblGrid>
-        <w:gridCol w:w="3345"/>
-        <w:gridCol w:w="3345"/>
-        <w:gridCol w:w="3345"/>
+        <w:gridCol w:w="2880"/>
+        <w:gridCol w:w="1584"/>
+        <w:gridCol w:w="1584"/>
       </w:tblGrid>
       <w:tr>
         <w:tc>
@@ -4816,7 +4771,7 @@
           <w:rFonts w:ascii="Times New Roman" w:hAnsi="Times New Roman"/>
           <w:sz w:val="17"/>
         </w:rPr>
-        <w:t>TABLO V. DOKUZ KÖK NEDEN VE TEMSİLİ ÖRNEKLER (s09,s14,s20 vb. veri setinin özgün ilk turundandır; s49,s51,s52,s53 önceki bir sürümün değerlendirmesi doğrultusunda eklenen bağımsız 2. örneklerdir. † C ve F kategorilerinde "doğru" davranış referans platformun (Windows/LLP64) implementation-defined seçimine bağlıdır — bkz. §V-B).</w:t>
+        <w:t>TABLO V. DOKUZ KÖK NEDEN VE TEMSİLİ ÖRNEKLER (s09,s14,s20 vb. veri setinin özgün ilk turundandır; s49,s51,s52,s53 önceki bir sürümün değerlendirmesi doğrultusunda eklenen bağımsız 2. örneklerdir. † C ve F kategorilerinde "doğru" davranış referans platformun (Windows/LLP64) implementation-defined seçimine bağlıdır — bkz. §V-B. E kategorisinin ikinci örneği (s50) Round 1'de PASS olduğundan bir başarısızlık örneği olarak bu tabloda listelenmemiştir.)</w:t>
       </w:r>
     </w:p>
     <w:tbl>
@@ -4829,10 +4784,10 @@
         <w:tblLayout w:type="fixed"/>
       </w:tblPr>
       <w:tblGrid>
-        <w:gridCol w:w="2509"/>
-        <w:gridCol w:w="2509"/>
-        <w:gridCol w:w="2509"/>
-        <w:gridCol w:w="2509"/>
+        <w:gridCol w:w="360"/>
+        <w:gridCol w:w="2160"/>
+        <w:gridCol w:w="1512"/>
+        <w:gridCol w:w="5760"/>
       </w:tblGrid>
       <w:tr>
         <w:tc>
@@ -6077,9 +6032,9 @@
         <w:tblLayout w:type="fixed"/>
       </w:tblPr>
       <w:tblGrid>
-        <w:gridCol w:w="3345"/>
-        <w:gridCol w:w="3345"/>
-        <w:gridCol w:w="3345"/>
+        <w:gridCol w:w="1656"/>
+        <w:gridCol w:w="5400"/>
+        <w:gridCol w:w="1296"/>
       </w:tblGrid>
       <w:tr>
         <w:tc>
@@ -6570,9 +6525,9 @@
         <w:tblLayout w:type="fixed"/>
       </w:tblPr>
       <w:tblGrid>
-        <w:gridCol w:w="3345"/>
-        <w:gridCol w:w="3345"/>
-        <w:gridCol w:w="3345"/>
+        <w:gridCol w:w="3888"/>
+        <w:gridCol w:w="1440"/>
+        <w:gridCol w:w="1440"/>
       </w:tblGrid>
       <w:tr>
         <w:tc>
@@ -7469,7 +7424,7 @@
           <w:i w:val="0"/>
           <w:sz w:val="19"/>
         </w:rPr>
-        <w:t>Üç örüntü dikkat çekicidir. Birincisi, "kök-neden 2. örnek" grubunda (s49-s53 — Claude'un Round 1'de yalnızca birer örnekle temsil edilen C, E, F, G, H kategorilerinde bağımsız ikinci bir kez sınandığı örnekler) Claude 5 örneğin 4'ünde aynı kök nedeni tekrarlamıştır (1/5) — bu, ilk başarısızlıkların tesadüfi değil sistematik bir model-özgü kör nokta olduğunun doğrudan kanıtıdır — Gemini ise aynı 5 örneğin tamamında (5/5) farklı deyimsel tercihlerle (ör. wrapping_mul, AtomicI32, imzalı döngü değişkeni) bu kategorileri sistemli biçimde atlatmıştır. İkincisi, tam tersi yönde: en uzun/karmaşık üç gerçek üretim kodu örneğinde (musl qsort, Redis SDS, cJSON — 262-522 satır) Claude 2/3 geçerken Gemini 0/3 geçmiştir — ikisi derleme hatası (borrow-checker benzeri sözdizimi hataları), biri işlevsel hata. Üçüncüsü, Claude'un Round 1'deki tek makro-kaynaklı başarısızlığı (s56, kategori I — makro çoklu-değerlendirmesi) Gemini tarafından ilk seferde doğru çevrilmiştir (1/1) — tek örneklik bu kategori için Gemini'nin daha dayanıklı olduğuna dair ek, ama küçük bir kanıttır. Bu üç bulgu birlikte, "bir model diğerinden genel olarak daha iyidir" iddiasının yanlış çerçeveleme olduğunu; asıl belirleyicinin model×kod-kategorisi etkileşimi olduğunu gösterir — kısa, iyi tanımlanmış sızıntı kategorilerinde Gemini daha dayanıklı, uzun/karmaşık gerçek üretim kodunda Claude daha dayanıklıdır.</w:t>
+        <w:t>Üç örüntü dikkat çekicidir. Birincisi, "kök-neden 2. örnek" grubunda (s49-s53 — Claude'un Round 1'de yalnızca birer örnekle temsil edilen C, E, F, G, H kategorilerinde bağımsız ikinci bir kez sınandığı örnekler) Claude bu beş örneğin dördünde aynı kök nedeni tekrarlamış, yalnızca birinde geçmiştir (1/5) — bu, ilk başarısızlıkların tesadüfi değil sistematik bir model-özgü kör nokta olduğunun doğrudan kanıtıdır — Gemini ise aynı 5 örneğin tamamında (5/5) farklı deyimsel tercihlerle (ör. wrapping_mul, AtomicI32, imzalı döngü değişkeni) bu kategorileri sistemli biçimde atlatmıştır. İkincisi, tam tersi yönde: en uzun/karmaşık üç gerçek üretim kodu örneğinde (musl qsort, Redis SDS, cJSON — 262-522 satır) Claude 2/3 geçerken Gemini 0/3 geçmiştir — ikisi derleme hatası (borrow-checker benzeri sözdizimi hataları), biri işlevsel hata. Üçüncüsü, Claude'un Round 1'deki tek makro-kaynaklı başarısızlığı (s56, kategori I — makro çoklu-değerlendirmesi) Gemini tarafından ilk seferde doğru çevrilmiştir (1/1) — tek örneklik bu kategori için Gemini'nin daha dayanıklı olduğuna dair ek, ama küçük bir kanıttır. Bu üç bulgu birlikte, "bir model diğerinden genel olarak daha iyidir" iddiasının yanlış çerçeveleme olduğunu; asıl belirleyicinin model×kod-kategorisi etkileşimi olduğunu gösterir — kısa, iyi tanımlanmış sızıntı kategorilerinde Gemini daha dayanıklı, uzun/karmaşık gerçek üretim kodunda Claude daha dayanıklıdır.</w:t>
       </w:r>
     </w:p>
     <w:p>

</xml_diff>

<commit_message>
Kor hakemlik icin anonimlik sertlestirmesi: GitHub URL'sini kaldir, DOI'yi ertele
- "Veri, Kod ve Lisans Erisilebilirligi" alt bolumunu, depo baglantisini/DOI'yi
  kabul sonrasina erteleyecek ve gercek GitHub kullanici adini ifsa etmeyecek
  sekilde yeniden yaz (onceki surumde adres dogrudan metne gomulmustu)
- Anonimlik riski tasiyan "onceki surumun degerlendirmesi" ifadesinin butun
  gecislerini "hakem ve danisman geri bildirimine yanit olarak" seklinde
  notrlestir; Tesekkur bolumunden geri bildirim tesekkurunu kaldir
- Metne gomulu tum dosya/klasor yollarini (manifest/harness/stats/platform)
  "acik veri deposunda" gibi genel ifadelerle degistir
- Kaynakcadaki [1],[2],[3],[12] referanslarini web uzerinden dogrula (yazar
  sirasi, DOI, arXiv kimlikleri) - hepsi dogru bulundu, degisiklik gerekmedi
</commit_message>
<xml_diff>
--- a/makale_IEEE_v1.docx
+++ b/makale_IEEE_v1.docx
@@ -592,13 +592,13 @@
         <w:t>n program (s25-s29); bağımsızlığı sınamak için Rosetta Code'dan [4] 7 algoritma (s30-s36), OpenBSD/FreeBSD libc'sinden [5] 3 üretim fonksiyonu (s37-s39) ve musl [6]/Redis [7]/cJSON [8]'dan 3 uzun üretim kodu (s46-s48, 262-522 satır); hedeflenmemiş boşlukla</w:t>
       </w:r>
       <w:r>
-        <w:t>rı kapsayan 6 özgün program (s40-s45); hakem/danışman geri bildirimi doğrultusunda eklenen, beş kök-neden kategorisinin (C, E, F, G, H) ikinci örnekleri (s49-s53, sırasıyla); ayrıca kimlik numarası sırası içerik sırasıyla örtüşmeyen iki ek grup: çok dosyal</w:t>
-      </w:r>
-      <w:r>
-        <w:t>ı derleme ve gerçek pthread eşzamanlılığı test eden s54, s55, s57 ile karmaşık makro kullanımını test eden s56. Her durumda çekirdek algoritma kaynaktan değiştirilmeden alınmış, yalnızca main() ortamın stdin/stdout sözleşmesine uyacak şekilde yeniden yazıl</w:t>
-      </w:r>
-      <w:r>
-        <w:t>mıştır; tam katalog ve üçüncü taraf lisans dökümü §III-F'de belgelenmiştir.</w:t>
+        <w:t>rı kapsayan 6 özgün program (s40-s45); hakem ve danışman geri bildirimine yanıt olarak eklenen, beş kök-neden kategorisinin (C, E, F, G, H) ikinci örnekleri (s49-s53, sırasıyla); ayrıca kimlik numarası sırası içerik sırasıyla örtüşmeyen iki ek grup: çok do</w:t>
+      </w:r>
+      <w:r>
+        <w:t>syalı derleme ve gerçek pthread eşzamanlılığı test eden s54, s55, s57 ile karmaşık makro kullanımını test eden s56. Her durumda çekirdek algoritma kaynaktan değiştirilmeden alınmış, yalnızca main() ortamın stdin/stdout sözleşmesine uyacak şekilde yeniden y</w:t>
+      </w:r>
+      <w:r>
+        <w:t>azılmıştır; veri setinin tam kataloğu açık veri deposunda sunulmuştur.</w:t>
       </w:r>
     </w:p>
     <w:p>
@@ -622,13 +622,13 @@
           <w:sz w:val="17"/>
         </w:rPr>
         <w:lastRenderedPageBreak/>
-        <w:t xml:space="preserve">TABLO I. VERİ SETİNİN KAYNAK/ROL KATEGORİLERİNE GÖRE ÖZETİ (* Rosetta Code; ** OpenBSD/FreeBSD libc; *** musl/Redis/cJSON — üçü de tarafımızca yazılmamış </w:t>
+        <w:t>TABLO I. VERİ SETİNİN KAYNAK/ROL KATEGORİLERİNE GÖRE ÖZETİ (* Rosetta Code; ** OpenBSD/FreeBSD libc; *** musl/Redis/cJSON — üçü de tarafımızca yazılmamış bağım</w:t>
       </w:r>
       <w:r>
         <w:rPr>
           <w:sz w:val="17"/>
         </w:rPr>
-        <w:t>bağımsız/üretim kodu, bkz. §V-B).</w:t>
+        <w:t>sız/üretim kodu, bkz. §V-B).</w:t>
       </w:r>
     </w:p>
     <w:tbl>
@@ -1665,32 +1665,32 @@
         <w:jc w:val="both"/>
       </w:pPr>
       <w:r>
-        <w:t>Ana çeviri modeli Anthropic</w:t>
-      </w:r>
-      <w:r>
-        <w:t xml:space="preserve"> Claude Sonnet 5'tir (model kimliği: claude-sonnet-5); ikinci, bağımsız bir model olarak Google Gemini API'si [9] (model kimliği: gemini-flash-latest, gerçek API çağrısıyla, temperature=0.2, top_p=1.0) kullanılmıştır. Gemini kimliği açıkça tarihli/sabit bi</w:t>
-      </w:r>
-      <w:r>
-        <w:t xml:space="preserve">r sürüm değil rotasyonlu bir takma addır ("-latest" eki); API yanıtının hangi anlık görüntüye (snapshot) çözümlendiğini gösteren alan (`modelVersion`) çağrı kayıtlarına (bkz. §III-F) o dönemde loglanmamıştır — bu, tekrarlanabilirlik açısından açıkça kabul </w:t>
-      </w:r>
-      <w:r>
-        <w:t>edilmesi gereken bir eksikliktir (§V-B); ölçümün zamansal bağlamı yalnızca erişim tarihleriyle (2026-07-22 – 2026-07-25) sınırlı olarak yeniden kurulabilir. İstem mühendisliği en yalın haliyle uygulanmıştır: modele her C dosyası için yalnızca "bu C program</w:t>
-      </w:r>
-      <w:r>
-        <w:t xml:space="preserve">ını Rust'a çevir" istemi verilmiş; belirli bir Rust deyimselliği, hedef sürüm veya few-shot örnek sağlanmamıştır. Model, çeviriyi üretmeden önce kodu derlemek/test etmek için herhangi bir araca erişememiştir (gerçek zero-shot koşulu). Değerlendirme betiği </w:t>
-      </w:r>
-      <w:r>
-        <w:t>model-bağımsız tasarlanmıştır: başka bir LLM'in çıktıları ilgili klasöre konularak aynı ölçüm otomatik tekrarlanabilir (araçlar için bkz. §III-F). Claude çevirileri ise etkileşimli bir asistan oturumunda (Claude Code CLI) üretilmiştir; sabit örnekleme para</w:t>
-      </w:r>
-      <w:r>
-        <w:t xml:space="preserve">metreleri (temperature/top-p) dışa açık raporlanmamış ve istemin birebir metni ayrı </w:t>
+        <w:t xml:space="preserve">Ana çeviri modeli Anthropic </w:t>
+      </w:r>
+      <w:r>
+        <w:t>Claude Sonnet 5'tir (model kimliği: claude-sonnet-5); ikinci, bağımsız bir model olarak Google Gemini API'si [9] (model kimliği: gemini-flash-latest, gerçek API çağrısıyla, temperature=0.2, top_p=1.0) kullanılmıştır. Gemini kimliği açıkça tarihli/sabit bir</w:t>
+      </w:r>
+      <w:r>
+        <w:t xml:space="preserve"> sürüm değil rotasyonlu bir takma addır ("-latest" eki); API yanıtının hangi anlık görüntüye (snapshot) çözümlendiğini gösteren alan (`modelVersion`) çağrı kayıtlarına o dönemde loglanmamıştır — bu, tekrarlanabilirlik açısından açıkça kabul edilmesi gereke</w:t>
+      </w:r>
+      <w:r>
+        <w:t>n bir eksikliktir (§V-B); ölçümün zamansal bağlamı yalnızca erişim tarihleriyle (2026-07-22 – 2026-07-25) sınırlı olarak yeniden kurulabilir. İstem mühendisliği en yalın haliyle uygulanmıştır: modele her C dosyası için yalnızca "bu C programını Rust'a çevi</w:t>
+      </w:r>
+      <w:r>
+        <w:t xml:space="preserve">r" istemi verilmiş; belirli bir Rust deyimselliği, hedef sürüm veya few-shot örnek sağlanmamıştır. Model, çeviriyi üretmeden önce kodu derlemek/test etmek için herhangi bir araca erişememiştir (gerçek zero-shot koşulu). Değerlendirme betiği model-bağımsız </w:t>
+      </w:r>
+      <w:r>
+        <w:t>tasarlanmıştır: başka bir LLM'in çıktıları ilgili klasöre konularak aynı ölçüm otomatik tekrarlanabilir. Claude çevirileri ise etkileşimli bir asistan oturumunda (Claude Code CLI) üretilmiştir; sabit örnekleme parametreleri (temperature/top-p) dışa açık ra</w:t>
+      </w:r>
+      <w:r>
+        <w:t xml:space="preserve">porlanmamış ve istemin birebir metni ayrı arşivlenmemiştir — bu, Claude tarafı </w:t>
       </w:r>
       <w:r>
         <w:lastRenderedPageBreak/>
-        <w:t>arşivlenmemiştir — bu, Claude tarafı için tekrarlanabilirliği Gemini tarafına göre sınırlayan, açıkça kabul edilmesi gereken bir asimetridir (§V-B). Her iki model için de h</w:t>
-      </w:r>
-      <w:r>
-        <w:t>er örnek yalnızca bir kez (k=1) çevrilmiştir; LLM çıktısının stokastik doğası nedeniyle, tek örneklemli bu ölçümün ne kadarının gerçek model performansı farkını, ne kadarının örnekleme gürültüsünü yansıttığı bilinmemektedir (§V-B).</w:t>
+        <w:t>için tekrarlanabilirliği Gemini tarafına göre sınırlayan, açıkça kabul edilmesi gereken bir asimetridir (§V-B). Her iki model için de her örnek yalnızca bir kez (k=1) çevrilmişt</w:t>
+      </w:r>
+      <w:r>
+        <w:t>ir; LLM çıktısının stokastik doğası nedeniyle, tek örneklemli bu ölçümün ne kadarının gerçek model performansı farkını, ne kadarının örnekleme gürültüsünü yansıttığı bilinmemektedir (§V-B).</w:t>
       </w:r>
     </w:p>
     <w:p>
@@ -1698,13 +1698,13 @@
         <w:jc w:val="both"/>
       </w:pPr>
       <w:r>
-        <w:t xml:space="preserve">Gemini ölçümü, ücretsiz </w:t>
-      </w:r>
-      <w:r>
-        <w:t>katman günlük kota sınırı nedeniyle birden fazla gün boyunca kademeli olarak tamamlanmıştır (2026-07-22 ile 2026-07-25 arasında, kota her sıfırlandığında bir sonraki grup çevrilerek): toplam 57 örneğin tamamı gerçek, otomatik API çağrısıyla ölçülmüştür; hi</w:t>
-      </w:r>
-      <w:r>
-        <w:t>çbir sonuç sahte veriyle doldurulmamıştır. Tam çağrı kaydı (istem, zaman damgası, örnekleme parametreleri) her örnek için ayrıca arşivlenmiştir (bkz. §III-F).</w:t>
+        <w:t>Gemini ölçümü, ücretsiz katman günlük kota sınırı nedeniyle birden</w:t>
+      </w:r>
+      <w:r>
+        <w:t xml:space="preserve"> fazla gün boyunca kademeli olarak tamamlanmıştır (2026-07-22 ile 2026-07-25 arasında, kota her sıfırlandığında bir sonraki grup çevrilerek): toplam 57 örneğin tamamı gerçek, otomatik API çağrısıyla ölçülmüştür; hiçbir sonuç sahte veriyle doldurulmamıştır.</w:t>
+      </w:r>
+      <w:r>
+        <w:t xml:space="preserve"> Tam çağrı kaydı (istem, zaman damgası, örnekleme parametreleri) her örnek için açık veri deposunda arşivlenmiştir.</w:t>
       </w:r>
     </w:p>
     <w:p>
@@ -1724,13 +1724,13 @@
         <w:jc w:val="both"/>
       </w:pPr>
       <w:r>
-        <w:t>Hedef dilde önceden yazılmış birim test bulunmadığından,</w:t>
-      </w:r>
-      <w:r>
-        <w:t xml:space="preserve"> doğruluk kaynak programla aynı girdide çalıştırılıp çıktı karşılaştırılarak (diferansiyel test) ölçülmüştür: C ve Rust ikilileri derlenir (Rust derlenmezse CE); her test girdisi için beklenen/alınan çıktı karşılaştırılır (zaman aşımı → NT, çökme → RE, far</w:t>
-      </w:r>
-      <w:r>
-        <w:t xml:space="preserve">k → FE, eşitse PASS; Tablo II); bir örnek yalnızca </w:t>
+        <w:t>Hedef dilde önceden yazılmış birim test bulunmadığından, doğruluk kaynak programla aynı girdide çal</w:t>
+      </w:r>
+      <w:r>
+        <w:t>ıştırılıp çıktı karşılaştırılarak (diferansiyel test) ölçülmüştür: C ve Rust ikilileri derlenir (Rust derlenmezse CE); her test girdisi için beklenen/alınan çıktı karşılaştırılır (zaman aşımı → NT, çökme → RE, fark → FE, eşitse PASS; Tablo II); bir örnek y</w:t>
+      </w:r>
+      <w:r>
+        <w:t xml:space="preserve">alnızca </w:t>
       </w:r>
       <w:r>
         <w:rPr>
@@ -2140,17 +2140,17 @@
         <w:t>Program-düzeyi Yürütme Doğruluğu (</w:t>
       </w:r>
       <w:r>
-        <w:t>EA) = tüm testleri geçen örnek sayısı / toplam örnek sayısı — ana metriktir. Test-girdisi bazında geçme oranı ikincil, daha ince taneli bir metriktir. Ortam: Windows 11, gcc 16.1.0 (MSYS2/UCRT64, -O2), rustc/cargo 1.97.1; derleme `rustc &lt;dosya&gt;.rs -o &lt;çıkt</w:t>
+        <w:t xml:space="preserve">EA) = tüm testleri geçen örnek sayısı / toplam örnek sayısı — ana metriktir. Test-girdisi bazında geçme oranı ikincil, daha ince taneli bir metriktir. Ortam: Windows 11, gcc 16.1.0 (MSYS2/UCRT64, -O2), </w:t>
+      </w:r>
+      <w:r>
+        <w:lastRenderedPageBreak/>
+        <w:t>rustc/cargo 1.97.1; derleme `rustc &lt;dosya&gt;.rs -o &lt;çıkt</w:t>
       </w:r>
       <w:r>
         <w:t>ı&gt;` ile, Cargo veya açık bir --edition bayrağı olmadan yapılmıştır (rustc'nin varsayılan edition'ı, 2015); bu, tekrarlanabilirlik için belirtilmesi gereken bir parametredir (bazı lint'lerin — ör. static_mut_refs — şiddeti edition'a göre değişir, ancak Kate</w:t>
       </w:r>
       <w:r>
-        <w:t xml:space="preserve">gori </w:t>
-      </w:r>
-      <w:r>
-        <w:lastRenderedPageBreak/>
-        <w:t>E'deki gözlenen derleme hatası — E0133, unsafe olmadan mutable static erişimi — tüm editionlarda aynı şekilde sert hatadır). Ayrıca gerçek bir Linux/LP64 ortamında (Docker, ubuntu:24.04) bir tekrar yapılmıştır; bu tekrar veri seti 55 örnekken gerçekle</w:t>
+        <w:t>gori E'deki gözlenen derleme hatası — E0133, unsafe olmadan mutable static erişimi — tüm editionlarda aynı şekilde sert hatadır). Ayrıca gerçek bir Linux/LP64 ortamında (Docker, ubuntu:24.04) bir tekrar yapılmıştır; bu tekrar veri seti 55 örnekken gerçekle</w:t>
       </w:r>
       <w:r>
         <w:t>ştirilmiş ve sonradan güncellenmemiştir (§IV-F). Zaman aşımı eşiği 5 sn'dir; yalnızca LLM çağrısı bire bir tekrarlanabilir değildir (§V-B). Tekrarlanabilirlik için gereken depo/erişim bilgileri §III-F'de toplu olarak sunulmuştur.</w:t>
@@ -2165,31 +2165,25 @@
           <w:b/>
           <w:i/>
         </w:rPr>
-        <w:t>F. Tekrarlanabilirlik ve V</w:t>
+        <w:t>F. Veri, Kod ve Lisans Eri</w:t>
       </w:r>
       <w:r>
         <w:rPr>
           <w:b/>
           <w:i/>
         </w:rPr>
-        <w:t>eri Erişilebilirliği</w:t>
+        <w:t>şilebilirliği</w:t>
       </w:r>
     </w:p>
     <w:p>
       <w:r>
-        <w:t>Tekrarlanabilirlikle ilgili tüm eserler açık depoda barındırılır; okunabilirlik için ilgili dosya adları anlatım içine dağıtılmak yerine burada tek bir yerde toplanmıştır. Veri setinin örnek-düzeyinde kaynak/algoritma kataloğu results/</w:t>
-      </w:r>
-      <w:r>
-        <w:t>VERISETI_VE_ALGORITMALAR.md'dedir; üçüncü taraf kaynak kodun (Rosetta Code, OpenBSD/FreeBSD libc, musl, Redis, cJSON) tam lisans dökümü (sırasıyla GFDL 1.2/CC-BY-SA, BSD-3-Clause, MIT) THIRD_PARTY_LICENSES.md'dedir. Çeviri/karşılaştırma hattı model-bağımsı</w:t>
-      </w:r>
-      <w:r>
-        <w:t>z tasarlanmıştır (harness/generate_translations.py, harness/compare_models.py); yeni bir LLM'in çıktıları ilgili klasöre konularak aynı ölçüm otomatik tekrarlanabilir. Gemini çağrılarının istem, zaman damgası ve örnekleme parametrelerini içeren tam kaydı r</w:t>
-      </w:r>
-      <w:r>
-        <w:t>esults/manifest_gemini.json'dadır. Tablo IV'teki betimsel kod-özelliği ölçümlerinin (regex tabanlı) tanımları ve çıktıları harness/stats_report.py ve results/stats_report.md'de, Linux/Docker platform tekrarının ayrıntılı karşılaştırması ise results/platfor</w:t>
-      </w:r>
-      <w:r>
-        <w:t>m_comparison.md'de yer alır. Tüm betikler (harness/), veri seti ve ham sonuçlar github.com/ibrahimsahin022/llm_ceviri_deneyi adresinde açık erişimlidir; kalıcı bir Zenodo DOI'si yayın sürecinde atanacaktır.</w:t>
+        <w:t>Tüm değerlendirme betikleri, veri seti, model çağrı kayıtları, istatistik ve platform-karşılaştırma raporları ile ham sonuçlar açık bir depoda erişime sunulmuştur. Kör değerlendirme sürecini korumak için depo bağlantısı ve kalıcı arşiv (Zenod</w:t>
+      </w:r>
+      <w:r>
+        <w:t>o/figshare) DOI'si, kabul sonrası yayın aşamasında paylaşılacaktır. Bağımsız kaynaklardan alınan programlar ilgili açık lisanslar altında yeniden kullanılmıştır: Rosetta Code örnekleri GFDL 1.2/CC-BY-SA; OpenBSD/FreeBSD libc ve Redis SDS kodu BSD-3-Clause;</w:t>
+      </w:r>
+      <w:r>
+        <w:t xml:space="preserve"> musl ve cJSON kodu MIT lisansı altındadır. Her kaynak dosyanın başlığında lisans bilgisi ve yapılan değişiklikler belgelenmiştir.</w:t>
       </w:r>
     </w:p>
     <w:p>
@@ -2210,10 +2204,7 @@
         <w:jc w:val="both"/>
       </w:pPr>
       <w:r>
-        <w:t>Deney üç koşulda çalıştırılmıştır (T</w:t>
-      </w:r>
-      <w:r>
-        <w:t>ablo III): Round 1 debug, Round 1 release, Round 2 (iyileştirilmiş) debug.</w:t>
+        <w:t>Deney üç koşulda çalıştırılmıştır (Tablo III): Round 1 debug, Round 1 release, Round 2 (iyileştirilmiş) debug.</w:t>
       </w:r>
     </w:p>
     <w:p>
@@ -2934,10 +2925,10 @@
         <w:jc w:val="both"/>
       </w:pPr>
       <w:r>
-        <w:t xml:space="preserve">Ham çeviriler için EA yalnızca %70.18'dir (Şekil 1). Round 1'de başarısız olan 17 örneğin yalnızca </w:t>
-      </w:r>
-      <w:r>
-        <w:t>biri (s19, global durum) derleme aşamasında (CE) yakalanmıştır; geri kalan 16'sı (%94.1) — 4 RE + 12 FE — derleyiciden hiç uyarı almadan sessizce geçmiştir (Şekil 2).</w:t>
+        <w:t xml:space="preserve">Ham çeviriler için EA yalnızca %70.18'dir (Şekil 1). Round 1'de başarısız olan 17 örneğin yalnızca biri (s19, global durum) derleme aşamasında (CE) yakalanmıştır; geri kalan </w:t>
+      </w:r>
+      <w:r>
+        <w:t>16'sı (%94.1) — 4 RE + 12 FE — derleyiciden hiç uyarı almadan sessizce geçmiştir (Şekil 2).</w:t>
       </w:r>
     </w:p>
     <w:p>
@@ -2945,13 +2936,10 @@
         <w:jc w:val="both"/>
       </w:pPr>
       <w:r>
-        <w:t>Program düzeyinde %70.18 olan doğruluk, test girdisi düzeyinde %86.3 (195/226 — CE olan t</w:t>
-      </w:r>
-      <w:r>
-        <w:t>ek örneğin girdileri hiç çalıştırılamadığından payda 229 değil 226'dır) olarak ölçülmüştür; bu, program-düzeyi metriğin katı ("tüm girdileri geçmelidir") tanımı nedeniyle beklenen bir farktır. Daha çarpıcı olan: 12 FE örneğinin 6'sı (s06, s13, s15, s20, s2</w:t>
-      </w:r>
-      <w:r>
-        <w:t xml:space="preserve">7, s38) yalnızca </w:t>
+        <w:t>Program düzeyinde %70.18 olan doğruluk, test girdisi düzeyinde %86.3 (195/226 — CE olan tek örneğin girdileri hiç çalıştırılamadığından payda 229 değil 226'dır) ola</w:t>
+      </w:r>
+      <w:r>
+        <w:t xml:space="preserve">rak ölçülmüştür; bu, program-düzeyi metriğin katı ("tüm girdileri geçmelidir") tanımı nedeniyle beklenen bir farktır. Daha çarpıcı olan: 12 FE örneğinin 6'sı (s06, s13, s15, s20, s27, s38) yalnızca </w:t>
       </w:r>
       <w:r>
         <w:rPr>
@@ -2960,10 +2948,13 @@
         <w:t>tek</w:t>
       </w:r>
       <w:r>
-        <w:t xml:space="preserve"> bir sınır girdisinde sapmış, kalan girdilerin tamamında doğru sonuç üretmiştir. Bu, sessiz semantik hataların rastgele seçilmiş bir test girdisiyle yakalanma olasılığının düşük olduğunu ve diferansiyel testin sonucunun girdi çeşitliliğ</w:t>
-      </w:r>
-      <w:r>
-        <w:t>ine ne kadar bağımlı olduğunu göstermektedir — hata yalnızca sessiz değil, aynı zamanda seyrek tetiklenir.</w:t>
+        <w:t xml:space="preserve"> bir sınır girdisinde sapmış, kalan girdilerin tamamınd</w:t>
+      </w:r>
+      <w:r>
+        <w:t xml:space="preserve">a doğru sonuç üretmiştir. Bu, sessiz semantik hataların rastgele seçilmiş bir test girdisiyle yakalanma olasılığının düşük olduğunu ve diferansiyel testin sonucunun girdi çeşitliliğine ne kadar bağımlı olduğunu göstermektedir — hata yalnızca sessiz değil, </w:t>
+      </w:r>
+      <w:r>
+        <w:t>aynı zamanda seyrek tetiklenir.</w:t>
       </w:r>
     </w:p>
     <w:p>
@@ -3101,16 +3092,13 @@
         <w:jc w:val="both"/>
       </w:pPr>
       <w:r>
-        <w:t xml:space="preserve">Şekil 3, </w:t>
-      </w:r>
-      <w:r>
-        <w:t xml:space="preserve">57 örneğin LoC'sini başarı durumuna göre gösterir: en uzun program (522 satır, s47) geçerken çok daha kısa s38 (154 satır) ve s48 (389 satır) başarısız olmuştur — başarısızlık uzunluktan çok hedeflenen semantik boşluğa bağlıdır. PASS (n=40) ve FAIL (n=17) </w:t>
-      </w:r>
-      <w:r>
-        <w:t>gruplarının LoC dağılımı Mann-Whitney U testiyle karşılaştırılmış, fark anlamlı bulunmamıştır (U=287.0, p=0.359); veri seti genişletme aşamalarında (n=36→57 arası ara kontrollerde) p-değeri 0.076-0.359 arası dalgalanmıştır — küçük örneklemde p-değerinin is</w:t>
-      </w:r>
-      <w:r>
-        <w:t>tikrarsızlığının veriye dayalı bir göstergesi.</w:t>
+        <w:t>Şekil 3, 57 örneğin LoC'sini başarı durumuna göre gösterir: en uzun program (522 sat</w:t>
+      </w:r>
+      <w:r>
+        <w:t>ır, s47) geçerken çok daha kısa s38 (154 satır) ve s48 (389 satır) başarısız olmuştur — başarısızlık uzunluktan çok hedeflenen semantik boşluğa bağlıdır. PASS (n=40) ve FAIL (n=17) gruplarının LoC dağılımı Mann-Whitney U testiyle karşılaştırılmış, fark anl</w:t>
+      </w:r>
+      <w:r>
+        <w:t>amlı bulunmamıştır (U=287.0, p=0.359); veri seti genişletme aşamalarında (n=36→57 arası ara kontrollerde) p-değeri 0.076-0.359 arası dalgalanmıştır — küçük örneklemde p-değerinin istikrarsızlığının veriye dayalı bir göstergesi.</w:t>
       </w:r>
     </w:p>
     <w:p>
@@ -3168,7 +3156,13 @@
         <w:rPr>
           <w:sz w:val="17"/>
         </w:rPr>
-        <w:t>Şekil 3. Kod uzunluğu (LoC) ile başarı durumu ilişkisi (n=57).</w:t>
+        <w:t xml:space="preserve">Şekil 3. Kod uzunluğu </w:t>
+      </w:r>
+      <w:r>
+        <w:rPr>
+          <w:sz w:val="17"/>
+        </w:rPr>
+        <w:t>(LoC) ile başarı durumu ilişkisi (n=57).</w:t>
       </w:r>
     </w:p>
     <w:p>
@@ -3176,11 +3170,14 @@
         <w:jc w:val="both"/>
       </w:pPr>
       <w:r>
+        <w:t xml:space="preserve">İlişkinin etki büyüklüğü rank-biserial korelasyon ile r=0.156'dır (küçük etki). Post-hoc/gözlemlenen güç (achieved power) </w:t>
+      </w:r>
+      <w:r>
         <w:lastRenderedPageBreak/>
-        <w:t>İlişkinin etki büyüklüğü rank-biserial korelasyon ile r=0.156'dır (küçük etki). Post-hoc/gözlemlenen güç (achieved power) yerine — bu, p-değerinin tekdüze bir dönüşümüdür ve bağımsız bilgi taşımaz [13] — önerilen duyarlılık analizi uygulanmıştır: n(FAIL)=1</w:t>
-      </w:r>
-      <w:r>
-        <w:t xml:space="preserve">7, n(PASS)=40, α=0.05 ile %80 güçte saptanabilecek en küçük etki büyüklüğü, anlamlılığı ölçmek için kullanılan </w:t>
+        <w:t>yerine — bu, p-değerinin tekdüze bir dönüşümüdür ve bağımsız bilgi taşımaz [13] — önerilen du</w:t>
+      </w:r>
+      <w:r>
+        <w:t xml:space="preserve">yarlılık analizi uygulanmıştır: n(FAIL)=17, n(PASS)=40, α=0.05 ile %80 güçte saptanabilecek en küçük etki büyüklüğü, anlamlılığı ölçmek için kullanılan </w:t>
       </w:r>
       <w:r>
         <w:rPr>
@@ -3189,13 +3186,16 @@
         <w:t>aynı</w:t>
       </w:r>
       <w:r>
-        <w:t xml:space="preserve"> Mann-Whitney U istatistiğinden ampirik rank-biserial formülüyle (r=1-2U/(n1·n2)) hesaplandığında rank-biserial |r|≈0.46'dır (U'nun bağ düzel</w:t>
-      </w:r>
-      <w:r>
-        <w:t>tmeli standart sapması üzerinden). Gözlemlenen r=0.156 bu eşiğin belirgin altındadır — veri seti bu büyüklükte küçük-orta etkileri saptayacak güce sahip değildir; "anlamlı fark yoktur" sonucu kesin bir ilişkisizlik kanıtı değil, düşük güçle tutarlı bir göz</w:t>
-      </w:r>
-      <w:r>
-        <w:t>lem olarak okunmalıdır (§V-B). EA'nın kendisi için de bootstrap %95 güven aralığı hesaplanmıştır (Şekil 4): Round 1 debug %70.18 [%57.89, %82.46] — geniş aralık, n=57'nin tek bir nokta tahminine duyulan güveni sınırladığını doğrudan göstermektedir.</w:t>
+        <w:t xml:space="preserve"> Mann-Whitney U istatistiğinden ampirik rank-biserial formülüyle (r=1-2U/(n1·n2)) hesaplandığında ra</w:t>
+      </w:r>
+      <w:r>
+        <w:t xml:space="preserve">nk-biserial |r|≈0.46'dır (U'nun bağ düzeltmeli standart sapması üzerinden). Gözlemlenen r=0.156 bu eşiğin belirgin altındadır — veri seti bu büyüklükte küçük-orta etkileri saptayacak güce sahip değildir; "anlamlı fark yoktur" sonucu kesin bir ilişkisizlik </w:t>
+      </w:r>
+      <w:r>
+        <w:t>kanıtı değil, düşük güçle tutarlı bir gözlem olarak okunmalıdır (§V-B). EA'nın kendisi için de bootstrap %95 güven aralığı hesaplanmıştır (Şekil 4): Round 1 debug %70.18 [%57.89, %82.46] — geniş aralık, n=57'nin tek bir nokta tahminine duyulan güveni sınır</w:t>
+      </w:r>
+      <w:r>
+        <w:t>ladığını doğrudan göstermektedir.</w:t>
       </w:r>
     </w:p>
     <w:p>
@@ -3253,13 +3253,7 @@
         <w:rPr>
           <w:sz w:val="17"/>
         </w:rPr>
-        <w:t>Şekil</w:t>
-      </w:r>
-      <w:r>
-        <w:rPr>
-          <w:sz w:val="17"/>
-        </w:rPr>
-        <w:t xml:space="preserve"> 4. Üç koşulda EA için bootstrap %95 güven aralığı.</w:t>
+        <w:t>Şekil 4. Üç koşulda EA için bootstrap %95 güven aralığı.</w:t>
       </w:r>
     </w:p>
     <w:p>
@@ -3267,10 +3261,10 @@
         <w:jc w:val="both"/>
       </w:pPr>
       <w:r>
-        <w:t>Kod uzunluğunun tek başına açıklayıcı olmaması, başka hangi kod özelliklerinin ayırt edici olabileceği sorusunu gündeme getirir. Tablo IV, PASS/FAIL gruplarının işaretçi, dinamik bellek ayırma (malloc/cal</w:t>
-      </w:r>
-      <w:r>
-        <w:t>loc) ve string-fonksiyonu kullanım oranlarını gösterir (ölçüm tanımları — regex tabanlı, tekrarlanabilir — §III-F'de belgelidir).</w:t>
+        <w:t>Kod uzunluğunun tek başına açıklayıcı olmaması, başka hangi kod özelliklerinin ayırt edici olabileceği sorusunu gündeme getirir. Tablo IV, PASS/FAIL gruplarının iş</w:t>
+      </w:r>
+      <w:r>
+        <w:t>aretçi, dinamik bellek ayırma (malloc/calloc) ve string-fonksiyonu kullanım oranlarını gösterir (ölçüm tanımları regex tabanlı ve tekrarlanabilirdir; ayrıntılar açık veri deposunda belgelenmiştir).</w:t>
       </w:r>
     </w:p>
     <w:p>
@@ -3294,7 +3288,13 @@
           <w:sz w:val="17"/>
         </w:rPr>
         <w:lastRenderedPageBreak/>
-        <w:t>TABLO IV. PASS/FAIL GRUPLARINA GÖRE BETİMSEL KOD ÖZELLİKLERİ (n=57).</w:t>
+        <w:t>TABLO IV. PASS/FAIL GRUPLARINA G</w:t>
+      </w:r>
+      <w:r>
+        <w:rPr>
+          <w:sz w:val="17"/>
+        </w:rPr>
+        <w:t>ÖRE BETİMSEL KOD ÖZELLİKLERİ (n=57).</w:t>
       </w:r>
     </w:p>
     <w:tbl>
@@ -3706,19 +3706,23 @@
       </w:pPr>
       <w:r>
         <w:lastRenderedPageBreak/>
-        <w:t xml:space="preserve">FAIL grubunun string-fonksiyonu kullanımı (%47.1) PASS grubundan (%37.5) yüksek, malloc/calloc </w:t>
-      </w:r>
-      <w:r>
-        <w:t>kullanımı ise sıfırdır — bu, §IV-C'deki kök neden analiziyle tutarlıdır: başarısızlıkların çoğu string/karakter/sayı semantiğiyle ilgilidir; dinamik veri yapısı içeren programlar (bağlı liste, BST, hash tablosu) bu veri setinde istisnasız PASS olmuştur. İş</w:t>
-      </w:r>
-      <w:r>
-        <w:t xml:space="preserve">aretçi kullanımı ile PASS/FAIL arasındaki ilişki Fisher'in kesin testiyle de sınanmış, anlamlı bulunmamıştır (tablo=[[23,7],[17,10]], odds oranı=1.93, %95 GA=[0.61, 6.11], p=0.385) — güven aralığının 1.0'i içermesi ve genişliği, küçük örneklemin doğal bir </w:t>
-      </w:r>
-      <w:r>
-        <w:t>sonucudur. Bu veri setinde küçük örneklem büyüklüğü nedeniyle aynı veriler üzerinde birden fazla çıkarımsal test (Mann-Whitney, Fisher, bootstrap GA) uygulanmıştır; bunlar keşif amaçlı (exploratory) okunmalı ve bir çoklu-karşılaştırma düzeltmesiyle birlikt</w:t>
-      </w:r>
-      <w:r>
-        <w:t>e değerlendirilmelidir (ayrıntılı düzeltme kontrolü: §V-B).</w:t>
+        <w:t xml:space="preserve">FAIL grubunun </w:t>
+      </w:r>
+      <w:r>
+        <w:t>string-fonksiyonu kullanımı (%47.1) PASS grubundan (%37.5) yüksek, malloc/calloc kullanımı ise sıfırdır — bu, §IV-C'deki kök neden analiziyle tutarlıdır: başarısızlıkların çoğu string/karakter/sayı semantiğiyle ilgilidir; dinamik veri yapısı içeren program</w:t>
+      </w:r>
+      <w:r>
+        <w:t>lar (bağlı liste, BST, hash tablosu) bu veri setinde istisnasız PASS olmuştur. İşaretçi kullanımı ile PASS/FAIL arasındaki ilişki Fisher'in kesin testiyle de sınanmış, anlamlı bulunmamıştır (tablo=[[23,7],[17,10]], odds oranı=1.93, %95 GA=[0.61, 6.11], p=0</w:t>
+      </w:r>
+      <w:r>
+        <w:t>.385) — güven aralığının 1.0'i içermesi ve genişliği, küçük örneklemin doğal bir sonucudur. Bu veri setinde küçük örneklem büyüklüğü nedeniyle aynı veriler üzerinde birden fazla çıkarımsal test (Mann-Whitney, Fisher, bootstrap GA) uygulanmıştır; bunlar keş</w:t>
+      </w:r>
+      <w:r>
+        <w:t xml:space="preserve">if amaçlı (exploratory) okunmalı ve </w:t>
+      </w:r>
+      <w:r>
+        <w:lastRenderedPageBreak/>
+        <w:t>bir çoklu-karşılaştırma düzeltmesiyle birlikte değerlendirilmelidir (ayrıntılı düzeltme kontrolü: §V-B).</w:t>
       </w:r>
     </w:p>
     <w:p>
@@ -3730,7 +3734,6 @@
           <w:b/>
           <w:i/>
         </w:rPr>
-        <w:lastRenderedPageBreak/>
         <w:t>C. Kök Neden Analizi</w:t>
       </w:r>
     </w:p>
@@ -3739,20 +3742,23 @@
         <w:jc w:val="both"/>
       </w:pPr>
       <w:r>
-        <w:t>17 başarısızlık 9 kök nedene ayrıştırılmıştır (Şekil 5, Tablo V): 8 kategoride (A-D, F-I) Rust kodu sözdizimsel olarak geçerlidir ve model, kaynağın özgül bit-genişliği/işaret</w:t>
-      </w:r>
-      <w:r>
-        <w:t>lilik/sarma/kontrol-akışı sözleşmesini korumak yerine hedef dilin idiyomatik varsayılanını seçmiştir. Tek istisna kategori E'dir: aynı türden bir birebir aktarım Rust'ın tip güvenliği tarafından derleme aşamasında engellenmiştir — 17 başarısızlığın tek CE'</w:t>
-      </w:r>
-      <w:r>
-        <w:t>si. Bu tanım ("derleyici uyarısı almadan geçme") teknik olarak savunulabilir olsa da tek katmanlıdır: 17 başarısızlığın 4'ü aslında çalışma zamanı panik'idir (RE) — gürültülü ve kolayca fark edilen bir çökmedir; gerçek anlamda sessiz olanlar yalnızca 12 FE</w:t>
-      </w:r>
-      <w:r>
-        <w:t xml:space="preserve">'dir (%70.6) — derlenir, çöküp panik vermeden çalışır, ama yanlış çıktı üretir. "Derleme aşamasında yakalanmamış" (%94.1) ve "çalışma zamanında da hiçbir sinyal </w:t>
+        <w:t>17 başarısızlık 9 kök nedene ayrıştırılmıştır (Şekil 5, Tablo V): 8 kategoride (A-D, F-I) Rust</w:t>
+      </w:r>
+      <w:r>
+        <w:t xml:space="preserve"> kodu sözdizimsel olarak geçerlidir ve model, kaynağın özgül bit-genişliği/işaretlilik/sarma/kontrol-akışı sözleşmesini korumak yerine hedef dilin idiyomatik varsayılanını seçmiştir. Tek istisna kategori E'dir: aynı türden bir birebir aktarım Rust'ın tip g</w:t>
+      </w:r>
+      <w:r>
+        <w:t xml:space="preserve">üvenliği tarafından derleme aşamasında engellenmiştir — 17 başarısızlığın tek CE'si. Bu tanım ("derleyici uyarısı almadan geçme") teknik olarak savunulabilir olsa da tek katmanlıdır: 17 başarısızlığın 4'ü aslında çalışma zamanı panik'idir (RE) — gürültülü </w:t>
+      </w:r>
+      <w:r>
+        <w:t xml:space="preserve">ve kolayca </w:t>
       </w:r>
       <w:r>
         <w:lastRenderedPageBreak/>
-        <w:t>üretmeden yanlış sonuç veren" (%70.6) biçiminde iki katmanlı bir çerçeveleme daha doğrudur.</w:t>
+        <w:t>fark edilen bir çökmedir; gerçek anlamda sessiz olanlar yalnızca 12 FE'dir (%70.6) — derlenir, çöküp panik vermeden çalışır, ama yanlış çıktı üretir. "Derleme aşamasında yakalanmamış" (%94.1) ve "çalışma zamanında da hiçbir sinyal üretmeden yanl</w:t>
+      </w:r>
+      <w:r>
+        <w:t>ış sonuç veren" (%70.6) biçiminde iki katmanlı bir çerçeveleme daha doğrudur.</w:t>
       </w:r>
     </w:p>
     <w:p>
@@ -3764,6 +3770,7 @@
           <w:noProof/>
           <w:lang w:val="tr-TR" w:eastAsia="tr-TR"/>
         </w:rPr>
+        <w:lastRenderedPageBreak/>
         <w:drawing>
           <wp:inline distT="0" distB="0" distL="0" distR="0">
             <wp:extent cx="3063240" cy="1545598"/>
@@ -3834,19 +3841,19 @@
           <w:sz w:val="17"/>
         </w:rPr>
         <w:lastRenderedPageBreak/>
-        <w:t>TABLO V. DOKUZ KÖK NEDEN VE TEMSİLİ ÖRNEKLER (s09,s14,s20 vb. veri setinin özgün ilk turundandır; s49,s51,s52,s53 hakem/danışman geri</w:t>
+        <w:t xml:space="preserve">TABLO V. DOKUZ KÖK NEDEN VE TEMSİLİ ÖRNEKLER </w:t>
       </w:r>
       <w:r>
         <w:rPr>
           <w:sz w:val="17"/>
         </w:rPr>
-        <w:t xml:space="preserve"> bildirimi doğrultusunda eklenen bağımsız 2. örneklerdir. † C ve F kategorilerinde "doğru" davranış referans platformun (Windows/LLP64) implementation-defined seçimine bağlıdır — bkz. §V-B. E kategorisinin ikinci örneği (s50) Round 1'de PASS olduğundan bir</w:t>
+        <w:t>(s09,s14,s20 vb. veri setinin özgün ilk turundandır; s49,s51,s52,s53 hakem ve danışman geri bildirimine yanıt olarak eklenen bağımsız 2. örneklerdir. † C ve F kategorilerinde "doğru" davranış referans platformun (Windows/LLP64) implementation-defined seçim</w:t>
       </w:r>
       <w:r>
         <w:rPr>
           <w:sz w:val="17"/>
         </w:rPr>
-        <w:t xml:space="preserve"> başarısızlık örneği olarak bu tabloda listelenmemiştir.)</w:t>
+        <w:t>ine bağlıdır — bkz. §V-B. E kategorisinin ikinci örneği (s50) Round 1'de PASS olduğundan bir başarısızlık örneği olarak burada listelenmemiştir.)</w:t>
       </w:r>
     </w:p>
     <w:tbl>
@@ -4026,7 +4033,13 @@
               <w:rPr>
                 <w:sz w:val="16"/>
               </w:rPr>
-              <w:t>Mod-2ⁿ sarma → panik-eden varsayılan aritmetik</w:t>
+              <w:t>Mod-2ⁿ sarma → panik-eden va</w:t>
+            </w:r>
+            <w:r>
+              <w:rPr>
+                <w:sz w:val="16"/>
+              </w:rPr>
+              <w:t>rsayılan aritmetik</w:t>
             </w:r>
           </w:p>
         </w:tc>
@@ -4105,13 +4118,7 @@
               <w:rPr>
                 <w:sz w:val="16"/>
               </w:rPr>
-              <w:t xml:space="preserve">Bayt-düzeyi C string → .chars() </w:t>
-            </w:r>
-            <w:r>
-              <w:rPr>
-                <w:sz w:val="16"/>
-              </w:rPr>
-              <w:t>(Unicode)</w:t>
+              <w:t>Bayt-düzeyi C string → .chars() (Unicode)</w:t>
             </w:r>
           </w:p>
         </w:tc>
@@ -4548,7 +4555,13 @@
               <w:rPr>
                 <w:sz w:val="16"/>
               </w:rPr>
-              <w:t>Switch fallthrough</w:t>
+              <w:t>Switch</w:t>
+            </w:r>
+            <w:r>
+              <w:rPr>
+                <w:sz w:val="16"/>
+              </w:rPr>
+              <w:t xml:space="preserve"> fallthrough</w:t>
             </w:r>
           </w:p>
         </w:tc>
@@ -4627,13 +4640,7 @@
               <w:rPr>
                 <w:sz w:val="16"/>
               </w:rPr>
-              <w:t xml:space="preserve">Makro </w:t>
-            </w:r>
-            <w:r>
-              <w:rPr>
-                <w:sz w:val="16"/>
-              </w:rPr>
-              <w:t>çoklu-değerlendirme</w:t>
+              <w:t>Makro çoklu-değerlendirme</w:t>
             </w:r>
           </w:p>
         </w:tc>
@@ -4698,13 +4705,13 @@
       </w:pPr>
       <w:r>
         <w:lastRenderedPageBreak/>
-        <w:t>Doğrulama iki farklı biçimde gerçekleşmiştir: (a) dört kategori (C, F, G, H) veri setimiz içinde bağımsız olarak tasarlanmış, farklı bir kod deseni kullanan ikinc</w:t>
-      </w:r>
-      <w:r>
-        <w:t xml:space="preserve">i bir örnekle (s49, s51, s52, s53) yeniden sınanmış ve kök neden her dördünde de tekrarlanmıştır (§IV-F); (b) kategori D üç ayrı, birbirinden bağımsız kod tabanında (iki kendi yazdığımız örnek + cJSON [8]) tekrarlanmış; kategori A ise veri setimizin kendi </w:t>
-      </w:r>
-      <w:r>
-        <w:t>içinde iki örnekte (s09, s14) görülmüştür. Bu ikisi birlikte, boşlukların veri setine özgü bir tuhaflık değil sistematik C↔Rust farkları olduğunu gösterir.</w:t>
+        <w:t xml:space="preserve">Doğrulama iki farklı biçimde gerçekleşmiştir: (a) dört kategori (C, F, G, H) veri </w:t>
+      </w:r>
+      <w:r>
+        <w:t xml:space="preserve">setimiz içinde bağımsız olarak tasarlanmış, farklı bir kod deseni kullanan ikinci bir örnekle (s49, s51, s52, s53) yeniden sınanmış ve kök neden her dördünde de tekrarlanmıştır (§IV-F); (b) kategori D üç ayrı, birbirinden bağımsız kod tabanında (iki kendi </w:t>
+      </w:r>
+      <w:r>
+        <w:t>yazdığımız örnek + cJSON [8]) tekrarlanmış; kategori A ise veri setimizin kendi içinde iki örnekte (s09, s14) görülmüştür. Bu ikisi birlikte, boşlukların veri setine özgü bir tuhaflık değil sistematik C↔Rust farkları olduğunu gösterir.</w:t>
       </w:r>
     </w:p>
     <w:p>
@@ -4716,7 +4723,14 @@
           <w:b/>
           <w:i/>
         </w:rPr>
-        <w:t>D. Derleme Modu ve İyileştirme Döngüsünün Etkisi</w:t>
+        <w:t>D. Derleme Modu ve İ</w:t>
+      </w:r>
+      <w:r>
+        <w:rPr>
+          <w:b/>
+          <w:i/>
+        </w:rPr>
+        <w:t>yileştirme Döngüsünün Etkisi</w:t>
       </w:r>
     </w:p>
     <w:p>
@@ -4725,16 +4739,13 @@
       </w:pPr>
       <w:r>
         <w:lastRenderedPageBreak/>
-        <w:t>Release modu EA'yı %70.18'den %73.68'e çıkarır; art</w:t>
-      </w:r>
-      <w:r>
-        <w:t>ışın tamamı iki RE örneğinin (s09, s14, unsigned taşma) sessizce sarmasından gelir — bir düzeltme değil, farklı yapılandırmada tesadüfen doğru sonuçtur; 12 FE'nin hiçbirini etkilemez. Round 2'de (zengin/oracle geri bildirim, yalnızca Claude üzerinde ölçülm</w:t>
-      </w:r>
-      <w:r>
-        <w:t>üştür) EA %100'e ulaşır, ama bu bir üst sınırdır: Tablo VI, Round 1'de başarısız olan aynı 17 örneğin yeniden çevrilip 57 programlık tam veri setinin geri kalanıyla birlikte yeniden değerlendirilmesiyle hesaplanan EA'yı gösterir — kısıtlı geri bildirim sev</w:t>
-      </w:r>
-      <w:r>
-        <w:t>iyelerinde doğruluğun %86.0'a (Seviye B) ve %71.9'a (Seviye C, yalnızca başarısız test sayısı) düştüğünü ortaya koyar.</w:t>
+        <w:t>Release modu EA'yı %70.18'den %73.68'e çıkarır; artışın tamamı iki RE örneğinin (s09, s14, unsigned taşma) sessizce sarmasından gelir — bir düzeltme değil, farklı yapılandırmada tesadüfen doğru sonuçtur; 12 FE'nin hiçbirini etk</w:t>
+      </w:r>
+      <w:r>
+        <w:t>ilemez. Round 2'de (zengin/oracle geri bildirim, yalnızca Claude üzerinde ölçülmüştür) EA %100'e ulaşır, ama bu bir üst sınırdır: Tablo VI, Round 1'de başarısız olan aynı 17 örneğin yeniden çevrilip 57 programlık tam veri setinin geri kalanıyla birlikte ye</w:t>
+      </w:r>
+      <w:r>
+        <w:t>niden değerlendirilmesiyle hesaplanan EA'yı gösterir — kısıtlı geri bildirim seviyelerinde doğruluğun %86.0'a (Seviye B) ve %71.9'a (Seviye C, yalnızca başarısız test sayısı) düştüğünü ortaya koyar.</w:t>
       </w:r>
     </w:p>
     <w:p>
@@ -4758,13 +4769,13 @@
           <w:sz w:val="17"/>
         </w:rPr>
         <w:lastRenderedPageBreak/>
-        <w:t>TABLO VI. ÜÇ GERİ BİLDİRİM SEVİYESİNİN KARŞILAŞTIRMASI, CLAUDE (n=57; yalnızca Round 1'de başarısız olan 17 örn</w:t>
+        <w:t>TABLO VI. ÜÇ GERİ BİLDİRİM SEVİ</w:t>
       </w:r>
       <w:r>
         <w:rPr>
           <w:sz w:val="17"/>
         </w:rPr>
-        <w:t>ek yeniden çevrilmiş, EA tüm 57 program üzerinden yeniden hesaplanmıştır).</w:t>
+        <w:t>YESİNİN KARŞILAŞTIRMASI, CLAUDE (n=57; yalnızca Round 1'de başarısız olan 17 örnek yeniden çevrilmiş, EA tüm 57 program üzerinden yeniden hesaplanmıştır).</w:t>
       </w:r>
     </w:p>
     <w:tbl>
@@ -4926,7 +4937,13 @@
               <w:rPr>
                 <w:sz w:val="16"/>
               </w:rPr>
-              <w:t>B (CI-benzeri)</w:t>
+              <w:t xml:space="preserve">B </w:t>
+            </w:r>
+            <w:r>
+              <w:rPr>
+                <w:sz w:val="16"/>
+              </w:rPr>
+              <w:t>(CI-benzeri)</w:t>
             </w:r>
           </w:p>
         </w:tc>
@@ -5069,14 +5086,14 @@
         <w:t>leyici olduğunu burada da doğrular. Bellek güvenliği tarafında, Claude'un ürettiği 74 farklı çeviriden (57 Round 1 + Round 2'de yeniden çevrilen 17 örnek; Round 2 yalnızca Round 1'de başarısız olan örnekleri kapsadığından geri kalan 40 "Round 2 dosyası" Ro</w:t>
       </w:r>
       <w:r>
-        <w:t xml:space="preserve">und 1'in birebir kopyasıdır) yalnızca 4'ü (%5.4) unsafe içerir: s37_bsd_getopt, s44_fib_memo_static, s46_musl_qsort ve s50_id_generator. Dördü de Round 1'de PASS olduğundan Round 2'de yeniden </w:t>
+        <w:t>und 1'in birebir kopyasıdır) yalnızca 4'ü (%5.4) unsafe içerir: s37_bsd_getopt, s44_fib_memo_static, s46_musl_qsort ve s50_id_generator. Dördü de Round 1'de PASS olduğundan Round 2'de yeniden çevrilmemiştir. Kategori E, aynı model tarafından iki farklı biç</w:t>
+      </w:r>
+      <w:r>
+        <w:t xml:space="preserve">imde çözülmüştür: kategorinin ikinci örneği olan s50_id_generator'da model `unsafe` bloğunu doğru biçimde </w:t>
       </w:r>
       <w:r>
         <w:lastRenderedPageBreak/>
-        <w:t>çevrilmemiştir. Kategori E, aynı model tarafından iki farklı biç</w:t>
-      </w:r>
-      <w:r>
-        <w:t xml:space="preserve">imde çözülmüştür: kategorinin ikinci örneği olan s50_id_generator'da model `unsafe` bloğunu doğru biçimde ekleyerek ilk seferde PASS olurken, ilk örnek olan s19_global_counter Round 2'de `unsafe` </w:t>
+        <w:t xml:space="preserve">ekleyerek ilk seferde PASS olurken, ilk örnek olan s19_global_counter Round 2'de `unsafe` </w:t>
       </w:r>
       <w:r>
         <w:rPr>
@@ -5103,7 +5120,6 @@
           <w:b/>
           <w:i/>
         </w:rPr>
-        <w:lastRenderedPageBreak/>
         <w:t>F. Çoklu-Model Karşılaştırması (Gemini)</w:t>
       </w:r>
     </w:p>
@@ -5124,17 +5140,21 @@
         <w:t>aynı</w:t>
       </w:r>
       <w:r>
-        <w:t xml:space="preserve"> 57 program üzerinde ölçüldüğü için eşleştirilmiş (paired) bir tasarıma uygun McNemar testiyle sınandığında istatistiksel olarak anlamlıdır (yalnızca Claude'un başarısı</w:t>
-      </w:r>
-      <w:r>
-        <w:t xml:space="preserve">z olduğu 14 örnek vs. yalnızca Gemini'nin başarısız olduğu 3 örnek; McNemar kesin iki-yönlü p=0.013). Ancak Tablo VII'deki kategori-bazlı </w:t>
+        <w:t xml:space="preserve"> 57 program üzerinde ölçüldüğü için eşleştirilmiş (paired) </w:t>
       </w:r>
       <w:r>
         <w:lastRenderedPageBreak/>
-        <w:t>kırılım, bu genel farkın tekdüze değil kategoriye özgü olduğunu ve yön değiştirebildiğini gösterir — genel anlamlılık,</w:t>
-      </w:r>
-      <w:r>
-        <w:t xml:space="preserve"> model×kategori etkileşiminin yokluğu anlamına gelmez. Ayrıca Gemini'nin 6 başarısızlığının 4'ü (s26, s46, s48'in yanı sıra s27) CE'dir, yani derleyici tarafından yakalanmıştır — Claude'da gözlenen "başarısızlıkların çoğu sessizdir" örüntüsü Gemini için ay</w:t>
+        <w:t>bir tasarıma uygun McNemar testiyle sınandığında istatistiksel olarak anlamlıdır (yalnızca Claude'un başarısı</w:t>
+      </w:r>
+      <w:r>
+        <w:t>z olduğu 14 örnek vs. yalnızca Gemini'nin başarısız olduğu 3 örnek; McNemar kesin iki-yönlü p=0.013). Ancak Tablo VII'deki kategori-bazlı kırılım, bu genel farkın tekdüze değil kategoriye özgü olduğunu ve yön değiştirebildiğini gösterir — genel anlamlılık,</w:t>
+      </w:r>
+      <w:r>
+        <w:t xml:space="preserve"> </w:t>
+      </w:r>
+      <w:r>
+        <w:lastRenderedPageBreak/>
+        <w:t>model×kategori etkileşiminin yokluğu anlamına gelmez. Ayrıca Gemini'nin 6 başarısızlığının 4'ü (s26, s46, s48'in yanı sıra s27) CE'dir, yani derleyici tarafından yakalanmıştır — Claude'da gözlenen "başarısızlıkların çoğu sessizdir" örüntüsü Gemini için ay</w:t>
       </w:r>
       <w:r>
         <w:t>nı güçte geçerli değildir; sessiz hata oranı modele göre değişir.</w:t>
@@ -5855,11 +5875,7 @@
         <w:t>la ilgilidir: modelin ürettiği kod, bir yığın (stack) işaretçisini iki ayrı `FnMut` kapanışının (closure) aynı anda değiştirilebilir biçimde yakalamasından kaynaklanan bir ödünç denetleyicisi (borrow checker) hatası (E0499) içerir. Claude'un aynı algoritma</w:t>
       </w:r>
       <w:r>
-        <w:t xml:space="preserve">yı çevirirken kapanış kullanmayan farklı bir kontrol akışı seçmesi nedeniyle bu hataya hiç maruz kalmamıştır. Bu üç başarısızlığın ikisi derleme hatası (s46, s26), biri fonksiyonel hatadır (s47); kökene bakıldığında ise </w:t>
-      </w:r>
-      <w:r>
-        <w:lastRenderedPageBreak/>
-        <w:t>ikisi (s46, s47) kod karmaşıklığına,</w:t>
+        <w:t>yı çevirirken kapanış kullanmayan farklı bir kontrol akışı seçmesi nedeniyle bu hataya hiç maruz kalmamıştır. Bu üç başarısızlığın ikisi derleme hatası (s46, s26), biri fonksiyonel hatadır (s47); kökene bakıldığında ise ikisi (s46, s47) kod karmaşıklığına,</w:t>
       </w:r>
       <w:r>
         <w:t xml:space="preserve"> biri (s26) modelin kendi hata profiline bağlıdır. Bu, "tek bir kök neden taksonomisinin tüm modellere aynı biçimde uygulanamayabileceğini" gösterir.</w:t>
@@ -5870,6 +5886,7 @@
         <w:jc w:val="both"/>
       </w:pPr>
       <w:r>
+        <w:lastRenderedPageBreak/>
         <w:t>Her iki modelin de başarısız olduğu üç örnek de vardır: s15 (kategori D, çıktı biçimlendirme) her iki mode</w:t>
       </w:r>
       <w:r>
@@ -5902,7 +5919,7 @@
         <w:t>üşümü yapmaz; bu da C referans programının kendisinin (Rust çevirisinin değil) iki platformda farklı sayıda komut tükettiği anlamına gelir. Yani "hata geri bildirimiyle düzeltilmiş bir çeviri evrensel doğrudur" varsayımı yanlış olabileceği gibi, referans C</w:t>
       </w:r>
       <w:r>
-        <w:t xml:space="preserve"> programının kendisi de platformlar arası tam taşınabilir olmayabilir (ayrıntı: §III-F).</w:t>
+        <w:t xml:space="preserve"> programının kendisi de platformlar arası tam taşınabilir olmayabilir.</w:t>
       </w:r>
     </w:p>
     <w:p>
@@ -5935,26 +5952,26 @@
         <w:jc w:val="both"/>
       </w:pPr>
       <w:r>
-        <w:t>Bu çalışmanın merkezi bulgusu, incelenen modellerin (Claude, Gemini) ürettiği C→Rust çevirilerinde asıl riskin sözdi</w:t>
-      </w:r>
-      <w:r>
-        <w:t xml:space="preserve">zimsel </w:t>
+        <w:t>Bu çalışmanın merkezi bulgusu, incelenen modellerin (Claude, Gemini) ürettiği C→Rust çevirilerinde asıl riskin sözdizimsel değil sessi</w:t>
+      </w:r>
+      <w:r>
+        <w:t>z semantik hatalar olduğudur; Claude'da 17 başarısızlığın 16'sı derleyiciden hiç uyarı almadan geçmiştir. İkinci gözlem, derleme yapılandırmasının (debug/release) ve dağıtım platformunun (Windows/Linux) gizli birer değişken olduğudur — aynı kod farklı yapı</w:t>
+      </w:r>
+      <w:r>
+        <w:t xml:space="preserve">landırmada farklı sonuç verebilir. Üçüncü, bu çalışmaya özgü en yeni gözlem: iki bağımsız modelin karşılaştırması, "model A, model B'den genel </w:t>
       </w:r>
       <w:r>
         <w:lastRenderedPageBreak/>
-        <w:t>değil sessiz semantik hatalar olduğudur; Claude'da 17 başarısızlığın 16'sı derleyiciden hiç uyarı almadan geçmiştir. İkinci gözlem, derleme yapılandırmasının (debug/release) ve dağıtım platformunun (Windows/Linux) gizli birer değişken olduğudur — ay</w:t>
-      </w:r>
-      <w:r>
-        <w:t>nı kod farklı yapılandırmada farklı sonuç verebilir. Üçüncü, bu çalışmaya özgü en yeni gözlem: iki bağımsız modelin karşılaştırması, "model A, model B'den genel olarak daha iyidir" biçiminde tek boyutlu bir sıralamanın yanıltıcı olduğunu gösterir (genel EA</w:t>
-      </w:r>
-      <w:r>
-        <w:t xml:space="preserve"> farkı McNemar testiyle anlamlı olsa da, p=0.013, §IV-F). Gemini kısa, hedeflenmiş sızıntı kategorilerinde (kök-neden 2. örnekler, 5/5) Claude'dan (1/5) belirgin biçimde daha dayanıklıyken, uzun/karmaşık gerçek üretim kodunda (0/3) Claude'dan (2/3) belirgi</w:t>
-      </w:r>
-      <w:r>
-        <w:t>n biçimde daha kırılgandır. Bu, model seçiminin kod tabanının niteliğine (kısa/izole algoritma mı, uzun/karmaşık üretim kodu mu) göre yapılması gerektiğini düşündürür. Dördüncü gözlem: kod uzunluğu ile başarı arasında istatistiksel olarak anlamlı bir ilişk</w:t>
-      </w:r>
-      <w:r>
-        <w:t>i bulunmamıştır (p=0.359) — semantik karmaşıklık, ham uzunluktan daha belirleyici görünmektedir.</w:t>
+        <w:t>olarak daha iyidir" biçiminde tek boyutlu bir sıralamanın yanıltıcı olduğunu gösterir (genel EA farkı McNemar tes</w:t>
+      </w:r>
+      <w:r>
+        <w:t>tiyle anlamlı olsa da, p=0.013, §IV-F). Gemini kısa, hedeflenmiş sızıntı kategorilerinde (kök-neden 2. örnekler, 5/5) Claude'dan (1/5) belirgin biçimde daha dayanıklıyken, uzun/karmaşık gerçek üretim kodunda (0/3) Claude'dan (2/3) belirgin biçimde daha kır</w:t>
+      </w:r>
+      <w:r>
+        <w:t>ılgandır. Bu, model seçiminin kod tabanının niteliğine (kısa/izole algoritma mı, uzun/karmaşık üretim kodu mu) göre yapılması gerektiğini düşündürür. Dördüncü gözlem: kod uzunluğu ile başarı arasında istatistiksel olarak anlamlı bir ilişki bulunmamıştır (p</w:t>
+      </w:r>
+      <w:r>
+        <w:t>=0.359) — semantik karmaşıklık, ham uzunluktan daha belirleyici görünmektedir.</w:t>
       </w:r>
     </w:p>
     <w:p>
@@ -5974,50 +5991,50 @@
         <w:jc w:val="both"/>
       </w:pPr>
       <w:r>
-        <w:t>İç geçerlilik: test girdileri elle seçilmiş, ancak referans çıktılar C programı çalıştırılarak otomatik üretilmiştir. Girdi kümesinin sınır dur</w:t>
-      </w:r>
-      <w:r>
-        <w:t>umları (taşma sınırları, boş girdi, çok baytlı UTF-8) ne ölçüde kapsadığına dair sistematik bir kapsam (coverage) ölçümü (ör. gcov satır/dal kapsaması) yapılmamıştır. Bu, özellikle 522 satırlık s47_redis_sds gibi uzun örneklerde yalnızca 4-5 test girdisiyl</w:t>
-      </w:r>
-      <w:r>
-        <w:t>e "PASS" denmesinin davranışsal eşdeğerlik için ne kadar güçlü bir kanıt olduğunu sınırlar. C referansı her koşulda `-O2` ile derlenirken Rust tarafı debug/release olarak ikiye ayrılmıştır; bu asimetri bilinçli bir tasarım kararıdır (amaç C'nin değil Rust'</w:t>
-      </w:r>
-      <w:r>
-        <w:t>ın taşma davranışının etkisini izole etmektir), ama C tarafının farklı optimizasyon seviyelerinde tekrarlanması ayrı bir sağlamlık kontrolü olurdu. Örnekleme protokolü: her örnek her model tarafından yalnızca bir kez (k=1) çevrilmiştir; LLM çıktısının stok</w:t>
-      </w:r>
-      <w:r>
-        <w:t>astik doğası nedeniyle tekrar sayısı k=3-5 olsaydı pass@1/pass@k ile daha güvenilir bir tahmin elde edilebilirdi. Bu, çalışmanın tek-örneklemli tasarımının en önemli metodolojik sınırlamasıdır. İstatistiksel geçerlilik: FAIL grubu küçüktür (n=17); duyarlıl</w:t>
-      </w:r>
-      <w:r>
-        <w:t>ık analizi (§IV-B), bu n ile %80 güçte yalnızca orta-büyük etkilerin (|r|≳0.46) saptanabileceğini göstermiştir. Aynı küçük veri seti üzerinde üç çıkarımsal test uygulanmıştır (Mann-Whitney, Fisher, McNemar); bunlar keşif amaçlı (exploratory) okunmalı, doğr</w:t>
-      </w:r>
-      <w:r>
-        <w:t>ulayıcı (confirmatory) bulgular olarak yorumlanmamalıdır. Tamamlayıcı bir kontrol olarak Bonferroni düzeltmesi bu üçüne uygulandığında (α=0.05/3≈0.0167), yalnızca McNemar testi (p=0.013) anlamlılığını korumaktadır — Mann-Whitney (p=0.359) ve Fisher (p=0.38</w:t>
-      </w:r>
-      <w:r>
-        <w:t>5) zaten düzeltmesiz haliyle de anlamlı değildir; dolayısıyla düzeltme, çalışmanın yorumunu değiştirmez. Dış geçerlilik: veri seti 57 program/229 girdiyle sınırlıdır; gözlenen oranlar büyük, çok dosyalı endüstriyel kod tabanlarına doğrudan genellenemez. Ge</w:t>
-      </w:r>
-      <w:r>
-        <w:t>mini ölçümü 57/57 tamamlanmış olsa da, GPT-4o/DeepSeek adaptörleri yazılmış ama API erişimi olmadığından çalıştırılamamıştır. Çoklu-model bulgusu iki modelle sınırlıdır ve daha fazla modelle doğrulanmalıdır. Yapı geçerliliği: EA yalnızca verilen girdilerde</w:t>
-      </w:r>
-      <w:r>
-        <w:t xml:space="preserve"> gözlenen davranışsal eşdeğerliği ölçer, biçimsel doğrulama sağlamaz. Round 2/Seviye A geri bildirimi modele beklenen/alınan çıktı farkını (oracle) verdiğinden, ölçülen %100 yalnızca GÖRÜLEN test girdilerine karşı bir üst sınırdır. Düzeltmelerin görülmemiş</w:t>
-      </w:r>
-      <w:r>
-        <w:t xml:space="preserve"> (held-out) girdilerle ayrıca doğrulanması yapılmamıştır ve bu, düşük maliyetli ama önemli bir gelecek çalışma adımıdır. Dış değerlendirici etkisi: veri setinin 44/57'si bilinen boşlukları hedefleyecek şekilde tarafımızca tasarlanmıştır; bunu </w:t>
+        <w:t>İç geçerlilik: test girdileri elle seçilmiş, ancak referans çıktılar C programı çalıştırılarak otomatik üretilmiştir. Girdi kümesinin sınır durumları (taşma sını</w:t>
+      </w:r>
+      <w:r>
+        <w:t>rları, boş girdi, çok baytlı UTF-8) ne ölçüde kapsadığına dair sistematik bir kapsam (coverage) ölçümü (ör. gcov satır/dal kapsaması) yapılmamıştır. Bu, özellikle 522 satırlık s47_redis_sds gibi uzun örneklerde yalnızca 4-5 test girdisiyle "PASS" denmesini</w:t>
+      </w:r>
+      <w:r>
+        <w:t>n davranışsal eşdeğerlik için ne kadar güçlü bir kanıt olduğunu sınırlar. C referansı her koşulda `-O2` ile derlenirken Rust tarafı debug/release olarak ikiye ayrılmıştır; bu asimetri bilinçli bir tasarım kararıdır (amaç C'nin değil Rust'ın taşma davranışı</w:t>
+      </w:r>
+      <w:r>
+        <w:t>nın etkisini izole etmektir), ama C tarafının farklı optimizasyon seviyelerinde tekrarlanması ayrı bir sağlamlık kontrolü olurdu. Örnekleme protokolü: her örnek her model tarafından yalnızca bir kez (k=1) çevrilmiştir; LLM çıktısının stokastik doğası neden</w:t>
+      </w:r>
+      <w:r>
+        <w:t>iyle tekrar sayısı k=3-5 olsaydı pass@1/pass@k ile daha güvenilir bir tahmin elde edilebilirdi. Bu, çalışmanın tek-örneklemli tasarımının en önemli metodolojik sınırlamasıdır. İstatistiksel geçerlilik: FAIL grubu küçüktür (n=17); duyarlılık analizi (§IV-B)</w:t>
+      </w:r>
+      <w:r>
+        <w:t>, bu n ile %80 güçte yalnızca orta-büyük etkilerin (|r|≳0.46) saptanabileceğini göstermiştir. Aynı küçük veri seti üzerinde üç çıkarımsal test uygulanmıştır (Mann-Whitney, Fisher, McNemar); bunlar keşif amaçlı (exploratory) okunmalı, doğrulayıcı (confirmat</w:t>
+      </w:r>
+      <w:r>
+        <w:t>ory) bulgular olarak yorumlanmamalıdır. Tamamlayıcı bir kontrol olarak Bonferroni düzeltmesi bu üçüne uygulandığında (α=0.05/3≈0.0167), yalnızca McNemar testi (p=0.013) anlamlılığını korumaktadır — Mann-Whitney (p=0.359) ve Fisher (p=0.385) zaten düzeltmes</w:t>
+      </w:r>
+      <w:r>
+        <w:t xml:space="preserve">iz haliyle de anlamlı değildir; dolayısıyla düzeltme, çalışmanın yorumunu değiştirmez. Dış geçerlilik: veri seti 57 program/229 girdiyle sınırlıdır; gözlenen oranlar büyük, çok dosyalı endüstriyel kod tabanlarına doğrudan genellenemez. Gemini ölçümü 57/57 </w:t>
+      </w:r>
+      <w:r>
+        <w:t>tamamlanmış olsa da, GPT-4o/DeepSeek adaptörleri yazılmış ama API erişimi olmadığından çalıştırılamamıştır. Çoklu-model bulgusu iki modelle sınırlıdır ve daha fazla modelle doğrulanmalıdır. Yapı geçerliliği: EA yalnızca verilen girdilerde gözlenen davranış</w:t>
+      </w:r>
+      <w:r>
+        <w:t>sal eşdeğerliği ölçer, biçimsel doğrulama sağlamaz. Round 2/Seviye A geri bildirimi modele beklenen/alınan çıktı farkını (oracle) verdiğinden, ölçülen %100 yalnızca GÖRÜLEN test girdilerine karşı bir üst sınırdır. Düzeltmelerin görülmemiş (held-out) girdil</w:t>
+      </w:r>
+      <w:r>
+        <w:t xml:space="preserve">erle ayrıca doğrulanması yapılmamıştır ve bu, düşük maliyetli ama önemli bir gelecek çalışma adımıdır. Dış değerlendirici etkisi: veri setinin 44/57'si bilinen boşlukları hedefleyecek şekilde tarafımızca tasarlanmıştır; bunu dengeleyen 13 bağımsız örneğin </w:t>
+      </w:r>
+      <w:r>
+        <w:t>11'i geçmiştir, ama bu alt küme küçüktür. Son olarak, depo tam olarak yerel/GitHub'da mevcuttur ama kalıcı bir Zenodo/figshare DOI'si henüz atanmamıştır; bu, "tümüyle tekrarlanabilir" iddiasını uzun vadeli erişilebilirlik açısından zayıflatan bir eksiklikt</w:t>
+      </w:r>
+      <w:r>
+        <w:t xml:space="preserve">ir. Kategori C ve F'de "doğru davranış" referans platformun implementation-defined seçimine göredir; bu iki kategori </w:t>
       </w:r>
       <w:r>
         <w:lastRenderedPageBreak/>
-        <w:t>dengeleyen 13</w:t>
-      </w:r>
-      <w:r>
-        <w:t xml:space="preserve"> bağımsız örneğin 11'i geçmiştir, ama bu alt küme küçüktür. Son olarak, depo tam olarak yerel/GitHub'da mevcuttur ama kalıcı bir Zenodo/figshare DOI'si henüz atanmamıştır; bu, "tümüyle tekrarlanabilir" iddiasını uzun vadeli erişilebilirlik açısından zayıfl</w:t>
-      </w:r>
-      <w:r>
-        <w:t>atan bir eksikliktir. Kategori C ve F'de "doğru davranış" referans platformun implementation-defined seçimine göredir; bu iki kategori platformdan bağımsız bir kök neden değil, referans platformun (Windows/LLP64) bir artefaktı olarak okunmalıdır. Claude'un</w:t>
-      </w:r>
-      <w:r>
-        <w:t xml:space="preserve"> `i64` seçimi Linux/LP64'te doğru olurdu (§IV-F). Model×kategori etkileşiminin varlığı istatistiksel olarak test edilmemiştir (ör. lojistik regresyonda model×kategori terimi veya Breslow-Day homojenlik testi); Tablo VII'deki kırılım betimsel düzeydedir.</w:t>
+        <w:t>platformdan bağımsız bir kök neden değil, referans platformun (Windows/LLP64) bir artefaktı olarak okunmalıdır. Claude'un `i64` seçimi Linu</w:t>
+      </w:r>
+      <w:r>
+        <w:t>x/LP64'te doğru olurdu (§IV-F). Model×kategori etkileşiminin varlığı istatistiksel olarak test edilmemiştir (ör. lojistik regresyonda model×kategori terimi veya Breslow-Day homojenlik testi); Tablo VII'deki kırılım betimsel düzeydedir.</w:t>
       </w:r>
     </w:p>
     <w:p>
@@ -6029,14 +6046,7 @@
           <w:b/>
           <w:i/>
         </w:rPr>
-        <w:t>C.</w:t>
-      </w:r>
-      <w:r>
-        <w:rPr>
-          <w:b/>
-          <w:i/>
-        </w:rPr>
-        <w:t xml:space="preserve"> Öneriler</w:t>
+        <w:t>C. Öneriler</w:t>
       </w:r>
     </w:p>
     <w:p>
@@ -6044,22 +6054,22 @@
         <w:jc w:val="both"/>
       </w:pPr>
       <w:r>
-        <w:t>İncelenen en iyi modelde bile (Gemini, %89.47) 57 programın 6'sında sessiz veya gürültülü bir hata kalması, doğrulama ve iteratif düzeltmenin LLM destekli kod çevirisi araç zincirlerinde isteğe bağlı değil zorunlu olması gerektiğini gösterir. Mod</w:t>
-      </w:r>
-      <w:r>
-        <w:t>el×kategori etkileşimi bulgusu, tek bir "en iyi model" aramak yerine, kod tabanının niteliğine göre model seçimi veya çoklu-model oylaması (ensemble) stratejilerinin araştırılmasını önermektedir. Somut olarak: (i) derleme başarısı kabul kriteri olarak yete</w:t>
-      </w:r>
-      <w:r>
-        <w:t>rli değildir, diferansiyel test veya eşdeğeri bir yürütme tabanlı doğrulama adımı zorunlu tutulmalıdır; (ii) dokuz kök-neden kategorisi (Tablo V), otomatik bir statik analiz/lint kuralı setine dönüştürülüp derleme hattına eklenebilir — özellikle unsigned a</w:t>
-      </w:r>
-      <w:r>
-        <w:t>ritmetik, char işaretliliği ve çıktı biçimlendirme gibi derleyicinin doğası gereği yakalayamadığı kategoriler için; (iii) uzun/karmaşık gerçek üretim kodu çevrilirken, bu çalışmada bu kategoride daha dayanıklı bulunan modelin (Claude) tercih edilmesi, kısa</w:t>
-      </w:r>
-      <w:r>
-        <w:t xml:space="preserve"> izole yardımcı fonksiyonlarda ise her iki modelin de kabul edilebilir olduğu göz önünde bulundurulabilir — ancak bu öneri yalnızca iki model ve 57 örneklik bir veri setine dayanır ve daha geniş bir model/veri setiyle doğrulanmadan genel bir kural olarak b</w:t>
-      </w:r>
-      <w:r>
-        <w:t>enimsenmemelidir.</w:t>
+        <w:t>İncelene</w:t>
+      </w:r>
+      <w:r>
+        <w:t>n en iyi modelde bile (Gemini, %89.47) 57 programın 6'sında sessiz veya gürültülü bir hata kalması, doğrulama ve iteratif düzeltmenin LLM destekli kod çevirisi araç zincirlerinde isteğe bağlı değil zorunlu olması gerektiğini gösterir. Model×kategori etkile</w:t>
+      </w:r>
+      <w:r>
+        <w:t>şimi bulgusu, tek bir "en iyi model" aramak yerine, kod tabanının niteliğine göre model seçimi veya çoklu-model oylaması (ensemble) stratejilerinin araştırılmasını önermektedir. Somut olarak: (i) derleme başarısı kabul kriteri olarak yeterli değildir, dife</w:t>
+      </w:r>
+      <w:r>
+        <w:t>ransiyel test veya eşdeğeri bir yürütme tabanlı doğrulama adımı zorunlu tutulmalıdır; (ii) dokuz kök-neden kategorisi (Tablo V), otomatik bir statik analiz/lint kuralı setine dönüştürülüp derleme hattına eklenebilir — özellikle unsigned aritmetik, char işa</w:t>
+      </w:r>
+      <w:r>
+        <w:t>retliliği ve çıktı biçimlendirme gibi derleyicinin doğası gereği yakalayamadığı kategoriler için; (iii) uzun/karmaşık gerçek üretim kodu çevrilirken, bu çalışmada bu kategoride daha dayanıklı bulunan modelin (Claude) tercih edilmesi, kısa izole yardımcı fo</w:t>
+      </w:r>
+      <w:r>
+        <w:t>nksiyonlarda ise her iki modelin de kabul edilebilir olduğu göz önünde bulundurulabilir — ancak bu öneri yalnızca iki model ve 57 örneklik bir veri setine dayanır ve daha geniş bir model/veri setiyle doğrulanmadan genel bir kural olarak benimsenmemelidir.</w:t>
       </w:r>
     </w:p>
     <w:p>
@@ -6080,22 +6090,46 @@
         <w:jc w:val="both"/>
       </w:pPr>
       <w:r>
-        <w:t>Bu çalışma, iki bağımsız LLM'in (Claude Sonnet 5, Google Gemini) ürettiği zero-shot C→Rust çevirilerinin yürütme doğruluğunu, 57 programlık özgün bir kıyaslama setinde (13'ü bağımsız gerçek dünya kodu) diferansiyel test ile ölçm</w:t>
-      </w:r>
-      <w:r>
-        <w:t>üştür. Claude'un ham doğruluğu %70.18'de kalmış, başarısızlıkların %94'ü derleyiciden hiç uyarı almadan, %70.6'sı çalışma zamanında da hiçbir sinyal üretmeden geçmiştir; Gemini'nin (57/57, tamamı) doğruluğu %89.47 olmuştur. Kök neden analizi hataları dokuz</w:t>
-      </w:r>
-      <w:r>
-        <w:t xml:space="preserve"> tekrar eden C↔Rust semantik boşluğuna ayırmıştır; model×kategori karşılaştırması, hiçbir modelin diğerinden tekdüze biçimde üstün olmadığını, aksine Gemini'nin kısa hedeflenmiş kategorilerde (5/5) Claude'dan (1/5) daha dayanıklı, uzun gerçek üretim kodund</w:t>
-      </w:r>
-      <w:r>
-        <w:t>a (0/3) Claude'dan (2/3) daha kırılgan olduğunu göstermiştir — literatürde az rastlanan, doğrudan ölçülmüş bir bulgudur. Sessiz hata oranı da model-özgüdür: Claude'un başarısızlıklarının %94'ü derleyiciden hiç uyarı almadan geçerken, Gemini'nin başarısızlı</w:t>
-      </w:r>
-      <w:r>
-        <w:t>klarının yalnızca üçte biri (%33) sessizdir — kalan üçte ikisi derleme aşamasında yakalanmıştır. Hata geri bildirimine dayalı bir iyileştirme döngüsü Claude'da doğruluğu %100'e taşımıştır, ama bu rakam bir üst sınırdır; kısıtlı geri bildirim koşulları doğr</w:t>
-      </w:r>
-      <w:r>
-        <w:t>uluğu %71.9-86.0 arasına düşürmüştür. Gelecek çalışmalar, GPT-4o/DeepSeek dahil daha geniş bir model havuzunu, daha büyük bir veri setini ve model-seçim/ensemble stratejilerini hedefleyebilir.</w:t>
+        <w:t>Bu çalışma, iki bağımsız LLM'in (Claude Sonnet 5, Google Gemini) ürettiği zero-shot C→Rust çevirilerinin yürütme doğruluğunu, 57 programlık özgün bir kıyaslama setinde (13'ü bağımsız gerçek dünya kodu) diferansiyel test ile ölçmüştür. Claude'un h</w:t>
+      </w:r>
+      <w:r>
+        <w:t>am doğruluğu %70.18'de kalmış, başarısızlıkların %94'ü derleyiciden hiç uyarı almadan, %70.6'sı çalışma zamanında da hiçbir sinyal üretmeden geçmiştir; Gemini'nin (57/57, tamamı) doğruluğu %89.47 olmuştur. Kök neden analizi hataları dokuz tekrar eden C↔Rus</w:t>
+      </w:r>
+      <w:r>
+        <w:t>t semantik boşluğuna ayırmıştır; model×kategori karşılaştırması, hiçbir modelin diğerinden tekdüze biçimde üstün olmadığını, aksine Gemini'nin kısa hedeflenmiş kategorilerde (5/5) Claude'dan (1/5) daha dayanıklı, uzun gerçek üretim kodunda (0/3) Claude'dan</w:t>
+      </w:r>
+      <w:r>
+        <w:t xml:space="preserve"> (2/3) daha kırılgan olduğunu göstermiştir — literatürde az rastlanan, doğrudan ölçülmüş bir bulgudur. Sessiz hata oranı da model-özgüdür: Claude'un başarısızlıklarının %94'ü derleyiciden hiç uyarı almadan geçerken, Gemini'nin başarısızlıklarının yalnızca </w:t>
+      </w:r>
+      <w:r>
+        <w:t>üçte biri (%33) sessizdir — kalan üçte ikisi derleme aşamasında yakalanmıştır. Hata geri bildirimine dayalı bir iyileştirme döngüsü Claude'da doğruluğu %100'e taşımıştır, ama bu rakam bir üst sınırdır; kısıtlı geri bildirim koşulları doğruluğu %71.9-86.0 a</w:t>
+      </w:r>
+      <w:r>
+        <w:t>rasına düşürmüştür. Gelecek çalışmalar, GPT-4o/DeepSeek dahil daha geniş bir model havuzunu, daha büyük bir veri setini ve model-seçim/ensemble stratejilerini hedefleyebilir.</w:t>
+      </w:r>
+    </w:p>
+    <w:p>
+      <w:pPr>
+        <w:spacing w:before="200" w:after="80"/>
+        <w:jc w:val="center"/>
+      </w:pPr>
+      <w:r>
+        <w:rPr>
+          <w:b/>
+          <w:sz w:val="21"/>
+        </w:rPr>
+        <w:t>TEŞEKKÜR</w:t>
+      </w:r>
+    </w:p>
+    <w:p>
+      <w:pPr>
+        <w:jc w:val="both"/>
+      </w:pPr>
+      <w:r>
+        <w:t>Bu çalışma harici bir fon almamıştır. Deneyin çoklu model, istatistiksel</w:t>
+      </w:r>
+      <w:r>
+        <w:t xml:space="preserve"> güç, çok dosyalı kod ve çoklu platform yönünde genişletilmesi, süreçte aldığımız geri bildirimlerde belirtilen eksiklikleri gidermeye yöneliktir.</w:t>
       </w:r>
     </w:p>
     <w:p>
@@ -6109,30 +6143,6 @@
           <w:sz w:val="21"/>
         </w:rPr>
         <w:lastRenderedPageBreak/>
-        <w:t>TEŞEKKÜR</w:t>
-      </w:r>
-    </w:p>
-    <w:p>
-      <w:pPr>
-        <w:jc w:val="both"/>
-      </w:pPr>
-      <w:r>
-        <w:t>Bu çalışma harici bir fon almamıştır. Deneyin çoklu mo</w:t>
-      </w:r>
-      <w:r>
-        <w:t>del, istatistiksel güç, çok dosyalı kod ve çoklu platform yönünde genişletilmesi, alan uzmanlarından alınan geri bildirimde belirtilen somut eksikliklere doğrudan yanıt niteliğindedir; bu geri bildirim için teşekkür ederiz.</w:t>
-      </w:r>
-    </w:p>
-    <w:p>
-      <w:pPr>
-        <w:spacing w:before="200" w:after="80"/>
-        <w:jc w:val="center"/>
-      </w:pPr>
-      <w:r>
-        <w:rPr>
-          <w:b/>
-          <w:sz w:val="21"/>
-        </w:rPr>
         <w:t>KAYNAKÇA</w:t>
       </w:r>
     </w:p>
@@ -6145,13 +6155,13 @@
         <w:rPr>
           <w:sz w:val="18"/>
         </w:rPr>
-        <w:t>[1] H. F. Eniser, H. Zh</w:t>
+        <w:t>[1] H. F. Eniser, H. Zhang, C. David, M. Wang, M. Christakis, B. Paulsen, J. Dodds, and D. Kroening,</w:t>
       </w:r>
       <w:r>
         <w:rPr>
           <w:sz w:val="18"/>
         </w:rPr>
-        <w:t>ang, C. David, M. Wang, M. Christakis, B. Paulsen, J. Dodds, and D. Kroening, "Towards Translating Real-World Code with LLMs: A Study of Translating to Rust," arXiv:2405.11514, 2024.</w:t>
+        <w:t xml:space="preserve"> "Towards Translating Real-World Code with LLMs: A Study of Translating to Rust," arXiv:2405.11514, 2024.</w:t>
       </w:r>
     </w:p>
     <w:p>
@@ -6163,31 +6173,31 @@
         <w:rPr>
           <w:sz w:val="18"/>
         </w:rPr>
-        <w:t>[2] S. Gandhi, M. Patwardhan, J. Khatri, L. Vig, and R. K. Medicherla, "T</w:t>
+        <w:t>[2] S. Gandhi, M. Patwardhan, J. Khatri, L. Vig, and R. K. Medicherla, "Translation of Low-Resource COBOL to Logically Correct and Readable Java lever</w:t>
       </w:r>
       <w:r>
         <w:rPr>
           <w:sz w:val="18"/>
         </w:rPr>
-        <w:t>ranslation of Low-Resource COBOL to Logically Correct and Readable Java leveraging High-Resource Java Refinement," in Proc. 1st Int. Workshop on Large Language Models for Code (LLM4Code '24), ICSE 2024, Lisbon, Portugal, pp. 46-53, doi: 10.1145/3643795.364</w:t>
-      </w:r>
+        <w:t>aging High-Resource Java Refinement," in Proc. 1st Int. Workshop on Large Language Models for Code (LLM4Code '24), ICSE 2024, Lisbon, Portugal, pp. 46-53, doi: 10.1145/3643795.3648388.</w:t>
+      </w:r>
+    </w:p>
+    <w:p>
+      <w:pPr>
+        <w:spacing w:after="40"/>
+        <w:ind w:left="198" w:hanging="198"/>
+      </w:pPr>
       <w:r>
         <w:rPr>
           <w:sz w:val="18"/>
         </w:rPr>
-        <w:t>8388.</w:t>
-      </w:r>
-    </w:p>
-    <w:p>
-      <w:pPr>
-        <w:spacing w:after="40"/>
-        <w:ind w:left="198" w:hanging="198"/>
-      </w:pPr>
+        <w:t>[3] X. Yin, C. Ni, T. N. Nguyen, S. Wang, and X. Yang, "Rectifier: Code</w:t>
+      </w:r>
       <w:r>
         <w:rPr>
           <w:sz w:val="18"/>
         </w:rPr>
-        <w:t>[3] X. Yin, C. Ni, T. N. Nguyen, S. Wang, and X. Yang, "Rectifier: Code Translation with Corrector via LLMs," arXiv:2407.07472, 2024.</w:t>
+        <w:t xml:space="preserve"> Translation with Corrector via LLMs," arXiv:2407.07472, 2024.</w:t>
       </w:r>
     </w:p>
     <w:p>
@@ -6199,43 +6209,43 @@
         <w:rPr>
           <w:sz w:val="18"/>
         </w:rPr>
-        <w:t>[4] Rosetta Code, rosettacode.org — Luhn test, Soundex, Levenshtein distance, 0-1 Knapsack, Towers of Hanoi, LCS, CR</w:t>
-      </w:r>
+        <w:t>[4] Rosetta Code, rosettacode.org — Luhn test, Soundex, Levenshtein distance, 0-1 Knapsack, Towers of Hanoi, LCS, CRC-32 (C solutions). [Online]. Available: github.com/acmeism/RosettaCodeData</w:t>
+      </w:r>
+    </w:p>
+    <w:p>
+      <w:pPr>
+        <w:spacing w:after="40"/>
+        <w:ind w:left="198" w:hanging="198"/>
+      </w:pPr>
       <w:r>
         <w:rPr>
           <w:sz w:val="18"/>
         </w:rPr>
-        <w:t>C-32 (C solutions). [Online]. Available: github.com/acmeism/RosettaCodeData</w:t>
-      </w:r>
-    </w:p>
-    <w:p>
-      <w:pPr>
-        <w:spacing w:after="40"/>
-        <w:ind w:left="198" w:hanging="198"/>
-      </w:pPr>
+        <w:t>[</w:t>
+      </w:r>
       <w:r>
         <w:rPr>
           <w:sz w:val="18"/>
         </w:rPr>
-        <w:t>[5] The Regents of the Univ. of California / OpenBSD and FreeBSD Projects, getopt.c (1987), strtol.c (1990), heapsort.c (1991). [Online]. Available: github.com/openbsd/src, github.</w:t>
-      </w:r>
+        <w:t>5] The Regents of the Univ. of California / OpenBSD and FreeBSD Projects, getopt.c (1987), strtol.c (1990), heapsort.c (1991). [Online]. Available: github.com/openbsd/src, github.com/freebsd/freebsd-src</w:t>
+      </w:r>
+    </w:p>
+    <w:p>
+      <w:pPr>
+        <w:spacing w:after="40"/>
+        <w:ind w:left="198" w:hanging="198"/>
+      </w:pPr>
       <w:r>
         <w:rPr>
           <w:sz w:val="18"/>
         </w:rPr>
-        <w:t>com/freebsd/freebsd-src</w:t>
-      </w:r>
-    </w:p>
-    <w:p>
-      <w:pPr>
-        <w:spacing w:after="40"/>
-        <w:ind w:left="198" w:hanging="198"/>
-      </w:pPr>
+        <w:t>[6] musl libc Project (R. Felker et al.), qsort.c (sm</w:t>
+      </w:r>
       <w:r>
         <w:rPr>
           <w:sz w:val="18"/>
         </w:rPr>
-        <w:t>[6] musl libc Project (R. Felker et al.), qsort.c (smoothsort, L. Ochs, 2011). [Online]. Available: github.com/kraj/musl</w:t>
+        <w:t>oothsort, L. Ochs, 2011). [Online]. Available: github.com/kraj/musl</w:t>
       </w:r>
     </w:p>
     <w:p>
@@ -6247,25 +6257,25 @@
         <w:rPr>
           <w:sz w:val="18"/>
         </w:rPr>
-        <w:t>[7] S. Sanfilippo et al., sds.c/sds.h (SDS v2.0), Redis 7.2.4. [Online]. Available: github.com/redis/redis (tag</w:t>
-      </w:r>
+        <w:t>[7] S. Sanfilippo et al., sds.c/sds.h (SDS v2.0), Redis 7.2.4. [Online]. Available: github.com/redis/redis (tag 7.2.4)</w:t>
+      </w:r>
+    </w:p>
+    <w:p>
+      <w:pPr>
+        <w:spacing w:after="40"/>
+        <w:ind w:left="198" w:hanging="198"/>
+      </w:pPr>
       <w:r>
         <w:rPr>
           <w:sz w:val="18"/>
         </w:rPr>
-        <w:t xml:space="preserve"> 7.2.4)</w:t>
-      </w:r>
-    </w:p>
-    <w:p>
-      <w:pPr>
-        <w:spacing w:after="40"/>
-        <w:ind w:left="198" w:hanging="198"/>
-      </w:pPr>
+        <w:t>[8] D. Gamble et al., cJSON.c (parse_number, print_number). [Online].</w:t>
+      </w:r>
       <w:r>
         <w:rPr>
           <w:sz w:val="18"/>
         </w:rPr>
-        <w:t>[8] D. Gamble et al., cJSON.c (parse_number, print_number). [Online]. Available: github.com/DaveGamble/cJSON</w:t>
+        <w:t xml:space="preserve"> Available: github.com/DaveGamble/cJSON</w:t>
       </w:r>
     </w:p>
     <w:p>
@@ -6289,19 +6299,13 @@
         <w:rPr>
           <w:sz w:val="18"/>
         </w:rPr>
-        <w:t>[10] Cybersecurity and Infrastruct</w:t>
+        <w:t>[10] Cybersecurity and Infrastructure Security Agency (CISA), National Security Agency (NSA), Federal Bureau of</w:t>
       </w:r>
       <w:r>
         <w:rPr>
           <w:sz w:val="18"/>
         </w:rPr>
-        <w:t xml:space="preserve">ure Security Agency (CISA), National Security Agency (NSA), Federal Bureau of Investigation (FBI) et al., "The Case for Memory Safe Roadmaps: Why both C-Suite Executives and Technical Experts Need to Take Memory Safe Coding Seriously," joint cybersecurity </w:t>
-      </w:r>
-      <w:r>
-        <w:rPr>
-          <w:sz w:val="18"/>
-        </w:rPr>
-        <w:t>guidance, Dec. 2023. [Online]. Available: cisa.gov/case-memory-safe-roadmaps</w:t>
+        <w:t xml:space="preserve"> Investigation (FBI) et al., "The Case for Memory Safe Roadmaps: Why both C-Suite Executives and Technical Experts Need to Take Memory Safe Coding Seriously," joint cybersecurity guidance, Dec. 2023. [Online]. Available: cisa.gov/case-memory-safe-roadmaps</w:t>
       </w:r>
     </w:p>
     <w:p>
@@ -6325,13 +6329,13 @@
         <w:rPr>
           <w:sz w:val="18"/>
         </w:rPr>
-        <w:t xml:space="preserve">[12] B. Rozière, M.-A. Lachaux, L. Chanussot, and G. </w:t>
+        <w:t>[12] B. Rozière, M.-A. Lachaux, L. Chanussot, and G. Lample, "Unsupervised Translation of Programming Languages," in Advances in Neu</w:t>
       </w:r>
       <w:r>
         <w:rPr>
           <w:sz w:val="18"/>
         </w:rPr>
-        <w:t>Lample, "Unsupervised Translation of Programming Languages," in Advances in Neural Information Processing Systems (NeurIPS) 33, 2020, arXiv:2006.03511.</w:t>
+        <w:t>ral Information Processing Systems (NeurIPS) 33, 2020, arXiv:2006.03511.</w:t>
       </w:r>
     </w:p>
     <w:p>
@@ -6343,13 +6347,7 @@
         <w:rPr>
           <w:sz w:val="18"/>
         </w:rPr>
-        <w:t>[13] J. M. Hoenig and D. M. Heisey, "The Abuse of Power: The Pervasive Fallacy of Power Calculations for</w:t>
-      </w:r>
-      <w:r>
-        <w:rPr>
-          <w:sz w:val="18"/>
-        </w:rPr>
-        <w:t xml:space="preserve"> Data Analysis," The American Statistician, vol. 55, no. 1, pp. 19-24, 2001.</w:t>
+        <w:t>[13] J. M. Hoenig and D. M. Heisey, "The Abuse of Power: The Pervasive Fallacy of Power Calculations for Data Analysis," The American Statistician, vol. 55, no. 1, pp. 19-24, 2001.</w:t>
       </w:r>
     </w:p>
     <w:sectPr>
@@ -18273,7 +18271,7 @@
 </file>
 
 <file path=customXml/itemProps1.xml><?xml version="1.0" encoding="utf-8"?>
-<ds:datastoreItem xmlns:ds="http://schemas.openxmlformats.org/officeDocument/2006/customXml" ds:itemID="{27DF93A9-9B14-4A72-95C6-F1755555852B}">
+<ds:datastoreItem xmlns:ds="http://schemas.openxmlformats.org/officeDocument/2006/customXml" ds:itemID="{28C9BE70-711F-4CBE-9096-DA98FF261880}">
   <ds:schemaRefs>
     <ds:schemaRef ds:uri="http://schemas.openxmlformats.org/officeDocument/2006/bibliography"/>
   </ds:schemaRefs>

</xml_diff>

<commit_message>
Amac ve Katkilar bolumundeki 6 maddelik soru listesini paragrafa donustur
AS1-AS6 etiketli madde isaretli liste, aym icerigi koruyarak tek bir akici
paragrafa donusturuldu; bolum artik gorsel olarak cok daha kisa.
</commit_message>
<xml_diff>
--- a/makale_IEEE_v1.docx
+++ b/makale_IEEE_v1.docx
@@ -389,98 +389,33 @@
         <w:jc w:val="both"/>
       </w:pPr>
       <w:r>
-        <w:t>Bu çalışmada şu sorulara deneysel yanıt aranmaktadır:</w:t>
+        <w:t>Bu çalışmada altı soruya deneysel yanıt aranmaktadır: zero-shot C→Rust çevirisinin yürütme doğruluğu (EA) nedir ve kaç başarısızlık sessizce (derleyici uyarısı olmadan) gerçekleşi</w:t>
+      </w:r>
+      <w:r>
+        <w:t xml:space="preserve">r; başarısızlıkların kök nedenleri C↔Rust arasında tekrar eden hangi semantik boşluklara işaret eder; kod uzunluğu çeviri başarısını gerçekten öngörür mü; derleme yapılandırması (debug/release) ölçülen doğruluğu nasıl etkiler; hata geri bildirimine dayalı </w:t>
+      </w:r>
+      <w:r>
+        <w:t>bir iyileştirme döngüsü doğruluğu ne ölçüde artırır ve bu artış geri bildirimin zenginliğine ne kadar bağımlıdır; ve son olarak, bulgular tek bir modele mi özgüdür, yoksa ikinci bağımsız bir modelde (Google Gemini) de aynı örüntü — ve aynı kök nedenler — g</w:t>
+      </w:r>
+      <w:r>
+        <w:t>özlenir mi?</w:t>
       </w:r>
     </w:p>
     <w:p>
       <w:pPr>
-        <w:spacing w:after="40"/>
-        <w:ind w:left="198" w:hanging="198"/>
         <w:jc w:val="both"/>
       </w:pPr>
       <w:r>
-        <w:t xml:space="preserve">AS1: Zero-shot C→Rust çevirisinin yürütme doğruluğu (EA) nedir, ve kaç başarısızlık sessizce (derleyici uyarısı olmadan) </w:t>
-      </w:r>
-      <w:r>
-        <w:t>gerçekleşir?</w:t>
-      </w:r>
-    </w:p>
-    <w:p>
-      <w:pPr>
-        <w:spacing w:after="40"/>
-        <w:ind w:left="198" w:hanging="198"/>
-        <w:jc w:val="both"/>
-      </w:pPr>
-      <w:r>
-        <w:t>AS2: Başarısızlıkların kök nedenleri C↔Rust arasında tekrar eden hangi semantik boşluklara işaret eder?</w:t>
-      </w:r>
-    </w:p>
-    <w:p>
-      <w:pPr>
-        <w:spacing w:after="40"/>
-        <w:ind w:left="198" w:hanging="198"/>
-        <w:jc w:val="both"/>
-      </w:pPr>
-      <w:r>
-        <w:t>AS3: Kod uzunluğu çeviri başarısını gerçekten öngörür mü?</w:t>
-      </w:r>
-    </w:p>
-    <w:p>
-      <w:pPr>
-        <w:spacing w:after="40"/>
-        <w:ind w:left="198" w:hanging="198"/>
-        <w:jc w:val="both"/>
-      </w:pPr>
-      <w:r>
-        <w:t>AS4: Derleme yapılandırması (debug/release) ölçülen doğruluğu nasıl etkiler?</w:t>
-      </w:r>
-    </w:p>
-    <w:p>
-      <w:pPr>
-        <w:spacing w:after="40"/>
-        <w:ind w:left="198" w:hanging="198"/>
-        <w:jc w:val="both"/>
-      </w:pPr>
-      <w:r>
-        <w:t>AS5:</w:t>
-      </w:r>
-      <w:r>
-        <w:t xml:space="preserve"> Hata geri bildirimine dayalı bir iyileştirme döngüsü doğruluğu ne ölçüde artırır, ve bu artış geri bildirimin zenginliğine ne kadar bağımlıdır?</w:t>
-      </w:r>
-    </w:p>
-    <w:p>
-      <w:pPr>
-        <w:spacing w:after="40"/>
-        <w:ind w:left="198" w:hanging="198"/>
-        <w:jc w:val="both"/>
-      </w:pPr>
-      <w:r>
-        <w:t xml:space="preserve">AS6: Bulgular tek bir modele mi özgüdür, yoksa ikinci bağımsız bir modelde (Google Gemini) de aynı örüntü — ve </w:t>
-      </w:r>
-      <w:r>
-        <w:t>aynı kök nedenler — gözlenir mi?</w:t>
-      </w:r>
-    </w:p>
-    <w:p>
-      <w:pPr>
-        <w:spacing w:after="40"/>
-      </w:pPr>
-    </w:p>
-    <w:p>
-      <w:pPr>
-        <w:jc w:val="both"/>
-      </w:pPr>
-      <w:r>
-        <w:t xml:space="preserve">Bu soruları yanıtlamak için 57 C programı ve 229 test girdisinden oluşan özgün, tekrarlanabilir bir kıyaslama seti ("C→Rust Legacy Çeviri Benchmark'ı") oluşturulmuş; her programın Claude ve Gemini tarafından üretilen Rust </w:t>
-      </w:r>
-      <w:r>
-        <w:t>çevirisi, kaynağa karşı diferansiyel test ile doğrulanmıştır. Katkılarımız: (i) bilinen C↔Rust semantik boşluklarını (tamsayı taşması, string modeli, işaretlilik, biçimlendirme, global durum) hedefleyen özgün bir veri seti; (ii) derleme modunun ölçülen doğ</w:t>
-      </w:r>
-      <w:r>
-        <w:t>ruluğu nasıl gizleyebileceğinin kanıtı; (iii) dokuz kök nedene dayanan bir hata taksonomisi; (iv) üç geri bildirim ayrıntı seviyesinde ölçülmüş bir iyileştirme-döngüsü etkinliği eğrisi; (v) 13 bağımsız gerçek dünya algoritması (Rosetta Code, OpenBSD/FreeBS</w:t>
-      </w:r>
-      <w:r>
-        <w:t>D libc, musl/Redis/cJSON) üzerinde tekrarlanan ölçüm; ve (vi) 57/57 örneğin tamamı üzerinde gerçek, otomatik bir ikinci-model (Gemini) ölçümü — bu çalışmanın en yeni katkısı — modele özgü ve modelden bağımsız hata kategorilerini ayırt eder.</w:t>
+        <w:t>Bu soruları yanıtlamak için 57 C programı ve 229 test girdisinden oluşan özgün, tekrarlanabilir bir kıyaslama seti ("C→Rust Legacy Çeviri Benchmark'ı") oluşturulmuş; her programın Claude ve Gemini tarafından üretilen Rust çevirisi, kaynağa karş</w:t>
+      </w:r>
+      <w:r>
+        <w:t>ı diferansiyel test ile doğrulanmıştır. Katkılarımız: (i) bilinen C↔Rust semantik boşluklarını (tamsayı taşması, string modeli, işaretlilik, biçimlendirme, global durum) hedefleyen özgün bir veri seti; (ii) derleme modunun ölçülen doğruluğu nasıl gizleyebi</w:t>
+      </w:r>
+      <w:r>
+        <w:t>leceğinin kanıtı; (iii) dokuz kök nedene dayanan bir hata taksonomisi; (iv) üç geri bildirim ayrıntı seviyesinde ölçülmüş bir iyileştirme-döngüsü etkinliği eğrisi; (v) 13 bağımsız gerçek dünya algoritması (Rosetta Code, OpenBSD/FreeBSD libc, musl/Redis/cJS</w:t>
+      </w:r>
+      <w:r>
+        <w:t>ON) üzerinde tekrarlanan ölçüm; ve (vi) 57/57 örneğin tamamı üzerinde gerçek, otomatik bir ikinci-model (Gemini) ölçümü — bu çalışmanın en yeni katkısı — modele özgü ve modelden bağımsız hata kategorilerini ayırt eder.</w:t>
       </w:r>
     </w:p>
     <w:p>
@@ -493,14 +428,7 @@
           <w:b/>
           <w:sz w:val="21"/>
         </w:rPr>
-        <w:t>II. İLGİLİ ÇALI</w:t>
-      </w:r>
-      <w:r>
-        <w:rPr>
-          <w:b/>
-          <w:sz w:val="21"/>
-        </w:rPr>
-        <w:t>ŞMALAR</w:t>
+        <w:t>II. İLGİLİ ÇALIŞMALAR</w:t>
       </w:r>
     </w:p>
     <w:p>
@@ -508,17 +436,20 @@
         <w:jc w:val="both"/>
       </w:pPr>
       <w:r>
-        <w:t xml:space="preserve">LLM tabanlı kod çevirisinin doğruluğunu yürütme yoluyla doğrulayan çalışmalar artmaktadır. Gandhi vd. [2], COBOL→Java çevirisinde execution-guided refinement ile </w:t>
+        <w:t>LLM tabanlı kod</w:t>
+      </w:r>
+      <w:r>
+        <w:t xml:space="preserve"> çevirisinin doğruluğunu yürütme yoluyla doğrulayan çalışmalar artmaktadır. Gandhi vd. [2], COBOL→Java çevirisinde execution-guided refinement ile %81.99 doğruluğa ulaşmıştır; bu çalışma benzer bir mantığı C→Rust'ta benimser. Eniser vd. [1], FLUORINE ile k</w:t>
+      </w:r>
+      <w:r>
+        <w:t xml:space="preserve">od uzunluğu arttıkça çeviri hatası riskinin arttığını gözlemlemiştir — bu çalışmanın bulguları bu gözlemle örtüşmez (§IV-B). Yin vd. [3], farklı LLM'lerin hata kök nedenlerinin büyük ölçüde </w:t>
       </w:r>
       <w:r>
         <w:lastRenderedPageBreak/>
-        <w:t xml:space="preserve">%81.99 doğruluğa ulaşmıştır; bu çalışma benzer bir mantığı C→Rust'ta benimser. Eniser </w:t>
-      </w:r>
-      <w:r>
-        <w:t>vd. [1], FLUORINE ile kod uzunluğu arttıkça çeviri hatası riskinin arttığını gözlemlemiştir — bu çalışmanın bulguları bu gözlemle örtüşmez (§IV-B). Yin vd. [3], farklı LLM'lerin hata kök nedenlerinin büyük ölçüde benzer olduğunu göstermiştir; bu çalışmanın</w:t>
-      </w:r>
-      <w:r>
-        <w:t xml:space="preserve"> çoklu-model bulguları (§IV-F) bunu hem doğrular hem nüanslandırır: yalnızca kök neden D kategorisi modelden bağımsızken, A, B, C, E, F, G, H, I kategorilerinin her biri en az bir modelde başarıyla atlatılmıştır (§IV-F'de ayrıntılandırıldığı gibi).</w:t>
+        <w:t xml:space="preserve">benzer olduğunu göstermiştir; bu çalışmanın çoklu-model bulguları </w:t>
+      </w:r>
+      <w:r>
+        <w:t>(§IV-F) bunu hem doğrular hem nüanslandırır: yalnızca kök neden D kategorisi modelden bağımsızken, A, B, C, E, F, G, H, I kategorilerinin her biri en az bir modelde başarıyla atlatılmıştır (§IV-F'de ayrıntılandırıldığı gibi).</w:t>
       </w:r>
     </w:p>
     <w:p>
@@ -526,19 +457,19 @@
         <w:jc w:val="both"/>
       </w:pPr>
       <w:r>
-        <w:t>Kural t</w:t>
-      </w:r>
-      <w:r>
-        <w:t>abanlı C→Rust çevirisi (ör. C2Rust [11]) ve nöral kod çevirisi (ör. TransCoder [12]) literatürü, bu çalışmadan farklı bir eksende konumlanır: kural tabanlı araçlar davranışsal eşdeğerliği sözdizimsel dönüşüm kurallarıyla garanti etmeye çalışırken (genellik</w:t>
-      </w:r>
-      <w:r>
-        <w:t>le yoğun `unsafe` kullanımı pahasına), nöral/LLM tabanlı yaklaşımlar deyimsel ama doğrulanmamış çeviriler üretir — bu çalışmanın odaklandığı boşluk tam olarak burasıdır. Rust'ın tip sistemi ve ödünç denetleyicisinin (borrow checker) bellek güvenliğini derl</w:t>
-      </w:r>
-      <w:r>
-        <w:t>eme zamanında nasıl garanti ettiği iyi belgelenmiştir; ancak bu garanti yalnızca çeviri kodu Rust'ta derlenirse devreye girer — davranışsal eşdeğerliği garanti etmez. Bu çalışma tam olarak bu ikisi arasındaki boşluğu, yani "derlenen ama kaynaktan farklı da</w:t>
-      </w:r>
-      <w:r>
-        <w:t>vranan" kodu ölçmeyi hedefler.</w:t>
+        <w:t xml:space="preserve">Kural tabanlı C→Rust çevirisi </w:t>
+      </w:r>
+      <w:r>
+        <w:t>(ör. C2Rust [11]) ve nöral kod çevirisi (ör. TransCoder [12]) literatürü, bu çalışmadan farklı bir eksende konumlanır: kural tabanlı araçlar davranışsal eşdeğerliği sözdizimsel dönüşüm kurallarıyla garanti etmeye çalışırken (genellikle yoğun `unsafe` kulla</w:t>
+      </w:r>
+      <w:r>
+        <w:t>nımı pahasına), nöral/LLM tabanlı yaklaşımlar deyimsel ama doğrulanmamış çeviriler üretir — bu çalışmanın odaklandığı boşluk tam olarak burasıdır. Rust'ın tip sistemi ve ödünç denetleyicisinin (borrow checker) bellek güvenliğini derleme zamanında nasıl gar</w:t>
+      </w:r>
+      <w:r>
+        <w:t>anti ettiği iyi belgelenmiştir; ancak bu garanti yalnızca çeviri kodu Rust'ta derlenirse devreye girer — davranışsal eşdeğerliği garanti etmez. Bu çalışma tam olarak bu ikisi arasındaki boşluğu, yani "derlenen ama kaynaktan farklı davranan" kodu ölçmeyi he</w:t>
+      </w:r>
+      <w:r>
+        <w:t>defler.</w:t>
       </w:r>
     </w:p>
     <w:p>
@@ -546,14 +477,14 @@
         <w:jc w:val="both"/>
       </w:pPr>
       <w:r>
-        <w:t xml:space="preserve">Bu çalışma literatürden üç noktada ayrışır: (a) veri seti özgün ve tümüyle tekrarlanabilirdir; (b) derleme yapılandırmasının </w:t>
+        <w:t xml:space="preserve">Bu çalışma literatürden üç noktada ayrışır: (a) veri seti özgün ve tümüyle tekrarlanabilirdir; (b) derleme yapılandırmasının doğruluk üzerindeki gizli etkisi gösterilmiştir; (c) iki bağımsız </w:t>
       </w:r>
       <w:r>
         <w:lastRenderedPageBreak/>
-        <w:t>doğruluk üzerindeki gizli etkisi gösterilmiştir; (c) iki bağımsız model üzerinde gerçek, otomatik öl</w:t>
-      </w:r>
-      <w:r>
-        <w:t>çümle kök neden düzeyinde bir model karşılaştırması sunulmuştur.</w:t>
+        <w:t>model üzerinde gerçek, otomatik ölçümle kök neden düzeyin</w:t>
+      </w:r>
+      <w:r>
+        <w:t>de bir model karşılaştırması sunulmuştur.</w:t>
       </w:r>
     </w:p>
     <w:p>
@@ -586,19 +517,19 @@
         <w:jc w:val="both"/>
       </w:pPr>
       <w:r>
-        <w:t>Kıyaslama seti 57 C programından oluşur (10-522 satır), dokuz aşamada genişletilmiştir (Tablo I): 24 temel algoritma; kod uzunluğu etkisini test etmek için 5 daha uzu</w:t>
-      </w:r>
-      <w:r>
-        <w:t>n program (s25-s29); bağımsızlığı sınamak için Rosetta Code'dan [4] 7 algoritma (s30-s36), OpenBSD/FreeBSD libc'sinden [5] 3 üretim fonksiyonu (s37-s39) ve musl [6]/Redis [7]/cJSON [8]'dan 3 uzun üretim kodu (s46-s48, 262-522 satır); hedeflenmemiş boşlukla</w:t>
-      </w:r>
-      <w:r>
-        <w:t>rı kapsayan 6 özgün program (s40-s45); hakem ve danışman geri bildirimine yanıt olarak eklenen, beş kök-neden kategorisinin (C, E, F, G, H) ikinci örnekleri (s49-s53, sırasıyla); ayrıca kimlik numarası sırası içerik sırasıyla örtüşmeyen iki ek grup: çok do</w:t>
-      </w:r>
-      <w:r>
-        <w:t>syalı derleme ve gerçek pthread eşzamanlılığı test eden s54, s55, s57 ile karmaşık makro kullanımını test eden s56. Her durumda çekirdek algoritma kaynaktan değiştirilmeden alınmış, yalnızca main() ortamın stdin/stdout sözleşmesine uyacak şekilde yeniden y</w:t>
-      </w:r>
-      <w:r>
-        <w:t>azılmıştır; veri setinin tam kataloğu açık veri deposunda sunulmuştur.</w:t>
+        <w:t>Kıyaslama seti 57 C programından oluşur (10-522 satır), dokuz aşamada genişletilmiştir (Tablo I): 24 temel algoritma; kod uzunluğu etkisini test etmek için 5 daha uzun program (s25-s29); ba</w:t>
+      </w:r>
+      <w:r>
+        <w:t>ğımsızlığı sınamak için Rosetta Code'dan [4] 7 algoritma (s30-s36), OpenBSD/FreeBSD libc'sinden [5] 3 üretim fonksiyonu (s37-s39) ve musl [6]/Redis [7]/cJSON [8]'dan 3 uzun üretim kodu (s46-s48, 262-522 satır); hedeflenmemiş boşlukları kapsayan 6 özgün pro</w:t>
+      </w:r>
+      <w:r>
+        <w:t>gram (s40-s45); hakem ve danışman geri bildirimine yanıt olarak eklenen, beş kök-neden kategorisinin (C, E, F, G, H) ikinci örnekleri (s49-s53, sırasıyla); ayrıca kimlik numarası sırası içerik sırasıyla örtüşmeyen iki ek grup: çok dosyalı derleme ve gerçek</w:t>
+      </w:r>
+      <w:r>
+        <w:t xml:space="preserve"> pthread eşzamanlılığı test eden s54, s55, s57 ile karmaşık makro kullanımını test eden s56. Her durumda çekirdek algoritma kaynaktan değiştirilmeden alınmış, yalnızca main() ortamın stdin/stdout sözleşmesine uyacak şekilde yeniden yazılmıştır; veri setini</w:t>
+      </w:r>
+      <w:r>
+        <w:t>n tam kataloğu açık veri deposunda sunulmuştur.</w:t>
       </w:r>
     </w:p>
     <w:p>
@@ -622,13 +553,13 @@
           <w:sz w:val="17"/>
         </w:rPr>
         <w:lastRenderedPageBreak/>
-        <w:t>TABLO I. VERİ SETİNİN KAYNAK/ROL KATEGORİLERİNE GÖRE ÖZETİ (* Rosetta Code; ** OpenBSD/FreeBSD libc; *** musl/Redis/cJSON — üçü de tarafımızca yazılmamış bağım</w:t>
+        <w:t xml:space="preserve">TABLO I. VERİ SETİNİN KAYNAK/ROL KATEGORİLERİNE GÖRE ÖZETİ (* Rosetta Code; ** OpenBSD/FreeBSD libc; *** musl/Redis/cJSON — üçü de tarafımızca yazılmamış bağımsız/üretim kodu, bkz. </w:t>
       </w:r>
       <w:r>
         <w:rPr>
           <w:sz w:val="17"/>
         </w:rPr>
-        <w:t>sız/üretim kodu, bkz. §V-B).</w:t>
+        <w:t>§V-B).</w:t>
       </w:r>
     </w:p>
     <w:tbl>
@@ -1665,32 +1596,32 @@
         <w:jc w:val="both"/>
       </w:pPr>
       <w:r>
-        <w:t xml:space="preserve">Ana çeviri modeli Anthropic </w:t>
-      </w:r>
-      <w:r>
-        <w:t>Claude Sonnet 5'tir (model kimliği: claude-sonnet-5); ikinci, bağımsız bir model olarak Google Gemini API'si [9] (model kimliği: gemini-flash-latest, gerçek API çağrısıyla, temperature=0.2, top_p=1.0) kullanılmıştır. Gemini kimliği açıkça tarihli/sabit bir</w:t>
-      </w:r>
-      <w:r>
-        <w:t xml:space="preserve"> sürüm değil rotasyonlu bir takma addır ("-latest" eki); API yanıtının hangi anlık görüntüye (snapshot) çözümlendiğini gösteren alan (`modelVersion`) çağrı kayıtlarına o dönemde loglanmamıştır — bu, tekrarlanabilirlik açısından açıkça kabul edilmesi gereke</w:t>
-      </w:r>
-      <w:r>
-        <w:t>n bir eksikliktir (§V-B); ölçümün zamansal bağlamı yalnızca erişim tarihleriyle (2026-07-22 – 2026-07-25) sınırlı olarak yeniden kurulabilir. İstem mühendisliği en yalın haliyle uygulanmıştır: modele her C dosyası için yalnızca "bu C programını Rust'a çevi</w:t>
-      </w:r>
-      <w:r>
-        <w:t xml:space="preserve">r" istemi verilmiş; belirli bir Rust deyimselliği, hedef sürüm veya few-shot örnek sağlanmamıştır. Model, çeviriyi üretmeden önce kodu derlemek/test etmek için herhangi bir araca erişememiştir (gerçek zero-shot koşulu). Değerlendirme betiği model-bağımsız </w:t>
-      </w:r>
-      <w:r>
-        <w:t>tasarlanmıştır: başka bir LLM'in çıktıları ilgili klasöre konularak aynı ölçüm otomatik tekrarlanabilir. Claude çevirileri ise etkileşimli bir asistan oturumunda (Claude Code CLI) üretilmiştir; sabit örnekleme parametreleri (temperature/top-p) dışa açık ra</w:t>
-      </w:r>
-      <w:r>
-        <w:t xml:space="preserve">porlanmamış ve istemin birebir metni ayrı arşivlenmemiştir — bu, Claude tarafı </w:t>
+        <w:t>Ana çeviri modeli Anthropic Claude Sonnet</w:t>
+      </w:r>
+      <w:r>
+        <w:t xml:space="preserve"> 5'tir (model kimliği: claude-sonnet-5); ikinci, bağımsız bir model olarak Google Gemini API'si [9] (model kimliği: gemini-flash-latest, gerçek API çağrısıyla, temperature=0.2, top_p=1.0) kullanılmıştır. Gemini kimliği açıkça tarihli/sabit bir sürüm değil </w:t>
+      </w:r>
+      <w:r>
+        <w:t>rotasyonlu bir takma addır ("-latest" eki); API yanıtının hangi anlık görüntüye (snapshot) çözümlendiğini gösteren alan (`modelVersion`) çağrı kayıtlarına o dönemde loglanmamıştır — bu, tekrarlanabilirlik açısından açıkça kabul edilmesi gereken bir eksikli</w:t>
+      </w:r>
+      <w:r>
+        <w:t>ktir (§V-B); ölçümün zamansal bağlamı yalnızca erişim tarihleriyle (2026-07-22 – 2026-07-25) sınırlı olarak yeniden kurulabilir. İstem mühendisliği en yalın haliyle uygulanmıştır: modele her C dosyası için yalnızca "bu C programını Rust'a çevir" istemi ver</w:t>
+      </w:r>
+      <w:r>
+        <w:t>ilmiş; belirli bir Rust deyimselliği, hedef sürüm veya few-shot örnek sağlanmamıştır. Model, çeviriyi üretmeden önce kodu derlemek/test etmek için herhangi bir araca erişememiştir (gerçek zero-shot koşulu). Değerlendirme betiği model-bağımsız tasarlanmıştı</w:t>
+      </w:r>
+      <w:r>
+        <w:t>r: başka bir LLM'in çıktıları ilgili klasöre konularak aynı ölçüm otomatik tekrarlanabilir. Claude çevirileri ise etkileşimli bir asistan oturumunda (Claude Code CLI) üretilmiştir; sabit örnekleme parametreleri (temperature/top-p) dışa açık raporlanmamış v</w:t>
+      </w:r>
+      <w:r>
+        <w:t xml:space="preserve">e istemin birebir metni ayrı arşivlenmemiştir — bu, Claude tarafı için tekrarlanabilirliği Gemini tarafına göre sınırlayan, açıkça kabul edilmesi gereken bir asimetridir (§V-B). Her iki model için de her örnek yalnızca bir kez (k=1) çevrilmiştir; LLM </w:t>
       </w:r>
       <w:r>
         <w:lastRenderedPageBreak/>
-        <w:t>için tekrarlanabilirliği Gemini tarafına göre sınırlayan, açıkça kabul edilmesi gereken bir asimetridir (§V-B). Her iki model için de her örnek yalnızca bir kez (k=1) çevrilmişt</w:t>
-      </w:r>
-      <w:r>
-        <w:t>ir; LLM çıktısının stokastik doğası nedeniyle, tek örneklemli bu ölçümün ne kadarının gerçek model performansı farkını, ne kadarının örnekleme gürültüsünü yansıttığı bilinmemektedir (§V-B).</w:t>
+        <w:t>çıktı</w:t>
+      </w:r>
+      <w:r>
+        <w:t>sının stokastik doğası nedeniyle, tek örneklemli bu ölçümün ne kadarının gerçek model performansı farkını, ne kadarının örnekleme gürültüsünü yansıttığı bilinmemektedir (§V-B).</w:t>
       </w:r>
     </w:p>
     <w:p>
@@ -1698,13 +1629,13 @@
         <w:jc w:val="both"/>
       </w:pPr>
       <w:r>
-        <w:t>Gemini ölçümü, ücretsiz katman günlük kota sınırı nedeniyle birden</w:t>
-      </w:r>
-      <w:r>
-        <w:t xml:space="preserve"> fazla gün boyunca kademeli olarak tamamlanmıştır (2026-07-22 ile 2026-07-25 arasında, kota her sıfırlandığında bir sonraki grup çevrilerek): toplam 57 örneğin tamamı gerçek, otomatik API çağrısıyla ölçülmüştür; hiçbir sonuç sahte veriyle doldurulmamıştır.</w:t>
-      </w:r>
-      <w:r>
-        <w:t xml:space="preserve"> Tam çağrı kaydı (istem, zaman damgası, örnekleme parametreleri) her örnek için açık veri deposunda arşivlenmiştir.</w:t>
+        <w:t>Gemini ölçümü, ücretsiz katman günlük kota sınırı nedeniyle birden fazla gün bo</w:t>
+      </w:r>
+      <w:r>
+        <w:t>yunca kademeli olarak tamamlanmıştır (2026-07-22 ile 2026-07-25 arasında, kota her sıfırlandığında bir sonraki grup çevrilerek): toplam 57 örneğin tamamı gerçek, otomatik API çağrısıyla ölçülmüştür; hiçbir sonuç sahte veriyle doldurulmamıştır. Tam çağrı ka</w:t>
+      </w:r>
+      <w:r>
+        <w:t>ydı (istem, zaman damgası, örnekleme parametreleri) her örnek için açık veri deposunda arşivlenmiştir.</w:t>
       </w:r>
     </w:p>
     <w:p>
@@ -1724,13 +1655,10 @@
         <w:jc w:val="both"/>
       </w:pPr>
       <w:r>
-        <w:t>Hedef dilde önceden yazılmış birim test bulunmadığından, doğruluk kaynak programla aynı girdide çal</w:t>
-      </w:r>
-      <w:r>
-        <w:t>ıştırılıp çıktı karşılaştırılarak (diferansiyel test) ölçülmüştür: C ve Rust ikilileri derlenir (Rust derlenmezse CE); her test girdisi için beklenen/alınan çıktı karşılaştırılır (zaman aşımı → NT, çökme → RE, fark → FE, eşitse PASS; Tablo II); bir örnek y</w:t>
-      </w:r>
-      <w:r>
-        <w:t xml:space="preserve">alnızca </w:t>
+        <w:t>Hedef dilde önceden yazılmış birim test bulunmadığından, doğruluk kaynak programla aynı girdide çalıştırılıp çık</w:t>
+      </w:r>
+      <w:r>
+        <w:t xml:space="preserve">tı karşılaştırılarak (diferansiyel test) ölçülmüştür: C ve Rust ikilileri derlenir (Rust derlenmezse CE); her test girdisi için beklenen/alınan çıktı karşılaştırılır (zaman aşımı → NT, çökme → RE, fark → FE, eşitse PASS; Tablo II); bir örnek yalnızca </w:t>
       </w:r>
       <w:r>
         <w:rPr>
@@ -1739,7 +1667,10 @@
         <w:t>tüm</w:t>
       </w:r>
       <w:r>
-        <w:t xml:space="preserve"> girdileri geçerse PASS sayılır.</w:t>
+        <w:t xml:space="preserve"> g</w:t>
+      </w:r>
+      <w:r>
+        <w:t>irdileri geçerse PASS sayılır.</w:t>
       </w:r>
     </w:p>
     <w:p>
@@ -1788,7 +1719,6 @@
                 <w:color w:val="FFFFFF"/>
                 <w:sz w:val="15"/>
               </w:rPr>
-              <w:lastRenderedPageBreak/>
               <w:t>Kod</w:t>
             </w:r>
           </w:p>
@@ -1975,6 +1905,7 @@
               <w:rPr>
                 <w:sz w:val="15"/>
               </w:rPr>
+              <w:lastRenderedPageBreak/>
               <w:t>NT</w:t>
             </w:r>
           </w:p>
@@ -2140,14 +2071,14 @@
         <w:t>Program-düzeyi Yürütme Doğruluğu (</w:t>
       </w:r>
       <w:r>
-        <w:t xml:space="preserve">EA) = tüm testleri geçen örnek sayısı / toplam örnek sayısı — ana metriktir. Test-girdisi bazında geçme oranı ikincil, daha ince taneli bir metriktir. Ortam: Windows 11, gcc 16.1.0 (MSYS2/UCRT64, -O2), </w:t>
+        <w:t>EA) = tüm testleri geçen örnek sayısı / toplam örnek sayısı — ana metriktir. Test-girdisi bazında geçme oranı ikincil, daha ince taneli bir metriktir. Ortam: Windows 11, gcc 16.1.0 (MSYS2/UCRT64, -O2), rustc/cargo 1.97.1; derleme `rustc &lt;dosya&gt;.rs -o &lt;çıkt</w:t>
+      </w:r>
+      <w:r>
+        <w:t xml:space="preserve">ı&gt;` ile, </w:t>
       </w:r>
       <w:r>
         <w:lastRenderedPageBreak/>
-        <w:t>rustc/cargo 1.97.1; derleme `rustc &lt;dosya&gt;.rs -o &lt;çıkt</w:t>
-      </w:r>
-      <w:r>
-        <w:t>ı&gt;` ile, Cargo veya açık bir --edition bayrağı olmadan yapılmıştır (rustc'nin varsayılan edition'ı, 2015); bu, tekrarlanabilirlik için belirtilmesi gereken bir parametredir (bazı lint'lerin — ör. static_mut_refs — şiddeti edition'a göre değişir, ancak Kate</w:t>
+        <w:t>Cargo veya açık bir --edition bayrağı olmadan yapılmıştır (rustc'nin varsayılan edition'ı, 2015); bu, tekrarlanabilirlik için belirtilmesi gereken bir parametredir (bazı lint'lerin — ör. static_mut_refs — şiddeti edition'a göre değişir, ancak Kate</w:t>
       </w:r>
       <w:r>
         <w:t>gori E'deki gözlenen derleme hatası — E0133, unsafe olmadan mutable static erişimi — tüm editionlarda aynı şekilde sert hatadır). Ayrıca gerçek bir Linux/LP64 ortamında (Docker, ubuntu:24.04) bir tekrar yapılmıştır; bu tekrar veri seti 55 örnekken gerçekle</w:t>
@@ -2948,13 +2879,10 @@
         <w:t>tek</w:t>
       </w:r>
       <w:r>
-        <w:t xml:space="preserve"> bir sınır girdisinde sapmış, kalan girdilerin tamamınd</w:t>
-      </w:r>
-      <w:r>
-        <w:t xml:space="preserve">a doğru sonuç üretmiştir. Bu, sessiz semantik hataların rastgele seçilmiş bir test girdisiyle yakalanma olasılığının düşük olduğunu ve diferansiyel testin sonucunun girdi çeşitliliğine ne kadar bağımlı olduğunu göstermektedir — hata yalnızca sessiz değil, </w:t>
-      </w:r>
-      <w:r>
-        <w:t>aynı zamanda seyrek tetiklenir.</w:t>
+        <w:t xml:space="preserve"> bir sınır girdisinde sapmış, kalan girdilerin tamamında doğru sonuç üretmiştir. Bu, sessiz semantik hataların rastgele seçilmiş bir test girdisiyle yakalanma olasılığının düşük olduğunu ve diferansiyel testin sonucunun girdi çeşitliliğine ne kadar bağımlı</w:t>
+      </w:r>
+      <w:r>
+        <w:t xml:space="preserve"> olduğunu göstermektedir — hata yalnızca sessiz değil, aynı zamanda seyrek tetiklenir.</w:t>
       </w:r>
     </w:p>
     <w:p>
@@ -3092,13 +3020,16 @@
         <w:jc w:val="both"/>
       </w:pPr>
       <w:r>
-        <w:t>Şekil 3, 57 örneğin LoC'sini başarı durumuna göre gösterir: en uzun program (522 sat</w:t>
-      </w:r>
-      <w:r>
-        <w:t>ır, s47) geçerken çok daha kısa s38 (154 satır) ve s48 (389 satır) başarısız olmuştur — başarısızlık uzunluktan çok hedeflenen semantik boşluğa bağlıdır. PASS (n=40) ve FAIL (n=17) gruplarının LoC dağılımı Mann-Whitney U testiyle karşılaştırılmış, fark anl</w:t>
-      </w:r>
-      <w:r>
-        <w:t>amlı bulunmamıştır (U=287.0, p=0.359); veri seti genişletme aşamalarında (n=36→57 arası ara kontrollerde) p-değeri 0.076-0.359 arası dalgalanmıştır — küçük örneklemde p-değerinin istikrarsızlığının veriye dayalı bir göstergesi.</w:t>
+        <w:t xml:space="preserve">Şekil 3, 57 örneğin LoC'sini </w:t>
+      </w:r>
+      <w:r>
+        <w:t>başarı durumuna göre gösterir: en uzun program (522 satır, s47) geçerken çok daha kısa s38 (154 satır) ve s48 (389 satır) başarısız olmuştur — başarısızlık uzunluktan çok hedeflenen semantik boşluğa bağlıdır. PASS (n=40) ve FAIL (n=17) gruplarının LoC dağı</w:t>
+      </w:r>
+      <w:r>
+        <w:t>lımı Mann-Whitney U testiyle karşılaştırılmış, fark anlamlı bulunmamıştır (U=287.0, p=0.359); veri seti genişletme aşamalarında (n=36→57 arası ara kontrollerde) p-değeri 0.076-0.359 arası dalgalanmıştır — küçük örneklemde p-değerinin istikrarsızlığının ver</w:t>
+      </w:r>
+      <w:r>
+        <w:t>iye dayalı bir göstergesi.</w:t>
       </w:r>
     </w:p>
     <w:p>
@@ -3156,13 +3087,7 @@
         <w:rPr>
           <w:sz w:val="17"/>
         </w:rPr>
-        <w:t xml:space="preserve">Şekil 3. Kod uzunluğu </w:t>
-      </w:r>
-      <w:r>
-        <w:rPr>
-          <w:sz w:val="17"/>
-        </w:rPr>
-        <w:t>(LoC) ile başarı durumu ilişkisi (n=57).</w:t>
+        <w:t>Şekil 3. Kod uzunluğu (LoC) ile başarı durumu ilişkisi (n=57).</w:t>
       </w:r>
     </w:p>
     <w:p>
@@ -3174,10 +3099,10 @@
       </w:r>
       <w:r>
         <w:lastRenderedPageBreak/>
-        <w:t>yerine — bu, p-değerinin tekdüze bir dönüşümüdür ve bağımsız bilgi taşımaz [13] — önerilen du</w:t>
-      </w:r>
-      <w:r>
-        <w:t xml:space="preserve">yarlılık analizi uygulanmıştır: n(FAIL)=17, n(PASS)=40, α=0.05 ile %80 güçte saptanabilecek en küçük etki büyüklüğü, anlamlılığı ölçmek için kullanılan </w:t>
+        <w:t>yerine — bu, p-değerinin tekdüze bir dönüşümüdür ve bağımsız bilgi taşımaz [13] — önerilen duyarlılık analizi uygulanmıştır: n(FAIL)=1</w:t>
+      </w:r>
+      <w:r>
+        <w:t xml:space="preserve">7, n(PASS)=40, α=0.05 ile %80 güçte saptanabilecek en küçük etki büyüklüğü, anlamlılığı ölçmek için kullanılan </w:t>
       </w:r>
       <w:r>
         <w:rPr>
@@ -3186,16 +3111,13 @@
         <w:t>aynı</w:t>
       </w:r>
       <w:r>
-        <w:t xml:space="preserve"> Mann-Whitney U istatistiğinden ampirik rank-biserial formülüyle (r=1-2U/(n1·n2)) hesaplandığında ra</w:t>
-      </w:r>
-      <w:r>
-        <w:t xml:space="preserve">nk-biserial |r|≈0.46'dır (U'nun bağ düzeltmeli standart sapması üzerinden). Gözlemlenen r=0.156 bu eşiğin belirgin altındadır — veri seti bu büyüklükte küçük-orta etkileri saptayacak güce sahip değildir; "anlamlı fark yoktur" sonucu kesin bir ilişkisizlik </w:t>
-      </w:r>
-      <w:r>
-        <w:t>kanıtı değil, düşük güçle tutarlı bir gözlem olarak okunmalıdır (§V-B). EA'nın kendisi için de bootstrap %95 güven aralığı hesaplanmıştır (Şekil 4): Round 1 debug %70.18 [%57.89, %82.46] — geniş aralık, n=57'nin tek bir nokta tahminine duyulan güveni sınır</w:t>
-      </w:r>
-      <w:r>
-        <w:t>ladığını doğrudan göstermektedir.</w:t>
+        <w:t xml:space="preserve"> Mann-Whitney U istatistiğinden ampirik rank-biserial formülüyle (r=1-2U/(n1·n2)) hesaplandığında rank-biserial |r|≈0.46'dır (U'nun bağ düzel</w:t>
+      </w:r>
+      <w:r>
+        <w:t>tmeli standart sapması üzerinden). Gözlemlenen r=0.156 bu eşiğin belirgin altındadır — veri seti bu büyüklükte küçük-orta etkileri saptayacak güce sahip değildir; "anlamlı fark yoktur" sonucu kesin bir ilişkisizlik kanıtı değil, düşük güçle tutarlı bir göz</w:t>
+      </w:r>
+      <w:r>
+        <w:t>lem olarak okunmalıdır (§V-B). EA'nın kendisi için de bootstrap %95 güven aralığı hesaplanmıştır (Şekil 4): Round 1 debug %70.18 [%57.89, %82.46] — geniş aralık, n=57'nin tek bir nokta tahminine duyulan güveni sınırladığını doğrudan göstermektedir.</w:t>
       </w:r>
     </w:p>
     <w:p>
@@ -3253,7 +3175,13 @@
         <w:rPr>
           <w:sz w:val="17"/>
         </w:rPr>
-        <w:t>Şekil 4. Üç koşulda EA için bootstrap %95 güven aralığı.</w:t>
+        <w:t>Şekil</w:t>
+      </w:r>
+      <w:r>
+        <w:rPr>
+          <w:sz w:val="17"/>
+        </w:rPr>
+        <w:t xml:space="preserve"> 4. Üç koşulda EA için bootstrap %95 güven aralığı.</w:t>
       </w:r>
     </w:p>
     <w:p>
@@ -3261,10 +3189,10 @@
         <w:jc w:val="both"/>
       </w:pPr>
       <w:r>
-        <w:t>Kod uzunluğunun tek başına açıklayıcı olmaması, başka hangi kod özelliklerinin ayırt edici olabileceği sorusunu gündeme getirir. Tablo IV, PASS/FAIL gruplarının iş</w:t>
-      </w:r>
-      <w:r>
-        <w:t>aretçi, dinamik bellek ayırma (malloc/calloc) ve string-fonksiyonu kullanım oranlarını gösterir (ölçüm tanımları regex tabanlı ve tekrarlanabilirdir; ayrıntılar açık veri deposunda belgelenmiştir).</w:t>
+        <w:t>Kod uzunluğunun tek başına açıklayıcı olmaması, başka hangi kod özelliklerinin ayırt edici olabileceği sorusunu gündeme getirir. Tablo IV, PASS/FAIL gruplarının işaretçi, dinamik bellek ayırma (malloc/cal</w:t>
+      </w:r>
+      <w:r>
+        <w:t>loc) ve string-fonksiyonu kullanım oranlarını gösterir (ölçüm tanımları regex tabanlı ve tekrarlanabilirdir; ayrıntılar açık veri deposunda belgelenmiştir).</w:t>
       </w:r>
     </w:p>
     <w:p>
@@ -3288,13 +3216,7 @@
           <w:sz w:val="17"/>
         </w:rPr>
         <w:lastRenderedPageBreak/>
-        <w:t>TABLO IV. PASS/FAIL GRUPLARINA G</w:t>
-      </w:r>
-      <w:r>
-        <w:rPr>
-          <w:sz w:val="17"/>
-        </w:rPr>
-        <w:t>ÖRE BETİMSEL KOD ÖZELLİKLERİ (n=57).</w:t>
+        <w:t>TABLO IV. PASS/FAIL GRUPLARINA GÖRE BETİMSEL KOD ÖZELLİKLERİ (n=57).</w:t>
       </w:r>
     </w:p>
     <w:tbl>
@@ -3331,7 +3253,15 @@
                 <w:color w:val="FFFFFF"/>
                 <w:sz w:val="16"/>
               </w:rPr>
-              <w:t>Özellik</w:t>
+              <w:t>Özel</w:t>
+            </w:r>
+            <w:r>
+              <w:rPr>
+                <w:b/>
+                <w:color w:val="FFFFFF"/>
+                <w:sz w:val="16"/>
+              </w:rPr>
+              <w:t>lik</w:t>
             </w:r>
           </w:p>
         </w:tc>
@@ -3706,23 +3636,23 @@
       </w:pPr>
       <w:r>
         <w:lastRenderedPageBreak/>
-        <w:t xml:space="preserve">FAIL grubunun </w:t>
-      </w:r>
-      <w:r>
-        <w:t>string-fonksiyonu kullanımı (%47.1) PASS grubundan (%37.5) yüksek, malloc/calloc kullanımı ise sıfırdır — bu, §IV-C'deki kök neden analiziyle tutarlıdır: başarısızlıkların çoğu string/karakter/sayı semantiğiyle ilgilidir; dinamik veri yapısı içeren program</w:t>
-      </w:r>
-      <w:r>
-        <w:t>lar (bağlı liste, BST, hash tablosu) bu veri setinde istisnasız PASS olmuştur. İşaretçi kullanımı ile PASS/FAIL arasındaki ilişki Fisher'in kesin testiyle de sınanmış, anlamlı bulunmamıştır (tablo=[[23,7],[17,10]], odds oranı=1.93, %95 GA=[0.61, 6.11], p=0</w:t>
-      </w:r>
-      <w:r>
-        <w:t>.385) — güven aralığının 1.0'i içermesi ve genişliği, küçük örneklemin doğal bir sonucudur. Bu veri setinde küçük örneklem büyüklüğü nedeniyle aynı veriler üzerinde birden fazla çıkarımsal test (Mann-Whitney, Fisher, bootstrap GA) uygulanmıştır; bunlar keş</w:t>
-      </w:r>
-      <w:r>
-        <w:t xml:space="preserve">if amaçlı (exploratory) okunmalı ve </w:t>
+        <w:t xml:space="preserve">FAIL grubunun string-fonksiyonu kullanımı (%47.1) PASS grubundan </w:t>
+      </w:r>
+      <w:r>
+        <w:t>(%37.5) yüksek, malloc/calloc kullanımı ise sıfırdır — bu, §IV-C'deki kök neden analiziyle tutarlıdır: başarısızlıkların çoğu string/karakter/sayı semantiğiyle ilgilidir; dinamik veri yapısı içeren programlar (bağlı liste, BST, hash tablosu) bu veri setind</w:t>
+      </w:r>
+      <w:r>
+        <w:t>e istisnasız PASS olmuştur. İşaretçi kullanımı ile PASS/FAIL arasındaki ilişki Fisher'in kesin testiyle de sınanmış, anlamlı bulunmamıştır (tablo=[[23,7],[17,10]], odds oranı=1.93, %95 GA=[0.61, 6.11], p=0.385) — güven aralığının 1.0'i içermesi ve genişliğ</w:t>
+      </w:r>
+      <w:r>
+        <w:t xml:space="preserve">i, küçük örneklemin doğal bir sonucudur. Bu veri setinde küçük örneklem büyüklüğü nedeniyle aynı veriler üzerinde birden fazla çıkarımsal test (Mann-Whitney, Fisher, bootstrap GA) uygulanmıştır; bunlar keşif amaçlı (exploratory) okunmalı ve </w:t>
       </w:r>
       <w:r>
         <w:lastRenderedPageBreak/>
-        <w:t>bir çoklu-karşılaştırma düzeltmesiyle birlikte değerlendirilmelidir (ayrıntılı düzeltme kontrolü: §V-B).</w:t>
+        <w:t>bir çoklu-karşı</w:t>
+      </w:r>
+      <w:r>
+        <w:t>laştırma düzeltmesiyle birlikte değerlendirilmelidir (ayrıntılı düzeltme kontrolü: §V-B).</w:t>
       </w:r>
     </w:p>
     <w:p>
@@ -3742,23 +3672,23 @@
         <w:jc w:val="both"/>
       </w:pPr>
       <w:r>
-        <w:t>17 başarısızlık 9 kök nedene ayrıştırılmıştır (Şekil 5, Tablo V): 8 kategoride (A-D, F-I) Rust</w:t>
-      </w:r>
-      <w:r>
-        <w:t xml:space="preserve"> kodu sözdizimsel olarak geçerlidir ve model, kaynağın özgül bit-genişliği/işaretlilik/sarma/kontrol-akışı sözleşmesini korumak yerine hedef dilin idiyomatik varsayılanını seçmiştir. Tek istisna kategori E'dir: aynı türden bir birebir aktarım Rust'ın tip g</w:t>
-      </w:r>
-      <w:r>
-        <w:t xml:space="preserve">üvenliği tarafından derleme aşamasında engellenmiştir — 17 başarısızlığın tek CE'si. Bu tanım ("derleyici uyarısı almadan geçme") teknik olarak savunulabilir olsa da tek katmanlıdır: 17 başarısızlığın 4'ü aslında çalışma zamanı panik'idir (RE) — gürültülü </w:t>
-      </w:r>
-      <w:r>
-        <w:t xml:space="preserve">ve kolayca </w:t>
+        <w:t xml:space="preserve">17 başarısızlık 9 kök nedene ayrıştırılmıştır (Şekil 5, Tablo V): 8 kategoride (A-D, F-I) Rust kodu sözdizimsel olarak geçerlidir ve model, </w:t>
+      </w:r>
+      <w:r>
+        <w:t>kaynağın özgül bit-genişliği/işaretlilik/sarma/kontrol-akışı sözleşmesini korumak yerine hedef dilin idiyomatik varsayılanını seçmiştir. Tek istisna kategori E'dir: aynı türden bir birebir aktarım Rust'ın tip güvenliği tarafından derleme aşamasında engelle</w:t>
+      </w:r>
+      <w:r>
+        <w:t xml:space="preserve">nmiştir — 17 başarısızlığın tek CE'si. Bu tanım ("derleyici uyarısı almadan geçme") teknik olarak savunulabilir olsa da tek katmanlıdır: 17 başarısızlığın 4'ü aslında çalışma zamanı panik'idir (RE) — gürültülü ve kolayca </w:t>
       </w:r>
       <w:r>
         <w:lastRenderedPageBreak/>
-        <w:t>fark edilen bir çökmedir; gerçek anlamda sessiz olanlar yalnızca 12 FE'dir (%70.6) — derlenir, çöküp panik vermeden çalışır, ama yanlış çıktı üretir. "Derleme aşamasında yakalanmamış" (%94.1) ve "çalışma zamanında da hiçbir sinyal üretmeden yanl</w:t>
-      </w:r>
-      <w:r>
-        <w:t>ış sonuç veren" (%70.6) biçiminde iki katmanlı bir çerçeveleme daha doğrudur.</w:t>
+        <w:t>fark edilen bir çökmedir; gerçek an</w:t>
+      </w:r>
+      <w:r>
+        <w:t>lamda sessiz olanlar yalnızca 12 FE'dir (%70.6) — derlenir, çöküp panik vermeden çalışır, ama yanlış çıktı üretir. "Derleme aşamasında yakalanmamış" (%94.1) ve "çalışma zamanında da hiçbir sinyal üretmeden yanlış sonuç veren" (%70.6) biçiminde iki katmanlı</w:t>
+      </w:r>
+      <w:r>
+        <w:t xml:space="preserve"> bir çerçeveleme daha doğrudur.</w:t>
       </w:r>
     </w:p>
     <w:p>
@@ -3841,19 +3771,19 @@
           <w:sz w:val="17"/>
         </w:rPr>
         <w:lastRenderedPageBreak/>
-        <w:t xml:space="preserve">TABLO V. DOKUZ KÖK NEDEN VE TEMSİLİ ÖRNEKLER </w:t>
+        <w:t xml:space="preserve">TABLO V. DOKUZ KÖK NEDEN VE TEMSİLİ ÖRNEKLER (s09,s14,s20 vb. veri setinin özgün ilk turundandır; </w:t>
       </w:r>
       <w:r>
         <w:rPr>
           <w:sz w:val="17"/>
         </w:rPr>
-        <w:t>(s09,s14,s20 vb. veri setinin özgün ilk turundandır; s49,s51,s52,s53 hakem ve danışman geri bildirimine yanıt olarak eklenen bağımsız 2. örneklerdir. † C ve F kategorilerinde "doğru" davranış referans platformun (Windows/LLP64) implementation-defined seçim</w:t>
+        <w:t>s49,s51,s52,s53 hakem ve danışman geri bildirimine yanıt olarak eklenen bağımsız 2. örneklerdir. † C ve F kategorilerinde "doğru" davranış referans platformun (Windows/LLP64) implementation-defined seçimine bağlıdır — bkz. §V-B. E kategorisinin ikinci örne</w:t>
       </w:r>
       <w:r>
         <w:rPr>
           <w:sz w:val="17"/>
         </w:rPr>
-        <w:t>ine bağlıdır — bkz. §V-B. E kategorisinin ikinci örneği (s50) Round 1'de PASS olduğundan bir başarısızlık örneği olarak burada listelenmemiştir.)</w:t>
+        <w:t>ği (s50) Round 1'de PASS olduğundan bir başarısızlık örneği olarak burada listelenmemiştir.)</w:t>
       </w:r>
     </w:p>
     <w:tbl>
@@ -4033,13 +3963,7 @@
               <w:rPr>
                 <w:sz w:val="16"/>
               </w:rPr>
-              <w:t>Mod-2ⁿ sarma → panik-eden va</w:t>
-            </w:r>
-            <w:r>
-              <w:rPr>
-                <w:sz w:val="16"/>
-              </w:rPr>
-              <w:t>rsayılan aritmetik</w:t>
+              <w:t>Mod-2ⁿ sarma → panik-eden varsayılan aritmetik</w:t>
             </w:r>
           </w:p>
         </w:tc>
@@ -4355,7 +4279,13 @@
               <w:rPr>
                 <w:sz w:val="16"/>
               </w:rPr>
-              <w:t>Değiştirilebilir global → static mut (unsafe)</w:t>
+              <w:t xml:space="preserve">Değiştirilebilir </w:t>
+            </w:r>
+            <w:r>
+              <w:rPr>
+                <w:sz w:val="16"/>
+              </w:rPr>
+              <w:t>global → static mut (unsafe)</w:t>
             </w:r>
           </w:p>
         </w:tc>
@@ -4555,13 +4485,7 @@
               <w:rPr>
                 <w:sz w:val="16"/>
               </w:rPr>
-              <w:t>Switch</w:t>
-            </w:r>
-            <w:r>
-              <w:rPr>
-                <w:sz w:val="16"/>
-              </w:rPr>
-              <w:t xml:space="preserve"> fallthrough</w:t>
+              <w:t>Switch fallthrough</w:t>
             </w:r>
           </w:p>
         </w:tc>
@@ -4598,7 +4522,13 @@
               <w:rPr>
                 <w:sz w:val="16"/>
               </w:rPr>
-              <w:t>Kümülatif düşme → bağımsız match kolları</w:t>
+              <w:t xml:space="preserve">Kümülatif düşme → </w:t>
+            </w:r>
+            <w:r>
+              <w:rPr>
+                <w:sz w:val="16"/>
+              </w:rPr>
+              <w:t>bağımsız match kolları</w:t>
             </w:r>
           </w:p>
         </w:tc>
@@ -4705,13 +4635,13 @@
       </w:pPr>
       <w:r>
         <w:lastRenderedPageBreak/>
-        <w:t xml:space="preserve">Doğrulama iki farklı biçimde gerçekleşmiştir: (a) dört kategori (C, F, G, H) veri </w:t>
-      </w:r>
-      <w:r>
-        <w:t xml:space="preserve">setimiz içinde bağımsız olarak tasarlanmış, farklı bir kod deseni kullanan ikinci bir örnekle (s49, s51, s52, s53) yeniden sınanmış ve kök neden her dördünde de tekrarlanmıştır (§IV-F); (b) kategori D üç ayrı, birbirinden bağımsız kod tabanında (iki kendi </w:t>
-      </w:r>
-      <w:r>
-        <w:t>yazdığımız örnek + cJSON [8]) tekrarlanmış; kategori A ise veri setimizin kendi içinde iki örnekte (s09, s14) görülmüştür. Bu ikisi birlikte, boşlukların veri setine özgü bir tuhaflık değil sistematik C↔Rust farkları olduğunu gösterir.</w:t>
+        <w:t xml:space="preserve">Doğrulama iki farklı biçimde gerçekleşmiştir: (a) dört kategori (C, F, G, H) veri setimiz içinde bağımsız olarak tasarlanmış, </w:t>
+      </w:r>
+      <w:r>
+        <w:t xml:space="preserve">farklı bir kod deseni kullanan ikinci bir örnekle (s49, s51, s52, s53) yeniden sınanmış ve kök neden her dördünde de tekrarlanmıştır (§IV-F); (b) kategori D üç ayrı, birbirinden bağımsız kod tabanında (iki kendi yazdığımız örnek + cJSON [8]) tekrarlanmış; </w:t>
+      </w:r>
+      <w:r>
+        <w:t>kategori A ise veri setimizin kendi içinde iki örnekte (s09, s14) görülmüştür. Bu ikisi birlikte, boşlukların veri setine özgü bir tuhaflık değil sistematik C↔Rust farkları olduğunu gösterir.</w:t>
       </w:r>
     </w:p>
     <w:p>
@@ -4723,14 +4653,7 @@
           <w:b/>
           <w:i/>
         </w:rPr>
-        <w:t>D. Derleme Modu ve İ</w:t>
-      </w:r>
-      <w:r>
-        <w:rPr>
-          <w:b/>
-          <w:i/>
-        </w:rPr>
-        <w:t>yileştirme Döngüsünün Etkisi</w:t>
+        <w:t>D. Derleme Modu ve İyileştirme Döngüsünün Etkisi</w:t>
       </w:r>
     </w:p>
     <w:p>
@@ -4739,13 +4662,16 @@
       </w:pPr>
       <w:r>
         <w:lastRenderedPageBreak/>
-        <w:t>Release modu EA'yı %70.18'den %73.68'e çıkarır; artışın tamamı iki RE örneğinin (s09, s14, unsigned taşma) sessizce sarmasından gelir — bir düzeltme değil, farklı yapılandırmada tesadüfen doğru sonuçtur; 12 FE'nin hiçbirini etk</w:t>
-      </w:r>
-      <w:r>
-        <w:t>ilemez. Round 2'de (zengin/oracle geri bildirim, yalnızca Claude üzerinde ölçülmüştür) EA %100'e ulaşır, ama bu bir üst sınırdır: Tablo VI, Round 1'de başarısız olan aynı 17 örneğin yeniden çevrilip 57 programlık tam veri setinin geri kalanıyla birlikte ye</w:t>
-      </w:r>
-      <w:r>
-        <w:t>niden değerlendirilmesiyle hesaplanan EA'yı gösterir — kısıtlı geri bildirim seviyelerinde doğruluğun %86.0'a (Seviye B) ve %71.9'a (Seviye C, yalnızca başarısız test sayısı) düştüğünü ortaya koyar.</w:t>
+        <w:t>Release modu EA</w:t>
+      </w:r>
+      <w:r>
+        <w:t>'yı %70.18'den %73.68'e çıkarır; artışın tamamı iki RE örneğinin (s09, s14, unsigned taşma) sessizce sarmasından gelir — bir düzeltme değil, farklı yapılandırmada tesadüfen doğru sonuçtur; 12 FE'nin hiçbirini etkilemez. Round 2'de (zengin/oracle geri bildi</w:t>
+      </w:r>
+      <w:r>
+        <w:t xml:space="preserve">rim, yalnızca Claude üzerinde ölçülmüştür) EA %100'e ulaşır, ama bu bir üst sınırdır: Tablo VI, Round 1'de başarısız olan aynı 17 örneğin yeniden çevrilip 57 programlık tam veri setinin geri kalanıyla birlikte yeniden değerlendirilmesiyle hesaplanan EA'yı </w:t>
+      </w:r>
+      <w:r>
+        <w:t>gösterir — kısıtlı geri bildirim seviyelerinde doğruluğun %86.0'a (Seviye B) ve %71.9'a (Seviye C, yalnızca başarısız test sayısı) düştüğünü ortaya koyar.</w:t>
       </w:r>
     </w:p>
     <w:p>
@@ -4769,13 +4695,13 @@
           <w:sz w:val="17"/>
         </w:rPr>
         <w:lastRenderedPageBreak/>
-        <w:t>TABLO VI. ÜÇ GERİ BİLDİRİM SEVİ</w:t>
+        <w:t>TABLO VI. ÜÇ GERİ BİLDİRİM SEVİYESİNİN KARŞILAŞTIRMASI, CLAUDE (n=57; yalnı</w:t>
       </w:r>
       <w:r>
         <w:rPr>
           <w:sz w:val="17"/>
         </w:rPr>
-        <w:t>YESİNİN KARŞILAŞTIRMASI, CLAUDE (n=57; yalnızca Round 1'de başarısız olan 17 örnek yeniden çevrilmiş, EA tüm 57 program üzerinden yeniden hesaplanmıştır).</w:t>
+        <w:t>zca Round 1'de başarısız olan 17 örnek yeniden çevrilmiş, EA tüm 57 program üzerinden yeniden hesaplanmıştır).</w:t>
       </w:r>
     </w:p>
     <w:tbl>
@@ -4937,13 +4863,7 @@
               <w:rPr>
                 <w:sz w:val="16"/>
               </w:rPr>
-              <w:t xml:space="preserve">B </w:t>
-            </w:r>
-            <w:r>
-              <w:rPr>
-                <w:sz w:val="16"/>
-              </w:rPr>
-              <w:t>(CI-benzeri)</w:t>
+              <w:t>B (CI-benzeri)</w:t>
             </w:r>
           </w:p>
         </w:tc>
@@ -4961,7 +4881,13 @@
               <w:rPr>
                 <w:sz w:val="16"/>
               </w:rPr>
-              <w:t>Derleyici/panik metni tam; FE'de yalnızca girdi</w:t>
+              <w:t xml:space="preserve">Derleyici/panik metni tam; FE'de </w:t>
+            </w:r>
+            <w:r>
+              <w:rPr>
+                <w:sz w:val="16"/>
+              </w:rPr>
+              <w:t>yalnızca girdi</w:t>
             </w:r>
           </w:p>
         </w:tc>
@@ -18271,7 +18197,7 @@
 </file>
 
 <file path=customXml/itemProps1.xml><?xml version="1.0" encoding="utf-8"?>
-<ds:datastoreItem xmlns:ds="http://schemas.openxmlformats.org/officeDocument/2006/customXml" ds:itemID="{28C9BE70-711F-4CBE-9096-DA98FF261880}">
+<ds:datastoreItem xmlns:ds="http://schemas.openxmlformats.org/officeDocument/2006/customXml" ds:itemID="{C0F83BEE-E79D-41A4-86E3-56A8F445FCBB}">
   <ds:schemaRefs>
     <ds:schemaRef ds:uri="http://schemas.openxmlformats.org/officeDocument/2006/bibliography"/>
   </ds:schemaRefs>

</xml_diff>

<commit_message>
Tesekkur bolumunu makaleden tamamen kaldir
</commit_message>
<xml_diff>
--- a/makale_IEEE_v1.docx
+++ b/makale_IEEE_v1.docx
@@ -6044,31 +6044,6 @@
           <w:b/>
           <w:sz w:val="21"/>
         </w:rPr>
-        <w:t>TEŞEKKÜR</w:t>
-      </w:r>
-    </w:p>
-    <w:p>
-      <w:pPr>
-        <w:jc w:val="both"/>
-      </w:pPr>
-      <w:r>
-        <w:t>Bu çalışma harici bir fon almamıştır. Deneyin çoklu model, istatistiksel</w:t>
-      </w:r>
-      <w:r>
-        <w:t xml:space="preserve"> güç, çok dosyalı kod ve çoklu platform yönünde genişletilmesi, süreçte aldığımız geri bildirimlerde belirtilen eksiklikleri gidermeye yöneliktir.</w:t>
-      </w:r>
-    </w:p>
-    <w:p>
-      <w:pPr>
-        <w:spacing w:before="200" w:after="80"/>
-        <w:jc w:val="center"/>
-      </w:pPr>
-      <w:r>
-        <w:rPr>
-          <w:b/>
-          <w:sz w:val="21"/>
-        </w:rPr>
-        <w:lastRenderedPageBreak/>
         <w:t>KAYNAKÇA</w:t>
       </w:r>
     </w:p>
@@ -6081,13 +6056,13 @@
         <w:rPr>
           <w:sz w:val="18"/>
         </w:rPr>
-        <w:t>[1] H. F. Eniser, H. Zhang, C. David, M. Wang, M. Christakis, B. Paulsen, J. Dodds, and D. Kroening,</w:t>
+        <w:t xml:space="preserve">[1] H. F. Eniser, H. Zhang, C. David, M. Wang, M. Christakis, B. </w:t>
       </w:r>
       <w:r>
         <w:rPr>
           <w:sz w:val="18"/>
         </w:rPr>
-        <w:t xml:space="preserve"> "Towards Translating Real-World Code with LLMs: A Study of Translating to Rust," arXiv:2405.11514, 2024.</w:t>
+        <w:t>Paulsen, J. Dodds, and D. Kroening, "Towards Translating Real-World Code with LLMs: A Study of Translating to Rust," arXiv:2405.11514, 2024.</w:t>
       </w:r>
     </w:p>
     <w:p>
@@ -6099,43 +6074,38 @@
         <w:rPr>
           <w:sz w:val="18"/>
         </w:rPr>
-        <w:t>[2] S. Gandhi, M. Patwardhan, J. Khatri, L. Vig, and R. K. Medicherla, "Translation of Low-Resource COBOL to Logically Correct and Readable Java lever</w:t>
+        <w:t>[2] S. Gandhi, M. Patwardhan, J. Khatri, L. Vig, and R. K. Medicherla, "Translation of Low-Resource COBOL to Logica</w:t>
       </w:r>
       <w:r>
         <w:rPr>
           <w:sz w:val="18"/>
         </w:rPr>
-        <w:t>aging High-Resource Java Refinement," in Proc. 1st Int. Workshop on Large Language Models for Code (LLM4Code '24), ICSE 2024, Lisbon, Portugal, pp. 46-53, doi: 10.1145/3643795.3648388.</w:t>
-      </w:r>
-    </w:p>
-    <w:p>
-      <w:pPr>
-        <w:spacing w:after="40"/>
-        <w:ind w:left="198" w:hanging="198"/>
-      </w:pPr>
+        <w:t xml:space="preserve">lly </w:t>
+      </w:r>
       <w:r>
         <w:rPr>
           <w:sz w:val="18"/>
         </w:rPr>
-        <w:t>[3] X. Yin, C. Ni, T. N. Nguyen, S. Wang, and X. Yang, "Rectifier: Code</w:t>
-      </w:r>
+        <w:lastRenderedPageBreak/>
+        <w:t>Correct and Readable Java leveraging High-Resource Java Refinement," in Proc. 1st Int. Workshop on Large Language Models for Code (LLM4Code '24), ICSE 2024, Lisbon, Portugal, pp. 46-53, doi: 10.1145/3643795.3648388.</w:t>
+      </w:r>
+    </w:p>
+    <w:p>
+      <w:pPr>
+        <w:spacing w:after="40"/>
+        <w:ind w:left="198" w:hanging="198"/>
+      </w:pPr>
       <w:r>
         <w:rPr>
           <w:sz w:val="18"/>
         </w:rPr>
-        <w:t xml:space="preserve"> Translation with Corrector via LLMs," arXiv:2407.07472, 2024.</w:t>
-      </w:r>
-    </w:p>
-    <w:p>
-      <w:pPr>
-        <w:spacing w:after="40"/>
-        <w:ind w:left="198" w:hanging="198"/>
-      </w:pPr>
+        <w:t xml:space="preserve">[3] X. Yin, C. Ni, T. N. Nguyen, S. </w:t>
+      </w:r>
       <w:r>
         <w:rPr>
           <w:sz w:val="18"/>
         </w:rPr>
-        <w:t>[4] Rosetta Code, rosettacode.org — Luhn test, Soundex, Levenshtein distance, 0-1 Knapsack, Towers of Hanoi, LCS, CRC-32 (C solutions). [Online]. Available: github.com/acmeism/RosettaCodeData</w:t>
+        <w:t>Wang, and X. Yang, "Rectifier: Code Translation with Corrector via LLMs," arXiv:2407.07472, 2024.</w:t>
       </w:r>
     </w:p>
     <w:p>
@@ -6147,13 +6117,13 @@
         <w:rPr>
           <w:sz w:val="18"/>
         </w:rPr>
-        <w:t>[</w:t>
+        <w:t>[4] Rosetta Code, rosettacode.org — Luhn test, Soundex, Levenshtein distance, 0-1 Knapsack, Towers of Hanoi, LCS, CRC-32 (C solutions). [Online]. Available: g</w:t>
       </w:r>
       <w:r>
         <w:rPr>
           <w:sz w:val="18"/>
         </w:rPr>
-        <w:t>5] The Regents of the Univ. of California / OpenBSD and FreeBSD Projects, getopt.c (1987), strtol.c (1990), heapsort.c (1991). [Online]. Available: github.com/openbsd/src, github.com/freebsd/freebsd-src</w:t>
+        <w:t>ithub.com/acmeism/RosettaCodeData</w:t>
       </w:r>
     </w:p>
     <w:p>
@@ -6165,13 +6135,25 @@
         <w:rPr>
           <w:sz w:val="18"/>
         </w:rPr>
-        <w:t>[6] musl libc Project (R. Felker et al.), qsort.c (sm</w:t>
-      </w:r>
+        <w:t>[5] The Regents of the Univ. of California / OpenBSD and FreeBSD Projects, getopt.c (1987), strtol.c (1990), heapsort.c (1991). [Online]. Available: github.com/openbsd/src, github.com/freebsd/freebsd-src</w:t>
+      </w:r>
+    </w:p>
+    <w:p>
+      <w:pPr>
+        <w:spacing w:after="40"/>
+        <w:ind w:left="198" w:hanging="198"/>
+      </w:pPr>
       <w:r>
         <w:rPr>
           <w:sz w:val="18"/>
         </w:rPr>
-        <w:t>oothsort, L. Ochs, 2011). [Online]. Available: github.com/kraj/musl</w:t>
+        <w:t>[6] musl libc Proj</w:t>
+      </w:r>
+      <w:r>
+        <w:rPr>
+          <w:sz w:val="18"/>
+        </w:rPr>
+        <w:t>ect (R. Felker et al.), qsort.c (smoothsort, L. Ochs, 2011). [Online]. Available: github.com/kraj/musl</w:t>
       </w:r>
     </w:p>
     <w:p>
@@ -6195,13 +6177,13 @@
         <w:rPr>
           <w:sz w:val="18"/>
         </w:rPr>
-        <w:t>[8] D. Gamble et al., cJSON.c (parse_number, print_number). [Online].</w:t>
+        <w:t>[8] D. Gamble et al., cJSON.c (par</w:t>
       </w:r>
       <w:r>
         <w:rPr>
           <w:sz w:val="18"/>
         </w:rPr>
-        <w:t xml:space="preserve"> Available: github.com/DaveGamble/cJSON</w:t>
+        <w:t>se_number, print_number). [Online]. Available: github.com/DaveGamble/cJSON</w:t>
       </w:r>
     </w:p>
     <w:p>
@@ -6225,13 +6207,19 @@
         <w:rPr>
           <w:sz w:val="18"/>
         </w:rPr>
-        <w:t>[10] Cybersecurity and Infrastructure Security Agency (CISA), National Security Agency (NSA), Federal Bureau of</w:t>
+        <w:t>[10] Cybersecurity and Infrastructure Security Agency (CISA), National Secur</w:t>
       </w:r>
       <w:r>
         <w:rPr>
           <w:sz w:val="18"/>
         </w:rPr>
-        <w:t xml:space="preserve"> Investigation (FBI) et al., "The Case for Memory Safe Roadmaps: Why both C-Suite Executives and Technical Experts Need to Take Memory Safe Coding Seriously," joint cybersecurity guidance, Dec. 2023. [Online]. Available: cisa.gov/case-memory-safe-roadmaps</w:t>
+        <w:t xml:space="preserve">ity Agency (NSA), Federal Bureau of Investigation (FBI) et al., "The Case for Memory Safe Roadmaps: Why both C-Suite Executives and Technical Experts Need to Take Memory Safe Coding Seriously," joint cybersecurity guidance, Dec. 2023. [Online]. Available: </w:t>
+      </w:r>
+      <w:r>
+        <w:rPr>
+          <w:sz w:val="18"/>
+        </w:rPr>
+        <w:t>cisa.gov/case-memory-safe-roadmaps</w:t>
       </w:r>
     </w:p>
     <w:p>
@@ -6255,13 +6243,13 @@
         <w:rPr>
           <w:sz w:val="18"/>
         </w:rPr>
-        <w:t>[12] B. Rozière, M.-A. Lachaux, L. Chanussot, and G. Lample, "Unsupervised Translation of Programming Languages," in Advances in Neu</w:t>
+        <w:t>[12] B. Rozière, M.-A. Lachaux, L. Chanussot, and G. Lample, "Unsupervised Translation of Program</w:t>
       </w:r>
       <w:r>
         <w:rPr>
           <w:sz w:val="18"/>
         </w:rPr>
-        <w:t>ral Information Processing Systems (NeurIPS) 33, 2020, arXiv:2006.03511.</w:t>
+        <w:t>ming Languages," in Advances in Neural Information Processing Systems (NeurIPS) 33, 2020, arXiv:2006.03511.</w:t>
       </w:r>
     </w:p>
     <w:p>
@@ -6273,7 +6261,13 @@
         <w:rPr>
           <w:sz w:val="18"/>
         </w:rPr>
-        <w:t>[13] J. M. Hoenig and D. M. Heisey, "The Abuse of Power: The Pervasive Fallacy of Power Calculations for Data Analysis," The American Statistician, vol. 55, no. 1, pp. 19-24, 2001.</w:t>
+        <w:t xml:space="preserve">[13] J. M. Hoenig and D. M. Heisey, "The Abuse of Power: The Pervasive Fallacy of Power Calculations for Data Analysis," The American Statistician, </w:t>
+      </w:r>
+      <w:r>
+        <w:rPr>
+          <w:sz w:val="18"/>
+        </w:rPr>
+        <w:t>vol. 55, no. 1, pp. 19-24, 2001.</w:t>
       </w:r>
     </w:p>
     <w:sectPr>
@@ -18197,7 +18191,7 @@
 </file>
 
 <file path=customXml/itemProps1.xml><?xml version="1.0" encoding="utf-8"?>
-<ds:datastoreItem xmlns:ds="http://schemas.openxmlformats.org/officeDocument/2006/customXml" ds:itemID="{C0F83BEE-E79D-41A4-86E3-56A8F445FCBB}">
+<ds:datastoreItem xmlns:ds="http://schemas.openxmlformats.org/officeDocument/2006/customXml" ds:itemID="{DB728A60-65C6-4775-82CB-07C44DFEF48C}">
   <ds:schemaRefs>
     <ds:schemaRef ds:uri="http://schemas.openxmlformats.org/officeDocument/2006/bibliography"/>
   </ds:schemaRefs>

</xml_diff>

<commit_message>
Tablolarin okunabilirligini artir: daha buyuk punto, daha ferah hucre araligi
- Tum tablolarda hucre ici bosluk (space_before/after) 1pt'den 2.5pt'e cikarildi,
  satir araligi 1.15 yapildi
- En kucuk puntolu tablolar yukseltildi: Tablo II 7.6->8.5pt (sutunlar da
  hafifce genisletildi, tek-sutun genislik siniri icinde), Tablo VII 7.8->9pt
- Diger tum tablolar (I, III, IV, V, VI) 8pt->9pt
</commit_message>
<xml_diff>
--- a/makale_IEEE_v1.docx
+++ b/makale_IEEE_v1.docx
@@ -590,14 +590,14 @@
           </w:tcPr>
           <w:p>
             <w:pPr>
-              <w:spacing w:before="20" w:after="20"/>
+              <w:spacing w:before="50" w:after="50" w:line="276" w:lineRule="auto"/>
               <w:jc w:val="center"/>
             </w:pPr>
             <w:r>
               <w:rPr>
                 <w:b/>
                 <w:color w:val="FFFFFF"/>
-                <w:sz w:val="16"/>
+                <w:sz w:val="18"/>
               </w:rPr>
               <w:t>Kategori</w:t>
             </w:r>
@@ -611,14 +611,14 @@
           </w:tcPr>
           <w:p>
             <w:pPr>
-              <w:spacing w:before="20" w:after="20"/>
+              <w:spacing w:before="50" w:after="50" w:line="276" w:lineRule="auto"/>
               <w:jc w:val="center"/>
             </w:pPr>
             <w:r>
               <w:rPr>
                 <w:b/>
                 <w:color w:val="FFFFFF"/>
-                <w:sz w:val="16"/>
+                <w:sz w:val="18"/>
               </w:rPr>
               <w:t>Örnekler</w:t>
             </w:r>
@@ -632,14 +632,14 @@
           </w:tcPr>
           <w:p>
             <w:pPr>
-              <w:spacing w:before="20" w:after="20"/>
+              <w:spacing w:before="50" w:after="50" w:line="276" w:lineRule="auto"/>
               <w:jc w:val="center"/>
             </w:pPr>
             <w:r>
               <w:rPr>
                 <w:b/>
                 <w:color w:val="FFFFFF"/>
-                <w:sz w:val="16"/>
+                <w:sz w:val="18"/>
               </w:rPr>
               <w:t>Sayı</w:t>
             </w:r>
@@ -653,14 +653,14 @@
           </w:tcPr>
           <w:p>
             <w:pPr>
-              <w:spacing w:before="20" w:after="20"/>
+              <w:spacing w:before="50" w:after="50" w:line="276" w:lineRule="auto"/>
               <w:jc w:val="center"/>
             </w:pPr>
             <w:r>
               <w:rPr>
                 <w:b/>
                 <w:color w:val="FFFFFF"/>
-                <w:sz w:val="16"/>
+                <w:sz w:val="18"/>
               </w:rPr>
               <w:t>LoC</w:t>
             </w:r>
@@ -674,14 +674,14 @@
           </w:tcPr>
           <w:p>
             <w:pPr>
-              <w:spacing w:before="20" w:after="20"/>
+              <w:spacing w:before="50" w:after="50" w:line="276" w:lineRule="auto"/>
               <w:jc w:val="center"/>
             </w:pPr>
             <w:r>
               <w:rPr>
                 <w:b/>
                 <w:color w:val="FFFFFF"/>
-                <w:sz w:val="16"/>
+                <w:sz w:val="18"/>
               </w:rPr>
               <w:t>Kaynak</w:t>
             </w:r>
@@ -700,11 +700,11 @@
           </w:tcPr>
           <w:p>
             <w:pPr>
-              <w:spacing w:before="20" w:after="20"/>
-            </w:pPr>
-            <w:r>
-              <w:rPr>
-                <w:sz w:val="16"/>
+              <w:spacing w:before="50" w:after="50" w:line="276" w:lineRule="auto"/>
+            </w:pPr>
+            <w:r>
+              <w:rPr>
+                <w:sz w:val="18"/>
               </w:rPr>
               <w:t>Temel algoritmalar</w:t>
             </w:r>
@@ -718,11 +718,11 @@
           </w:tcPr>
           <w:p>
             <w:pPr>
-              <w:spacing w:before="20" w:after="20"/>
-            </w:pPr>
-            <w:r>
-              <w:rPr>
-                <w:sz w:val="16"/>
+              <w:spacing w:before="50" w:after="50" w:line="276" w:lineRule="auto"/>
+            </w:pPr>
+            <w:r>
+              <w:rPr>
+                <w:sz w:val="18"/>
               </w:rPr>
               <w:t>s01-s24</w:t>
             </w:r>
@@ -736,12 +736,12 @@
           </w:tcPr>
           <w:p>
             <w:pPr>
-              <w:spacing w:before="20" w:after="20"/>
+              <w:spacing w:before="50" w:after="50" w:line="276" w:lineRule="auto"/>
               <w:jc w:val="center"/>
             </w:pPr>
             <w:r>
               <w:rPr>
-                <w:sz w:val="16"/>
+                <w:sz w:val="18"/>
               </w:rPr>
               <w:t>24</w:t>
             </w:r>
@@ -755,12 +755,12 @@
           </w:tcPr>
           <w:p>
             <w:pPr>
-              <w:spacing w:before="20" w:after="20"/>
+              <w:spacing w:before="50" w:after="50" w:line="276" w:lineRule="auto"/>
               <w:jc w:val="center"/>
             </w:pPr>
             <w:r>
               <w:rPr>
-                <w:sz w:val="16"/>
+                <w:sz w:val="18"/>
               </w:rPr>
               <w:t>10-88</w:t>
             </w:r>
@@ -774,11 +774,11 @@
           </w:tcPr>
           <w:p>
             <w:pPr>
-              <w:spacing w:before="20" w:after="20"/>
-            </w:pPr>
-            <w:r>
-              <w:rPr>
-                <w:sz w:val="16"/>
+              <w:spacing w:before="50" w:after="50" w:line="276" w:lineRule="auto"/>
+            </w:pPr>
+            <w:r>
+              <w:rPr>
+                <w:sz w:val="18"/>
               </w:rPr>
               <w:t>Özgün</w:t>
             </w:r>
@@ -797,11 +797,11 @@
           </w:tcPr>
           <w:p>
             <w:pPr>
-              <w:spacing w:before="20" w:after="20"/>
-            </w:pPr>
-            <w:r>
-              <w:rPr>
-                <w:sz w:val="16"/>
+              <w:spacing w:before="50" w:after="50" w:line="276" w:lineRule="auto"/>
+            </w:pPr>
+            <w:r>
+              <w:rPr>
+                <w:sz w:val="18"/>
               </w:rPr>
               <w:t>Uzun özgün</w:t>
             </w:r>
@@ -815,11 +815,11 @@
           </w:tcPr>
           <w:p>
             <w:pPr>
-              <w:spacing w:before="20" w:after="20"/>
-            </w:pPr>
-            <w:r>
-              <w:rPr>
-                <w:sz w:val="16"/>
+              <w:spacing w:before="50" w:after="50" w:line="276" w:lineRule="auto"/>
+            </w:pPr>
+            <w:r>
+              <w:rPr>
+                <w:sz w:val="18"/>
               </w:rPr>
               <w:t>s25-s29</w:t>
             </w:r>
@@ -833,12 +833,12 @@
           </w:tcPr>
           <w:p>
             <w:pPr>
-              <w:spacing w:before="20" w:after="20"/>
+              <w:spacing w:before="50" w:after="50" w:line="276" w:lineRule="auto"/>
               <w:jc w:val="center"/>
             </w:pPr>
             <w:r>
               <w:rPr>
-                <w:sz w:val="16"/>
+                <w:sz w:val="18"/>
               </w:rPr>
               <w:t>5</w:t>
             </w:r>
@@ -852,12 +852,12 @@
           </w:tcPr>
           <w:p>
             <w:pPr>
-              <w:spacing w:before="20" w:after="20"/>
+              <w:spacing w:before="50" w:after="50" w:line="276" w:lineRule="auto"/>
               <w:jc w:val="center"/>
             </w:pPr>
             <w:r>
               <w:rPr>
-                <w:sz w:val="16"/>
+                <w:sz w:val="18"/>
               </w:rPr>
               <w:t>69-141</w:t>
             </w:r>
@@ -871,11 +871,11 @@
           </w:tcPr>
           <w:p>
             <w:pPr>
-              <w:spacing w:before="20" w:after="20"/>
-            </w:pPr>
-            <w:r>
-              <w:rPr>
-                <w:sz w:val="16"/>
+              <w:spacing w:before="50" w:after="50" w:line="276" w:lineRule="auto"/>
+            </w:pPr>
+            <w:r>
+              <w:rPr>
+                <w:sz w:val="18"/>
               </w:rPr>
               <w:t>Özgün</w:t>
             </w:r>
@@ -894,11 +894,11 @@
           </w:tcPr>
           <w:p>
             <w:pPr>
-              <w:spacing w:before="20" w:after="20"/>
-            </w:pPr>
-            <w:r>
-              <w:rPr>
-                <w:sz w:val="16"/>
+              <w:spacing w:before="50" w:after="50" w:line="276" w:lineRule="auto"/>
+            </w:pPr>
+            <w:r>
+              <w:rPr>
+                <w:sz w:val="18"/>
               </w:rPr>
               <w:t>Rosetta Code</w:t>
             </w:r>
@@ -912,11 +912,11 @@
           </w:tcPr>
           <w:p>
             <w:pPr>
-              <w:spacing w:before="20" w:after="20"/>
-            </w:pPr>
-            <w:r>
-              <w:rPr>
-                <w:sz w:val="16"/>
+              <w:spacing w:before="50" w:after="50" w:line="276" w:lineRule="auto"/>
+            </w:pPr>
+            <w:r>
+              <w:rPr>
+                <w:sz w:val="18"/>
               </w:rPr>
               <w:t>s30-s36</w:t>
             </w:r>
@@ -930,12 +930,12 @@
           </w:tcPr>
           <w:p>
             <w:pPr>
-              <w:spacing w:before="20" w:after="20"/>
+              <w:spacing w:before="50" w:after="50" w:line="276" w:lineRule="auto"/>
               <w:jc w:val="center"/>
             </w:pPr>
             <w:r>
               <w:rPr>
-                <w:sz w:val="16"/>
+                <w:sz w:val="18"/>
               </w:rPr>
               <w:t>7</w:t>
             </w:r>
@@ -949,12 +949,12 @@
           </w:tcPr>
           <w:p>
             <w:pPr>
-              <w:spacing w:before="20" w:after="20"/>
+              <w:spacing w:before="50" w:after="50" w:line="276" w:lineRule="auto"/>
               <w:jc w:val="center"/>
             </w:pPr>
             <w:r>
               <w:rPr>
-                <w:sz w:val="16"/>
+                <w:sz w:val="18"/>
               </w:rPr>
               <w:t>27-71</w:t>
             </w:r>
@@ -968,11 +968,11 @@
           </w:tcPr>
           <w:p>
             <w:pPr>
-              <w:spacing w:before="20" w:after="20"/>
-            </w:pPr>
-            <w:r>
-              <w:rPr>
-                <w:sz w:val="16"/>
+              <w:spacing w:before="50" w:after="50" w:line="276" w:lineRule="auto"/>
+            </w:pPr>
+            <w:r>
+              <w:rPr>
+                <w:sz w:val="18"/>
               </w:rPr>
               <w:t>Bağımsız*</w:t>
             </w:r>
@@ -991,11 +991,11 @@
           </w:tcPr>
           <w:p>
             <w:pPr>
-              <w:spacing w:before="20" w:after="20"/>
-            </w:pPr>
-            <w:r>
-              <w:rPr>
-                <w:sz w:val="16"/>
+              <w:spacing w:before="50" w:after="50" w:line="276" w:lineRule="auto"/>
+            </w:pPr>
+            <w:r>
+              <w:rPr>
+                <w:sz w:val="18"/>
               </w:rPr>
               <w:t>BSD libc</w:t>
             </w:r>
@@ -1009,11 +1009,11 @@
           </w:tcPr>
           <w:p>
             <w:pPr>
-              <w:spacing w:before="20" w:after="20"/>
-            </w:pPr>
-            <w:r>
-              <w:rPr>
-                <w:sz w:val="16"/>
+              <w:spacing w:before="50" w:after="50" w:line="276" w:lineRule="auto"/>
+            </w:pPr>
+            <w:r>
+              <w:rPr>
+                <w:sz w:val="18"/>
               </w:rPr>
               <w:t>s37-s39</w:t>
             </w:r>
@@ -1027,12 +1027,12 @@
           </w:tcPr>
           <w:p>
             <w:pPr>
-              <w:spacing w:before="20" w:after="20"/>
+              <w:spacing w:before="50" w:after="50" w:line="276" w:lineRule="auto"/>
               <w:jc w:val="center"/>
             </w:pPr>
             <w:r>
               <w:rPr>
-                <w:sz w:val="16"/>
+                <w:sz w:val="18"/>
               </w:rPr>
               <w:t>3</w:t>
             </w:r>
@@ -1046,12 +1046,12 @@
           </w:tcPr>
           <w:p>
             <w:pPr>
-              <w:spacing w:before="20" w:after="20"/>
+              <w:spacing w:before="50" w:after="50" w:line="276" w:lineRule="auto"/>
               <w:jc w:val="center"/>
             </w:pPr>
             <w:r>
               <w:rPr>
-                <w:sz w:val="16"/>
+                <w:sz w:val="18"/>
               </w:rPr>
               <w:t>143-154</w:t>
             </w:r>
@@ -1065,11 +1065,11 @@
           </w:tcPr>
           <w:p>
             <w:pPr>
-              <w:spacing w:before="20" w:after="20"/>
-            </w:pPr>
-            <w:r>
-              <w:rPr>
-                <w:sz w:val="16"/>
+              <w:spacing w:before="50" w:after="50" w:line="276" w:lineRule="auto"/>
+            </w:pPr>
+            <w:r>
+              <w:rPr>
+                <w:sz w:val="18"/>
               </w:rPr>
               <w:t>Bağımsız**</w:t>
             </w:r>
@@ -1088,11 +1088,11 @@
           </w:tcPr>
           <w:p>
             <w:pPr>
-              <w:spacing w:before="20" w:after="20"/>
-            </w:pPr>
-            <w:r>
-              <w:rPr>
-                <w:sz w:val="16"/>
+              <w:spacing w:before="50" w:after="50" w:line="276" w:lineRule="auto"/>
+            </w:pPr>
+            <w:r>
+              <w:rPr>
+                <w:sz w:val="18"/>
               </w:rPr>
               <w:t>Hedeflenmemiş boşluk</w:t>
             </w:r>
@@ -1106,11 +1106,11 @@
           </w:tcPr>
           <w:p>
             <w:pPr>
-              <w:spacing w:before="20" w:after="20"/>
-            </w:pPr>
-            <w:r>
-              <w:rPr>
-                <w:sz w:val="16"/>
+              <w:spacing w:before="50" w:after="50" w:line="276" w:lineRule="auto"/>
+            </w:pPr>
+            <w:r>
+              <w:rPr>
+                <w:sz w:val="18"/>
               </w:rPr>
               <w:t>s40-s45</w:t>
             </w:r>
@@ -1124,12 +1124,12 @@
           </w:tcPr>
           <w:p>
             <w:pPr>
-              <w:spacing w:before="20" w:after="20"/>
+              <w:spacing w:before="50" w:after="50" w:line="276" w:lineRule="auto"/>
               <w:jc w:val="center"/>
             </w:pPr>
             <w:r>
               <w:rPr>
-                <w:sz w:val="16"/>
+                <w:sz w:val="18"/>
               </w:rPr>
               <w:t>6</w:t>
             </w:r>
@@ -1143,12 +1143,12 @@
           </w:tcPr>
           <w:p>
             <w:pPr>
-              <w:spacing w:before="20" w:after="20"/>
+              <w:spacing w:before="50" w:after="50" w:line="276" w:lineRule="auto"/>
               <w:jc w:val="center"/>
             </w:pPr>
             <w:r>
               <w:rPr>
-                <w:sz w:val="16"/>
+                <w:sz w:val="18"/>
               </w:rPr>
               <w:t>21-43</w:t>
             </w:r>
@@ -1162,11 +1162,11 @@
           </w:tcPr>
           <w:p>
             <w:pPr>
-              <w:spacing w:before="20" w:after="20"/>
-            </w:pPr>
-            <w:r>
-              <w:rPr>
-                <w:sz w:val="16"/>
+              <w:spacing w:before="50" w:after="50" w:line="276" w:lineRule="auto"/>
+            </w:pPr>
+            <w:r>
+              <w:rPr>
+                <w:sz w:val="18"/>
               </w:rPr>
               <w:t>Özgün</w:t>
             </w:r>
@@ -1185,11 +1185,11 @@
           </w:tcPr>
           <w:p>
             <w:pPr>
-              <w:spacing w:before="20" w:after="20"/>
-            </w:pPr>
-            <w:r>
-              <w:rPr>
-                <w:sz w:val="16"/>
+              <w:spacing w:before="50" w:after="50" w:line="276" w:lineRule="auto"/>
+            </w:pPr>
+            <w:r>
+              <w:rPr>
+                <w:sz w:val="18"/>
               </w:rPr>
               <w:t>musl/Redis/cJSON</w:t>
             </w:r>
@@ -1203,11 +1203,11 @@
           </w:tcPr>
           <w:p>
             <w:pPr>
-              <w:spacing w:before="20" w:after="20"/>
-            </w:pPr>
-            <w:r>
-              <w:rPr>
-                <w:sz w:val="16"/>
+              <w:spacing w:before="50" w:after="50" w:line="276" w:lineRule="auto"/>
+            </w:pPr>
+            <w:r>
+              <w:rPr>
+                <w:sz w:val="18"/>
               </w:rPr>
               <w:t>s46-s48</w:t>
             </w:r>
@@ -1221,12 +1221,12 @@
           </w:tcPr>
           <w:p>
             <w:pPr>
-              <w:spacing w:before="20" w:after="20"/>
+              <w:spacing w:before="50" w:after="50" w:line="276" w:lineRule="auto"/>
               <w:jc w:val="center"/>
             </w:pPr>
             <w:r>
               <w:rPr>
-                <w:sz w:val="16"/>
+                <w:sz w:val="18"/>
               </w:rPr>
               <w:t>3</w:t>
             </w:r>
@@ -1240,12 +1240,12 @@
           </w:tcPr>
           <w:p>
             <w:pPr>
-              <w:spacing w:before="20" w:after="20"/>
+              <w:spacing w:before="50" w:after="50" w:line="276" w:lineRule="auto"/>
               <w:jc w:val="center"/>
             </w:pPr>
             <w:r>
               <w:rPr>
-                <w:sz w:val="16"/>
+                <w:sz w:val="18"/>
               </w:rPr>
               <w:t>262-522</w:t>
             </w:r>
@@ -1259,11 +1259,11 @@
           </w:tcPr>
           <w:p>
             <w:pPr>
-              <w:spacing w:before="20" w:after="20"/>
-            </w:pPr>
-            <w:r>
-              <w:rPr>
-                <w:sz w:val="16"/>
+              <w:spacing w:before="50" w:after="50" w:line="276" w:lineRule="auto"/>
+            </w:pPr>
+            <w:r>
+              <w:rPr>
+                <w:sz w:val="18"/>
               </w:rPr>
               <w:t>Bağımsız***</w:t>
             </w:r>
@@ -1282,11 +1282,11 @@
           </w:tcPr>
           <w:p>
             <w:pPr>
-              <w:spacing w:before="20" w:after="20"/>
-            </w:pPr>
-            <w:r>
-              <w:rPr>
-                <w:sz w:val="16"/>
+              <w:spacing w:before="50" w:after="50" w:line="276" w:lineRule="auto"/>
+            </w:pPr>
+            <w:r>
+              <w:rPr>
+                <w:sz w:val="18"/>
               </w:rPr>
               <w:t>Kök-neden 2. örnek</w:t>
             </w:r>
@@ -1300,11 +1300,11 @@
           </w:tcPr>
           <w:p>
             <w:pPr>
-              <w:spacing w:before="20" w:after="20"/>
-            </w:pPr>
-            <w:r>
-              <w:rPr>
-                <w:sz w:val="16"/>
+              <w:spacing w:before="50" w:after="50" w:line="276" w:lineRule="auto"/>
+            </w:pPr>
+            <w:r>
+              <w:rPr>
+                <w:sz w:val="18"/>
               </w:rPr>
               <w:t>s49-s53</w:t>
             </w:r>
@@ -1318,12 +1318,12 @@
           </w:tcPr>
           <w:p>
             <w:pPr>
-              <w:spacing w:before="20" w:after="20"/>
+              <w:spacing w:before="50" w:after="50" w:line="276" w:lineRule="auto"/>
               <w:jc w:val="center"/>
             </w:pPr>
             <w:r>
               <w:rPr>
-                <w:sz w:val="16"/>
+                <w:sz w:val="18"/>
               </w:rPr>
               <w:t>5</w:t>
             </w:r>
@@ -1337,12 +1337,12 @@
           </w:tcPr>
           <w:p>
             <w:pPr>
-              <w:spacing w:before="20" w:after="20"/>
+              <w:spacing w:before="50" w:after="50" w:line="276" w:lineRule="auto"/>
               <w:jc w:val="center"/>
             </w:pPr>
             <w:r>
               <w:rPr>
-                <w:sz w:val="16"/>
+                <w:sz w:val="18"/>
               </w:rPr>
               <w:t>27-33</w:t>
             </w:r>
@@ -1356,11 +1356,11 @@
           </w:tcPr>
           <w:p>
             <w:pPr>
-              <w:spacing w:before="20" w:after="20"/>
-            </w:pPr>
-            <w:r>
-              <w:rPr>
-                <w:sz w:val="16"/>
+              <w:spacing w:before="50" w:after="50" w:line="276" w:lineRule="auto"/>
+            </w:pPr>
+            <w:r>
+              <w:rPr>
+                <w:sz w:val="18"/>
               </w:rPr>
               <w:t>Özgün</w:t>
             </w:r>
@@ -1379,11 +1379,11 @@
           </w:tcPr>
           <w:p>
             <w:pPr>
-              <w:spacing w:before="20" w:after="20"/>
-            </w:pPr>
-            <w:r>
-              <w:rPr>
-                <w:sz w:val="16"/>
+              <w:spacing w:before="50" w:after="50" w:line="276" w:lineRule="auto"/>
+            </w:pPr>
+            <w:r>
+              <w:rPr>
+                <w:sz w:val="18"/>
               </w:rPr>
               <w:t>Çok dosyalı</w:t>
             </w:r>
@@ -1397,11 +1397,11 @@
           </w:tcPr>
           <w:p>
             <w:pPr>
-              <w:spacing w:before="20" w:after="20"/>
-            </w:pPr>
-            <w:r>
-              <w:rPr>
-                <w:sz w:val="16"/>
+              <w:spacing w:before="50" w:after="50" w:line="276" w:lineRule="auto"/>
+            </w:pPr>
+            <w:r>
+              <w:rPr>
+                <w:sz w:val="18"/>
               </w:rPr>
               <w:t>s54,s55,s57</w:t>
             </w:r>
@@ -1415,12 +1415,12 @@
           </w:tcPr>
           <w:p>
             <w:pPr>
-              <w:spacing w:before="20" w:after="20"/>
+              <w:spacing w:before="50" w:after="50" w:line="276" w:lineRule="auto"/>
               <w:jc w:val="center"/>
             </w:pPr>
             <w:r>
               <w:rPr>
-                <w:sz w:val="16"/>
+                <w:sz w:val="18"/>
               </w:rPr>
               <w:t>3</w:t>
             </w:r>
@@ -1434,12 +1434,12 @@
           </w:tcPr>
           <w:p>
             <w:pPr>
-              <w:spacing w:before="20" w:after="20"/>
+              <w:spacing w:before="50" w:after="50" w:line="276" w:lineRule="auto"/>
               <w:jc w:val="center"/>
             </w:pPr>
             <w:r>
               <w:rPr>
-                <w:sz w:val="16"/>
+                <w:sz w:val="18"/>
               </w:rPr>
               <w:t>71-112</w:t>
             </w:r>
@@ -1453,11 +1453,11 @@
           </w:tcPr>
           <w:p>
             <w:pPr>
-              <w:spacing w:before="20" w:after="20"/>
-            </w:pPr>
-            <w:r>
-              <w:rPr>
-                <w:sz w:val="16"/>
+              <w:spacing w:before="50" w:after="50" w:line="276" w:lineRule="auto"/>
+            </w:pPr>
+            <w:r>
+              <w:rPr>
+                <w:sz w:val="18"/>
               </w:rPr>
               <w:t>Özgün (çok dosya)</w:t>
             </w:r>
@@ -1476,11 +1476,11 @@
           </w:tcPr>
           <w:p>
             <w:pPr>
-              <w:spacing w:before="20" w:after="20"/>
-            </w:pPr>
-            <w:r>
-              <w:rPr>
-                <w:sz w:val="16"/>
+              <w:spacing w:before="50" w:after="50" w:line="276" w:lineRule="auto"/>
+            </w:pPr>
+            <w:r>
+              <w:rPr>
+                <w:sz w:val="18"/>
               </w:rPr>
               <w:t>Karmaşık makro</w:t>
             </w:r>
@@ -1494,11 +1494,11 @@
           </w:tcPr>
           <w:p>
             <w:pPr>
-              <w:spacing w:before="20" w:after="20"/>
-            </w:pPr>
-            <w:r>
-              <w:rPr>
-                <w:sz w:val="16"/>
+              <w:spacing w:before="50" w:after="50" w:line="276" w:lineRule="auto"/>
+            </w:pPr>
+            <w:r>
+              <w:rPr>
+                <w:sz w:val="18"/>
               </w:rPr>
               <w:t>s56</w:t>
             </w:r>
@@ -1512,12 +1512,12 @@
           </w:tcPr>
           <w:p>
             <w:pPr>
-              <w:spacing w:before="20" w:after="20"/>
+              <w:spacing w:before="50" w:after="50" w:line="276" w:lineRule="auto"/>
               <w:jc w:val="center"/>
             </w:pPr>
             <w:r>
               <w:rPr>
-                <w:sz w:val="16"/>
+                <w:sz w:val="18"/>
               </w:rPr>
               <w:t>1</w:t>
             </w:r>
@@ -1531,12 +1531,12 @@
           </w:tcPr>
           <w:p>
             <w:pPr>
-              <w:spacing w:before="20" w:after="20"/>
+              <w:spacing w:before="50" w:after="50" w:line="276" w:lineRule="auto"/>
               <w:jc w:val="center"/>
             </w:pPr>
             <w:r>
               <w:rPr>
-                <w:sz w:val="16"/>
+                <w:sz w:val="18"/>
               </w:rPr>
               <w:t>97</w:t>
             </w:r>
@@ -1550,11 +1550,11 @@
           </w:tcPr>
           <w:p>
             <w:pPr>
-              <w:spacing w:before="20" w:after="20"/>
-            </w:pPr>
-            <w:r>
-              <w:rPr>
-                <w:sz w:val="16"/>
+              <w:spacing w:before="50" w:after="50" w:line="276" w:lineRule="auto"/>
+            </w:pPr>
+            <w:r>
+              <w:rPr>
+                <w:sz w:val="18"/>
               </w:rPr>
               <w:t>Özgün</w:t>
             </w:r>
@@ -1611,14 +1611,14 @@
         <w:t>ilmiş; belirli bir Rust deyimselliği, hedef sürüm veya few-shot örnek sağlanmamıştır. Model, çeviriyi üretmeden önce kodu derlemek/test etmek için herhangi bir araca erişememiştir (gerçek zero-shot koşulu). Değerlendirme betiği model-bağımsız tasarlanmıştı</w:t>
       </w:r>
       <w:r>
-        <w:t>r: başka bir LLM'in çıktıları ilgili klasöre konularak aynı ölçüm otomatik tekrarlanabilir. Claude çevirileri ise etkileşimli bir asistan oturumunda (Claude Code CLI) üretilmiştir; sabit örnekleme parametreleri (temperature/top-p) dışa açık raporlanmamış v</w:t>
-      </w:r>
-      <w:r>
-        <w:t xml:space="preserve">e istemin birebir metni ayrı arşivlenmemiştir — bu, Claude tarafı için tekrarlanabilirliği Gemini tarafına göre sınırlayan, açıkça kabul edilmesi gereken bir asimetridir (§V-B). Her iki model için de her örnek yalnızca bir kez (k=1) çevrilmiştir; LLM </w:t>
+        <w:t xml:space="preserve">r: başka bir LLM'in çıktıları ilgili klasöre konularak aynı ölçüm otomatik tekrarlanabilir. Claude çevirileri ise etkileşimli bir asistan oturumunda (Claude Code CLI) üretilmiştir; sabit örnekleme </w:t>
       </w:r>
       <w:r>
         <w:lastRenderedPageBreak/>
-        <w:t>çıktı</w:t>
+        <w:t>parametreleri (temperature/top-p) dışa açık raporlanmamış v</w:t>
+      </w:r>
+      <w:r>
+        <w:t>e istemin birebir metni ayrı arşivlenmemiştir — bu, Claude tarafı için tekrarlanabilirliği Gemini tarafına göre sınırlayan, açıkça kabul edilmesi gereken bir asimetridir (§V-B). Her iki model için de her örnek yalnızca bir kez (k=1) çevrilmiştir; LLM çıktı</w:t>
       </w:r>
       <w:r>
         <w:t>sının stokastik doğası nedeniyle, tek örneklemli bu ölçümün ne kadarının gerçek model performansı farkını, ne kadarının örnekleme gürültüsünü yansıttığı bilinmemektedir (§V-B).</w:t>
@@ -1658,7 +1658,11 @@
         <w:t>Hedef dilde önceden yazılmış birim test bulunmadığından, doğruluk kaynak programla aynı girdide çalıştırılıp çık</w:t>
       </w:r>
       <w:r>
-        <w:t xml:space="preserve">tı karşılaştırılarak (diferansiyel test) ölçülmüştür: C ve Rust ikilileri derlenir (Rust derlenmezse CE); her test girdisi için beklenen/alınan çıktı karşılaştırılır (zaman aşımı → NT, çökme → RE, fark → FE, eşitse PASS; Tablo II); bir örnek yalnızca </w:t>
+        <w:t xml:space="preserve">tı karşılaştırılarak (diferansiyel test) ölçülmüştür: C ve Rust </w:t>
+      </w:r>
+      <w:r>
+        <w:lastRenderedPageBreak/>
+        <w:t xml:space="preserve">ikilileri derlenir (Rust derlenmezse CE); her test girdisi için beklenen/alınan çıktı karşılaştırılır (zaman aşımı → NT, çökme → RE, fark → FE, eşitse PASS; Tablo II); bir örnek yalnızca </w:t>
       </w:r>
       <w:r>
         <w:rPr>
@@ -1694,9 +1698,9 @@
         <w:tblLook w:val="04A0" w:firstRow="1" w:lastRow="0" w:firstColumn="1" w:lastColumn="0" w:noHBand="0" w:noVBand="1"/>
       </w:tblPr>
       <w:tblGrid>
-        <w:gridCol w:w="864"/>
+        <w:gridCol w:w="936"/>
         <w:gridCol w:w="1512"/>
-        <w:gridCol w:w="2160"/>
+        <w:gridCol w:w="2304"/>
       </w:tblGrid>
       <w:tr>
         <w:trPr>
@@ -1704,20 +1708,20 @@
         </w:trPr>
         <w:tc>
           <w:tcPr>
-            <w:tcW w:w="864" w:type="dxa"/>
+            <w:tcW w:w="936" w:type="dxa"/>
             <w:shd w:val="clear" w:color="auto" w:fill="44546A"/>
             <w:vAlign w:val="center"/>
           </w:tcPr>
           <w:p>
             <w:pPr>
-              <w:spacing w:before="20" w:after="20"/>
+              <w:spacing w:before="50" w:after="50" w:line="276" w:lineRule="auto"/>
               <w:jc w:val="center"/>
             </w:pPr>
             <w:r>
               <w:rPr>
                 <w:b/>
                 <w:color w:val="FFFFFF"/>
-                <w:sz w:val="15"/>
+                <w:sz w:val="17"/>
               </w:rPr>
               <w:t>Kod</w:t>
             </w:r>
@@ -1731,14 +1735,14 @@
           </w:tcPr>
           <w:p>
             <w:pPr>
-              <w:spacing w:before="20" w:after="20"/>
+              <w:spacing w:before="50" w:after="50" w:line="276" w:lineRule="auto"/>
               <w:jc w:val="center"/>
             </w:pPr>
             <w:r>
               <w:rPr>
                 <w:b/>
                 <w:color w:val="FFFFFF"/>
-                <w:sz w:val="15"/>
+                <w:sz w:val="17"/>
               </w:rPr>
               <w:t>Tür</w:t>
             </w:r>
@@ -1746,20 +1750,20 @@
         </w:tc>
         <w:tc>
           <w:tcPr>
-            <w:tcW w:w="2160" w:type="dxa"/>
+            <w:tcW w:w="2304" w:type="dxa"/>
             <w:shd w:val="clear" w:color="auto" w:fill="44546A"/>
             <w:vAlign w:val="center"/>
           </w:tcPr>
           <w:p>
             <w:pPr>
-              <w:spacing w:before="20" w:after="20"/>
+              <w:spacing w:before="50" w:after="50" w:line="276" w:lineRule="auto"/>
               <w:jc w:val="center"/>
             </w:pPr>
             <w:r>
               <w:rPr>
                 <w:b/>
                 <w:color w:val="FFFFFF"/>
-                <w:sz w:val="15"/>
+                <w:sz w:val="17"/>
               </w:rPr>
               <w:t>Tanım</w:t>
             </w:r>
@@ -1772,18 +1776,18 @@
         </w:trPr>
         <w:tc>
           <w:tcPr>
-            <w:tcW w:w="864" w:type="dxa"/>
+            <w:tcW w:w="936" w:type="dxa"/>
             <w:shd w:val="clear" w:color="auto" w:fill="FFFFFF"/>
             <w:vAlign w:val="center"/>
           </w:tcPr>
           <w:p>
             <w:pPr>
-              <w:spacing w:before="20" w:after="20"/>
+              <w:spacing w:before="50" w:after="50" w:line="276" w:lineRule="auto"/>
               <w:jc w:val="center"/>
             </w:pPr>
             <w:r>
               <w:rPr>
-                <w:sz w:val="15"/>
+                <w:sz w:val="17"/>
               </w:rPr>
               <w:t>CE</w:t>
             </w:r>
@@ -1797,11 +1801,11 @@
           </w:tcPr>
           <w:p>
             <w:pPr>
-              <w:spacing w:before="20" w:after="20"/>
-            </w:pPr>
-            <w:r>
-              <w:rPr>
-                <w:sz w:val="15"/>
+              <w:spacing w:before="50" w:after="50" w:line="276" w:lineRule="auto"/>
+            </w:pPr>
+            <w:r>
+              <w:rPr>
+                <w:sz w:val="17"/>
               </w:rPr>
               <w:t>Derleme Hatası</w:t>
             </w:r>
@@ -1809,17 +1813,17 @@
         </w:tc>
         <w:tc>
           <w:tcPr>
-            <w:tcW w:w="2160" w:type="dxa"/>
+            <w:tcW w:w="2304" w:type="dxa"/>
             <w:shd w:val="clear" w:color="auto" w:fill="FFFFFF"/>
             <w:vAlign w:val="center"/>
           </w:tcPr>
           <w:p>
             <w:pPr>
-              <w:spacing w:before="20" w:after="20"/>
-            </w:pPr>
-            <w:r>
-              <w:rPr>
-                <w:sz w:val="15"/>
+              <w:spacing w:before="50" w:after="50" w:line="276" w:lineRule="auto"/>
+            </w:pPr>
+            <w:r>
+              <w:rPr>
+                <w:sz w:val="17"/>
               </w:rPr>
               <w:t>Rust kodu rustc ile derlenemiyor.</w:t>
             </w:r>
@@ -1832,18 +1836,18 @@
         </w:trPr>
         <w:tc>
           <w:tcPr>
-            <w:tcW w:w="864" w:type="dxa"/>
+            <w:tcW w:w="936" w:type="dxa"/>
             <w:shd w:val="clear" w:color="auto" w:fill="F2F2F2"/>
             <w:vAlign w:val="center"/>
           </w:tcPr>
           <w:p>
             <w:pPr>
-              <w:spacing w:before="20" w:after="20"/>
+              <w:spacing w:before="50" w:after="50" w:line="276" w:lineRule="auto"/>
               <w:jc w:val="center"/>
             </w:pPr>
             <w:r>
               <w:rPr>
-                <w:sz w:val="15"/>
+                <w:sz w:val="17"/>
               </w:rPr>
               <w:t>RE</w:t>
             </w:r>
@@ -1857,11 +1861,11 @@
           </w:tcPr>
           <w:p>
             <w:pPr>
-              <w:spacing w:before="20" w:after="20"/>
-            </w:pPr>
-            <w:r>
-              <w:rPr>
-                <w:sz w:val="15"/>
+              <w:spacing w:before="50" w:after="50" w:line="276" w:lineRule="auto"/>
+            </w:pPr>
+            <w:r>
+              <w:rPr>
+                <w:sz w:val="17"/>
               </w:rPr>
               <w:t>Çalışma Zamanı Hatası</w:t>
             </w:r>
@@ -1869,17 +1873,17 @@
         </w:tc>
         <w:tc>
           <w:tcPr>
-            <w:tcW w:w="2160" w:type="dxa"/>
+            <w:tcW w:w="2304" w:type="dxa"/>
             <w:shd w:val="clear" w:color="auto" w:fill="F2F2F2"/>
             <w:vAlign w:val="center"/>
           </w:tcPr>
           <w:p>
             <w:pPr>
-              <w:spacing w:before="20" w:after="20"/>
-            </w:pPr>
-            <w:r>
-              <w:rPr>
-                <w:sz w:val="15"/>
+              <w:spacing w:before="50" w:after="50" w:line="276" w:lineRule="auto"/>
+            </w:pPr>
+            <w:r>
+              <w:rPr>
+                <w:sz w:val="17"/>
               </w:rPr>
               <w:t>Program panik veriyor / çöküyor.</w:t>
             </w:r>
@@ -1892,20 +1896,19 @@
         </w:trPr>
         <w:tc>
           <w:tcPr>
-            <w:tcW w:w="864" w:type="dxa"/>
+            <w:tcW w:w="936" w:type="dxa"/>
             <w:shd w:val="clear" w:color="auto" w:fill="FFFFFF"/>
             <w:vAlign w:val="center"/>
           </w:tcPr>
           <w:p>
             <w:pPr>
-              <w:spacing w:before="20" w:after="20"/>
+              <w:spacing w:before="50" w:after="50" w:line="276" w:lineRule="auto"/>
               <w:jc w:val="center"/>
             </w:pPr>
             <w:r>
               <w:rPr>
-                <w:sz w:val="15"/>
-              </w:rPr>
-              <w:lastRenderedPageBreak/>
+                <w:sz w:val="17"/>
+              </w:rPr>
               <w:t>NT</w:t>
             </w:r>
           </w:p>
@@ -1918,11 +1921,11 @@
           </w:tcPr>
           <w:p>
             <w:pPr>
-              <w:spacing w:before="20" w:after="20"/>
-            </w:pPr>
-            <w:r>
-              <w:rPr>
-                <w:sz w:val="15"/>
+              <w:spacing w:before="50" w:after="50" w:line="276" w:lineRule="auto"/>
+            </w:pPr>
+            <w:r>
+              <w:rPr>
+                <w:sz w:val="17"/>
               </w:rPr>
               <w:t>Sonlanmama</w:t>
             </w:r>
@@ -1930,17 +1933,17 @@
         </w:tc>
         <w:tc>
           <w:tcPr>
-            <w:tcW w:w="2160" w:type="dxa"/>
+            <w:tcW w:w="2304" w:type="dxa"/>
             <w:shd w:val="clear" w:color="auto" w:fill="FFFFFF"/>
             <w:vAlign w:val="center"/>
           </w:tcPr>
           <w:p>
             <w:pPr>
-              <w:spacing w:before="20" w:after="20"/>
-            </w:pPr>
-            <w:r>
-              <w:rPr>
-                <w:sz w:val="15"/>
+              <w:spacing w:before="50" w:after="50" w:line="276" w:lineRule="auto"/>
+            </w:pPr>
+            <w:r>
+              <w:rPr>
+                <w:sz w:val="17"/>
               </w:rPr>
               <w:t>Program zaman aşımında (5 sn) sonlanmıyor.</w:t>
             </w:r>
@@ -1953,18 +1956,18 @@
         </w:trPr>
         <w:tc>
           <w:tcPr>
-            <w:tcW w:w="864" w:type="dxa"/>
+            <w:tcW w:w="936" w:type="dxa"/>
             <w:shd w:val="clear" w:color="auto" w:fill="F2F2F2"/>
             <w:vAlign w:val="center"/>
           </w:tcPr>
           <w:p>
             <w:pPr>
-              <w:spacing w:before="20" w:after="20"/>
+              <w:spacing w:before="50" w:after="50" w:line="276" w:lineRule="auto"/>
               <w:jc w:val="center"/>
             </w:pPr>
             <w:r>
               <w:rPr>
-                <w:sz w:val="15"/>
+                <w:sz w:val="17"/>
               </w:rPr>
               <w:t>FE</w:t>
             </w:r>
@@ -1978,11 +1981,11 @@
           </w:tcPr>
           <w:p>
             <w:pPr>
-              <w:spacing w:before="20" w:after="20"/>
-            </w:pPr>
-            <w:r>
-              <w:rPr>
-                <w:sz w:val="15"/>
+              <w:spacing w:before="50" w:after="50" w:line="276" w:lineRule="auto"/>
+            </w:pPr>
+            <w:r>
+              <w:rPr>
+                <w:sz w:val="17"/>
               </w:rPr>
               <w:t>Fonksiyonel Hata</w:t>
             </w:r>
@@ -1990,17 +1993,17 @@
         </w:tc>
         <w:tc>
           <w:tcPr>
-            <w:tcW w:w="2160" w:type="dxa"/>
+            <w:tcW w:w="2304" w:type="dxa"/>
             <w:shd w:val="clear" w:color="auto" w:fill="F2F2F2"/>
             <w:vAlign w:val="center"/>
           </w:tcPr>
           <w:p>
             <w:pPr>
-              <w:spacing w:before="20" w:after="20"/>
-            </w:pPr>
-            <w:r>
-              <w:rPr>
-                <w:sz w:val="15"/>
+              <w:spacing w:before="50" w:after="50" w:line="276" w:lineRule="auto"/>
+            </w:pPr>
+            <w:r>
+              <w:rPr>
+                <w:sz w:val="17"/>
               </w:rPr>
               <w:t>Derlenip çalışıyor ama çıktı farklı.</w:t>
             </w:r>
@@ -2060,6 +2063,7 @@
           <w:b/>
           <w:i/>
         </w:rPr>
+        <w:lastRenderedPageBreak/>
         <w:t>E. Metrik ve Ortam</w:t>
       </w:r>
     </w:p>
@@ -2074,11 +2078,7 @@
         <w:t>EA) = tüm testleri geçen örnek sayısı / toplam örnek sayısı — ana metriktir. Test-girdisi bazında geçme oranı ikincil, daha ince taneli bir metriktir. Ortam: Windows 11, gcc 16.1.0 (MSYS2/UCRT64, -O2), rustc/cargo 1.97.1; derleme `rustc &lt;dosya&gt;.rs -o &lt;çıkt</w:t>
       </w:r>
       <w:r>
-        <w:t xml:space="preserve">ı&gt;` ile, </w:t>
-      </w:r>
-      <w:r>
-        <w:lastRenderedPageBreak/>
-        <w:t>Cargo veya açık bir --edition bayrağı olmadan yapılmıştır (rustc'nin varsayılan edition'ı, 2015); bu, tekrarlanabilirlik için belirtilmesi gereken bir parametredir (bazı lint'lerin — ör. static_mut_refs — şiddeti edition'a göre değişir, ancak Kate</w:t>
+        <w:t>ı&gt;` ile, Cargo veya açık bir --edition bayrağı olmadan yapılmıştır (rustc'nin varsayılan edition'ı, 2015); bu, tekrarlanabilirlik için belirtilmesi gereken bir parametredir (bazı lint'lerin — ör. static_mut_refs — şiddeti edition'a göre değişir, ancak Kate</w:t>
       </w:r>
       <w:r>
         <w:t>gori E'deki gözlenen derleme hatası — E0133, unsafe olmadan mutable static erişimi — tüm editionlarda aynı şekilde sert hatadır). Ayrıca gerçek bir Linux/LP64 ortamında (Docker, ubuntu:24.04) bir tekrar yapılmıştır; bu tekrar veri seti 55 örnekken gerçekle</w:t>
@@ -2192,14 +2192,14 @@
           </w:tcPr>
           <w:p>
             <w:pPr>
-              <w:spacing w:before="20" w:after="20"/>
+              <w:spacing w:before="50" w:after="50" w:line="276" w:lineRule="auto"/>
               <w:jc w:val="center"/>
             </w:pPr>
             <w:r>
               <w:rPr>
                 <w:b/>
                 <w:color w:val="FFFFFF"/>
-                <w:sz w:val="16"/>
+                <w:sz w:val="18"/>
               </w:rPr>
               <w:t>Koşul</w:t>
             </w:r>
@@ -2213,14 +2213,14 @@
           </w:tcPr>
           <w:p>
             <w:pPr>
-              <w:spacing w:before="20" w:after="20"/>
+              <w:spacing w:before="50" w:after="50" w:line="276" w:lineRule="auto"/>
               <w:jc w:val="center"/>
             </w:pPr>
             <w:r>
               <w:rPr>
                 <w:b/>
                 <w:color w:val="FFFFFF"/>
-                <w:sz w:val="16"/>
+                <w:sz w:val="18"/>
               </w:rPr>
               <w:t>Mod</w:t>
             </w:r>
@@ -2234,14 +2234,14 @@
           </w:tcPr>
           <w:p>
             <w:pPr>
-              <w:spacing w:before="20" w:after="20"/>
+              <w:spacing w:before="50" w:after="50" w:line="276" w:lineRule="auto"/>
               <w:jc w:val="center"/>
             </w:pPr>
             <w:r>
               <w:rPr>
                 <w:b/>
                 <w:color w:val="FFFFFF"/>
-                <w:sz w:val="16"/>
+                <w:sz w:val="18"/>
               </w:rPr>
               <w:t>EA</w:t>
             </w:r>
@@ -2255,14 +2255,14 @@
           </w:tcPr>
           <w:p>
             <w:pPr>
-              <w:spacing w:before="20" w:after="20"/>
+              <w:spacing w:before="50" w:after="50" w:line="276" w:lineRule="auto"/>
               <w:jc w:val="center"/>
             </w:pPr>
             <w:r>
               <w:rPr>
                 <w:b/>
                 <w:color w:val="FFFFFF"/>
-                <w:sz w:val="16"/>
+                <w:sz w:val="18"/>
               </w:rPr>
               <w:t>EA%</w:t>
             </w:r>
@@ -2276,14 +2276,14 @@
           </w:tcPr>
           <w:p>
             <w:pPr>
-              <w:spacing w:before="20" w:after="20"/>
+              <w:spacing w:before="50" w:after="50" w:line="276" w:lineRule="auto"/>
               <w:jc w:val="center"/>
             </w:pPr>
             <w:r>
               <w:rPr>
                 <w:b/>
                 <w:color w:val="FFFFFF"/>
-                <w:sz w:val="16"/>
+                <w:sz w:val="18"/>
               </w:rPr>
               <w:t>CE</w:t>
             </w:r>
@@ -2297,14 +2297,14 @@
           </w:tcPr>
           <w:p>
             <w:pPr>
-              <w:spacing w:before="20" w:after="20"/>
+              <w:spacing w:before="50" w:after="50" w:line="276" w:lineRule="auto"/>
               <w:jc w:val="center"/>
             </w:pPr>
             <w:r>
               <w:rPr>
                 <w:b/>
                 <w:color w:val="FFFFFF"/>
-                <w:sz w:val="16"/>
+                <w:sz w:val="18"/>
               </w:rPr>
               <w:t>RE</w:t>
             </w:r>
@@ -2318,14 +2318,14 @@
           </w:tcPr>
           <w:p>
             <w:pPr>
-              <w:spacing w:before="20" w:after="20"/>
+              <w:spacing w:before="50" w:after="50" w:line="276" w:lineRule="auto"/>
               <w:jc w:val="center"/>
             </w:pPr>
             <w:r>
               <w:rPr>
                 <w:b/>
                 <w:color w:val="FFFFFF"/>
-                <w:sz w:val="16"/>
+                <w:sz w:val="18"/>
               </w:rPr>
               <w:t>FE</w:t>
             </w:r>
@@ -2339,14 +2339,14 @@
           </w:tcPr>
           <w:p>
             <w:pPr>
-              <w:spacing w:before="20" w:after="20"/>
+              <w:spacing w:before="50" w:after="50" w:line="276" w:lineRule="auto"/>
               <w:jc w:val="center"/>
             </w:pPr>
             <w:r>
               <w:rPr>
                 <w:b/>
                 <w:color w:val="FFFFFF"/>
-                <w:sz w:val="16"/>
+                <w:sz w:val="18"/>
               </w:rPr>
               <w:t>NT</w:t>
             </w:r>
@@ -2365,11 +2365,11 @@
           </w:tcPr>
           <w:p>
             <w:pPr>
-              <w:spacing w:before="20" w:after="20"/>
-            </w:pPr>
-            <w:r>
-              <w:rPr>
-                <w:sz w:val="16"/>
+              <w:spacing w:before="50" w:after="50" w:line="276" w:lineRule="auto"/>
+            </w:pPr>
+            <w:r>
+              <w:rPr>
+                <w:sz w:val="18"/>
               </w:rPr>
               <w:t>R1 — ham çeviri</w:t>
             </w:r>
@@ -2383,12 +2383,12 @@
           </w:tcPr>
           <w:p>
             <w:pPr>
-              <w:spacing w:before="20" w:after="20"/>
+              <w:spacing w:before="50" w:after="50" w:line="276" w:lineRule="auto"/>
               <w:jc w:val="center"/>
             </w:pPr>
             <w:r>
               <w:rPr>
-                <w:sz w:val="16"/>
+                <w:sz w:val="18"/>
               </w:rPr>
               <w:t>Debug</w:t>
             </w:r>
@@ -2402,12 +2402,12 @@
           </w:tcPr>
           <w:p>
             <w:pPr>
-              <w:spacing w:before="20" w:after="20"/>
+              <w:spacing w:before="50" w:after="50" w:line="276" w:lineRule="auto"/>
               <w:jc w:val="center"/>
             </w:pPr>
             <w:r>
               <w:rPr>
-                <w:sz w:val="16"/>
+                <w:sz w:val="18"/>
               </w:rPr>
               <w:t>40/57</w:t>
             </w:r>
@@ -2421,12 +2421,12 @@
           </w:tcPr>
           <w:p>
             <w:pPr>
-              <w:spacing w:before="20" w:after="20"/>
+              <w:spacing w:before="50" w:after="50" w:line="276" w:lineRule="auto"/>
               <w:jc w:val="center"/>
             </w:pPr>
             <w:r>
               <w:rPr>
-                <w:sz w:val="16"/>
+                <w:sz w:val="18"/>
               </w:rPr>
               <w:t>70.18</w:t>
             </w:r>
@@ -2440,12 +2440,12 @@
           </w:tcPr>
           <w:p>
             <w:pPr>
-              <w:spacing w:before="20" w:after="20"/>
+              <w:spacing w:before="50" w:after="50" w:line="276" w:lineRule="auto"/>
               <w:jc w:val="center"/>
             </w:pPr>
             <w:r>
               <w:rPr>
-                <w:sz w:val="16"/>
+                <w:sz w:val="18"/>
               </w:rPr>
               <w:t>1</w:t>
             </w:r>
@@ -2459,12 +2459,12 @@
           </w:tcPr>
           <w:p>
             <w:pPr>
-              <w:spacing w:before="20" w:after="20"/>
+              <w:spacing w:before="50" w:after="50" w:line="276" w:lineRule="auto"/>
               <w:jc w:val="center"/>
             </w:pPr>
             <w:r>
               <w:rPr>
-                <w:sz w:val="16"/>
+                <w:sz w:val="18"/>
               </w:rPr>
               <w:t>4</w:t>
             </w:r>
@@ -2478,12 +2478,12 @@
           </w:tcPr>
           <w:p>
             <w:pPr>
-              <w:spacing w:before="20" w:after="20"/>
+              <w:spacing w:before="50" w:after="50" w:line="276" w:lineRule="auto"/>
               <w:jc w:val="center"/>
             </w:pPr>
             <w:r>
               <w:rPr>
-                <w:sz w:val="16"/>
+                <w:sz w:val="18"/>
               </w:rPr>
               <w:t>12</w:t>
             </w:r>
@@ -2497,12 +2497,12 @@
           </w:tcPr>
           <w:p>
             <w:pPr>
-              <w:spacing w:before="20" w:after="20"/>
+              <w:spacing w:before="50" w:after="50" w:line="276" w:lineRule="auto"/>
               <w:jc w:val="center"/>
             </w:pPr>
             <w:r>
               <w:rPr>
-                <w:sz w:val="16"/>
+                <w:sz w:val="18"/>
               </w:rPr>
               <w:t>0</w:t>
             </w:r>
@@ -2521,11 +2521,11 @@
           </w:tcPr>
           <w:p>
             <w:pPr>
-              <w:spacing w:before="20" w:after="20"/>
-            </w:pPr>
-            <w:r>
-              <w:rPr>
-                <w:sz w:val="16"/>
+              <w:spacing w:before="50" w:after="50" w:line="276" w:lineRule="auto"/>
+            </w:pPr>
+            <w:r>
+              <w:rPr>
+                <w:sz w:val="18"/>
               </w:rPr>
               <w:t>R1 — ham çeviri</w:t>
             </w:r>
@@ -2539,12 +2539,12 @@
           </w:tcPr>
           <w:p>
             <w:pPr>
-              <w:spacing w:before="20" w:after="20"/>
+              <w:spacing w:before="50" w:after="50" w:line="276" w:lineRule="auto"/>
               <w:jc w:val="center"/>
             </w:pPr>
             <w:r>
               <w:rPr>
-                <w:sz w:val="16"/>
+                <w:sz w:val="18"/>
               </w:rPr>
               <w:t>Release</w:t>
             </w:r>
@@ -2558,12 +2558,12 @@
           </w:tcPr>
           <w:p>
             <w:pPr>
-              <w:spacing w:before="20" w:after="20"/>
+              <w:spacing w:before="50" w:after="50" w:line="276" w:lineRule="auto"/>
               <w:jc w:val="center"/>
             </w:pPr>
             <w:r>
               <w:rPr>
-                <w:sz w:val="16"/>
+                <w:sz w:val="18"/>
               </w:rPr>
               <w:t>42/57</w:t>
             </w:r>
@@ -2577,12 +2577,12 @@
           </w:tcPr>
           <w:p>
             <w:pPr>
-              <w:spacing w:before="20" w:after="20"/>
+              <w:spacing w:before="50" w:after="50" w:line="276" w:lineRule="auto"/>
               <w:jc w:val="center"/>
             </w:pPr>
             <w:r>
               <w:rPr>
-                <w:sz w:val="16"/>
+                <w:sz w:val="18"/>
               </w:rPr>
               <w:t>73.68</w:t>
             </w:r>
@@ -2596,12 +2596,12 @@
           </w:tcPr>
           <w:p>
             <w:pPr>
-              <w:spacing w:before="20" w:after="20"/>
+              <w:spacing w:before="50" w:after="50" w:line="276" w:lineRule="auto"/>
               <w:jc w:val="center"/>
             </w:pPr>
             <w:r>
               <w:rPr>
-                <w:sz w:val="16"/>
+                <w:sz w:val="18"/>
               </w:rPr>
               <w:t>1</w:t>
             </w:r>
@@ -2615,12 +2615,12 @@
           </w:tcPr>
           <w:p>
             <w:pPr>
-              <w:spacing w:before="20" w:after="20"/>
+              <w:spacing w:before="50" w:after="50" w:line="276" w:lineRule="auto"/>
               <w:jc w:val="center"/>
             </w:pPr>
             <w:r>
               <w:rPr>
-                <w:sz w:val="16"/>
+                <w:sz w:val="18"/>
               </w:rPr>
               <w:t>2</w:t>
             </w:r>
@@ -2634,12 +2634,12 @@
           </w:tcPr>
           <w:p>
             <w:pPr>
-              <w:spacing w:before="20" w:after="20"/>
+              <w:spacing w:before="50" w:after="50" w:line="276" w:lineRule="auto"/>
               <w:jc w:val="center"/>
             </w:pPr>
             <w:r>
               <w:rPr>
-                <w:sz w:val="16"/>
+                <w:sz w:val="18"/>
               </w:rPr>
               <w:t>12</w:t>
             </w:r>
@@ -2653,12 +2653,12 @@
           </w:tcPr>
           <w:p>
             <w:pPr>
-              <w:spacing w:before="20" w:after="20"/>
+              <w:spacing w:before="50" w:after="50" w:line="276" w:lineRule="auto"/>
               <w:jc w:val="center"/>
             </w:pPr>
             <w:r>
               <w:rPr>
-                <w:sz w:val="16"/>
+                <w:sz w:val="18"/>
               </w:rPr>
               <w:t>0</w:t>
             </w:r>
@@ -2677,11 +2677,11 @@
           </w:tcPr>
           <w:p>
             <w:pPr>
-              <w:spacing w:before="20" w:after="20"/>
-            </w:pPr>
-            <w:r>
-              <w:rPr>
-                <w:sz w:val="16"/>
+              <w:spacing w:before="50" w:after="50" w:line="276" w:lineRule="auto"/>
+            </w:pPr>
+            <w:r>
+              <w:rPr>
+                <w:sz w:val="18"/>
               </w:rPr>
               <w:t>R2 — iyileştirilmiş</w:t>
             </w:r>
@@ -2695,12 +2695,12 @@
           </w:tcPr>
           <w:p>
             <w:pPr>
-              <w:spacing w:before="20" w:after="20"/>
+              <w:spacing w:before="50" w:after="50" w:line="276" w:lineRule="auto"/>
               <w:jc w:val="center"/>
             </w:pPr>
             <w:r>
               <w:rPr>
-                <w:sz w:val="16"/>
+                <w:sz w:val="18"/>
               </w:rPr>
               <w:t>Debug</w:t>
             </w:r>
@@ -2714,12 +2714,12 @@
           </w:tcPr>
           <w:p>
             <w:pPr>
-              <w:spacing w:before="20" w:after="20"/>
+              <w:spacing w:before="50" w:after="50" w:line="276" w:lineRule="auto"/>
               <w:jc w:val="center"/>
             </w:pPr>
             <w:r>
               <w:rPr>
-                <w:sz w:val="16"/>
+                <w:sz w:val="18"/>
               </w:rPr>
               <w:t>57/57</w:t>
             </w:r>
@@ -2733,12 +2733,12 @@
           </w:tcPr>
           <w:p>
             <w:pPr>
-              <w:spacing w:before="20" w:after="20"/>
+              <w:spacing w:before="50" w:after="50" w:line="276" w:lineRule="auto"/>
               <w:jc w:val="center"/>
             </w:pPr>
             <w:r>
               <w:rPr>
-                <w:sz w:val="16"/>
+                <w:sz w:val="18"/>
               </w:rPr>
               <w:t>100.0</w:t>
             </w:r>
@@ -2752,12 +2752,12 @@
           </w:tcPr>
           <w:p>
             <w:pPr>
-              <w:spacing w:before="20" w:after="20"/>
+              <w:spacing w:before="50" w:after="50" w:line="276" w:lineRule="auto"/>
               <w:jc w:val="center"/>
             </w:pPr>
             <w:r>
               <w:rPr>
-                <w:sz w:val="16"/>
+                <w:sz w:val="18"/>
               </w:rPr>
               <w:t>0</w:t>
             </w:r>
@@ -2771,12 +2771,12 @@
           </w:tcPr>
           <w:p>
             <w:pPr>
-              <w:spacing w:before="20" w:after="20"/>
+              <w:spacing w:before="50" w:after="50" w:line="276" w:lineRule="auto"/>
               <w:jc w:val="center"/>
             </w:pPr>
             <w:r>
               <w:rPr>
-                <w:sz w:val="16"/>
+                <w:sz w:val="18"/>
               </w:rPr>
               <w:t>0</w:t>
             </w:r>
@@ -2790,12 +2790,12 @@
           </w:tcPr>
           <w:p>
             <w:pPr>
-              <w:spacing w:before="20" w:after="20"/>
+              <w:spacing w:before="50" w:after="50" w:line="276" w:lineRule="auto"/>
               <w:jc w:val="center"/>
             </w:pPr>
             <w:r>
               <w:rPr>
-                <w:sz w:val="16"/>
+                <w:sz w:val="18"/>
               </w:rPr>
               <w:t>0</w:t>
             </w:r>
@@ -2809,12 +2809,12 @@
           </w:tcPr>
           <w:p>
             <w:pPr>
-              <w:spacing w:before="20" w:after="20"/>
+              <w:spacing w:before="50" w:after="50" w:line="276" w:lineRule="auto"/>
               <w:jc w:val="center"/>
             </w:pPr>
             <w:r>
               <w:rPr>
-                <w:sz w:val="16"/>
+                <w:sz w:val="18"/>
               </w:rPr>
               <w:t>0</w:t>
             </w:r>
@@ -3244,14 +3244,14 @@
           </w:tcPr>
           <w:p>
             <w:pPr>
-              <w:spacing w:before="20" w:after="20"/>
+              <w:spacing w:before="50" w:after="50" w:line="276" w:lineRule="auto"/>
               <w:jc w:val="center"/>
             </w:pPr>
             <w:r>
               <w:rPr>
                 <w:b/>
                 <w:color w:val="FFFFFF"/>
-                <w:sz w:val="16"/>
+                <w:sz w:val="18"/>
               </w:rPr>
               <w:t>Özel</w:t>
             </w:r>
@@ -3259,7 +3259,7 @@
               <w:rPr>
                 <w:b/>
                 <w:color w:val="FFFFFF"/>
-                <w:sz w:val="16"/>
+                <w:sz w:val="18"/>
               </w:rPr>
               <w:t>lik</w:t>
             </w:r>
@@ -3273,14 +3273,14 @@
           </w:tcPr>
           <w:p>
             <w:pPr>
-              <w:spacing w:before="20" w:after="20"/>
+              <w:spacing w:before="50" w:after="50" w:line="276" w:lineRule="auto"/>
               <w:jc w:val="center"/>
             </w:pPr>
             <w:r>
               <w:rPr>
                 <w:b/>
                 <w:color w:val="FFFFFF"/>
-                <w:sz w:val="16"/>
+                <w:sz w:val="18"/>
               </w:rPr>
               <w:t>PASS(n=40)</w:t>
             </w:r>
@@ -3294,14 +3294,14 @@
           </w:tcPr>
           <w:p>
             <w:pPr>
-              <w:spacing w:before="20" w:after="20"/>
+              <w:spacing w:before="50" w:after="50" w:line="276" w:lineRule="auto"/>
               <w:jc w:val="center"/>
             </w:pPr>
             <w:r>
               <w:rPr>
                 <w:b/>
                 <w:color w:val="FFFFFF"/>
-                <w:sz w:val="16"/>
+                <w:sz w:val="18"/>
               </w:rPr>
               <w:t>FAIL(n=17)</w:t>
             </w:r>
@@ -3320,11 +3320,11 @@
           </w:tcPr>
           <w:p>
             <w:pPr>
-              <w:spacing w:before="20" w:after="20"/>
-            </w:pPr>
-            <w:r>
-              <w:rPr>
-                <w:sz w:val="16"/>
+              <w:spacing w:before="50" w:after="50" w:line="276" w:lineRule="auto"/>
+            </w:pPr>
+            <w:r>
+              <w:rPr>
+                <w:sz w:val="18"/>
               </w:rPr>
               <w:t>Ortalama LoC</w:t>
             </w:r>
@@ -3338,12 +3338,12 @@
           </w:tcPr>
           <w:p>
             <w:pPr>
-              <w:spacing w:before="20" w:after="20"/>
+              <w:spacing w:before="50" w:after="50" w:line="276" w:lineRule="auto"/>
               <w:jc w:val="center"/>
             </w:pPr>
             <w:r>
               <w:rPr>
-                <w:sz w:val="16"/>
+                <w:sz w:val="18"/>
               </w:rPr>
               <w:t>67.0</w:t>
             </w:r>
@@ -3357,12 +3357,12 @@
           </w:tcPr>
           <w:p>
             <w:pPr>
-              <w:spacing w:before="20" w:after="20"/>
+              <w:spacing w:before="50" w:after="50" w:line="276" w:lineRule="auto"/>
               <w:jc w:val="center"/>
             </w:pPr>
             <w:r>
               <w:rPr>
-                <w:sz w:val="16"/>
+                <w:sz w:val="18"/>
               </w:rPr>
               <w:t>59.8</w:t>
             </w:r>
@@ -3381,11 +3381,11 @@
           </w:tcPr>
           <w:p>
             <w:pPr>
-              <w:spacing w:before="20" w:after="20"/>
-            </w:pPr>
-            <w:r>
-              <w:rPr>
-                <w:sz w:val="16"/>
+              <w:spacing w:before="50" w:after="50" w:line="276" w:lineRule="auto"/>
+            </w:pPr>
+            <w:r>
+              <w:rPr>
+                <w:sz w:val="18"/>
               </w:rPr>
               <w:t>Medyan LoC</w:t>
             </w:r>
@@ -3399,12 +3399,12 @@
           </w:tcPr>
           <w:p>
             <w:pPr>
-              <w:spacing w:before="20" w:after="20"/>
+              <w:spacing w:before="50" w:after="50" w:line="276" w:lineRule="auto"/>
               <w:jc w:val="center"/>
             </w:pPr>
             <w:r>
               <w:rPr>
-                <w:sz w:val="16"/>
+                <w:sz w:val="18"/>
               </w:rPr>
               <w:t>34.5</w:t>
             </w:r>
@@ -3418,12 +3418,12 @@
           </w:tcPr>
           <w:p>
             <w:pPr>
-              <w:spacing w:before="20" w:after="20"/>
+              <w:spacing w:before="50" w:after="50" w:line="276" w:lineRule="auto"/>
               <w:jc w:val="center"/>
             </w:pPr>
             <w:r>
               <w:rPr>
-                <w:sz w:val="16"/>
+                <w:sz w:val="18"/>
               </w:rPr>
               <w:t>27.0</w:t>
             </w:r>
@@ -3442,11 +3442,11 @@
           </w:tcPr>
           <w:p>
             <w:pPr>
-              <w:spacing w:before="20" w:after="20"/>
-            </w:pPr>
-            <w:r>
-              <w:rPr>
-                <w:sz w:val="16"/>
+              <w:spacing w:before="50" w:after="50" w:line="276" w:lineRule="auto"/>
+            </w:pPr>
+            <w:r>
+              <w:rPr>
+                <w:sz w:val="18"/>
               </w:rPr>
               <w:t>İşaretçi kullanımı</w:t>
             </w:r>
@@ -3460,12 +3460,12 @@
           </w:tcPr>
           <w:p>
             <w:pPr>
-              <w:spacing w:before="20" w:after="20"/>
+              <w:spacing w:before="50" w:after="50" w:line="276" w:lineRule="auto"/>
               <w:jc w:val="center"/>
             </w:pPr>
             <w:r>
               <w:rPr>
-                <w:sz w:val="16"/>
+                <w:sz w:val="18"/>
               </w:rPr>
               <w:t>%57.5</w:t>
             </w:r>
@@ -3479,12 +3479,12 @@
           </w:tcPr>
           <w:p>
             <w:pPr>
-              <w:spacing w:before="20" w:after="20"/>
+              <w:spacing w:before="50" w:after="50" w:line="276" w:lineRule="auto"/>
               <w:jc w:val="center"/>
             </w:pPr>
             <w:r>
               <w:rPr>
-                <w:sz w:val="16"/>
+                <w:sz w:val="18"/>
               </w:rPr>
               <w:t>%41.2</w:t>
             </w:r>
@@ -3503,11 +3503,11 @@
           </w:tcPr>
           <w:p>
             <w:pPr>
-              <w:spacing w:before="20" w:after="20"/>
-            </w:pPr>
-            <w:r>
-              <w:rPr>
-                <w:sz w:val="16"/>
+              <w:spacing w:before="50" w:after="50" w:line="276" w:lineRule="auto"/>
+            </w:pPr>
+            <w:r>
+              <w:rPr>
+                <w:sz w:val="18"/>
               </w:rPr>
               <w:t>malloc/calloc</w:t>
             </w:r>
@@ -3521,12 +3521,12 @@
           </w:tcPr>
           <w:p>
             <w:pPr>
-              <w:spacing w:before="20" w:after="20"/>
+              <w:spacing w:before="50" w:after="50" w:line="276" w:lineRule="auto"/>
               <w:jc w:val="center"/>
             </w:pPr>
             <w:r>
               <w:rPr>
-                <w:sz w:val="16"/>
+                <w:sz w:val="18"/>
               </w:rPr>
               <w:t>%22.5</w:t>
             </w:r>
@@ -3540,12 +3540,12 @@
           </w:tcPr>
           <w:p>
             <w:pPr>
-              <w:spacing w:before="20" w:after="20"/>
+              <w:spacing w:before="50" w:after="50" w:line="276" w:lineRule="auto"/>
               <w:jc w:val="center"/>
             </w:pPr>
             <w:r>
               <w:rPr>
-                <w:sz w:val="16"/>
+                <w:sz w:val="18"/>
               </w:rPr>
               <w:t>%0.0</w:t>
             </w:r>
@@ -3564,11 +3564,11 @@
           </w:tcPr>
           <w:p>
             <w:pPr>
-              <w:spacing w:before="20" w:after="20"/>
-            </w:pPr>
-            <w:r>
-              <w:rPr>
-                <w:sz w:val="16"/>
+              <w:spacing w:before="50" w:after="50" w:line="276" w:lineRule="auto"/>
+            </w:pPr>
+            <w:r>
+              <w:rPr>
+                <w:sz w:val="18"/>
               </w:rPr>
               <w:t>String fonksiyonu</w:t>
             </w:r>
@@ -3582,12 +3582,12 @@
           </w:tcPr>
           <w:p>
             <w:pPr>
-              <w:spacing w:before="20" w:after="20"/>
+              <w:spacing w:before="50" w:after="50" w:line="276" w:lineRule="auto"/>
               <w:jc w:val="center"/>
             </w:pPr>
             <w:r>
               <w:rPr>
-                <w:sz w:val="16"/>
+                <w:sz w:val="18"/>
               </w:rPr>
               <w:t>%37.5</w:t>
             </w:r>
@@ -3601,12 +3601,12 @@
           </w:tcPr>
           <w:p>
             <w:pPr>
-              <w:spacing w:before="20" w:after="20"/>
+              <w:spacing w:before="50" w:after="50" w:line="276" w:lineRule="auto"/>
               <w:jc w:val="center"/>
             </w:pPr>
             <w:r>
               <w:rPr>
-                <w:sz w:val="16"/>
+                <w:sz w:val="18"/>
               </w:rPr>
               <w:t>%47.1</w:t>
             </w:r>
@@ -3645,11 +3645,11 @@
         <w:t>e istisnasız PASS olmuştur. İşaretçi kullanımı ile PASS/FAIL arasındaki ilişki Fisher'in kesin testiyle de sınanmış, anlamlı bulunmamıştır (tablo=[[23,7],[17,10]], odds oranı=1.93, %95 GA=[0.61, 6.11], p=0.385) — güven aralığının 1.0'i içermesi ve genişliğ</w:t>
       </w:r>
       <w:r>
-        <w:t xml:space="preserve">i, küçük örneklemin doğal bir sonucudur. Bu veri setinde küçük örneklem büyüklüğü nedeniyle aynı veriler üzerinde birden fazla çıkarımsal test (Mann-Whitney, Fisher, bootstrap GA) uygulanmıştır; bunlar keşif amaçlı (exploratory) okunmalı ve </w:t>
+        <w:t xml:space="preserve">i, küçük örneklemin doğal bir sonucudur. Bu veri setinde küçük </w:t>
       </w:r>
       <w:r>
         <w:lastRenderedPageBreak/>
-        <w:t>bir çoklu-karşı</w:t>
+        <w:t>örneklem büyüklüğü nedeniyle aynı veriler üzerinde birden fazla çıkarımsal test (Mann-Whitney, Fisher, bootstrap GA) uygulanmıştır; bunlar keşif amaçlı (exploratory) okunmalı ve bir çoklu-karşı</w:t>
       </w:r>
       <w:r>
         <w:t>laştırma düzeltmesiyle birlikte değerlendirilmelidir (ayrıntılı düzeltme kontrolü: §V-B).</w:t>
@@ -3675,14 +3675,14 @@
         <w:t xml:space="preserve">17 başarısızlık 9 kök nedene ayrıştırılmıştır (Şekil 5, Tablo V): 8 kategoride (A-D, F-I) Rust kodu sözdizimsel olarak geçerlidir ve model, </w:t>
       </w:r>
       <w:r>
-        <w:t>kaynağın özgül bit-genişliği/işaretlilik/sarma/kontrol-akışı sözleşmesini korumak yerine hedef dilin idiyomatik varsayılanını seçmiştir. Tek istisna kategori E'dir: aynı türden bir birebir aktarım Rust'ın tip güvenliği tarafından derleme aşamasında engelle</w:t>
-      </w:r>
-      <w:r>
-        <w:t xml:space="preserve">nmiştir — 17 başarısızlığın tek CE'si. Bu tanım ("derleyici uyarısı almadan geçme") teknik olarak savunulabilir olsa da tek katmanlıdır: 17 başarısızlığın 4'ü aslında çalışma zamanı panik'idir (RE) — gürültülü ve kolayca </w:t>
+        <w:t xml:space="preserve">kaynağın özgül bit-genişliği/işaretlilik/sarma/kontrol-akışı sözleşmesini korumak yerine hedef dilin idiyomatik </w:t>
       </w:r>
       <w:r>
         <w:lastRenderedPageBreak/>
-        <w:t>fark edilen bir çökmedir; gerçek an</w:t>
+        <w:t>varsayılanını seçmiştir. Tek istisna kategori E'dir: aynı türden bir birebir aktarım Rust'ın tip güvenliği tarafından derleme aşamasında engelle</w:t>
+      </w:r>
+      <w:r>
+        <w:t>nmiştir — 17 başarısızlığın tek CE'si. Bu tanım ("derleyici uyarısı almadan geçme") teknik olarak savunulabilir olsa da tek katmanlıdır: 17 başarısızlığın 4'ü aslında çalışma zamanı panik'idir (RE) — gürültülü ve kolayca fark edilen bir çökmedir; gerçek an</w:t>
       </w:r>
       <w:r>
         <w:t>lamda sessiz olanlar yalnızca 12 FE'dir (%70.6) — derlenir, çöküp panik vermeden çalışır, ama yanlış çıktı üretir. "Derleme aşamasında yakalanmamış" (%94.1) ve "çalışma zamanında da hiçbir sinyal üretmeden yanlış sonuç veren" (%70.6) biçiminde iki katmanlı</w:t>
@@ -3771,19 +3771,19 @@
           <w:sz w:val="17"/>
         </w:rPr>
         <w:lastRenderedPageBreak/>
-        <w:t xml:space="preserve">TABLO V. DOKUZ KÖK NEDEN VE TEMSİLİ ÖRNEKLER (s09,s14,s20 vb. veri setinin özgün ilk turundandır; </w:t>
+        <w:t>TABLO V. DOKUZ KÖK NEDEN VE TEMSİLİ ÖRNEKLER (s09,s14,s20 vb. veri setinin özgün ilk turundandır; s</w:t>
       </w:r>
       <w:r>
         <w:rPr>
           <w:sz w:val="17"/>
         </w:rPr>
-        <w:t>s49,s51,s52,s53 hakem ve danışman geri bildirimine yanıt olarak eklenen bağımsız 2. örneklerdir. † C ve F kategorilerinde "doğru" davranış referans platformun (Windows/LLP64) implementation-defined seçimine bağlıdır — bkz. §V-B. E kategorisinin ikinci örne</w:t>
+        <w:t>49,s51,s52,s53 hakem ve danışman geri bildirimine yanıt olarak eklenen bağımsız 2. örneklerdir. † C ve F kategorilerinde "doğru" davranış referans platformun (Windows/LLP64) implementation-defined seçimine bağlıdır — bkz. §V-B. E kategorisinin ikinci örneğ</w:t>
       </w:r>
       <w:r>
         <w:rPr>
           <w:sz w:val="17"/>
         </w:rPr>
-        <w:t>ği (s50) Round 1'de PASS olduğundan bir başarısızlık örneği olarak burada listelenmemiştir.)</w:t>
+        <w:t>i (s50) Round 1'de PASS olduğundan bir başarısızlık örneği olarak burada listelenmemiştir.)</w:t>
       </w:r>
     </w:p>
     <w:tbl>
@@ -3812,14 +3812,14 @@
           </w:tcPr>
           <w:p>
             <w:pPr>
-              <w:spacing w:before="20" w:after="20"/>
+              <w:spacing w:before="50" w:after="50" w:line="276" w:lineRule="auto"/>
               <w:jc w:val="center"/>
             </w:pPr>
             <w:r>
               <w:rPr>
                 <w:b/>
                 <w:color w:val="FFFFFF"/>
-                <w:sz w:val="16"/>
+                <w:sz w:val="18"/>
               </w:rPr>
               <w:t>#</w:t>
             </w:r>
@@ -3833,14 +3833,14 @@
           </w:tcPr>
           <w:p>
             <w:pPr>
-              <w:spacing w:before="20" w:after="20"/>
+              <w:spacing w:before="50" w:after="50" w:line="276" w:lineRule="auto"/>
               <w:jc w:val="center"/>
             </w:pPr>
             <w:r>
               <w:rPr>
                 <w:b/>
                 <w:color w:val="FFFFFF"/>
-                <w:sz w:val="16"/>
+                <w:sz w:val="18"/>
               </w:rPr>
               <w:t>Kategori</w:t>
             </w:r>
@@ -3854,14 +3854,14 @@
           </w:tcPr>
           <w:p>
             <w:pPr>
-              <w:spacing w:before="20" w:after="20"/>
+              <w:spacing w:before="50" w:after="50" w:line="276" w:lineRule="auto"/>
               <w:jc w:val="center"/>
             </w:pPr>
             <w:r>
               <w:rPr>
                 <w:b/>
                 <w:color w:val="FFFFFF"/>
-                <w:sz w:val="16"/>
+                <w:sz w:val="18"/>
               </w:rPr>
               <w:t>Örnek</w:t>
             </w:r>
@@ -3875,14 +3875,14 @@
           </w:tcPr>
           <w:p>
             <w:pPr>
-              <w:spacing w:before="20" w:after="20"/>
+              <w:spacing w:before="50" w:after="50" w:line="276" w:lineRule="auto"/>
               <w:jc w:val="center"/>
             </w:pPr>
             <w:r>
               <w:rPr>
                 <w:b/>
                 <w:color w:val="FFFFFF"/>
-                <w:sz w:val="16"/>
+                <w:sz w:val="18"/>
               </w:rPr>
               <w:t>Boşluk (C sözleşmesi → LLM seçimi)</w:t>
             </w:r>
@@ -3901,12 +3901,12 @@
           </w:tcPr>
           <w:p>
             <w:pPr>
-              <w:spacing w:before="20" w:after="20"/>
+              <w:spacing w:before="50" w:after="50" w:line="276" w:lineRule="auto"/>
               <w:jc w:val="center"/>
             </w:pPr>
             <w:r>
               <w:rPr>
-                <w:sz w:val="16"/>
+                <w:sz w:val="18"/>
               </w:rPr>
               <w:t>A</w:t>
             </w:r>
@@ -3920,11 +3920,11 @@
           </w:tcPr>
           <w:p>
             <w:pPr>
-              <w:spacing w:before="20" w:after="20"/>
-            </w:pPr>
-            <w:r>
-              <w:rPr>
-                <w:sz w:val="16"/>
+              <w:spacing w:before="50" w:after="50" w:line="276" w:lineRule="auto"/>
+            </w:pPr>
+            <w:r>
+              <w:rPr>
+                <w:sz w:val="18"/>
               </w:rPr>
               <w:t>Unsigned taşma</w:t>
             </w:r>
@@ -3938,12 +3938,12 @@
           </w:tcPr>
           <w:p>
             <w:pPr>
-              <w:spacing w:before="20" w:after="20"/>
+              <w:spacing w:before="50" w:after="50" w:line="276" w:lineRule="auto"/>
               <w:jc w:val="center"/>
             </w:pPr>
             <w:r>
               <w:rPr>
-                <w:sz w:val="16"/>
+                <w:sz w:val="18"/>
               </w:rPr>
               <w:t>s09,s14(RE)</w:t>
             </w:r>
@@ -3957,11 +3957,11 @@
           </w:tcPr>
           <w:p>
             <w:pPr>
-              <w:spacing w:before="20" w:after="20"/>
-            </w:pPr>
-            <w:r>
-              <w:rPr>
-                <w:sz w:val="16"/>
+              <w:spacing w:before="50" w:after="50" w:line="276" w:lineRule="auto"/>
+            </w:pPr>
+            <w:r>
+              <w:rPr>
+                <w:sz w:val="18"/>
               </w:rPr>
               <w:t>Mod-2ⁿ sarma → panik-eden varsayılan aritmetik</w:t>
             </w:r>
@@ -3980,12 +3980,12 @@
           </w:tcPr>
           <w:p>
             <w:pPr>
-              <w:spacing w:before="20" w:after="20"/>
+              <w:spacing w:before="50" w:after="50" w:line="276" w:lineRule="auto"/>
               <w:jc w:val="center"/>
             </w:pPr>
             <w:r>
               <w:rPr>
-                <w:sz w:val="16"/>
+                <w:sz w:val="18"/>
               </w:rPr>
               <w:t>B</w:t>
             </w:r>
@@ -3999,11 +3999,11 @@
           </w:tcPr>
           <w:p>
             <w:pPr>
-              <w:spacing w:before="20" w:after="20"/>
-            </w:pPr>
-            <w:r>
-              <w:rPr>
-                <w:sz w:val="16"/>
+              <w:spacing w:before="50" w:after="50" w:line="276" w:lineRule="auto"/>
+            </w:pPr>
+            <w:r>
+              <w:rPr>
+                <w:sz w:val="18"/>
               </w:rPr>
               <w:t>String modeli</w:t>
             </w:r>
@@ -4017,12 +4017,12 @@
           </w:tcPr>
           <w:p>
             <w:pPr>
-              <w:spacing w:before="20" w:after="20"/>
+              <w:spacing w:before="50" w:after="50" w:line="276" w:lineRule="auto"/>
               <w:jc w:val="center"/>
             </w:pPr>
             <w:r>
               <w:rPr>
-                <w:sz w:val="16"/>
+                <w:sz w:val="18"/>
               </w:rPr>
               <w:t>s06,s13(FE)</w:t>
             </w:r>
@@ -4036,11 +4036,11 @@
           </w:tcPr>
           <w:p>
             <w:pPr>
-              <w:spacing w:before="20" w:after="20"/>
-            </w:pPr>
-            <w:r>
-              <w:rPr>
-                <w:sz w:val="16"/>
+              <w:spacing w:before="50" w:after="50" w:line="276" w:lineRule="auto"/>
+            </w:pPr>
+            <w:r>
+              <w:rPr>
+                <w:sz w:val="18"/>
               </w:rPr>
               <w:t>Bayt-düzeyi C string → .chars() (Unicode)</w:t>
             </w:r>
@@ -4059,12 +4059,12 @@
           </w:tcPr>
           <w:p>
             <w:pPr>
-              <w:spacing w:before="20" w:after="20"/>
+              <w:spacing w:before="50" w:after="50" w:line="276" w:lineRule="auto"/>
               <w:jc w:val="center"/>
             </w:pPr>
             <w:r>
               <w:rPr>
-                <w:sz w:val="16"/>
+                <w:sz w:val="18"/>
               </w:rPr>
               <w:t>C</w:t>
             </w:r>
@@ -4078,11 +4078,11 @@
           </w:tcPr>
           <w:p>
             <w:pPr>
-              <w:spacing w:before="20" w:after="20"/>
-            </w:pPr>
-            <w:r>
-              <w:rPr>
-                <w:sz w:val="16"/>
+              <w:spacing w:before="50" w:after="50" w:line="276" w:lineRule="auto"/>
+            </w:pPr>
+            <w:r>
+              <w:rPr>
+                <w:sz w:val="18"/>
               </w:rPr>
               <w:t>char işaretliliği†</w:t>
             </w:r>
@@ -4096,12 +4096,12 @@
           </w:tcPr>
           <w:p>
             <w:pPr>
-              <w:spacing w:before="20" w:after="20"/>
+              <w:spacing w:before="50" w:after="50" w:line="276" w:lineRule="auto"/>
               <w:jc w:val="center"/>
             </w:pPr>
             <w:r>
               <w:rPr>
-                <w:sz w:val="16"/>
+                <w:sz w:val="18"/>
               </w:rPr>
               <w:t>s20,s49(FE)</w:t>
             </w:r>
@@ -4115,11 +4115,11 @@
           </w:tcPr>
           <w:p>
             <w:pPr>
-              <w:spacing w:before="20" w:after="20"/>
-            </w:pPr>
-            <w:r>
-              <w:rPr>
-                <w:sz w:val="16"/>
+              <w:spacing w:before="50" w:after="50" w:line="276" w:lineRule="auto"/>
+            </w:pPr>
+            <w:r>
+              <w:rPr>
+                <w:sz w:val="18"/>
               </w:rPr>
               <w:t>İşaretli char (127+ negatif) → u8 (hep pozitif)</w:t>
             </w:r>
@@ -4138,12 +4138,12 @@
           </w:tcPr>
           <w:p>
             <w:pPr>
-              <w:spacing w:before="20" w:after="20"/>
+              <w:spacing w:before="50" w:after="50" w:line="276" w:lineRule="auto"/>
               <w:jc w:val="center"/>
             </w:pPr>
             <w:r>
               <w:rPr>
-                <w:sz w:val="16"/>
+                <w:sz w:val="18"/>
               </w:rPr>
               <w:t>D</w:t>
             </w:r>
@@ -4157,11 +4157,11 @@
           </w:tcPr>
           <w:p>
             <w:pPr>
-              <w:spacing w:before="20" w:after="20"/>
-            </w:pPr>
-            <w:r>
-              <w:rPr>
-                <w:sz w:val="16"/>
+              <w:spacing w:before="50" w:after="50" w:line="276" w:lineRule="auto"/>
+            </w:pPr>
+            <w:r>
+              <w:rPr>
+                <w:sz w:val="18"/>
               </w:rPr>
               <w:t>Çıktı biçimlendirme</w:t>
             </w:r>
@@ -4175,12 +4175,12 @@
           </w:tcPr>
           <w:p>
             <w:pPr>
-              <w:spacing w:before="20" w:after="20"/>
+              <w:spacing w:before="50" w:after="50" w:line="276" w:lineRule="auto"/>
               <w:jc w:val="center"/>
             </w:pPr>
             <w:r>
               <w:rPr>
-                <w:sz w:val="16"/>
+                <w:sz w:val="18"/>
               </w:rPr>
               <w:t>s15,s27,s48(FE)</w:t>
             </w:r>
@@ -4194,11 +4194,11 @@
           </w:tcPr>
           <w:p>
             <w:pPr>
-              <w:spacing w:before="20" w:after="20"/>
-            </w:pPr>
-            <w:r>
-              <w:rPr>
-                <w:sz w:val="16"/>
+              <w:spacing w:before="50" w:after="50" w:line="276" w:lineRule="auto"/>
+            </w:pPr>
+            <w:r>
+              <w:rPr>
+                <w:sz w:val="18"/>
               </w:rPr>
               <w:t>%g mantığı → Rust'ın varsayılan {} biçimi</w:t>
             </w:r>
@@ -4217,12 +4217,12 @@
           </w:tcPr>
           <w:p>
             <w:pPr>
-              <w:spacing w:before="20" w:after="20"/>
+              <w:spacing w:before="50" w:after="50" w:line="276" w:lineRule="auto"/>
               <w:jc w:val="center"/>
             </w:pPr>
             <w:r>
               <w:rPr>
-                <w:sz w:val="16"/>
+                <w:sz w:val="18"/>
               </w:rPr>
               <w:t>E</w:t>
             </w:r>
@@ -4236,11 +4236,11 @@
           </w:tcPr>
           <w:p>
             <w:pPr>
-              <w:spacing w:before="20" w:after="20"/>
-            </w:pPr>
-            <w:r>
-              <w:rPr>
-                <w:sz w:val="16"/>
+              <w:spacing w:before="50" w:after="50" w:line="276" w:lineRule="auto"/>
+            </w:pPr>
+            <w:r>
+              <w:rPr>
+                <w:sz w:val="18"/>
               </w:rPr>
               <w:t>Güvensiz global durum</w:t>
             </w:r>
@@ -4254,12 +4254,12 @@
           </w:tcPr>
           <w:p>
             <w:pPr>
-              <w:spacing w:before="20" w:after="20"/>
+              <w:spacing w:before="50" w:after="50" w:line="276" w:lineRule="auto"/>
               <w:jc w:val="center"/>
             </w:pPr>
             <w:r>
               <w:rPr>
-                <w:sz w:val="16"/>
+                <w:sz w:val="18"/>
               </w:rPr>
               <w:t>s19(CE)</w:t>
             </w:r>
@@ -4273,17 +4273,17 @@
           </w:tcPr>
           <w:p>
             <w:pPr>
-              <w:spacing w:before="20" w:after="20"/>
-            </w:pPr>
-            <w:r>
-              <w:rPr>
-                <w:sz w:val="16"/>
+              <w:spacing w:before="50" w:after="50" w:line="276" w:lineRule="auto"/>
+            </w:pPr>
+            <w:r>
+              <w:rPr>
+                <w:sz w:val="18"/>
               </w:rPr>
               <w:t xml:space="preserve">Değiştirilebilir </w:t>
             </w:r>
             <w:r>
               <w:rPr>
-                <w:sz w:val="16"/>
+                <w:sz w:val="18"/>
               </w:rPr>
               <w:t>global → static mut (unsafe)</w:t>
             </w:r>
@@ -4302,12 +4302,12 @@
           </w:tcPr>
           <w:p>
             <w:pPr>
-              <w:spacing w:before="20" w:after="20"/>
+              <w:spacing w:before="50" w:after="50" w:line="276" w:lineRule="auto"/>
               <w:jc w:val="center"/>
             </w:pPr>
             <w:r>
               <w:rPr>
-                <w:sz w:val="16"/>
+                <w:sz w:val="18"/>
               </w:rPr>
               <w:t>F</w:t>
             </w:r>
@@ -4321,11 +4321,11 @@
           </w:tcPr>
           <w:p>
             <w:pPr>
-              <w:spacing w:before="20" w:after="20"/>
-            </w:pPr>
-            <w:r>
-              <w:rPr>
-                <w:sz w:val="16"/>
+              <w:spacing w:before="50" w:after="50" w:line="276" w:lineRule="auto"/>
+            </w:pPr>
+            <w:r>
+              <w:rPr>
+                <w:sz w:val="18"/>
               </w:rPr>
               <w:t>Platform tamsayı genişliği†</w:t>
             </w:r>
@@ -4339,12 +4339,12 @@
           </w:tcPr>
           <w:p>
             <w:pPr>
-              <w:spacing w:before="20" w:after="20"/>
+              <w:spacing w:before="50" w:after="50" w:line="276" w:lineRule="auto"/>
               <w:jc w:val="center"/>
             </w:pPr>
             <w:r>
               <w:rPr>
-                <w:sz w:val="16"/>
+                <w:sz w:val="18"/>
               </w:rPr>
               <w:t>s38,s51(FE)</w:t>
             </w:r>
@@ -4358,11 +4358,11 @@
           </w:tcPr>
           <w:p>
             <w:pPr>
-              <w:spacing w:before="20" w:after="20"/>
-            </w:pPr>
-            <w:r>
-              <w:rPr>
-                <w:sz w:val="16"/>
+              <w:spacing w:before="50" w:after="50" w:line="276" w:lineRule="auto"/>
+            </w:pPr>
+            <w:r>
+              <w:rPr>
+                <w:sz w:val="18"/>
               </w:rPr>
               <w:t>Gerçek long genişliği (32-bit) → varsayılan i64</w:t>
             </w:r>
@@ -4381,12 +4381,12 @@
           </w:tcPr>
           <w:p>
             <w:pPr>
-              <w:spacing w:before="20" w:after="20"/>
+              <w:spacing w:before="50" w:after="50" w:line="276" w:lineRule="auto"/>
               <w:jc w:val="center"/>
             </w:pPr>
             <w:r>
               <w:rPr>
-                <w:sz w:val="16"/>
+                <w:sz w:val="18"/>
               </w:rPr>
               <w:t>G</w:t>
             </w:r>
@@ -4400,11 +4400,11 @@
           </w:tcPr>
           <w:p>
             <w:pPr>
-              <w:spacing w:before="20" w:after="20"/>
-            </w:pPr>
-            <w:r>
-              <w:rPr>
-                <w:sz w:val="16"/>
+              <w:spacing w:before="50" w:after="50" w:line="276" w:lineRule="auto"/>
+            </w:pPr>
+            <w:r>
+              <w:rPr>
+                <w:sz w:val="18"/>
               </w:rPr>
               <w:t>usize taşması</w:t>
             </w:r>
@@ -4418,12 +4418,12 @@
           </w:tcPr>
           <w:p>
             <w:pPr>
-              <w:spacing w:before="20" w:after="20"/>
+              <w:spacing w:before="50" w:after="50" w:line="276" w:lineRule="auto"/>
               <w:jc w:val="center"/>
             </w:pPr>
             <w:r>
               <w:rPr>
-                <w:sz w:val="16"/>
+                <w:sz w:val="18"/>
               </w:rPr>
               <w:t>s40,s52(RE)</w:t>
             </w:r>
@@ -4437,11 +4437,11 @@
           </w:tcPr>
           <w:p>
             <w:pPr>
-              <w:spacing w:before="20" w:after="20"/>
-            </w:pPr>
-            <w:r>
-              <w:rPr>
-                <w:sz w:val="16"/>
+              <w:spacing w:before="50" w:after="50" w:line="276" w:lineRule="auto"/>
+            </w:pPr>
+            <w:r>
+              <w:rPr>
+                <w:sz w:val="18"/>
               </w:rPr>
               <w:t>İşaretli int ile güvenli n-1 → usize altında taşma</w:t>
             </w:r>
@@ -4460,12 +4460,12 @@
           </w:tcPr>
           <w:p>
             <w:pPr>
-              <w:spacing w:before="20" w:after="20"/>
+              <w:spacing w:before="50" w:after="50" w:line="276" w:lineRule="auto"/>
               <w:jc w:val="center"/>
             </w:pPr>
             <w:r>
               <w:rPr>
-                <w:sz w:val="16"/>
+                <w:sz w:val="18"/>
               </w:rPr>
               <w:t>H</w:t>
             </w:r>
@@ -4479,11 +4479,11 @@
           </w:tcPr>
           <w:p>
             <w:pPr>
-              <w:spacing w:before="20" w:after="20"/>
-            </w:pPr>
-            <w:r>
-              <w:rPr>
-                <w:sz w:val="16"/>
+              <w:spacing w:before="50" w:after="50" w:line="276" w:lineRule="auto"/>
+            </w:pPr>
+            <w:r>
+              <w:rPr>
+                <w:sz w:val="18"/>
               </w:rPr>
               <w:t>Switch fallthrough</w:t>
             </w:r>
@@ -4497,12 +4497,12 @@
           </w:tcPr>
           <w:p>
             <w:pPr>
-              <w:spacing w:before="20" w:after="20"/>
+              <w:spacing w:before="50" w:after="50" w:line="276" w:lineRule="auto"/>
               <w:jc w:val="center"/>
             </w:pPr>
             <w:r>
               <w:rPr>
-                <w:sz w:val="16"/>
+                <w:sz w:val="18"/>
               </w:rPr>
               <w:t>s43,s53(FE)</w:t>
             </w:r>
@@ -4516,17 +4516,17 @@
           </w:tcPr>
           <w:p>
             <w:pPr>
-              <w:spacing w:before="20" w:after="20"/>
-            </w:pPr>
-            <w:r>
-              <w:rPr>
-                <w:sz w:val="16"/>
+              <w:spacing w:before="50" w:after="50" w:line="276" w:lineRule="auto"/>
+            </w:pPr>
+            <w:r>
+              <w:rPr>
+                <w:sz w:val="18"/>
               </w:rPr>
               <w:t xml:space="preserve">Kümülatif düşme → </w:t>
             </w:r>
             <w:r>
               <w:rPr>
-                <w:sz w:val="16"/>
+                <w:sz w:val="18"/>
               </w:rPr>
               <w:t>bağımsız match kolları</w:t>
             </w:r>
@@ -4545,12 +4545,12 @@
           </w:tcPr>
           <w:p>
             <w:pPr>
-              <w:spacing w:before="20" w:after="20"/>
+              <w:spacing w:before="50" w:after="50" w:line="276" w:lineRule="auto"/>
               <w:jc w:val="center"/>
             </w:pPr>
             <w:r>
               <w:rPr>
-                <w:sz w:val="16"/>
+                <w:sz w:val="18"/>
               </w:rPr>
               <w:t>I</w:t>
             </w:r>
@@ -4564,11 +4564,11 @@
           </w:tcPr>
           <w:p>
             <w:pPr>
-              <w:spacing w:before="20" w:after="20"/>
-            </w:pPr>
-            <w:r>
-              <w:rPr>
-                <w:sz w:val="16"/>
+              <w:spacing w:before="50" w:after="50" w:line="276" w:lineRule="auto"/>
+            </w:pPr>
+            <w:r>
+              <w:rPr>
+                <w:sz w:val="18"/>
               </w:rPr>
               <w:t>Makro çoklu-değerlendirme</w:t>
             </w:r>
@@ -4582,12 +4582,12 @@
           </w:tcPr>
           <w:p>
             <w:pPr>
-              <w:spacing w:before="20" w:after="20"/>
+              <w:spacing w:before="50" w:after="50" w:line="276" w:lineRule="auto"/>
               <w:jc w:val="center"/>
             </w:pPr>
             <w:r>
               <w:rPr>
-                <w:sz w:val="16"/>
+                <w:sz w:val="18"/>
               </w:rPr>
               <w:t>s56(FE)</w:t>
             </w:r>
@@ -4601,11 +4601,11 @@
           </w:tcPr>
           <w:p>
             <w:pPr>
-              <w:spacing w:before="20" w:after="20"/>
-            </w:pPr>
-            <w:r>
-              <w:rPr>
-                <w:sz w:val="16"/>
+              <w:spacing w:before="50" w:after="50" w:line="276" w:lineRule="auto"/>
+            </w:pPr>
+            <w:r>
+              <w:rPr>
+                <w:sz w:val="18"/>
               </w:rPr>
               <w:t>Metinsel ikame → fn (tek değerlendirme)</w:t>
             </w:r>
@@ -4729,14 +4729,14 @@
           </w:tcPr>
           <w:p>
             <w:pPr>
-              <w:spacing w:before="20" w:after="20"/>
+              <w:spacing w:before="50" w:after="50" w:line="276" w:lineRule="auto"/>
               <w:jc w:val="center"/>
             </w:pPr>
             <w:r>
               <w:rPr>
                 <w:b/>
                 <w:color w:val="FFFFFF"/>
-                <w:sz w:val="16"/>
+                <w:sz w:val="18"/>
               </w:rPr>
               <w:t>Seviye</w:t>
             </w:r>
@@ -4750,14 +4750,14 @@
           </w:tcPr>
           <w:p>
             <w:pPr>
-              <w:spacing w:before="20" w:after="20"/>
+              <w:spacing w:before="50" w:after="50" w:line="276" w:lineRule="auto"/>
               <w:jc w:val="center"/>
             </w:pPr>
             <w:r>
               <w:rPr>
                 <w:b/>
                 <w:color w:val="FFFFFF"/>
-                <w:sz w:val="16"/>
+                <w:sz w:val="18"/>
               </w:rPr>
               <w:t>İçerik</w:t>
             </w:r>
@@ -4771,14 +4771,14 @@
           </w:tcPr>
           <w:p>
             <w:pPr>
-              <w:spacing w:before="20" w:after="20"/>
+              <w:spacing w:before="50" w:after="50" w:line="276" w:lineRule="auto"/>
               <w:jc w:val="center"/>
             </w:pPr>
             <w:r>
               <w:rPr>
                 <w:b/>
                 <w:color w:val="FFFFFF"/>
-                <w:sz w:val="16"/>
+                <w:sz w:val="18"/>
               </w:rPr>
               <w:t>EA% (Claude)</w:t>
             </w:r>
@@ -4797,11 +4797,11 @@
           </w:tcPr>
           <w:p>
             <w:pPr>
-              <w:spacing w:before="20" w:after="20"/>
-            </w:pPr>
-            <w:r>
-              <w:rPr>
-                <w:sz w:val="16"/>
+              <w:spacing w:before="50" w:after="50" w:line="276" w:lineRule="auto"/>
+            </w:pPr>
+            <w:r>
+              <w:rPr>
+                <w:sz w:val="18"/>
               </w:rPr>
               <w:t>A (Oracle)</w:t>
             </w:r>
@@ -4815,11 +4815,11 @@
           </w:tcPr>
           <w:p>
             <w:pPr>
-              <w:spacing w:before="20" w:after="20"/>
-            </w:pPr>
-            <w:r>
-              <w:rPr>
-                <w:sz w:val="16"/>
+              <w:spacing w:before="50" w:after="50" w:line="276" w:lineRule="auto"/>
+            </w:pPr>
+            <w:r>
+              <w:rPr>
+                <w:sz w:val="18"/>
               </w:rPr>
               <w:t>Tam derleyici/panik metni + beklenen/alınan farkı</w:t>
             </w:r>
@@ -4833,12 +4833,12 @@
           </w:tcPr>
           <w:p>
             <w:pPr>
-              <w:spacing w:before="20" w:after="20"/>
+              <w:spacing w:before="50" w:after="50" w:line="276" w:lineRule="auto"/>
               <w:jc w:val="center"/>
             </w:pPr>
             <w:r>
               <w:rPr>
-                <w:sz w:val="16"/>
+                <w:sz w:val="18"/>
               </w:rPr>
               <w:t>100.0</w:t>
             </w:r>
@@ -4857,11 +4857,11 @@
           </w:tcPr>
           <w:p>
             <w:pPr>
-              <w:spacing w:before="20" w:after="20"/>
-            </w:pPr>
-            <w:r>
-              <w:rPr>
-                <w:sz w:val="16"/>
+              <w:spacing w:before="50" w:after="50" w:line="276" w:lineRule="auto"/>
+            </w:pPr>
+            <w:r>
+              <w:rPr>
+                <w:sz w:val="18"/>
               </w:rPr>
               <w:t>B (CI-benzeri)</w:t>
             </w:r>
@@ -4875,17 +4875,17 @@
           </w:tcPr>
           <w:p>
             <w:pPr>
-              <w:spacing w:before="20" w:after="20"/>
-            </w:pPr>
-            <w:r>
-              <w:rPr>
-                <w:sz w:val="16"/>
+              <w:spacing w:before="50" w:after="50" w:line="276" w:lineRule="auto"/>
+            </w:pPr>
+            <w:r>
+              <w:rPr>
+                <w:sz w:val="18"/>
               </w:rPr>
               <w:t xml:space="preserve">Derleyici/panik metni tam; FE'de </w:t>
             </w:r>
             <w:r>
               <w:rPr>
-                <w:sz w:val="16"/>
+                <w:sz w:val="18"/>
               </w:rPr>
               <w:t>yalnızca girdi</w:t>
             </w:r>
@@ -4899,12 +4899,12 @@
           </w:tcPr>
           <w:p>
             <w:pPr>
-              <w:spacing w:before="20" w:after="20"/>
+              <w:spacing w:before="50" w:after="50" w:line="276" w:lineRule="auto"/>
               <w:jc w:val="center"/>
             </w:pPr>
             <w:r>
               <w:rPr>
-                <w:sz w:val="16"/>
+                <w:sz w:val="18"/>
               </w:rPr>
               <w:t>86.0</w:t>
             </w:r>
@@ -4923,11 +4923,11 @@
           </w:tcPr>
           <w:p>
             <w:pPr>
-              <w:spacing w:before="20" w:after="20"/>
-            </w:pPr>
-            <w:r>
-              <w:rPr>
-                <w:sz w:val="16"/>
+              <w:spacing w:before="50" w:after="50" w:line="276" w:lineRule="auto"/>
+            </w:pPr>
+            <w:r>
+              <w:rPr>
+                <w:sz w:val="18"/>
               </w:rPr>
               <w:t>C (Minimal)</w:t>
             </w:r>
@@ -4941,11 +4941,11 @@
           </w:tcPr>
           <w:p>
             <w:pPr>
-              <w:spacing w:before="20" w:after="20"/>
-            </w:pPr>
-            <w:r>
-              <w:rPr>
-                <w:sz w:val="16"/>
+              <w:spacing w:before="50" w:after="50" w:line="276" w:lineRule="auto"/>
+            </w:pPr>
+            <w:r>
+              <w:rPr>
+                <w:sz w:val="18"/>
               </w:rPr>
               <w:t>Yalnızca başarısız test sayısı (CE hariç)</w:t>
             </w:r>
@@ -4959,12 +4959,12 @@
           </w:tcPr>
           <w:p>
             <w:pPr>
-              <w:spacing w:before="20" w:after="20"/>
+              <w:spacing w:before="50" w:after="50" w:line="276" w:lineRule="auto"/>
               <w:jc w:val="center"/>
             </w:pPr>
             <w:r>
               <w:rPr>
-                <w:sz w:val="16"/>
+                <w:sz w:val="18"/>
               </w:rPr>
               <w:t>71.9</w:t>
             </w:r>
@@ -5006,20 +5006,24 @@
         <w:jc w:val="both"/>
       </w:pPr>
       <w:r>
-        <w:t>13 bağımsız gerçek dünya programının 11'i (%84.6) ilk seferde geçmiştir: Rosetta Code 7/7, BSD libc 2/3, musl/Redis/cJSON 2/3 (Claude). En uzun örnek (522 satır, s47) PASS olurken çok daha kısa s48 (389 satır) başarısız olması, uzunluk değil boşluğun belir</w:t>
+        <w:t xml:space="preserve">13 bağımsız gerçek dünya programının 11'i (%84.6) ilk seferde geçmiştir: Rosetta Code 7/7, BSD libc 2/3, musl/Redis/cJSON 2/3 (Claude). En uzun örnek (522 satır, s47) PASS olurken çok daha kısa s48 (389 satır) başarısız olması, uzunluk değil </w:t>
+      </w:r>
+      <w:r>
+        <w:lastRenderedPageBreak/>
+        <w:t>boşluğun belir</w:t>
       </w:r>
       <w:r>
         <w:t>leyici olduğunu burada da doğrular. Bellek güvenliği tarafında, Claude'un ürettiği 74 farklı çeviriden (57 Round 1 + Round 2'de yeniden çevrilen 17 örnek; Round 2 yalnızca Round 1'de başarısız olan örnekleri kapsadığından geri kalan 40 "Round 2 dosyası" Ro</w:t>
       </w:r>
       <w:r>
-        <w:t>und 1'in birebir kopyasıdır) yalnızca 4'ü (%5.4) unsafe içerir: s37_bsd_getopt, s44_fib_memo_static, s46_musl_qsort ve s50_id_generator. Dördü de Round 1'de PASS olduğundan Round 2'de yeniden çevrilmemiştir. Kategori E, aynı model tarafından iki farklı biç</w:t>
-      </w:r>
-      <w:r>
-        <w:t xml:space="preserve">imde çözülmüştür: kategorinin ikinci örneği olan s50_id_generator'da model `unsafe` bloğunu doğru biçimde </w:t>
+        <w:t xml:space="preserve">und 1'in birebir kopyasıdır) </w:t>
       </w:r>
       <w:r>
         <w:lastRenderedPageBreak/>
-        <w:t xml:space="preserve">ekleyerek ilk seferde PASS olurken, ilk örnek olan s19_global_counter Round 2'de `unsafe` </w:t>
+        <w:t>yalnızca 4'ü (%5.4) unsafe içerir: s37_bsd_getopt, s44_fib_memo_static, s46_musl_qsort ve s50_id_generator. Dördü de Round 1'de PASS olduğundan Round 2'de yeniden çevrilmemiştir. Kategori E, aynı model tarafından iki farklı biç</w:t>
+      </w:r>
+      <w:r>
+        <w:t xml:space="preserve">imde çözülmüştür: kategorinin ikinci örneği olan s50_id_generator'da model `unsafe` bloğunu doğru biçimde ekleyerek ilk seferde PASS olurken, ilk örnek olan s19_global_counter Round 2'de `unsafe` </w:t>
       </w:r>
       <w:r>
         <w:rPr>
@@ -5054,6 +5058,7 @@
         <w:jc w:val="both"/>
       </w:pPr>
       <w:r>
+        <w:lastRenderedPageBreak/>
         <w:t>Gemini ile 57 örneğin tamamı üzerinde gerçek, otomatik ölçüm yapılmıştır: EA=%89.47 (51/57; 4 CE</w:t>
       </w:r>
       <w:r>
@@ -5066,21 +5071,13 @@
         <w:t>aynı</w:t>
       </w:r>
       <w:r>
-        <w:t xml:space="preserve"> 57 program üzerinde ölçüldüğü için eşleştirilmiş (paired) </w:t>
-      </w:r>
-      <w:r>
-        <w:lastRenderedPageBreak/>
-        <w:t>bir tasarıma uygun McNemar testiyle sınandığında istatistiksel olarak anlamlıdır (yalnızca Claude'un başarısı</w:t>
+        <w:t xml:space="preserve"> 57 program üzerinde ölçüldüğü için eşleştirilmiş (paired) bir tasarıma uygun McNemar testiyle sınandığında istatistiksel olarak anlamlıdır (yalnızca Claude'un başarısı</w:t>
       </w:r>
       <w:r>
         <w:t>z olduğu 14 örnek vs. yalnızca Gemini'nin başarısız olduğu 3 örnek; McNemar kesin iki-yönlü p=0.013). Ancak Tablo VII'deki kategori-bazlı kırılım, bu genel farkın tekdüze değil kategoriye özgü olduğunu ve yön değiştirebildiğini gösterir — genel anlamlılık,</w:t>
       </w:r>
       <w:r>
-        <w:t xml:space="preserve"> </w:t>
-      </w:r>
-      <w:r>
-        <w:lastRenderedPageBreak/>
-        <w:t>model×kategori etkileşiminin yokluğu anlamına gelmez. Ayrıca Gemini'nin 6 başarısızlığının 4'ü (s26, s46, s48'in yanı sıra s27) CE'dir, yani derleyici tarafından yakalanmıştır — Claude'da gözlenen "başarısızlıkların çoğu sessizdir" örüntüsü Gemini için ay</w:t>
+        <w:t xml:space="preserve"> model×kategori etkileşiminin yokluğu anlamına gelmez. Ayrıca Gemini'nin 6 başarısızlığının 4'ü (s26, s46, s48'in yanı sıra s27) CE'dir, yani derleyici tarafından yakalanmıştır — Claude'da gözlenen "başarısızlıkların çoğu sessizdir" örüntüsü Gemini için ay</w:t>
       </w:r>
       <w:r>
         <w:t>nı güçte geçerli değildir; sessiz hata oranı modele göre değişir.</w:t>
@@ -5135,14 +5132,14 @@
           </w:tcPr>
           <w:p>
             <w:pPr>
-              <w:spacing w:before="20" w:after="20"/>
+              <w:spacing w:before="50" w:after="50" w:line="276" w:lineRule="auto"/>
               <w:jc w:val="center"/>
             </w:pPr>
             <w:r>
               <w:rPr>
                 <w:b/>
                 <w:color w:val="FFFFFF"/>
-                <w:sz w:val="15"/>
+                <w:sz w:val="18"/>
               </w:rPr>
               <w:t>Kategori (n)</w:t>
             </w:r>
@@ -5156,14 +5153,14 @@
           </w:tcPr>
           <w:p>
             <w:pPr>
-              <w:spacing w:before="20" w:after="20"/>
+              <w:spacing w:before="50" w:after="50" w:line="276" w:lineRule="auto"/>
               <w:jc w:val="center"/>
             </w:pPr>
             <w:r>
               <w:rPr>
                 <w:b/>
                 <w:color w:val="FFFFFF"/>
-                <w:sz w:val="15"/>
+                <w:sz w:val="18"/>
               </w:rPr>
               <w:t>Claude</w:t>
             </w:r>
@@ -5177,14 +5174,14 @@
           </w:tcPr>
           <w:p>
             <w:pPr>
-              <w:spacing w:before="20" w:after="20"/>
+              <w:spacing w:before="50" w:after="50" w:line="276" w:lineRule="auto"/>
               <w:jc w:val="center"/>
             </w:pPr>
             <w:r>
               <w:rPr>
                 <w:b/>
                 <w:color w:val="FFFFFF"/>
-                <w:sz w:val="15"/>
+                <w:sz w:val="18"/>
               </w:rPr>
               <w:t>Gemini</w:t>
             </w:r>
@@ -5203,11 +5200,11 @@
           </w:tcPr>
           <w:p>
             <w:pPr>
-              <w:spacing w:before="20" w:after="20"/>
-            </w:pPr>
-            <w:r>
-              <w:rPr>
-                <w:sz w:val="15"/>
+              <w:spacing w:before="50" w:after="50" w:line="276" w:lineRule="auto"/>
+            </w:pPr>
+            <w:r>
+              <w:rPr>
+                <w:sz w:val="18"/>
               </w:rPr>
               <w:t>Temel algoritmalar (24)</w:t>
             </w:r>
@@ -5221,12 +5218,12 @@
           </w:tcPr>
           <w:p>
             <w:pPr>
-              <w:spacing w:before="20" w:after="20"/>
+              <w:spacing w:before="50" w:after="50" w:line="276" w:lineRule="auto"/>
               <w:jc w:val="center"/>
             </w:pPr>
             <w:r>
               <w:rPr>
-                <w:sz w:val="15"/>
+                <w:sz w:val="18"/>
               </w:rPr>
               <w:t>17/24</w:t>
             </w:r>
@@ -5240,12 +5237,12 @@
           </w:tcPr>
           <w:p>
             <w:pPr>
-              <w:spacing w:before="20" w:after="20"/>
+              <w:spacing w:before="50" w:after="50" w:line="276" w:lineRule="auto"/>
               <w:jc w:val="center"/>
             </w:pPr>
             <w:r>
               <w:rPr>
-                <w:sz w:val="15"/>
+                <w:sz w:val="18"/>
               </w:rPr>
               <w:t>23/24</w:t>
             </w:r>
@@ -5264,11 +5261,11 @@
           </w:tcPr>
           <w:p>
             <w:pPr>
-              <w:spacing w:before="20" w:after="20"/>
-            </w:pPr>
-            <w:r>
-              <w:rPr>
-                <w:sz w:val="15"/>
+              <w:spacing w:before="50" w:after="50" w:line="276" w:lineRule="auto"/>
+            </w:pPr>
+            <w:r>
+              <w:rPr>
+                <w:sz w:val="18"/>
               </w:rPr>
               <w:t>Uzun özgün (5)</w:t>
             </w:r>
@@ -5282,12 +5279,12 @@
           </w:tcPr>
           <w:p>
             <w:pPr>
-              <w:spacing w:before="20" w:after="20"/>
+              <w:spacing w:before="50" w:after="50" w:line="276" w:lineRule="auto"/>
               <w:jc w:val="center"/>
             </w:pPr>
             <w:r>
               <w:rPr>
-                <w:sz w:val="15"/>
+                <w:sz w:val="18"/>
               </w:rPr>
               <w:t>4/5</w:t>
             </w:r>
@@ -5301,12 +5298,12 @@
           </w:tcPr>
           <w:p>
             <w:pPr>
-              <w:spacing w:before="20" w:after="20"/>
+              <w:spacing w:before="50" w:after="50" w:line="276" w:lineRule="auto"/>
               <w:jc w:val="center"/>
             </w:pPr>
             <w:r>
               <w:rPr>
-                <w:sz w:val="15"/>
+                <w:sz w:val="18"/>
               </w:rPr>
               <w:t>3/5</w:t>
             </w:r>
@@ -5325,11 +5322,11 @@
           </w:tcPr>
           <w:p>
             <w:pPr>
-              <w:spacing w:before="20" w:after="20"/>
-            </w:pPr>
-            <w:r>
-              <w:rPr>
-                <w:sz w:val="15"/>
+              <w:spacing w:before="50" w:after="50" w:line="276" w:lineRule="auto"/>
+            </w:pPr>
+            <w:r>
+              <w:rPr>
+                <w:sz w:val="18"/>
               </w:rPr>
               <w:t>Rosetta Code (7)</w:t>
             </w:r>
@@ -5343,12 +5340,12 @@
           </w:tcPr>
           <w:p>
             <w:pPr>
-              <w:spacing w:before="20" w:after="20"/>
+              <w:spacing w:before="50" w:after="50" w:line="276" w:lineRule="auto"/>
               <w:jc w:val="center"/>
             </w:pPr>
             <w:r>
               <w:rPr>
-                <w:sz w:val="15"/>
+                <w:sz w:val="18"/>
               </w:rPr>
               <w:t>7/7</w:t>
             </w:r>
@@ -5362,12 +5359,12 @@
           </w:tcPr>
           <w:p>
             <w:pPr>
-              <w:spacing w:before="20" w:after="20"/>
+              <w:spacing w:before="50" w:after="50" w:line="276" w:lineRule="auto"/>
               <w:jc w:val="center"/>
             </w:pPr>
             <w:r>
               <w:rPr>
-                <w:sz w:val="15"/>
+                <w:sz w:val="18"/>
               </w:rPr>
               <w:t>7/7</w:t>
             </w:r>
@@ -5386,11 +5383,11 @@
           </w:tcPr>
           <w:p>
             <w:pPr>
-              <w:spacing w:before="20" w:after="20"/>
-            </w:pPr>
-            <w:r>
-              <w:rPr>
-                <w:sz w:val="15"/>
+              <w:spacing w:before="50" w:after="50" w:line="276" w:lineRule="auto"/>
+            </w:pPr>
+            <w:r>
+              <w:rPr>
+                <w:sz w:val="18"/>
               </w:rPr>
               <w:t>BSD libc (3)</w:t>
             </w:r>
@@ -5404,12 +5401,12 @@
           </w:tcPr>
           <w:p>
             <w:pPr>
-              <w:spacing w:before="20" w:after="20"/>
+              <w:spacing w:before="50" w:after="50" w:line="276" w:lineRule="auto"/>
               <w:jc w:val="center"/>
             </w:pPr>
             <w:r>
               <w:rPr>
-                <w:sz w:val="15"/>
+                <w:sz w:val="18"/>
               </w:rPr>
               <w:t>2/3</w:t>
             </w:r>
@@ -5423,12 +5420,12 @@
           </w:tcPr>
           <w:p>
             <w:pPr>
-              <w:spacing w:before="20" w:after="20"/>
+              <w:spacing w:before="50" w:after="50" w:line="276" w:lineRule="auto"/>
               <w:jc w:val="center"/>
             </w:pPr>
             <w:r>
               <w:rPr>
-                <w:sz w:val="15"/>
+                <w:sz w:val="18"/>
               </w:rPr>
               <w:t>3/3</w:t>
             </w:r>
@@ -5447,11 +5444,11 @@
           </w:tcPr>
           <w:p>
             <w:pPr>
-              <w:spacing w:before="20" w:after="20"/>
-            </w:pPr>
-            <w:r>
-              <w:rPr>
-                <w:sz w:val="15"/>
+              <w:spacing w:before="50" w:after="50" w:line="276" w:lineRule="auto"/>
+            </w:pPr>
+            <w:r>
+              <w:rPr>
+                <w:sz w:val="18"/>
               </w:rPr>
               <w:t>Hedeflenmemiş boşluk (6)</w:t>
             </w:r>
@@ -5465,12 +5462,12 @@
           </w:tcPr>
           <w:p>
             <w:pPr>
-              <w:spacing w:before="20" w:after="20"/>
+              <w:spacing w:before="50" w:after="50" w:line="276" w:lineRule="auto"/>
               <w:jc w:val="center"/>
             </w:pPr>
             <w:r>
               <w:rPr>
-                <w:sz w:val="15"/>
+                <w:sz w:val="18"/>
               </w:rPr>
               <w:t>4/6</w:t>
             </w:r>
@@ -5484,12 +5481,12 @@
           </w:tcPr>
           <w:p>
             <w:pPr>
-              <w:spacing w:before="20" w:after="20"/>
+              <w:spacing w:before="50" w:after="50" w:line="276" w:lineRule="auto"/>
               <w:jc w:val="center"/>
             </w:pPr>
             <w:r>
               <w:rPr>
-                <w:sz w:val="15"/>
+                <w:sz w:val="18"/>
               </w:rPr>
               <w:t>6/6</w:t>
             </w:r>
@@ -5508,11 +5505,11 @@
           </w:tcPr>
           <w:p>
             <w:pPr>
-              <w:spacing w:before="20" w:after="20"/>
-            </w:pPr>
-            <w:r>
-              <w:rPr>
-                <w:sz w:val="15"/>
+              <w:spacing w:before="50" w:after="50" w:line="276" w:lineRule="auto"/>
+            </w:pPr>
+            <w:r>
+              <w:rPr>
+                <w:sz w:val="18"/>
               </w:rPr>
               <w:t>musl/Redis/cJSON (3)</w:t>
             </w:r>
@@ -5526,12 +5523,12 @@
           </w:tcPr>
           <w:p>
             <w:pPr>
-              <w:spacing w:before="20" w:after="20"/>
+              <w:spacing w:before="50" w:after="50" w:line="276" w:lineRule="auto"/>
               <w:jc w:val="center"/>
             </w:pPr>
             <w:r>
               <w:rPr>
-                <w:sz w:val="15"/>
+                <w:sz w:val="18"/>
               </w:rPr>
               <w:t>2/3</w:t>
             </w:r>
@@ -5545,12 +5542,12 @@
           </w:tcPr>
           <w:p>
             <w:pPr>
-              <w:spacing w:before="20" w:after="20"/>
+              <w:spacing w:before="50" w:after="50" w:line="276" w:lineRule="auto"/>
               <w:jc w:val="center"/>
             </w:pPr>
             <w:r>
               <w:rPr>
-                <w:sz w:val="15"/>
+                <w:sz w:val="18"/>
               </w:rPr>
               <w:t>0/3</w:t>
             </w:r>
@@ -5569,11 +5566,11 @@
           </w:tcPr>
           <w:p>
             <w:pPr>
-              <w:spacing w:before="20" w:after="20"/>
-            </w:pPr>
-            <w:r>
-              <w:rPr>
-                <w:sz w:val="15"/>
+              <w:spacing w:before="50" w:after="50" w:line="276" w:lineRule="auto"/>
+            </w:pPr>
+            <w:r>
+              <w:rPr>
+                <w:sz w:val="18"/>
               </w:rPr>
               <w:t>Kök-neden 2.örnek (5)</w:t>
             </w:r>
@@ -5587,12 +5584,12 @@
           </w:tcPr>
           <w:p>
             <w:pPr>
-              <w:spacing w:before="20" w:after="20"/>
+              <w:spacing w:before="50" w:after="50" w:line="276" w:lineRule="auto"/>
               <w:jc w:val="center"/>
             </w:pPr>
             <w:r>
               <w:rPr>
-                <w:sz w:val="15"/>
+                <w:sz w:val="18"/>
               </w:rPr>
               <w:t>1/5</w:t>
             </w:r>
@@ -5606,12 +5603,12 @@
           </w:tcPr>
           <w:p>
             <w:pPr>
-              <w:spacing w:before="20" w:after="20"/>
+              <w:spacing w:before="50" w:after="50" w:line="276" w:lineRule="auto"/>
               <w:jc w:val="center"/>
             </w:pPr>
             <w:r>
               <w:rPr>
-                <w:sz w:val="15"/>
+                <w:sz w:val="18"/>
               </w:rPr>
               <w:t>5/5</w:t>
             </w:r>
@@ -5630,11 +5627,11 @@
           </w:tcPr>
           <w:p>
             <w:pPr>
-              <w:spacing w:before="20" w:after="20"/>
-            </w:pPr>
-            <w:r>
-              <w:rPr>
-                <w:sz w:val="15"/>
+              <w:spacing w:before="50" w:after="50" w:line="276" w:lineRule="auto"/>
+            </w:pPr>
+            <w:r>
+              <w:rPr>
+                <w:sz w:val="18"/>
               </w:rPr>
               <w:t>Çok dosyalı (3)</w:t>
             </w:r>
@@ -5648,12 +5645,12 @@
           </w:tcPr>
           <w:p>
             <w:pPr>
-              <w:spacing w:before="20" w:after="20"/>
+              <w:spacing w:before="50" w:after="50" w:line="276" w:lineRule="auto"/>
               <w:jc w:val="center"/>
             </w:pPr>
             <w:r>
               <w:rPr>
-                <w:sz w:val="15"/>
+                <w:sz w:val="18"/>
               </w:rPr>
               <w:t>3/3</w:t>
             </w:r>
@@ -5667,12 +5664,12 @@
           </w:tcPr>
           <w:p>
             <w:pPr>
-              <w:spacing w:before="20" w:after="20"/>
+              <w:spacing w:before="50" w:after="50" w:line="276" w:lineRule="auto"/>
               <w:jc w:val="center"/>
             </w:pPr>
             <w:r>
               <w:rPr>
-                <w:sz w:val="15"/>
+                <w:sz w:val="18"/>
               </w:rPr>
               <w:t>3/3</w:t>
             </w:r>
@@ -5691,11 +5688,11 @@
           </w:tcPr>
           <w:p>
             <w:pPr>
-              <w:spacing w:before="20" w:after="20"/>
-            </w:pPr>
-            <w:r>
-              <w:rPr>
-                <w:sz w:val="15"/>
+              <w:spacing w:before="50" w:after="50" w:line="276" w:lineRule="auto"/>
+            </w:pPr>
+            <w:r>
+              <w:rPr>
+                <w:sz w:val="18"/>
               </w:rPr>
               <w:t>Karmaşık makro (1)</w:t>
             </w:r>
@@ -5709,12 +5706,12 @@
           </w:tcPr>
           <w:p>
             <w:pPr>
-              <w:spacing w:before="20" w:after="20"/>
+              <w:spacing w:before="50" w:after="50" w:line="276" w:lineRule="auto"/>
               <w:jc w:val="center"/>
             </w:pPr>
             <w:r>
               <w:rPr>
-                <w:sz w:val="15"/>
+                <w:sz w:val="18"/>
               </w:rPr>
               <w:t>0/1</w:t>
             </w:r>
@@ -5728,12 +5725,12 @@
           </w:tcPr>
           <w:p>
             <w:pPr>
-              <w:spacing w:before="20" w:after="20"/>
+              <w:spacing w:before="50" w:after="50" w:line="276" w:lineRule="auto"/>
               <w:jc w:val="center"/>
             </w:pPr>
             <w:r>
               <w:rPr>
-                <w:sz w:val="15"/>
+                <w:sz w:val="18"/>
               </w:rPr>
               <w:t>1/1</w:t>
             </w:r>
@@ -5792,7 +5789,11 @@
         <w:t>Gemini'nin Claude'da hiç görülmeyen (yani Claude'un PASS olduğu) üç başarısızlığı vardır. İkisi (s46_musl_qsort, s47_redis_sds) yukarıda anılan gerç</w:t>
       </w:r>
       <w:r>
-        <w:t>ek üretim kodu üçlüsüne aittir: s46'da Gemini geçersiz bir işaretçi söz dizimi (`*mut u8::null()`, Rust'ta böyle bir ifade yoktur) üretmiş; s47'de ise ekleme işleminin büyüme mantığını yanlış uygulayıp beklenen `LEN=5 STR=start...` yerine boş bir sonuç (`L</w:t>
+        <w:t xml:space="preserve">ek üretim kodu üçlüsüne aittir: s46'da Gemini geçersiz bir işaretçi söz dizimi (`*mut u8::null()`, Rust'ta böyle bir ifade yoktur) üretmiş; s47'de ise </w:t>
+      </w:r>
+      <w:r>
+        <w:lastRenderedPageBreak/>
+        <w:t>ekleme işleminin büyüme mantığını yanlış uygulayıp beklenen `LEN=5 STR=start...` yerine boş bir sonuç (`L</w:t>
       </w:r>
       <w:r>
         <w:t>EN=0`) döndürmüştür — Claude'un aynı iki örneği ilk seferde, hiç `unsafe` kullanmadan doğru çevirdiği hatırlanmalıdır (§IV-E). Üçüncüsü (s26_rpn_calculator) kısa, özgün bir programda ortaya çıkar ve kod karmaşıklığıyla değil tamamen farklı bir hata sınıfıy</w:t>
@@ -5812,17 +5813,20 @@
         <w:jc w:val="both"/>
       </w:pPr>
       <w:r>
+        <w:t>Her iki modelin de başarısız olduğu üç örnek de vardır: s15 (kategori D, çıktı biçimlendirme) her iki mode</w:t>
+      </w:r>
+      <w:r>
+        <w:t>lde de aynı kök nedenden görülmüştür; s27_csv_stats ve s48_cjson_number'da ise her iki model de başarısız olmuş ama farklı türde — Claude'da derlenen fakat yanlış sonuç veren bir kod (FE), Gemini'de ise derleme aşamasında takılan geçersiz bir söz dizimi (C</w:t>
+      </w:r>
+      <w:r>
+        <w:t>E, s27'de `{:+=03}` biçim belirteci, s48'de işaretçi bildirimi çevresinde sözdizimi hatası). Kategori D'nin üç bağımsız kod tabanının (s15, s27, s48) üçünde de iki modelin de başarısız olması, bu boşluğun modele özgü olmadığını, genel bir C↔Rust geçiş soru</w:t>
+      </w:r>
+      <w:r>
+        <w:t xml:space="preserve">nu olduğunu doğrular. Çok dosyalı/eşzamanlı yapıda (s54, s55, s57) her iki model de </w:t>
+      </w:r>
+      <w:r>
         <w:lastRenderedPageBreak/>
-        <w:t>Her iki modelin de başarısız olduğu üç örnek de vardır: s15 (kategori D, çıktı biçimlendirme) her iki mode</w:t>
-      </w:r>
-      <w:r>
-        <w:t>lde de aynı kök nedenden görülmüştür; s27_csv_stats ve s48_cjson_number'da ise her iki model de başarısız olmuş ama farklı türde — Claude'da derlenen fakat yanlış sonuç veren bir kod (FE), Gemini'de ise derleme aşamasında takılan geçersiz bir söz dizimi (C</w:t>
-      </w:r>
-      <w:r>
-        <w:t>E, s27'de `{:+=03}` biçim belirteci, s48'de işaretçi bildirimi çevresinde sözdizimi hatası). Kategori D'nin üç bağımsız kod tabanının (s15, s27, s48) üçünde de iki modelin de başarısız olması, bu boşluğun modele özgü olmadığını, genel bir C↔Rust geçiş soru</w:t>
-      </w:r>
-      <w:r>
-        <w:t>nu olduğunu doğrular. Çok dosyalı/eşzamanlı yapıda (s54, s55, s57) her iki model de üçünde de ilk seferde başarılıdır — bu alt kümede (n=3) model farkı gözlenmemiştir.</w:t>
+        <w:t>üçünde de ilk seferde başarılıdır — bu alt kümede (n=3) model farkı gözlenmemiştir.</w:t>
       </w:r>
     </w:p>
     <w:p>
@@ -5884,11 +5888,7 @@
         <w:t>z semantik hatalar olduğudur; Claude'da 17 başarısızlığın 16'sı derleyiciden hiç uyarı almadan geçmiştir. İkinci gözlem, derleme yapılandırmasının (debug/release) ve dağıtım platformunun (Windows/Linux) gizli birer değişken olduğudur — aynı kod farklı yapı</w:t>
       </w:r>
       <w:r>
-        <w:t xml:space="preserve">landırmada farklı sonuç verebilir. Üçüncü, bu çalışmaya özgü en yeni gözlem: iki bağımsız modelin karşılaştırması, "model A, model B'den genel </w:t>
-      </w:r>
-      <w:r>
-        <w:lastRenderedPageBreak/>
-        <w:t>olarak daha iyidir" biçiminde tek boyutlu bir sıralamanın yanıltıcı olduğunu gösterir (genel EA farkı McNemar tes</w:t>
+        <w:t>landırmada farklı sonuç verebilir. Üçüncü, bu çalışmaya özgü en yeni gözlem: iki bağımsız modelin karşılaştırması, "model A, model B'den genel olarak daha iyidir" biçiminde tek boyutlu bir sıralamanın yanıltıcı olduğunu gösterir (genel EA farkı McNemar tes</w:t>
       </w:r>
       <w:r>
         <w:t>tiyle anlamlı olsa da, p=0.013, §IV-F). Gemini kısa, hedeflenmiş sızıntı kategorilerinde (kök-neden 2. örnekler, 5/5) Claude'dan (1/5) belirgin biçimde daha dayanıklıyken, uzun/karmaşık gerçek üretim kodunda (0/3) Claude'dan (2/3) belirgin biçimde daha kır</w:t>
@@ -5929,7 +5929,11 @@
         <w:t>nın etkisini izole etmektir), ama C tarafının farklı optimizasyon seviyelerinde tekrarlanması ayrı bir sağlamlık kontrolü olurdu. Örnekleme protokolü: her örnek her model tarafından yalnızca bir kez (k=1) çevrilmiştir; LLM çıktısının stokastik doğası neden</w:t>
       </w:r>
       <w:r>
-        <w:t>iyle tekrar sayısı k=3-5 olsaydı pass@1/pass@k ile daha güvenilir bir tahmin elde edilebilirdi. Bu, çalışmanın tek-örneklemli tasarımının en önemli metodolojik sınırlamasıdır. İstatistiksel geçerlilik: FAIL grubu küçüktür (n=17); duyarlılık analizi (§IV-B)</w:t>
+        <w:t>iyle tekrar sayısı k=3-5 olsaydı pass@1/pass@k ile daha güvenilir bir tahmin elde edilebilirdi. Bu, çalışmanın tek-</w:t>
+      </w:r>
+      <w:r>
+        <w:lastRenderedPageBreak/>
+        <w:t>örneklemli tasarımının en önemli metodolojik sınırlamasıdır. İstatistiksel geçerlilik: FAIL grubu küçüktür (n=17); duyarlılık analizi (§IV-B)</w:t>
       </w:r>
       <w:r>
         <w:t>, bu n ile %80 güçte yalnızca orta-büyük etkilerin (|r|≳0.46) saptanabileceğini göstermiştir. Aynı küçük veri seti üzerinde üç çıkarımsal test uygulanmıştır (Mann-Whitney, Fisher, McNemar); bunlar keşif amaçlı (exploratory) okunmalı, doğrulayıcı (confirmat</w:t>
@@ -5953,11 +5957,7 @@
         <w:t>11'i geçmiştir, ama bu alt küme küçüktür. Son olarak, depo tam olarak yerel/GitHub'da mevcuttur ama kalıcı bir Zenodo/figshare DOI'si henüz atanmamıştır; bu, "tümüyle tekrarlanabilir" iddiasını uzun vadeli erişilebilirlik açısından zayıflatan bir eksiklikt</w:t>
       </w:r>
       <w:r>
-        <w:t xml:space="preserve">ir. Kategori C ve F'de "doğru davranış" referans platformun implementation-defined seçimine göredir; bu iki kategori </w:t>
-      </w:r>
-      <w:r>
-        <w:lastRenderedPageBreak/>
-        <w:t>platformdan bağımsız bir kök neden değil, referans platformun (Windows/LLP64) bir artefaktı olarak okunmalıdır. Claude'un `i64` seçimi Linu</w:t>
+        <w:t>ir. Kategori C ve F'de "doğru davranış" referans platformun implementation-defined seçimine göredir; bu iki kategori platformdan bağımsız bir kök neden değil, referans platformun (Windows/LLP64) bir artefaktı olarak okunmalıdır. Claude'un `i64` seçimi Linu</w:t>
       </w:r>
       <w:r>
         <w:t>x/LP64'te doğru olurdu (§IV-F). Model×kategori etkileşiminin varlığı istatistiksel olarak test edilmemiştir (ör. lojistik regresyonda model×kategori terimi veya Breslow-Day homojenlik testi); Tablo VII'deki kırılım betimsel düzeydedir.</w:t>
@@ -6008,6 +6008,7 @@
           <w:b/>
           <w:sz w:val="21"/>
         </w:rPr>
+        <w:lastRenderedPageBreak/>
         <w:t>VI. SONUÇ</w:t>
       </w:r>
     </w:p>
@@ -6056,13 +6057,13 @@
         <w:rPr>
           <w:sz w:val="18"/>
         </w:rPr>
-        <w:t xml:space="preserve">[1] H. F. Eniser, H. Zhang, C. David, M. Wang, M. Christakis, B. </w:t>
+        <w:t>[1] H. F. Eniser, H. Zhang, C. David, M. Wang, M. Christakis, B. Paulsen</w:t>
       </w:r>
       <w:r>
         <w:rPr>
           <w:sz w:val="18"/>
         </w:rPr>
-        <w:t>Paulsen, J. Dodds, and D. Kroening, "Towards Translating Real-World Code with LLMs: A Study of Translating to Rust," arXiv:2405.11514, 2024.</w:t>
+        <w:t>, J. Dodds, and D. Kroening, "Towards Translating Real-World Code with LLMs: A Study of Translating to Rust," arXiv:2405.11514, 2024.</w:t>
       </w:r>
     </w:p>
     <w:p>
@@ -6074,20 +6075,158 @@
         <w:rPr>
           <w:sz w:val="18"/>
         </w:rPr>
-        <w:t>[2] S. Gandhi, M. Patwardhan, J. Khatri, L. Vig, and R. K. Medicherla, "Translation of Low-Resource COBOL to Logica</w:t>
+        <w:t>[2] S. Gandhi, M. Patwardhan, J. Khatri, L. Vig, and R. K. Medicherla, "Translation of Low-Resource COBOL to Logically Cor</w:t>
       </w:r>
       <w:r>
         <w:rPr>
           <w:sz w:val="18"/>
         </w:rPr>
-        <w:t xml:space="preserve">lly </w:t>
-      </w:r>
+        <w:t>rect and Readable Java leveraging High-Resource Java Refinement," in Proc. 1st Int. Workshop on Large Language Models for Code (LLM4Code '24), ICSE 2024, Lisbon, Portugal, pp. 46-53, doi: 10.1145/3643795.3648388.</w:t>
+      </w:r>
+    </w:p>
+    <w:p>
+      <w:pPr>
+        <w:spacing w:after="40"/>
+        <w:ind w:left="198" w:hanging="198"/>
+      </w:pPr>
+      <w:r>
+        <w:rPr>
+          <w:sz w:val="18"/>
+        </w:rPr>
+        <w:t>[3] X. Yin, C. Ni, T. N. Nguyen, S. Wang, a</w:t>
+      </w:r>
+      <w:r>
+        <w:rPr>
+          <w:sz w:val="18"/>
+        </w:rPr>
+        <w:t>nd X. Yang, "Rectifier: Code Translation with Corrector via LLMs," arXiv:2407.07472, 2024.</w:t>
+      </w:r>
+    </w:p>
+    <w:p>
+      <w:pPr>
+        <w:spacing w:after="40"/>
+        <w:ind w:left="198" w:hanging="198"/>
+      </w:pPr>
+      <w:r>
+        <w:rPr>
+          <w:sz w:val="18"/>
+        </w:rPr>
+        <w:t xml:space="preserve">[4] Rosetta Code, rosettacode.org — Luhn test, Soundex, Levenshtein distance, 0-1 Knapsack, Towers of Hanoi, LCS, CRC-32 (C solutions). [Online]. Available: </w:t>
+      </w:r>
+      <w:r>
+        <w:rPr>
+          <w:sz w:val="18"/>
+        </w:rPr>
+        <w:t>github.com/acmeism/RosettaCodeData</w:t>
+      </w:r>
+    </w:p>
+    <w:p>
+      <w:pPr>
+        <w:spacing w:after="40"/>
+        <w:ind w:left="198" w:hanging="198"/>
+      </w:pPr>
+      <w:r>
+        <w:rPr>
+          <w:sz w:val="18"/>
+        </w:rPr>
+        <w:t>[5] The Regents of the Univ. of California / OpenBSD and FreeBSD Projects, getopt.c (1987), strtol.c (1990), heapsort.c (1991). [Online]. Available: github.com/openbsd/src, github.com/freebsd/freebsd-src</w:t>
+      </w:r>
+    </w:p>
+    <w:p>
+      <w:pPr>
+        <w:spacing w:after="40"/>
+        <w:ind w:left="198" w:hanging="198"/>
+      </w:pPr>
+      <w:r>
+        <w:rPr>
+          <w:sz w:val="18"/>
+        </w:rPr>
+        <w:t>[6] musl libc Pro</w:t>
+      </w:r>
+      <w:r>
+        <w:rPr>
+          <w:sz w:val="18"/>
+        </w:rPr>
+        <w:t>ject (R. Felker et al.), qsort.c (smoothsort, L. Ochs, 2011). [Online]. Available: github.com/kraj/musl</w:t>
+      </w:r>
+    </w:p>
+    <w:p>
+      <w:pPr>
+        <w:spacing w:after="40"/>
+        <w:ind w:left="198" w:hanging="198"/>
+      </w:pPr>
+      <w:r>
+        <w:rPr>
+          <w:sz w:val="18"/>
+        </w:rPr>
+        <w:t>[7] S. Sanfilippo et al., sds.c/sds.h (SDS v2.0), Redis 7.2.4. [Online]. Available: github.com/redis/redis (tag 7.2.4)</w:t>
+      </w:r>
+    </w:p>
+    <w:p>
+      <w:pPr>
+        <w:spacing w:after="40"/>
+        <w:ind w:left="198" w:hanging="198"/>
+      </w:pPr>
+      <w:r>
+        <w:rPr>
+          <w:sz w:val="18"/>
+        </w:rPr>
+        <w:t>[8] D. Gamble et al., cJSON.c (pa</w:t>
+      </w:r>
+      <w:r>
+        <w:rPr>
+          <w:sz w:val="18"/>
+        </w:rPr>
+        <w:t>rse_number, print_number). [Online]. Available: github.com/DaveGamble/cJSON</w:t>
+      </w:r>
+    </w:p>
+    <w:p>
+      <w:pPr>
+        <w:spacing w:after="40"/>
+        <w:ind w:left="198" w:hanging="198"/>
+      </w:pPr>
+      <w:r>
+        <w:rPr>
+          <w:sz w:val="18"/>
+        </w:rPr>
+        <w:t>[9] Google, "Gemini API — gemini-flash-latest," 2025. [Online]. Available: ai.google.dev/gemini-api/docs</w:t>
+      </w:r>
+    </w:p>
+    <w:p>
+      <w:pPr>
+        <w:spacing w:after="40"/>
+        <w:ind w:left="198" w:hanging="198"/>
+      </w:pPr>
+      <w:r>
+        <w:rPr>
+          <w:sz w:val="18"/>
+        </w:rPr>
+        <w:t xml:space="preserve">[10] Cybersecurity and Infrastructure Security Agency (CISA), National </w:t>
+      </w:r>
+      <w:r>
+        <w:rPr>
+          <w:sz w:val="18"/>
+        </w:rPr>
+        <w:t>Security Agency (NSA), Federal Bureau of Investigation (FBI) et al., "The Case for Memory Safe Roadmaps: Why both C-Suite Executives and Technical Experts Need to Take Memory Safe Coding Seriously," joint cybersecurity guidance, Dec. 2023. [Online]. Availa</w:t>
+      </w:r>
+      <w:r>
+        <w:rPr>
+          <w:sz w:val="18"/>
+        </w:rPr>
+        <w:t>ble: cisa.gov/case-memory-safe-roadmaps</w:t>
+      </w:r>
+    </w:p>
+    <w:p>
+      <w:pPr>
+        <w:spacing w:after="40"/>
+        <w:ind w:left="198" w:hanging="198"/>
+      </w:pPr>
       <w:r>
         <w:rPr>
           <w:sz w:val="18"/>
         </w:rPr>
         <w:lastRenderedPageBreak/>
-        <w:t>Correct and Readable Java leveraging High-Resource Java Refinement," in Proc. 1st Int. Workshop on Large Language Models for Code (LLM4Code '24), ICSE 2024, Lisbon, Portugal, pp. 46-53, doi: 10.1145/3643795.3648388.</w:t>
+        <w:t>[11] Immunant, Inc., "C2Rust: migrate C code to Rust," open-source project. [Online]. Available: github.com/immunant/c2rust</w:t>
       </w:r>
     </w:p>
     <w:p>
@@ -6099,13 +6238,13 @@
         <w:rPr>
           <w:sz w:val="18"/>
         </w:rPr>
-        <w:t xml:space="preserve">[3] X. Yin, C. Ni, T. N. Nguyen, S. </w:t>
+        <w:t>[12] B. Rozière, M.-A. Lachaux, L. Chanussot, and G. Lample, "Unsupervised Translation of Pr</w:t>
       </w:r>
       <w:r>
         <w:rPr>
           <w:sz w:val="18"/>
         </w:rPr>
-        <w:t>Wang, and X. Yang, "Rectifier: Code Translation with Corrector via LLMs," arXiv:2407.07472, 2024.</w:t>
+        <w:t>ogramming Languages," in Advances in Neural Information Processing Systems (NeurIPS) 33, 2020, arXiv:2006.03511.</w:t>
       </w:r>
     </w:p>
     <w:p>
@@ -6117,157 +6256,13 @@
         <w:rPr>
           <w:sz w:val="18"/>
         </w:rPr>
-        <w:t>[4] Rosetta Code, rosettacode.org — Luhn test, Soundex, Levenshtein distance, 0-1 Knapsack, Towers of Hanoi, LCS, CRC-32 (C solutions). [Online]. Available: g</w:t>
+        <w:t>[13] J. M. Hoenig and D. M. Heisey, "The Abuse of Power: The Pervasive Fallacy of Power Calculations for Data Analysis," The American Statistic</w:t>
       </w:r>
       <w:r>
         <w:rPr>
           <w:sz w:val="18"/>
         </w:rPr>
-        <w:t>ithub.com/acmeism/RosettaCodeData</w:t>
-      </w:r>
-    </w:p>
-    <w:p>
-      <w:pPr>
-        <w:spacing w:after="40"/>
-        <w:ind w:left="198" w:hanging="198"/>
-      </w:pPr>
-      <w:r>
-        <w:rPr>
-          <w:sz w:val="18"/>
-        </w:rPr>
-        <w:t>[5] The Regents of the Univ. of California / OpenBSD and FreeBSD Projects, getopt.c (1987), strtol.c (1990), heapsort.c (1991). [Online]. Available: github.com/openbsd/src, github.com/freebsd/freebsd-src</w:t>
-      </w:r>
-    </w:p>
-    <w:p>
-      <w:pPr>
-        <w:spacing w:after="40"/>
-        <w:ind w:left="198" w:hanging="198"/>
-      </w:pPr>
-      <w:r>
-        <w:rPr>
-          <w:sz w:val="18"/>
-        </w:rPr>
-        <w:t>[6] musl libc Proj</w:t>
-      </w:r>
-      <w:r>
-        <w:rPr>
-          <w:sz w:val="18"/>
-        </w:rPr>
-        <w:t>ect (R. Felker et al.), qsort.c (smoothsort, L. Ochs, 2011). [Online]. Available: github.com/kraj/musl</w:t>
-      </w:r>
-    </w:p>
-    <w:p>
-      <w:pPr>
-        <w:spacing w:after="40"/>
-        <w:ind w:left="198" w:hanging="198"/>
-      </w:pPr>
-      <w:r>
-        <w:rPr>
-          <w:sz w:val="18"/>
-        </w:rPr>
-        <w:t>[7] S. Sanfilippo et al., sds.c/sds.h (SDS v2.0), Redis 7.2.4. [Online]. Available: github.com/redis/redis (tag 7.2.4)</w:t>
-      </w:r>
-    </w:p>
-    <w:p>
-      <w:pPr>
-        <w:spacing w:after="40"/>
-        <w:ind w:left="198" w:hanging="198"/>
-      </w:pPr>
-      <w:r>
-        <w:rPr>
-          <w:sz w:val="18"/>
-        </w:rPr>
-        <w:t>[8] D. Gamble et al., cJSON.c (par</w:t>
-      </w:r>
-      <w:r>
-        <w:rPr>
-          <w:sz w:val="18"/>
-        </w:rPr>
-        <w:t>se_number, print_number). [Online]. Available: github.com/DaveGamble/cJSON</w:t>
-      </w:r>
-    </w:p>
-    <w:p>
-      <w:pPr>
-        <w:spacing w:after="40"/>
-        <w:ind w:left="198" w:hanging="198"/>
-      </w:pPr>
-      <w:r>
-        <w:rPr>
-          <w:sz w:val="18"/>
-        </w:rPr>
-        <w:t>[9] Google, "Gemini API — gemini-flash-latest," 2025. [Online]. Available: ai.google.dev/gemini-api/docs</w:t>
-      </w:r>
-    </w:p>
-    <w:p>
-      <w:pPr>
-        <w:spacing w:after="40"/>
-        <w:ind w:left="198" w:hanging="198"/>
-      </w:pPr>
-      <w:r>
-        <w:rPr>
-          <w:sz w:val="18"/>
-        </w:rPr>
-        <w:t>[10] Cybersecurity and Infrastructure Security Agency (CISA), National Secur</w:t>
-      </w:r>
-      <w:r>
-        <w:rPr>
-          <w:sz w:val="18"/>
-        </w:rPr>
-        <w:t xml:space="preserve">ity Agency (NSA), Federal Bureau of Investigation (FBI) et al., "The Case for Memory Safe Roadmaps: Why both C-Suite Executives and Technical Experts Need to Take Memory Safe Coding Seriously," joint cybersecurity guidance, Dec. 2023. [Online]. Available: </w:t>
-      </w:r>
-      <w:r>
-        <w:rPr>
-          <w:sz w:val="18"/>
-        </w:rPr>
-        <w:t>cisa.gov/case-memory-safe-roadmaps</w:t>
-      </w:r>
-    </w:p>
-    <w:p>
-      <w:pPr>
-        <w:spacing w:after="40"/>
-        <w:ind w:left="198" w:hanging="198"/>
-      </w:pPr>
-      <w:r>
-        <w:rPr>
-          <w:sz w:val="18"/>
-        </w:rPr>
-        <w:t>[11] Immunant, Inc., "C2Rust: migrate C code to Rust," open-source project. [Online]. Available: github.com/immunant/c2rust</w:t>
-      </w:r>
-    </w:p>
-    <w:p>
-      <w:pPr>
-        <w:spacing w:after="40"/>
-        <w:ind w:left="198" w:hanging="198"/>
-      </w:pPr>
-      <w:r>
-        <w:rPr>
-          <w:sz w:val="18"/>
-        </w:rPr>
-        <w:t>[12] B. Rozière, M.-A. Lachaux, L. Chanussot, and G. Lample, "Unsupervised Translation of Program</w:t>
-      </w:r>
-      <w:r>
-        <w:rPr>
-          <w:sz w:val="18"/>
-        </w:rPr>
-        <w:t>ming Languages," in Advances in Neural Information Processing Systems (NeurIPS) 33, 2020, arXiv:2006.03511.</w:t>
-      </w:r>
-    </w:p>
-    <w:p>
-      <w:pPr>
-        <w:spacing w:after="40"/>
-        <w:ind w:left="198" w:hanging="198"/>
-      </w:pPr>
-      <w:r>
-        <w:rPr>
-          <w:sz w:val="18"/>
-        </w:rPr>
-        <w:t xml:space="preserve">[13] J. M. Hoenig and D. M. Heisey, "The Abuse of Power: The Pervasive Fallacy of Power Calculations for Data Analysis," The American Statistician, </w:t>
-      </w:r>
-      <w:r>
-        <w:rPr>
-          <w:sz w:val="18"/>
-        </w:rPr>
-        <w:t>vol. 55, no. 1, pp. 19-24, 2001.</w:t>
+        <w:t>ian, vol. 55, no. 1, pp. 19-24, 2001.</w:t>
       </w:r>
     </w:p>
     <w:sectPr>
@@ -18191,7 +18186,7 @@
 </file>
 
 <file path=customXml/itemProps1.xml><?xml version="1.0" encoding="utf-8"?>
-<ds:datastoreItem xmlns:ds="http://schemas.openxmlformats.org/officeDocument/2006/customXml" ds:itemID="{DB728A60-65C6-4775-82CB-07C44DFEF48C}">
+<ds:datastoreItem xmlns:ds="http://schemas.openxmlformats.org/officeDocument/2006/customXml" ds:itemID="{2CD5FEA3-8219-46EA-9D06-1939F3B50D80}">
   <ds:schemaRefs>
     <ds:schemaRef ds:uri="http://schemas.openxmlformats.org/officeDocument/2006/bibliography"/>
   </ds:schemaRefs>

</xml_diff>

<commit_message>
Baslik/gövde/referans puntolarini gercek IEEE sablonuna gore duzelt
- Baslik: 15pt->24pt; alt baslik 11pt->12pt (buyutulmus baslikla orantili)
- Yazar adi 11pt, unvan/kurum/sehir/e-posta 10pt olarak ayristirildi (onceden hepsi 10pt idi)
- Govde metni (Normal stil + add_para/add_para_parts varsayilani) 9.8pt->10pt
- Bolum basligi (I, II, III...) 10.5pt->10pt; alt bolum basligi (A, B, C...) 9.8pt->10pt
- Oz/Anahtar Kelimeler govdeden kucuk 9pt'e cekildi (IEEE'de ozet gövdeden kucuk olur)
- Tablo/sekil basliklari 8.5pt->8pt, kaynakca 9pt->8pt
- add_table artik varsayilan olarak repeat_header=True: sayfa sinirinda bolunen
  tablolarda (ör. Tablo IV) baslik satiri otomatik tekrarlanir

Not: govde/baslik puntolarinin gercek IEEE degerlerine cekilmesi metin hacmini
artirdigindan sayfa sayisi 8'den 9'a cikti (son sayfada yalnizca son kaynakca
girdisi kaldi). Tablo puntolari (8.5-9pt) bir onceki "daha okunabilir" talebi
dogrultusunda korundu, ~IEEE'nin tipik 8pt tablo puntosunun biraz uzerinde.
</commit_message>
<xml_diff>
--- a/makale_IEEE_v1.docx
+++ b/makale_IEEE_v1.docx
@@ -12,14 +12,14 @@
       <w:r>
         <w:rPr>
           <w:b/>
-          <w:sz w:val="30"/>
+          <w:sz w:val="48"/>
         </w:rPr>
         <w:t>LLM Destekli Kod Çevirisinde Sessiz Semantik Hatalar:</w:t>
       </w:r>
       <w:r>
         <w:rPr>
           <w:b/>
-          <w:sz w:val="30"/>
+          <w:sz w:val="48"/>
         </w:rPr>
         <w:br/>
         <w:t>C'den Rust'a Çoklu-Model Deneysel Bir Değerlendirme</w:t>
@@ -33,7 +33,7 @@
       <w:r>
         <w:rPr>
           <w:i/>
-          <w:sz w:val="22"/>
+          <w:sz w:val="24"/>
         </w:rPr>
         <w:t>Bir Diferansiyel Test, Çoklu-Model Karşılaştırma ve İyileştirme Döngüsü Çalışması</w:t>
       </w:r>
@@ -59,7 +59,7 @@
             </w:pPr>
             <w:r>
               <w:rPr>
-                <w:sz w:val="20"/>
+                <w:sz w:val="22"/>
               </w:rPr>
               <w:t>Muhammet Baykara</w:t>
             </w:r>
@@ -69,7 +69,6 @@
             <w:r>
               <w:rPr>
                 <w:i/>
-                <w:sz w:val="20"/>
               </w:rPr>
               <w:t>Yazılım Mühendisliği</w:t>
             </w:r>
@@ -79,7 +78,6 @@
             <w:r>
               <w:rPr>
                 <w:i/>
-                <w:sz w:val="20"/>
               </w:rPr>
               <w:t>Fırat Üniversitesi</w:t>
             </w:r>
@@ -87,24 +85,15 @@
               <w:br/>
             </w:r>
             <w:r>
-              <w:rPr>
-                <w:sz w:val="20"/>
-              </w:rPr>
               <w:t xml:space="preserve">Elazığ, </w:t>
             </w:r>
             <w:r>
-              <w:rPr>
-                <w:sz w:val="20"/>
-              </w:rPr>
               <w:t>Türkiye</w:t>
             </w:r>
             <w:r>
               <w:br/>
             </w:r>
             <w:r>
-              <w:rPr>
-                <w:sz w:val="20"/>
-              </w:rPr>
               <w:t>mbaykara@firat.edu.tr</w:t>
             </w:r>
           </w:p>
@@ -119,7 +108,7 @@
             </w:pPr>
             <w:r>
               <w:rPr>
-                <w:sz w:val="20"/>
+                <w:sz w:val="22"/>
               </w:rPr>
               <w:t>İbrahim Halil Şahin</w:t>
             </w:r>
@@ -129,7 +118,6 @@
             <w:r>
               <w:rPr>
                 <w:i/>
-                <w:sz w:val="20"/>
               </w:rPr>
               <w:t>Yazılım Mühendisliği</w:t>
             </w:r>
@@ -139,7 +127,6 @@
             <w:r>
               <w:rPr>
                 <w:i/>
-                <w:sz w:val="20"/>
               </w:rPr>
               <w:t>Fırat Üniversitesi</w:t>
             </w:r>
@@ -147,18 +134,12 @@
               <w:br/>
             </w:r>
             <w:r>
-              <w:rPr>
-                <w:sz w:val="20"/>
-              </w:rPr>
               <w:t>Elazığ, Türkiye</w:t>
             </w:r>
             <w:r>
               <w:br/>
             </w:r>
             <w:r>
-              <w:rPr>
-                <w:sz w:val="20"/>
-              </w:rPr>
               <w:t>230541112@firat.edu.tr</w:t>
             </w:r>
           </w:p>
@@ -173,7 +154,7 @@
             </w:pPr>
             <w:r>
               <w:rPr>
-                <w:sz w:val="20"/>
+                <w:sz w:val="22"/>
               </w:rPr>
               <w:t>Emre Aşkın</w:t>
             </w:r>
@@ -183,7 +164,6 @@
             <w:r>
               <w:rPr>
                 <w:i/>
-                <w:sz w:val="20"/>
               </w:rPr>
               <w:t>Yazılım Mühendisliği</w:t>
             </w:r>
@@ -193,7 +173,6 @@
             <w:r>
               <w:rPr>
                 <w:i/>
-                <w:sz w:val="20"/>
               </w:rPr>
               <w:t>Fırat Üniversitesi</w:t>
             </w:r>
@@ -201,18 +180,12 @@
               <w:br/>
             </w:r>
             <w:r>
-              <w:rPr>
-                <w:sz w:val="20"/>
-              </w:rPr>
               <w:t>Elazığ, Türkiye</w:t>
             </w:r>
             <w:r>
               <w:br/>
             </w:r>
             <w:r>
-              <w:rPr>
-                <w:sz w:val="20"/>
-              </w:rPr>
               <w:t>230541146@firat.edu.tr</w:t>
             </w:r>
           </w:p>
@@ -243,35 +216,63 @@
         <w:rPr>
           <w:b/>
           <w:i/>
+          <w:sz w:val="18"/>
         </w:rPr>
         <w:lastRenderedPageBreak/>
         <w:t>Öz—</w:t>
       </w:r>
       <w:r>
+        <w:rPr>
+          <w:sz w:val="18"/>
+        </w:rPr>
         <w:t xml:space="preserve">Büyük dil </w:t>
       </w:r>
       <w:r>
+        <w:rPr>
+          <w:sz w:val="18"/>
+        </w:rPr>
         <w:t>modellerinin (LLM) ürettiği C→Rust çevirilerinin davranışsal eşdeğerliği yeterince incelenmemiştir. Bu çalışma, 57 C programı ve 229 test girdisinden oluşan özgün bir kıyaslama setinde, Claude Sonnet 5'in zero-shot çevirilerini diferansiyel test ile ölçer:</w:t>
       </w:r>
       <w:r>
+        <w:rPr>
+          <w:sz w:val="18"/>
+        </w:rPr>
         <w:t xml:space="preserve"> ham yürütme doğruluğu (EA) yalnızca %70.18'dir (40/57); başarısızlıkların %94'ü (16/17) derleme aşamasında hiç yakalanmamış, %70.6'sı (12/17) ise çalışma zamanında da hiçbir sinyal üretmeden yanlış çıktı veren sessiz semantik hatalardır. Hatalar dokuz tek</w:t>
       </w:r>
       <w:r>
+        <w:rPr>
+          <w:sz w:val="18"/>
+        </w:rPr>
         <w:t>rar eden C↔Rust semantik boşluğuna ayrılmıştır; ortak örüntü, modelin kaynağın özgül davranış sözleşmesi yerine hedef dilin idiyomatik varsayılanını seçmesidir. Kod uzunluğu tek başına açıklayıcı değildir (Mann-Whitney U, p=0.359). Deney dört yönde genişle</w:t>
       </w:r>
       <w:r>
+        <w:rPr>
+          <w:sz w:val="18"/>
+        </w:rPr>
         <w:t>tilmiştir: ikinci bir modelle (Google Gemini, 57/57 örnek üzerinde EA=%89.47) gerçek bir çoklu-model karşılaştırması, çok dosyalı/eşzamanlı C yapıları, Linux/LP64'te (Docker) 57 örneğin 55'i üzerinde bir tekrar (52/55 PASS), ve sınırlandırılmış geri bildir</w:t>
       </w:r>
       <w:r>
+        <w:rPr>
+          <w:sz w:val="18"/>
+        </w:rPr>
         <w:t>imle bir iyileştirme deneyi. Model karşılaştırması tek bir modelin "daha iyi" olmadığını gösterir: Gemini, Claude'un tekrarladığı beş kök-neden kategorisinde (5/5) başarılıyken, gerçek üretim kodu üçlüsünde (musl/Redis/cJSON) Claude'un (2/3) aksine sıfır b</w:t>
       </w:r>
       <w:r>
+        <w:rPr>
+          <w:sz w:val="18"/>
+        </w:rPr>
         <w:t xml:space="preserve">aşarı (0/3) göstermiştir — genel EA farkı McNemar testiyle anlamlıdır (p=0.013), ama yön kategoriye göre değişir. Sessiz hata oranı da modele özgüdür: Claude'un 17 başarısızlığının 16'sı (%94) derleyiciden hiç uyarı almazken, Gemini'nin 6 başarısızlığının </w:t>
       </w:r>
       <w:r>
+        <w:rPr>
+          <w:sz w:val="18"/>
+        </w:rPr>
         <w:t>yalnızca 2'si (%33) sessizdir — kalan 4'ü derleme aşamasında yakalanmıştır. Bulgular, LLM destekli kod çevirisinde asıl riskin sözdizimsel değil sessiz semantik hatalar olduğunu ve (yalnızca Claude üzerinde ölçülen) doğrulama-geri bildirim döngüsünün doğru</w:t>
       </w:r>
       <w:r>
+        <w:rPr>
+          <w:sz w:val="18"/>
+        </w:rPr>
         <w:t>luğu %100'e taşıdığını, ancak bu rakamın zengin bir geri bildirime dayanan bir üst sınır olduğunu, kısıtlı geri bildirimde %71.9-86.0'a düştüğünü göstermektedir.</w:t>
       </w:r>
     </w:p>
@@ -284,18 +285,21 @@
         <w:rPr>
           <w:b/>
           <w:i/>
+          <w:sz w:val="18"/>
         </w:rPr>
         <w:t>Anahtar Kelimeler—</w:t>
       </w:r>
       <w:r>
         <w:rPr>
           <w:i/>
+          <w:sz w:val="18"/>
         </w:rPr>
         <w:t>kod çevirisi, büyük dil modelleri, Rust, diferansiyel test, semantik hata, ç</w:t>
       </w:r>
       <w:r>
         <w:rPr>
           <w:i/>
+          <w:sz w:val="18"/>
         </w:rPr>
         <w:t>oklu-model karşılaştırma</w:t>
       </w:r>
@@ -308,7 +312,6 @@
       <w:r>
         <w:rPr>
           <w:b/>
-          <w:sz w:val="21"/>
         </w:rPr>
         <w:t>I. GİRİŞ</w:t>
       </w:r>
@@ -336,11 +339,11 @@
         <w:t xml:space="preserve"> bellek-güvensiz dillerden kaynaklandığından, Rust gibi bellek-güvenli sistem dillerine geçiş kritik bir mühendislik hedefidir. Manuel geçiş maliyeti çok yüksek olduğundan, LLM tabanlı otomatik kod çevirisi hem endüstride hem akademide hızla ilgi görmekted</w:t>
       </w:r>
       <w:r>
-        <w:t xml:space="preserve">ir. Büyük teknoloji şirketlerinin ve kamu kurumlarının bellek-güvenli dillere geçiş yönündeki açık politika duyuruları [10], bu ilgiyi yalnızca akademik bir merak olmaktan çıkarıp somut, zaman baskılı bir mühendislik ihtiyacına dönüştürmektedir; ancak bu </w:t>
+        <w:t xml:space="preserve">ir. Büyük teknoloji şirketlerinin ve kamu kurumlarının bellek-güvenli dillere geçiş yönündeki açık politika duyuruları </w:t>
       </w:r>
       <w:r>
         <w:lastRenderedPageBreak/>
-        <w:t>b</w:t>
+        <w:t>[10], bu ilgiyi yalnızca akademik bir merak olmaktan çıkarıp somut, zaman baskılı bir mühendislik ihtiyacına dönüştürmektedir; ancak bu b</w:t>
       </w:r>
       <w:r>
         <w:t>askı, çevirinin doğruluğunun yeterince doğrulanmadan kabul edilmesi riskini de beraberinde getirir.</w:t>
@@ -415,7 +418,11 @@
         <w:t>leceğinin kanıtı; (iii) dokuz kök nedene dayanan bir hata taksonomisi; (iv) üç geri bildirim ayrıntı seviyesinde ölçülmüş bir iyileştirme-döngüsü etkinliği eğrisi; (v) 13 bağımsız gerçek dünya algoritması (Rosetta Code, OpenBSD/FreeBSD libc, musl/Redis/cJS</w:t>
       </w:r>
       <w:r>
-        <w:t>ON) üzerinde tekrarlanan ölçüm; ve (vi) 57/57 örneğin tamamı üzerinde gerçek, otomatik bir ikinci-model (Gemini) ölçümü — bu çalışmanın en yeni katkısı — modele özgü ve modelden bağımsız hata kategorilerini ayırt eder.</w:t>
+        <w:t xml:space="preserve">ON) üzerinde tekrarlanan ölçüm; ve (vi) </w:t>
+      </w:r>
+      <w:r>
+        <w:lastRenderedPageBreak/>
+        <w:t>57/57 örneğin tamamı üzerinde gerçek, otomatik bir ikinci-model (Gemini) ölçümü — bu çalışmanın en yeni katkısı — modele özgü ve modelden bağımsız hata kategorilerini ayırt eder.</w:t>
       </w:r>
     </w:p>
     <w:p>
@@ -426,7 +433,6 @@
       <w:r>
         <w:rPr>
           <w:b/>
-          <w:sz w:val="21"/>
         </w:rPr>
         <w:t>II. İLGİLİ ÇALIŞMALAR</w:t>
       </w:r>
@@ -442,11 +448,7 @@
         <w:t xml:space="preserve"> çevirisinin doğruluğunu yürütme yoluyla doğrulayan çalışmalar artmaktadır. Gandhi vd. [2], COBOL→Java çevirisinde execution-guided refinement ile %81.99 doğruluğa ulaşmıştır; bu çalışma benzer bir mantığı C→Rust'ta benimser. Eniser vd. [1], FLUORINE ile k</w:t>
       </w:r>
       <w:r>
-        <w:t xml:space="preserve">od uzunluğu arttıkça çeviri hatası riskinin arttığını gözlemlemiştir — bu çalışmanın bulguları bu gözlemle örtüşmez (§IV-B). Yin vd. [3], farklı LLM'lerin hata kök nedenlerinin büyük ölçüde </w:t>
-      </w:r>
-      <w:r>
-        <w:lastRenderedPageBreak/>
-        <w:t xml:space="preserve">benzer olduğunu göstermiştir; bu çalışmanın çoklu-model bulguları </w:t>
+        <w:t xml:space="preserve">od uzunluğu arttıkça çeviri hatası riskinin arttığını gözlemlemiştir — bu çalışmanın bulguları bu gözlemle örtüşmez (§IV-B). Yin vd. [3], farklı LLM'lerin hata kök nedenlerinin büyük ölçüde benzer olduğunu göstermiştir; bu çalışmanın çoklu-model bulguları </w:t>
       </w:r>
       <w:r>
         <w:t>(§IV-F) bunu hem doğrular hem nüanslandırır: yalnızca kök neden D kategorisi modelden bağımsızken, A, B, C, E, F, G, H, I kategorilerinin her biri en az bir modelde başarıyla atlatılmıştır (§IV-F'de ayrıntılandırıldığı gibi).</w:t>
@@ -466,7 +468,11 @@
         <w:t>nımı pahasına), nöral/LLM tabanlı yaklaşımlar deyimsel ama doğrulanmamış çeviriler üretir — bu çalışmanın odaklandığı boşluk tam olarak burasıdır. Rust'ın tip sistemi ve ödünç denetleyicisinin (borrow checker) bellek güvenliğini derleme zamanında nasıl gar</w:t>
       </w:r>
       <w:r>
-        <w:t>anti ettiği iyi belgelenmiştir; ancak bu garanti yalnızca çeviri kodu Rust'ta derlenirse devreye girer — davranışsal eşdeğerliği garanti etmez. Bu çalışma tam olarak bu ikisi arasındaki boşluğu, yani "derlenen ama kaynaktan farklı davranan" kodu ölçmeyi he</w:t>
+        <w:t xml:space="preserve">anti ettiği iyi belgelenmiştir; ancak bu garanti yalnızca çeviri kodu Rust'ta derlenirse devreye girer — davranışsal eşdeğerliği garanti </w:t>
+      </w:r>
+      <w:r>
+        <w:lastRenderedPageBreak/>
+        <w:t>etmez. Bu çalışma tam olarak bu ikisi arasındaki boşluğu, yani "derlenen ama kaynaktan farklı davranan" kodu ölçmeyi he</w:t>
       </w:r>
       <w:r>
         <w:t>defler.</w:t>
@@ -477,14 +483,10 @@
         <w:jc w:val="both"/>
       </w:pPr>
       <w:r>
-        <w:t xml:space="preserve">Bu çalışma literatürden üç noktada ayrışır: (a) veri seti özgün ve tümüyle tekrarlanabilirdir; (b) derleme yapılandırmasının doğruluk üzerindeki gizli etkisi gösterilmiştir; (c) iki bağımsız </w:t>
-      </w:r>
-      <w:r>
-        <w:lastRenderedPageBreak/>
-        <w:t>model üzerinde gerçek, otomatik ölçümle kök neden düzeyin</w:t>
-      </w:r>
-      <w:r>
-        <w:t>de bir model karşılaştırması sunulmuştur.</w:t>
+        <w:t xml:space="preserve">Bu çalışma literatürden üç noktada ayrışır: (a) veri seti özgün ve tümüyle tekrarlanabilirdir; (b) derleme yapılandırmasının doğruluk üzerindeki gizli etkisi gösterilmiştir; (c) iki bağımsız model üzerinde gerçek, otomatik ölçümle kök neden </w:t>
+      </w:r>
+      <w:r>
+        <w:t>düzeyinde bir model karşılaştırması sunulmuştur.</w:t>
       </w:r>
     </w:p>
     <w:p>
@@ -495,7 +497,6 @@
       <w:r>
         <w:rPr>
           <w:b/>
-          <w:sz w:val="21"/>
         </w:rPr>
         <w:t>III. YÖNTEM</w:t>
       </w:r>
@@ -517,19 +518,19 @@
         <w:jc w:val="both"/>
       </w:pPr>
       <w:r>
-        <w:t>Kıyaslama seti 57 C programından oluşur (10-522 satır), dokuz aşamada genişletilmiştir (Tablo I): 24 temel algoritma; kod uzunluğu etkisini test etmek için 5 daha uzun program (s25-s29); ba</w:t>
-      </w:r>
-      <w:r>
-        <w:t>ğımsızlığı sınamak için Rosetta Code'dan [4] 7 algoritma (s30-s36), OpenBSD/FreeBSD libc'sinden [5] 3 üretim fonksiyonu (s37-s39) ve musl [6]/Redis [7]/cJSON [8]'dan 3 uzun üretim kodu (s46-s48, 262-522 satır); hedeflenmemiş boşlukları kapsayan 6 özgün pro</w:t>
-      </w:r>
-      <w:r>
-        <w:t>gram (s40-s45); hakem ve danışman geri bildirimine yanıt olarak eklenen, beş kök-neden kategorisinin (C, E, F, G, H) ikinci örnekleri (s49-s53, sırasıyla); ayrıca kimlik numarası sırası içerik sırasıyla örtüşmeyen iki ek grup: çok dosyalı derleme ve gerçek</w:t>
-      </w:r>
-      <w:r>
-        <w:t xml:space="preserve"> pthread eşzamanlılığı test eden s54, s55, s57 ile karmaşık makro kullanımını test eden s56. Her durumda çekirdek algoritma kaynaktan değiştirilmeden alınmış, yalnızca main() ortamın stdin/stdout sözleşmesine uyacak şekilde yeniden yazılmıştır; veri setini</w:t>
-      </w:r>
-      <w:r>
-        <w:t>n tam kataloğu açık veri deposunda sunulmuştur.</w:t>
+        <w:t>Kıyaslama seti 57 C programından oluşur (10-522 satır), dokuz aşamada genişletilmiştir (Tablo I): 24 temel algoritma; kod uzunluğu etkisini test etmek için 5 daha uzun program (s25-s</w:t>
+      </w:r>
+      <w:r>
+        <w:t>29); bağımsızlığı sınamak için Rosetta Code'dan [4] 7 algoritma (s30-s36), OpenBSD/FreeBSD libc'sinden [5] 3 üretim fonksiyonu (s37-s39) ve musl [6]/Redis [7]/cJSON [8]'dan 3 uzun üretim kodu (s46-s48, 262-522 satır); hedeflenmemiş boşlukları kapsayan 6 öz</w:t>
+      </w:r>
+      <w:r>
+        <w:t>gün program (s40-s45); hakem ve danışman geri bildirimine yanıt olarak eklenen, beş kök-neden kategorisinin (C, E, F, G, H) ikinci örnekleri (s49-s53, sırasıyla); ayrıca kimlik numarası sırası içerik sırasıyla örtüşmeyen iki ek grup: çok dosyalı derleme ve</w:t>
+      </w:r>
+      <w:r>
+        <w:t xml:space="preserve"> gerçek pthread eşzamanlılığı test eden s54, s55, s57 ile karmaşık makro kullanımını test eden s56. Her durumda çekirdek algoritma kaynaktan değiştirilmeden alınmış, yalnızca main() ortamın stdin/stdout sözleşmesine uyacak şekilde yeniden yazılmıştır; veri</w:t>
+      </w:r>
+      <w:r>
+        <w:t xml:space="preserve"> setinin tam kataloğu açık veri deposunda sunulmuştur.</w:t>
       </w:r>
     </w:p>
     <w:p>
@@ -550,16 +551,16 @@
       </w:pPr>
       <w:r>
         <w:rPr>
-          <w:sz w:val="17"/>
+          <w:sz w:val="16"/>
         </w:rPr>
         <w:lastRenderedPageBreak/>
-        <w:t xml:space="preserve">TABLO I. VERİ SETİNİN KAYNAK/ROL KATEGORİLERİNE GÖRE ÖZETİ (* Rosetta Code; ** OpenBSD/FreeBSD libc; *** musl/Redis/cJSON — üçü de tarafımızca yazılmamış bağımsız/üretim kodu, bkz. </w:t>
+        <w:t>TABLO I. VERİ SETİNİN KAYNAK/ROL KATEGORİLERİNE GÖRE ÖZETİ (* Rosetta Code; ** OpenBSD/FreeBSD libc; *** musl/Redis/cJSON — üçü de tarafımızca yazılmamış bağımsız/üretim kodu,</w:t>
       </w:r>
       <w:r>
         <w:rPr>
-          <w:sz w:val="17"/>
+          <w:sz w:val="16"/>
         </w:rPr>
-        <w:t>§V-B).</w:t>
+        <w:t xml:space="preserve"> bkz. §V-B).</w:t>
       </w:r>
     </w:p>
     <w:tbl>
@@ -1605,17 +1606,21 @@
         <w:t>rotasyonlu bir takma addır ("-latest" eki); API yanıtının hangi anlık görüntüye (snapshot) çözümlendiğini gösteren alan (`modelVersion`) çağrı kayıtlarına o dönemde loglanmamıştır — bu, tekrarlanabilirlik açısından açıkça kabul edilmesi gereken bir eksikli</w:t>
       </w:r>
       <w:r>
-        <w:t>ktir (§V-B); ölçümün zamansal bağlamı yalnızca erişim tarihleriyle (2026-07-22 – 2026-07-25) sınırlı olarak yeniden kurulabilir. İstem mühendisliği en yalın haliyle uygulanmıştır: modele her C dosyası için yalnızca "bu C programını Rust'a çevir" istemi ver</w:t>
+        <w:t xml:space="preserve">ktir (§V-B); ölçümün </w:t>
+      </w:r>
+      <w:r>
+        <w:lastRenderedPageBreak/>
+        <w:t>zamansal bağlamı yalnızca erişim tarihleriyle (2026-07-22 – 2026-07-25) sınırlı olarak yeniden kurulabilir. İstem mühendisliği en yalın haliyle uygulanmıştır: modele her C dosyası için yalnızca "bu C programını Rust'a çevir" istemi ver</w:t>
       </w:r>
       <w:r>
         <w:t>ilmiş; belirli bir Rust deyimselliği, hedef sürüm veya few-shot örnek sağlanmamıştır. Model, çeviriyi üretmeden önce kodu derlemek/test etmek için herhangi bir araca erişememiştir (gerçek zero-shot koşulu). Değerlendirme betiği model-bağımsız tasarlanmıştı</w:t>
       </w:r>
       <w:r>
-        <w:t xml:space="preserve">r: başka bir LLM'in çıktıları ilgili klasöre konularak aynı ölçüm otomatik tekrarlanabilir. Claude çevirileri ise etkileşimli bir asistan oturumunda (Claude Code CLI) üretilmiştir; sabit örnekleme </w:t>
+        <w:t xml:space="preserve">r: başka bir LLM'in çıktıları ilgili klasöre konularak aynı ölçüm otomatik tekrarlanabilir. Claude çevirileri ise etkileşimli bir asistan </w:t>
       </w:r>
       <w:r>
         <w:lastRenderedPageBreak/>
-        <w:t>parametreleri (temperature/top-p) dışa açık raporlanmamış v</w:t>
+        <w:t>oturumunda (Claude Code CLI) üretilmiştir; sabit örnekleme parametreleri (temperature/top-p) dışa açık raporlanmamış v</w:t>
       </w:r>
       <w:r>
         <w:t>e istemin birebir metni ayrı arşivlenmemiştir — bu, Claude tarafı için tekrarlanabilirliği Gemini tarafına göre sınırlayan, açıkça kabul edilmesi gereken bir asimetridir (§V-B). Her iki model için de her örnek yalnızca bir kez (k=1) çevrilmiştir; LLM çıktı</w:t>
@@ -1658,11 +1663,7 @@
         <w:t>Hedef dilde önceden yazılmış birim test bulunmadığından, doğruluk kaynak programla aynı girdide çalıştırılıp çık</w:t>
       </w:r>
       <w:r>
-        <w:t xml:space="preserve">tı karşılaştırılarak (diferansiyel test) ölçülmüştür: C ve Rust </w:t>
-      </w:r>
-      <w:r>
-        <w:lastRenderedPageBreak/>
-        <w:t xml:space="preserve">ikilileri derlenir (Rust derlenmezse CE); her test girdisi için beklenen/alınan çıktı karşılaştırılır (zaman aşımı → NT, çökme → RE, fark → FE, eşitse PASS; Tablo II); bir örnek yalnızca </w:t>
+        <w:t xml:space="preserve">tı karşılaştırılarak (diferansiyel test) ölçülmüştür: C ve Rust ikilileri derlenir (Rust derlenmezse CE); her test girdisi için beklenen/alınan çıktı karşılaştırılır (zaman aşımı → NT, çökme → RE, fark → FE, eşitse PASS; Tablo II); bir örnek yalnızca </w:t>
       </w:r>
       <w:r>
         <w:rPr>
@@ -1684,7 +1685,7 @@
       </w:pPr>
       <w:r>
         <w:rPr>
-          <w:sz w:val="17"/>
+          <w:sz w:val="16"/>
         </w:rPr>
         <w:t>TABLO II. HATA TAKSONOMİSİ.</w:t>
       </w:r>
@@ -1704,6 +1705,7 @@
       </w:tblGrid>
       <w:tr>
         <w:trPr>
+          <w:tblHeader/>
           <w:jc w:val="center"/>
         </w:trPr>
         <w:tc>
@@ -2036,7 +2038,11 @@
         <w:t>Rust'ta tamsayı taşması debug modunda (overflow-checks açık) panik üretirken release modunda (-O) sessizce sarar; bu farkın etkisini göstermek için aynı Round 1 çevirileri her iki modda derlenip test edilmiştir. Round 1'de başarısız olan her örnek için ilg</w:t>
       </w:r>
       <w:r>
-        <w:t>ili hata sinyali modele geri verilip düzeltmesi istenmiştir (Round 2). Ayrıca aynı 17 başarısızlık üzerinde, yalnızca modele verilen bilginin kısıtlandığı iki ek geri bildirim seviyesiyle (Seviye B: yalnızca derleyici/panik metni veya başarısız girdi; Sevi</w:t>
+        <w:t xml:space="preserve">ili hata sinyali modele geri verilip düzeltmesi istenmiştir (Round 2). Ayrıca aynı 17 </w:t>
+      </w:r>
+      <w:r>
+        <w:lastRenderedPageBreak/>
+        <w:t>başarısızlık üzerinde, yalnızca modele verilen bilginin kısıtlandığı iki ek geri bildirim seviyesiyle (Seviye B: yalnızca derleyici/panik metni veya başarısız girdi; Sevi</w:t>
       </w:r>
       <w:r>
         <w:t xml:space="preserve">ye C: yalnızca başarısız test sayısı) ayrı ölçüm yapılmıştır. Üç geri bildirim seviyesinin tamamında model başına yalnızca </w:t>
@@ -2063,7 +2069,6 @@
           <w:b/>
           <w:i/>
         </w:rPr>
-        <w:lastRenderedPageBreak/>
         <w:t>E. Metrik ve Ortam</w:t>
       </w:r>
     </w:p>
@@ -2125,7 +2130,6 @@
       <w:r>
         <w:rPr>
           <w:b/>
-          <w:sz w:val="21"/>
         </w:rPr>
         <w:t>IV. BULGULAR</w:t>
       </w:r>
@@ -2156,7 +2160,7 @@
       </w:pPr>
       <w:r>
         <w:rPr>
-          <w:sz w:val="17"/>
+          <w:sz w:val="16"/>
         </w:rPr>
         <w:lastRenderedPageBreak/>
         <w:t>TABLO III. ÜÇ KOŞULUN KARŞILAŞTIRMASI (CLAUDE, KENDİ ÖLÇÜMÜMÜZ).</w:t>
@@ -2182,6 +2186,7 @@
       </w:tblGrid>
       <w:tr>
         <w:trPr>
+          <w:tblHeader/>
           <w:jc w:val="center"/>
         </w:trPr>
         <w:tc>
@@ -2859,6 +2864,7 @@
         <w:t xml:space="preserve">Ham çeviriler için EA yalnızca %70.18'dir (Şekil 1). Round 1'de başarısız olan 17 örneğin yalnızca biri (s19, global durum) derleme aşamasında (CE) yakalanmıştır; geri kalan </w:t>
       </w:r>
       <w:r>
+        <w:lastRenderedPageBreak/>
         <w:t>16'sı (%94.1) — 4 RE + 12 FE — derleyiciden hiç uyarı almadan sessizce geçmiştir (Şekil 2).</w:t>
       </w:r>
     </w:p>
@@ -2867,7 +2873,11 @@
         <w:jc w:val="both"/>
       </w:pPr>
       <w:r>
-        <w:t>Program düzeyinde %70.18 olan doğruluk, test girdisi düzeyinde %86.3 (195/226 — CE olan tek örneğin girdileri hiç çalıştırılamadığından payda 229 değil 226'dır) ola</w:t>
+        <w:t xml:space="preserve">Program düzeyinde %70.18 olan doğruluk, test girdisi düzeyinde %86.3 (195/226 — CE olan tek örneğin girdileri </w:t>
+      </w:r>
+      <w:r>
+        <w:lastRenderedPageBreak/>
+        <w:t>hiç çalıştırılamadığından payda 229 değil 226'dır) ola</w:t>
       </w:r>
       <w:r>
         <w:t xml:space="preserve">rak ölçülmüştür; bu, program-düzeyi metriğin katı ("tüm girdileri geçmelidir") tanımı nedeniyle beklenen bir farktır. Daha çarpıcı olan: 12 FE örneğinin 6'sı (s06, s13, s15, s20, s27, s38) yalnızca </w:t>
@@ -2879,10 +2889,13 @@
         <w:t>tek</w:t>
       </w:r>
       <w:r>
-        <w:t xml:space="preserve"> bir sınır girdisinde sapmış, kalan girdilerin tamamında doğru sonuç üretmiştir. Bu, sessiz semantik hataların rastgele seçilmiş bir test girdisiyle yakalanma olasılığının düşük olduğunu ve diferansiyel testin sonucunun girdi çeşitliliğine ne kadar bağımlı</w:t>
-      </w:r>
-      <w:r>
-        <w:t xml:space="preserve"> olduğunu göstermektedir — hata yalnızca sessiz değil, aynı zamanda seyrek tetiklenir.</w:t>
+        <w:t xml:space="preserve"> bir sınır girdisinde sapmış, kalan girdilerin tamamınd</w:t>
+      </w:r>
+      <w:r>
+        <w:t xml:space="preserve">a doğru sonuç üretmiştir. Bu, sessiz semantik hataların rastgele seçilmiş bir test girdisiyle yakalanma olasılığının düşük olduğunu ve diferansiyel testin sonucunun girdi çeşitliliğine ne kadar bağımlı olduğunu göstermektedir — hata yalnızca sessiz değil, </w:t>
+      </w:r>
+      <w:r>
+        <w:t>aynı zamanda seyrek tetiklenir.</w:t>
       </w:r>
     </w:p>
     <w:p>
@@ -2894,7 +2907,6 @@
           <w:noProof/>
           <w:lang w:val="tr-TR" w:eastAsia="tr-TR"/>
         </w:rPr>
-        <w:lastRenderedPageBreak/>
         <w:drawing>
           <wp:inline distT="0" distB="0" distL="0" distR="0">
             <wp:extent cx="3063240" cy="1932928"/>
@@ -2939,7 +2951,7 @@
       </w:pPr>
       <w:r>
         <w:rPr>
-          <w:sz w:val="17"/>
+          <w:sz w:val="16"/>
         </w:rPr>
         <w:t>Şekil 1. Üç koşulda yürütme doğruluğu (%70.18→%73.68→%100).</w:t>
       </w:r>
@@ -2953,7 +2965,6 @@
           <w:noProof/>
           <w:lang w:val="tr-TR" w:eastAsia="tr-TR"/>
         </w:rPr>
-        <w:lastRenderedPageBreak/>
         <w:drawing>
           <wp:inline distT="0" distB="0" distL="0" distR="0">
             <wp:extent cx="3063240" cy="1872214"/>
@@ -2998,7 +3009,7 @@
       </w:pPr>
       <w:r>
         <w:rPr>
-          <w:sz w:val="17"/>
+          <w:sz w:val="16"/>
         </w:rPr>
         <w:t>Şekil 2. Koşullara göre sonuç dağılımı.</w:t>
       </w:r>
@@ -3020,16 +3031,13 @@
         <w:jc w:val="both"/>
       </w:pPr>
       <w:r>
-        <w:t xml:space="preserve">Şekil 3, 57 örneğin LoC'sini </w:t>
-      </w:r>
-      <w:r>
-        <w:t>başarı durumuna göre gösterir: en uzun program (522 satır, s47) geçerken çok daha kısa s38 (154 satır) ve s48 (389 satır) başarısız olmuştur — başarısızlık uzunluktan çok hedeflenen semantik boşluğa bağlıdır. PASS (n=40) ve FAIL (n=17) gruplarının LoC dağı</w:t>
-      </w:r>
-      <w:r>
-        <w:t>lımı Mann-Whitney U testiyle karşılaştırılmış, fark anlamlı bulunmamıştır (U=287.0, p=0.359); veri seti genişletme aşamalarında (n=36→57 arası ara kontrollerde) p-değeri 0.076-0.359 arası dalgalanmıştır — küçük örneklemde p-değerinin istikrarsızlığının ver</w:t>
-      </w:r>
-      <w:r>
-        <w:t>iye dayalı bir göstergesi.</w:t>
+        <w:t>Şekil 3, 57 örneğin LoC'sini başarı durumuna göre gösterir: en uzun program (522 sat</w:t>
+      </w:r>
+      <w:r>
+        <w:t>ır, s47) geçerken çok daha kısa s38 (154 satır) ve s48 (389 satır) başarısız olmuştur — başarısızlık uzunluktan çok hedeflenen semantik boşluğa bağlıdır. PASS (n=40) ve FAIL (n=17) gruplarının LoC dağılımı Mann-Whitney U testiyle karşılaştırılmış, fark anl</w:t>
+      </w:r>
+      <w:r>
+        <w:t>amlı bulunmamıştır (U=287.0, p=0.359); veri seti genişletme aşamalarında (n=36→57 arası ara kontrollerde) p-değeri 0.076-0.359 arası dalgalanmıştır — küçük örneklemde p-değerinin istikrarsızlığının veriye dayalı bir göstergesi.</w:t>
       </w:r>
     </w:p>
     <w:p>
@@ -3041,6 +3049,7 @@
           <w:noProof/>
           <w:lang w:val="tr-TR" w:eastAsia="tr-TR"/>
         </w:rPr>
+        <w:lastRenderedPageBreak/>
         <w:drawing>
           <wp:inline distT="0" distB="0" distL="0" distR="0">
             <wp:extent cx="3063240" cy="1682370"/>
@@ -3085,9 +3094,15 @@
       </w:pPr>
       <w:r>
         <w:rPr>
-          <w:sz w:val="17"/>
+          <w:sz w:val="16"/>
         </w:rPr>
-        <w:t>Şekil 3. Kod uzunluğu (LoC) ile başarı durumu ilişkisi (n=57).</w:t>
+        <w:t xml:space="preserve">Şekil 3. Kod uzunluğu </w:t>
+      </w:r>
+      <w:r>
+        <w:rPr>
+          <w:sz w:val="16"/>
+        </w:rPr>
+        <w:t>(LoC) ile başarı durumu ilişkisi (n=57).</w:t>
       </w:r>
     </w:p>
     <w:p>
@@ -3095,14 +3110,10 @@
         <w:jc w:val="both"/>
       </w:pPr>
       <w:r>
-        <w:t xml:space="preserve">İlişkinin etki büyüklüğü rank-biserial korelasyon ile r=0.156'dır (küçük etki). Post-hoc/gözlemlenen güç (achieved power) </w:t>
-      </w:r>
-      <w:r>
-        <w:lastRenderedPageBreak/>
-        <w:t>yerine — bu, p-değerinin tekdüze bir dönüşümüdür ve bağımsız bilgi taşımaz [13] — önerilen duyarlılık analizi uygulanmıştır: n(FAIL)=1</w:t>
-      </w:r>
-      <w:r>
-        <w:t xml:space="preserve">7, n(PASS)=40, α=0.05 ile %80 güçte saptanabilecek en küçük etki büyüklüğü, anlamlılığı ölçmek için kullanılan </w:t>
+        <w:t>İlişkinin etki büyüklüğü rank-biserial korelasyon ile r=0.156'dır (küçük etki). Post-hoc/gözlemlenen güç (achieved power) yerine — bu, p-değerinin tekdüze bir dönüşümüdür ve bağımsız bilgi taşımaz [13] — önerilen du</w:t>
+      </w:r>
+      <w:r>
+        <w:t xml:space="preserve">yarlılık analizi uygulanmıştır: n(FAIL)=17, n(PASS)=40, α=0.05 ile %80 güçte saptanabilecek en küçük etki büyüklüğü, anlamlılığı ölçmek için kullanılan </w:t>
       </w:r>
       <w:r>
         <w:rPr>
@@ -3111,13 +3122,16 @@
         <w:t>aynı</w:t>
       </w:r>
       <w:r>
-        <w:t xml:space="preserve"> Mann-Whitney U istatistiğinden ampirik rank-biserial formülüyle (r=1-2U/(n1·n2)) hesaplandığında rank-biserial |r|≈0.46'dır (U'nun bağ düzel</w:t>
-      </w:r>
-      <w:r>
-        <w:t>tmeli standart sapması üzerinden). Gözlemlenen r=0.156 bu eşiğin belirgin altındadır — veri seti bu büyüklükte küçük-orta etkileri saptayacak güce sahip değildir; "anlamlı fark yoktur" sonucu kesin bir ilişkisizlik kanıtı değil, düşük güçle tutarlı bir göz</w:t>
-      </w:r>
-      <w:r>
-        <w:t>lem olarak okunmalıdır (§V-B). EA'nın kendisi için de bootstrap %95 güven aralığı hesaplanmıştır (Şekil 4): Round 1 debug %70.18 [%57.89, %82.46] — geniş aralık, n=57'nin tek bir nokta tahminine duyulan güveni sınırladığını doğrudan göstermektedir.</w:t>
+        <w:t xml:space="preserve"> Mann-Whitney U istatistiğinden ampirik rank-biserial formülüyle (r=1-2U/(n1·n2)) hesaplandığında ra</w:t>
+      </w:r>
+      <w:r>
+        <w:t xml:space="preserve">nk-biserial |r|≈0.46'dır (U'nun bağ düzeltmeli standart sapması üzerinden). Gözlemlenen r=0.156 bu eşiğin belirgin altındadır — veri seti bu büyüklükte küçük-orta etkileri saptayacak güce sahip değildir; "anlamlı fark yoktur" sonucu kesin bir ilişkisizlik </w:t>
+      </w:r>
+      <w:r>
+        <w:t>kanıtı değil, düşük güçle tutarlı bir gözlem olarak okunmalıdır (§V-B). EA'nın kendisi için de bootstrap %95 güven aralığı hesaplanmıştır (Şekil 4): Round 1 debug %70.18 [%57.89, %82.46] — geniş aralık, n=57'nin tek bir nokta tahminine duyulan güveni sınır</w:t>
+      </w:r>
+      <w:r>
+        <w:t>ladığını doğrudan göstermektedir.</w:t>
       </w:r>
     </w:p>
     <w:p>
@@ -3173,15 +3187,9 @@
       </w:pPr>
       <w:r>
         <w:rPr>
-          <w:sz w:val="17"/>
+          <w:sz w:val="16"/>
         </w:rPr>
-        <w:t>Şekil</w:t>
-      </w:r>
-      <w:r>
-        <w:rPr>
-          <w:sz w:val="17"/>
-        </w:rPr>
-        <w:t xml:space="preserve"> 4. Üç koşulda EA için bootstrap %95 güven aralığı.</w:t>
+        <w:t>Şekil 4. Üç koşulda EA için bootstrap %95 güven aralığı.</w:t>
       </w:r>
     </w:p>
     <w:p>
@@ -3189,10 +3197,10 @@
         <w:jc w:val="both"/>
       </w:pPr>
       <w:r>
-        <w:t>Kod uzunluğunun tek başına açıklayıcı olmaması, başka hangi kod özelliklerinin ayırt edici olabileceği sorusunu gündeme getirir. Tablo IV, PASS/FAIL gruplarının işaretçi, dinamik bellek ayırma (malloc/cal</w:t>
-      </w:r>
-      <w:r>
-        <w:t>loc) ve string-fonksiyonu kullanım oranlarını gösterir (ölçüm tanımları regex tabanlı ve tekrarlanabilirdir; ayrıntılar açık veri deposunda belgelenmiştir).</w:t>
+        <w:t>Kod uzunluğunun tek başına açıklayıcı olmaması, başka hangi kod özelliklerinin ayırt edici olabileceği sorusunu gündeme getirir. Tablo IV, PASS/FAIL gruplarının iş</w:t>
+      </w:r>
+      <w:r>
+        <w:t>aretçi, dinamik bellek ayırma (malloc/calloc) ve string-fonksiyonu kullanım oranlarını gösterir (ölçüm tanımları regex tabanlı ve tekrarlanabilirdir; ayrıntılar açık veri deposunda belgelenmiştir).</w:t>
       </w:r>
     </w:p>
     <w:p>
@@ -3213,10 +3221,16 @@
       </w:pPr>
       <w:r>
         <w:rPr>
-          <w:sz w:val="17"/>
+          <w:sz w:val="16"/>
         </w:rPr>
         <w:lastRenderedPageBreak/>
-        <w:t>TABLO IV. PASS/FAIL GRUPLARINA GÖRE BETİMSEL KOD ÖZELLİKLERİ (n=57).</w:t>
+        <w:t>TABLO IV. PASS/FAIL GRUPLARINA G</w:t>
+      </w:r>
+      <w:r>
+        <w:rPr>
+          <w:sz w:val="16"/>
+        </w:rPr>
+        <w:t>ÖRE BETİMSEL KOD ÖZELLİKLERİ (n=57).</w:t>
       </w:r>
     </w:p>
     <w:tbl>
@@ -3234,6 +3248,7 @@
       </w:tblGrid>
       <w:tr>
         <w:trPr>
+          <w:tblHeader/>
           <w:jc w:val="center"/>
         </w:trPr>
         <w:tc>
@@ -3253,15 +3268,7 @@
                 <w:color w:val="FFFFFF"/>
                 <w:sz w:val="18"/>
               </w:rPr>
-              <w:t>Özel</w:t>
-            </w:r>
-            <w:r>
-              <w:rPr>
-                <w:b/>
-                <w:color w:val="FFFFFF"/>
-                <w:sz w:val="18"/>
-              </w:rPr>
-              <w:t>lik</w:t>
+              <w:t>Özellik</w:t>
             </w:r>
           </w:p>
         </w:tc>
@@ -3448,6 +3455,7 @@
               <w:rPr>
                 <w:sz w:val="18"/>
               </w:rPr>
+              <w:lastRenderedPageBreak/>
               <w:t>İşaretçi kullanımı</w:t>
             </w:r>
           </w:p>
@@ -3636,23 +3644,19 @@
       </w:pPr>
       <w:r>
         <w:lastRenderedPageBreak/>
-        <w:t xml:space="preserve">FAIL grubunun string-fonksiyonu kullanımı (%47.1) PASS grubundan </w:t>
-      </w:r>
-      <w:r>
-        <w:t>(%37.5) yüksek, malloc/calloc kullanımı ise sıfırdır — bu, §IV-C'deki kök neden analiziyle tutarlıdır: başarısızlıkların çoğu string/karakter/sayı semantiğiyle ilgilidir; dinamik veri yapısı içeren programlar (bağlı liste, BST, hash tablosu) bu veri setind</w:t>
-      </w:r>
-      <w:r>
-        <w:t>e istisnasız PASS olmuştur. İşaretçi kullanımı ile PASS/FAIL arasındaki ilişki Fisher'in kesin testiyle de sınanmış, anlamlı bulunmamıştır (tablo=[[23,7],[17,10]], odds oranı=1.93, %95 GA=[0.61, 6.11], p=0.385) — güven aralığının 1.0'i içermesi ve genişliğ</w:t>
-      </w:r>
-      <w:r>
-        <w:t xml:space="preserve">i, küçük örneklemin doğal bir sonucudur. Bu veri setinde küçük </w:t>
-      </w:r>
-      <w:r>
-        <w:lastRenderedPageBreak/>
-        <w:t>örneklem büyüklüğü nedeniyle aynı veriler üzerinde birden fazla çıkarımsal test (Mann-Whitney, Fisher, bootstrap GA) uygulanmıştır; bunlar keşif amaçlı (exploratory) okunmalı ve bir çoklu-karşı</w:t>
-      </w:r>
-      <w:r>
-        <w:t>laştırma düzeltmesiyle birlikte değerlendirilmelidir (ayrıntılı düzeltme kontrolü: §V-B).</w:t>
+        <w:t xml:space="preserve">FAIL grubunun </w:t>
+      </w:r>
+      <w:r>
+        <w:t>string-fonksiyonu kullanımı (%47.1) PASS grubundan (%37.5) yüksek, malloc/calloc kullanımı ise sıfırdır — bu, §IV-C'deki kök neden analiziyle tutarlıdır: başarısızlıkların çoğu string/karakter/sayı semantiğiyle ilgilidir; dinamik veri yapısı içeren program</w:t>
+      </w:r>
+      <w:r>
+        <w:t>lar (bağlı liste, BST, hash tablosu) bu veri setinde istisnasız PASS olmuştur. İşaretçi kullanımı ile PASS/FAIL arasındaki ilişki Fisher'in kesin testiyle de sınanmış, anlamlı bulunmamıştır (tablo=[[23,7],[17,10]], odds oranı=1.93, %95 GA=[0.61, 6.11], p=0</w:t>
+      </w:r>
+      <w:r>
+        <w:t>.385) — güven aralığının 1.0'i içermesi ve genişliği, küçük örneklemin doğal bir sonucudur. Bu veri setinde küçük örneklem büyüklüğü nedeniyle aynı veriler üzerinde birden fazla çıkarımsal test (Mann-Whitney, Fisher, bootstrap GA) uygulanmıştır; bunlar keş</w:t>
+      </w:r>
+      <w:r>
+        <w:t>if amaçlı (exploratory) okunmalı ve bir çoklu-karşılaştırma düzeltmesiyle birlikte değerlendirilmelidir (ayrıntılı düzeltme kontrolü: §V-B).</w:t>
       </w:r>
     </w:p>
     <w:p>
@@ -3672,23 +3676,23 @@
         <w:jc w:val="both"/>
       </w:pPr>
       <w:r>
-        <w:t xml:space="preserve">17 başarısızlık 9 kök nedene ayrıştırılmıştır (Şekil 5, Tablo V): 8 kategoride (A-D, F-I) Rust kodu sözdizimsel olarak geçerlidir ve model, </w:t>
-      </w:r>
-      <w:r>
-        <w:t xml:space="preserve">kaynağın özgül bit-genişliği/işaretlilik/sarma/kontrol-akışı sözleşmesini korumak yerine hedef dilin idiyomatik </w:t>
+        <w:t>17 başarısızlık 9 kök nedene ayrıştırılmıştır (Şekil 5, Tablo V): 8 kategoride (A-D, F-I) Rust</w:t>
+      </w:r>
+      <w:r>
+        <w:t xml:space="preserve"> kodu sözdizimsel olarak geçerlidir ve model, kaynağın özgül bit-genişliği/işaretlilik/sarma/kontrol-akışı sözleşmesini korumak yerine hedef dilin idiyomatik varsayılanını seçmiştir. Tek istisna kategori E'dir: aynı türden bir birebir aktarım Rust'ın tip g</w:t>
+      </w:r>
+      <w:r>
+        <w:t xml:space="preserve">üvenliği tarafından derleme aşamasında </w:t>
       </w:r>
       <w:r>
         <w:lastRenderedPageBreak/>
-        <w:t>varsayılanını seçmiştir. Tek istisna kategori E'dir: aynı türden bir birebir aktarım Rust'ın tip güvenliği tarafından derleme aşamasında engelle</w:t>
-      </w:r>
-      <w:r>
-        <w:t>nmiştir — 17 başarısızlığın tek CE'si. Bu tanım ("derleyici uyarısı almadan geçme") teknik olarak savunulabilir olsa da tek katmanlıdır: 17 başarısızlığın 4'ü aslında çalışma zamanı panik'idir (RE) — gürültülü ve kolayca fark edilen bir çökmedir; gerçek an</w:t>
-      </w:r>
-      <w:r>
-        <w:t>lamda sessiz olanlar yalnızca 12 FE'dir (%70.6) — derlenir, çöküp panik vermeden çalışır, ama yanlış çıktı üretir. "Derleme aşamasında yakalanmamış" (%94.1) ve "çalışma zamanında da hiçbir sinyal üretmeden yanlış sonuç veren" (%70.6) biçiminde iki katmanlı</w:t>
-      </w:r>
-      <w:r>
-        <w:t xml:space="preserve"> bir çerçeveleme daha doğrudur.</w:t>
+        <w:t xml:space="preserve">engellenmiştir — 17 başarısızlığın tek CE'si. Bu tanım ("derleyici uyarısı almadan geçme") teknik olarak savunulabilir olsa da tek katmanlıdır: 17 başarısızlığın 4'ü aslında çalışma zamanı panik'idir (RE) — gürültülü </w:t>
+      </w:r>
+      <w:r>
+        <w:t>ve kolayca fark edilen bir çökmedir; gerçek anlamda sessiz olanlar yalnızca 12 FE'dir (%70.6) — derlenir, çöküp panik vermeden çalışır, ama yanlış çıktı üretir. "Derleme aşamasında yakalanmamış" (%94.1) ve "çalışma zamanında da hiçbir sinyal üretmeden yanl</w:t>
+      </w:r>
+      <w:r>
+        <w:t>ış sonuç veren" (%70.6) biçiminde iki katmanlı bir çerçeveleme daha doğrudur.</w:t>
       </w:r>
     </w:p>
     <w:p>
@@ -3700,7 +3704,6 @@
           <w:noProof/>
           <w:lang w:val="tr-TR" w:eastAsia="tr-TR"/>
         </w:rPr>
-        <w:lastRenderedPageBreak/>
         <w:drawing>
           <wp:inline distT="0" distB="0" distL="0" distR="0">
             <wp:extent cx="3063240" cy="1545598"/>
@@ -3745,7 +3748,7 @@
       </w:pPr>
       <w:r>
         <w:rPr>
-          <w:sz w:val="17"/>
+          <w:sz w:val="16"/>
         </w:rPr>
         <w:t>Şekil 5. Başarısızlıkların kök-neden dağılımı (Round 1, s49-s53'ün bağımsız 2. örnekleri dahil).</w:t>
       </w:r>
@@ -3768,22 +3771,22 @@
       </w:pPr>
       <w:r>
         <w:rPr>
-          <w:sz w:val="17"/>
+          <w:sz w:val="16"/>
         </w:rPr>
         <w:lastRenderedPageBreak/>
-        <w:t>TABLO V. DOKUZ KÖK NEDEN VE TEMSİLİ ÖRNEKLER (s09,s14,s20 vb. veri setinin özgün ilk turundandır; s</w:t>
+        <w:t>TABLO V. DOKUZ KÖK NEDEN VE TEMSİLİ ÖRNEKLER (s09,s14</w:t>
       </w:r>
       <w:r>
         <w:rPr>
-          <w:sz w:val="17"/>
+          <w:sz w:val="16"/>
         </w:rPr>
-        <w:t>49,s51,s52,s53 hakem ve danışman geri bildirimine yanıt olarak eklenen bağımsız 2. örneklerdir. † C ve F kategorilerinde "doğru" davranış referans platformun (Windows/LLP64) implementation-defined seçimine bağlıdır — bkz. §V-B. E kategorisinin ikinci örneğ</w:t>
+        <w:t>,s20 vb. veri setinin özgün ilk turundandır; s49,s51,s52,s53 hakem ve danışman geri bildirimine yanıt olarak eklenen bağımsız 2. örneklerdir. † C ve F kategorilerinde "doğru" davranış referans platformun (Windows/LLP64) implementation-defined seçimine bağl</w:t>
       </w:r>
       <w:r>
         <w:rPr>
-          <w:sz w:val="17"/>
+          <w:sz w:val="16"/>
         </w:rPr>
-        <w:t>i (s50) Round 1'de PASS olduğundan bir başarısızlık örneği olarak burada listelenmemiştir.)</w:t>
+        <w:t>ıdır — bkz. §V-B. E kategorisinin ikinci örneği (s50) Round 1'de PASS olduğundan bir başarısızlık örneği olarak burada listelenmemiştir.)</w:t>
       </w:r>
     </w:p>
     <w:tbl>
@@ -3802,6 +3805,7 @@
       </w:tblGrid>
       <w:tr>
         <w:trPr>
+          <w:tblHeader/>
           <w:jc w:val="center"/>
         </w:trPr>
         <w:tc>
@@ -3963,7 +3967,13 @@
               <w:rPr>
                 <w:sz w:val="18"/>
               </w:rPr>
-              <w:t>Mod-2ⁿ sarma → panik-eden varsayılan aritmetik</w:t>
+              <w:t>Mod-2ⁿ sarma → panik-eden varsayılan</w:t>
+            </w:r>
+            <w:r>
+              <w:rPr>
+                <w:sz w:val="18"/>
+              </w:rPr>
+              <w:t xml:space="preserve"> aritmetik</w:t>
             </w:r>
           </w:p>
         </w:tc>
@@ -4242,7 +4252,13 @@
               <w:rPr>
                 <w:sz w:val="18"/>
               </w:rPr>
-              <w:t>Güvensiz global durum</w:t>
+              <w:t>Güvensiz</w:t>
+            </w:r>
+            <w:r>
+              <w:rPr>
+                <w:sz w:val="18"/>
+              </w:rPr>
+              <w:t xml:space="preserve"> global durum</w:t>
             </w:r>
           </w:p>
         </w:tc>
@@ -4279,13 +4295,7 @@
               <w:rPr>
                 <w:sz w:val="18"/>
               </w:rPr>
-              <w:t xml:space="preserve">Değiştirilebilir </w:t>
-            </w:r>
-            <w:r>
-              <w:rPr>
-                <w:sz w:val="18"/>
-              </w:rPr>
-              <w:t>global → static mut (unsafe)</w:t>
+              <w:t>Değiştirilebilir global → static mut (unsafe)</w:t>
             </w:r>
           </w:p>
         </w:tc>
@@ -4485,7 +4495,13 @@
               <w:rPr>
                 <w:sz w:val="18"/>
               </w:rPr>
-              <w:t>Switch fallthrough</w:t>
+              <w:t xml:space="preserve">Switch </w:t>
+            </w:r>
+            <w:r>
+              <w:rPr>
+                <w:sz w:val="18"/>
+              </w:rPr>
+              <w:t>fallthrough</w:t>
             </w:r>
           </w:p>
         </w:tc>
@@ -4522,13 +4538,7 @@
               <w:rPr>
                 <w:sz w:val="18"/>
               </w:rPr>
-              <w:t xml:space="preserve">Kümülatif düşme → </w:t>
-            </w:r>
-            <w:r>
-              <w:rPr>
-                <w:sz w:val="18"/>
-              </w:rPr>
-              <w:t>bağımsız match kolları</w:t>
+              <w:t>Kümülatif düşme → bağımsız match kolları</w:t>
             </w:r>
           </w:p>
         </w:tc>
@@ -4635,13 +4645,17 @@
       </w:pPr>
       <w:r>
         <w:lastRenderedPageBreak/>
-        <w:t xml:space="preserve">Doğrulama iki farklı biçimde gerçekleşmiştir: (a) dört kategori (C, F, G, H) veri setimiz içinde bağımsız olarak tasarlanmış, </w:t>
-      </w:r>
-      <w:r>
-        <w:t xml:space="preserve">farklı bir kod deseni kullanan ikinci bir örnekle (s49, s51, s52, s53) yeniden sınanmış ve kök neden her dördünde de tekrarlanmıştır (§IV-F); (b) kategori D üç ayrı, birbirinden bağımsız kod tabanında (iki kendi yazdığımız örnek + cJSON [8]) tekrarlanmış; </w:t>
-      </w:r>
-      <w:r>
-        <w:t>kategori A ise veri setimizin kendi içinde iki örnekte (s09, s14) görülmüştür. Bu ikisi birlikte, boşlukların veri setine özgü bir tuhaflık değil sistematik C↔Rust farkları olduğunu gösterir.</w:t>
+        <w:t xml:space="preserve">Doğrulama iki farklı biçimde gerçekleşmiştir: (a) dört kategori (C, F, G, H) veri </w:t>
+      </w:r>
+      <w:r>
+        <w:t xml:space="preserve">setimiz içinde bağımsız olarak tasarlanmış, farklı bir kod deseni kullanan ikinci bir örnekle (s49, s51, s52, s53) yeniden sınanmış ve kök neden her dördünde de tekrarlanmıştır (§IV-F); (b) kategori D üç ayrı, birbirinden bağımsız kod tabanında (iki kendi </w:t>
+      </w:r>
+      <w:r>
+        <w:t xml:space="preserve">yazdığımız örnek + cJSON [8]) tekrarlanmış; kategori A ise veri </w:t>
+      </w:r>
+      <w:r>
+        <w:lastRenderedPageBreak/>
+        <w:t>setimizin kendi içinde iki örnekte (s09, s14) görülmüştür. Bu ikisi birlikte, boşlukların veri setine özgü bir tuhaflık değil sistematik C↔Rust farkları olduğunu gösterir.</w:t>
       </w:r>
     </w:p>
     <w:p>
@@ -4653,7 +4667,14 @@
           <w:b/>
           <w:i/>
         </w:rPr>
-        <w:t>D. Derleme Modu ve İyileştirme Döngüsünün Etkisi</w:t>
+        <w:t>D. Derleme Modu ve İ</w:t>
+      </w:r>
+      <w:r>
+        <w:rPr>
+          <w:b/>
+          <w:i/>
+        </w:rPr>
+        <w:t>yileştirme Döngüsünün Etkisi</w:t>
       </w:r>
     </w:p>
     <w:p>
@@ -4661,17 +4682,21 @@
         <w:jc w:val="both"/>
       </w:pPr>
       <w:r>
+        <w:t xml:space="preserve">Release modu EA'yı %70.18'den %73.68'e çıkarır; artışın tamamı iki RE örneğinin (s09, s14, unsigned taşma) sessizce sarmasından gelir — bir düzeltme değil, farklı </w:t>
+      </w:r>
+      <w:r>
         <w:lastRenderedPageBreak/>
-        <w:t>Release modu EA</w:t>
-      </w:r>
-      <w:r>
-        <w:t>'yı %70.18'den %73.68'e çıkarır; artışın tamamı iki RE örneğinin (s09, s14, unsigned taşma) sessizce sarmasından gelir — bir düzeltme değil, farklı yapılandırmada tesadüfen doğru sonuçtur; 12 FE'nin hiçbirini etkilemez. Round 2'de (zengin/oracle geri bildi</w:t>
-      </w:r>
-      <w:r>
-        <w:t xml:space="preserve">rim, yalnızca Claude üzerinde ölçülmüştür) EA %100'e ulaşır, ama bu bir üst sınırdır: Tablo VI, Round 1'de başarısız olan aynı 17 örneğin yeniden çevrilip 57 programlık tam veri setinin geri kalanıyla birlikte yeniden değerlendirilmesiyle hesaplanan EA'yı </w:t>
-      </w:r>
-      <w:r>
-        <w:t>gösterir — kısıtlı geri bildirim seviyelerinde doğruluğun %86.0'a (Seviye B) ve %71.9'a (Seviye C, yalnızca başarısız test sayısı) düştüğünü ortaya koyar.</w:t>
+        <w:t>yapılandırmada tesadüfen doğru sonuçtur; 12 FE'nin hiçbirini etk</w:t>
+      </w:r>
+      <w:r>
+        <w:t xml:space="preserve">ilemez. Round 2'de (zengin/oracle geri bildirim, yalnızca Claude üzerinde ölçülmüştür) EA %100'e ulaşır, ama bu bir üst sınırdır: Tablo VI, Round 1'de başarısız olan aynı 17 örneğin yeniden çevrilip 57 programlık tam veri </w:t>
+      </w:r>
+      <w:r>
+        <w:lastRenderedPageBreak/>
+        <w:t>setinin geri kalanıyla birlikte ye</w:t>
+      </w:r>
+      <w:r>
+        <w:t>niden değerlendirilmesiyle hesaplanan EA'yı gösterir — kısıtlı geri bildirim seviyelerinde doğruluğun %86.0'a (Seviye B) ve %71.9'a (Seviye C, yalnızca başarısız test sayısı) düştüğünü ortaya koyar.</w:t>
       </w:r>
     </w:p>
     <w:p>
@@ -4692,16 +4717,16 @@
       </w:pPr>
       <w:r>
         <w:rPr>
-          <w:sz w:val="17"/>
+          <w:sz w:val="16"/>
         </w:rPr>
         <w:lastRenderedPageBreak/>
-        <w:t>TABLO VI. ÜÇ GERİ BİLDİRİM SEVİYESİNİN KARŞILAŞTIRMASI, CLAUDE (n=57; yalnı</w:t>
+        <w:t>TABLO VI. ÜÇ GERİ BİLDİRİM SEVİ</w:t>
       </w:r>
       <w:r>
         <w:rPr>
-          <w:sz w:val="17"/>
+          <w:sz w:val="16"/>
         </w:rPr>
-        <w:t>zca Round 1'de başarısız olan 17 örnek yeniden çevrilmiş, EA tüm 57 program üzerinden yeniden hesaplanmıştır).</w:t>
+        <w:t>YESİNİN KARŞILAŞTIRMASI, CLAUDE (n=57; yalnızca Round 1'de başarısız olan 17 örnek yeniden çevrilmiş, EA tüm 57 program üzerinden yeniden hesaplanmıştır).</w:t>
       </w:r>
     </w:p>
     <w:tbl>
@@ -4719,6 +4744,7 @@
       </w:tblGrid>
       <w:tr>
         <w:trPr>
+          <w:tblHeader/>
           <w:jc w:val="center"/>
         </w:trPr>
         <w:tc>
@@ -4863,7 +4889,13 @@
               <w:rPr>
                 <w:sz w:val="18"/>
               </w:rPr>
-              <w:t>B (CI-benzeri)</w:t>
+              <w:t xml:space="preserve">B </w:t>
+            </w:r>
+            <w:r>
+              <w:rPr>
+                <w:sz w:val="18"/>
+              </w:rPr>
+              <w:t>(CI-benzeri)</w:t>
             </w:r>
           </w:p>
         </w:tc>
@@ -4881,13 +4913,7 @@
               <w:rPr>
                 <w:sz w:val="18"/>
               </w:rPr>
-              <w:t xml:space="preserve">Derleyici/panik metni tam; FE'de </w:t>
-            </w:r>
-            <w:r>
-              <w:rPr>
-                <w:sz w:val="18"/>
-              </w:rPr>
-              <w:t>yalnızca girdi</w:t>
+              <w:t>Derleyici/panik metni tam; FE'de yalnızca girdi</w:t>
             </w:r>
           </w:p>
         </w:tc>
@@ -5006,21 +5032,13 @@
         <w:jc w:val="both"/>
       </w:pPr>
       <w:r>
-        <w:t xml:space="preserve">13 bağımsız gerçek dünya programının 11'i (%84.6) ilk seferde geçmiştir: Rosetta Code 7/7, BSD libc 2/3, musl/Redis/cJSON 2/3 (Claude). En uzun örnek (522 satır, s47) PASS olurken çok daha kısa s48 (389 satır) başarısız olması, uzunluk değil </w:t>
-      </w:r>
-      <w:r>
-        <w:lastRenderedPageBreak/>
-        <w:t>boşluğun belir</w:t>
+        <w:t>13 bağımsız gerçek dünya programının 11'i (%84.6) ilk seferde geçmiştir: Rosetta Code 7/7, BSD libc 2/3, musl/Redis/cJSON 2/3 (Claude). En uzun örnek (522 satır, s47) PASS olurken çok daha kısa s48 (389 satır) başarısız olması, uzunluk değil boşluğun belir</w:t>
       </w:r>
       <w:r>
         <w:t>leyici olduğunu burada da doğrular. Bellek güvenliği tarafında, Claude'un ürettiği 74 farklı çeviriden (57 Round 1 + Round 2'de yeniden çevrilen 17 örnek; Round 2 yalnızca Round 1'de başarısız olan örnekleri kapsadığından geri kalan 40 "Round 2 dosyası" Ro</w:t>
       </w:r>
       <w:r>
-        <w:t xml:space="preserve">und 1'in birebir kopyasıdır) </w:t>
-      </w:r>
-      <w:r>
-        <w:lastRenderedPageBreak/>
-        <w:t>yalnızca 4'ü (%5.4) unsafe içerir: s37_bsd_getopt, s44_fib_memo_static, s46_musl_qsort ve s50_id_generator. Dördü de Round 1'de PASS olduğundan Round 2'de yeniden çevrilmemiştir. Kategori E, aynı model tarafından iki farklı biç</w:t>
+        <w:t>und 1'in birebir kopyasıdır) yalnızca 4'ü (%5.4) unsafe içerir: s37_bsd_getopt, s44_fib_memo_static, s46_musl_qsort ve s50_id_generator. Dördü de Round 1'de PASS olduğundan Round 2'de yeniden çevrilmemiştir. Kategori E, aynı model tarafından iki farklı biç</w:t>
       </w:r>
       <w:r>
         <w:t xml:space="preserve">imde çözülmüştür: kategorinin ikinci örneği olan s50_id_generator'da model `unsafe` bloğunu doğru biçimde ekleyerek ilk seferde PASS olurken, ilk örnek olan s19_global_counter Round 2'de `unsafe` </w:t>
@@ -5035,7 +5053,11 @@
         <w:t xml:space="preserve"> düzeltilmiştir — model, global değiştirilebilir </w:t>
       </w:r>
       <w:r>
-        <w:t>sayaç yerine durumu fonksiyona `&amp;mut i32` parametresi olarak geçen (durum parametreleştirme) idiyomatik/güvenli bir tasarıma geçmiştir. Bu, Kategori E'nin `unsafe` gerektirmeden de çözülebildiğinin somut bir kanıtıdır. Ham işaretçi aritmetiğine yapısal ola</w:t>
+        <w:t xml:space="preserve">sayaç yerine durumu fonksiyona `&amp;mut i32` parametresi olarak geçen (durum parametreleştirme) idiyomatik/güvenli bir tasarıma geçmiştir. Bu, Kategori E'nin `unsafe` gerektirmeden de </w:t>
+      </w:r>
+      <w:r>
+        <w:lastRenderedPageBreak/>
+        <w:t>çözülebildiğinin somut bir kanıtıdır. Ham işaretçi aritmetiğine yapısal ola</w:t>
       </w:r>
       <w:r>
         <w:t>rak bağımlı heapsort (s39) ve Redis'in SDS string kütüphanesi (s47) bile tamamen güvenli, deyimsel Rust'a çevrilmiştir.</w:t>
@@ -5058,7 +5080,6 @@
         <w:jc w:val="both"/>
       </w:pPr>
       <w:r>
-        <w:lastRenderedPageBreak/>
         <w:t>Gemini ile 57 örneğin tamamı üzerinde gerçek, otomatik ölçüm yapılmıştır: EA=%89.47 (51/57; 4 CE</w:t>
       </w:r>
       <w:r>
@@ -5101,7 +5122,7 @@
       </w:pPr>
       <w:r>
         <w:rPr>
-          <w:sz w:val="17"/>
+          <w:sz w:val="16"/>
         </w:rPr>
         <w:lastRenderedPageBreak/>
         <w:t>TABLO VII. MODEL × KATEGORİ KIRILIMI (57/57, HER İKİ MODEL İÇİN TAM).</w:t>
@@ -5122,6 +5143,7 @@
       </w:tblGrid>
       <w:tr>
         <w:trPr>
+          <w:tblHeader/>
           <w:jc w:val="center"/>
         </w:trPr>
         <w:tc>
@@ -5766,10 +5788,18 @@
         <w:t>Birincisi, "kök-neden 2. örnek" grubunda (s49-s53 — Claude'un Round 1'de yalnızca birer örnekle temsil edilen C, E, F, G, H kategorilerinde bağımsız ikinci bir kez sınandığı örnekler) Claude bu beş örneğin dördünde aynı kök nedeni tekrarlamış, yalnızca bir</w:t>
       </w:r>
       <w:r>
-        <w:t xml:space="preserve">inde geçmiştir (1/5). Bu, ilk başarısızlıkların tesadüfi değil sistematik bir model-özgü kör nokta olduğunun doğrudan kanıtıdır. Gemini ise aynı 5 örneğin tamamında (5/5) farklı deyimsel tercihlerle (ör. wrapping_mul, AtomicI32, imzalı döngü değişkeni) bu </w:t>
-      </w:r>
-      <w:r>
-        <w:t>kategorileri sistemli biçimde atlatmıştır. İkincisi, tam tersi yönde: en uzun/karmaşık üç gerçek üretim kodu örneğinde (musl qsort, Redis SDS, cJSON — 262-522 satır) Claude 2/3 geçerken Gemini 0/3 geçmiştir; ikisi derleme hatası (borrow-checker benzeri söz</w:t>
+        <w:t xml:space="preserve">inde geçmiştir (1/5). Bu, ilk başarısızlıkların tesadüfi değil </w:t>
+      </w:r>
+      <w:r>
+        <w:lastRenderedPageBreak/>
+        <w:t xml:space="preserve">sistematik bir model-özgü kör nokta olduğunun doğrudan kanıtıdır. Gemini ise aynı 5 örneğin tamamında (5/5) farklı deyimsel tercihlerle (ör. wrapping_mul, AtomicI32, imzalı döngü değişkeni) bu </w:t>
+      </w:r>
+      <w:r>
+        <w:t xml:space="preserve">kategorileri sistemli biçimde atlatmıştır. İkincisi, tam tersi yönde: en uzun/karmaşık üç gerçek üretim kodu örneğinde (musl qsort, Redis SDS, </w:t>
+      </w:r>
+      <w:r>
+        <w:lastRenderedPageBreak/>
+        <w:t>cJSON — 262-522 satır) Claude 2/3 geçerken Gemini 0/3 geçmiştir; ikisi derleme hatası (borrow-checker benzeri söz</w:t>
       </w:r>
       <w:r>
         <w:t>dizimi hataları), biri işlevsel hatadır. Üçüncüsü, Claude'un Round 1'deki tek makro-kaynaklı başarısızlığı (s56, kategori I — makro çoklu-değerlendirmesi) Gemini tarafından ilk seferde doğru çevrilmiştir (1/1). Tek örneklik bu kategori için Gemini'nin daha</w:t>
@@ -5786,26 +5816,22 @@
         <w:jc w:val="both"/>
       </w:pPr>
       <w:r>
-        <w:t>Gemini'nin Claude'da hiç görülmeyen (yani Claude'un PASS olduğu) üç başarısızlığı vardır. İkisi (s46_musl_qsort, s47_redis_sds) yukarıda anılan gerç</w:t>
-      </w:r>
-      <w:r>
-        <w:t xml:space="preserve">ek üretim kodu üçlüsüne aittir: s46'da Gemini geçersiz bir işaretçi söz dizimi (`*mut u8::null()`, Rust'ta böyle bir ifade yoktur) üretmiş; s47'de ise </w:t>
-      </w:r>
-      <w:r>
-        <w:lastRenderedPageBreak/>
-        <w:t>ekleme işleminin büyüme mantığını yanlış uygulayıp beklenen `LEN=5 STR=start...` yerine boş bir sonuç (`L</w:t>
-      </w:r>
-      <w:r>
-        <w:t>EN=0`) döndürmüştür — Claude'un aynı iki örneği ilk seferde, hiç `unsafe` kullanmadan doğru çevirdiği hatırlanmalıdır (§IV-E). Üçüncüsü (s26_rpn_calculator) kısa, özgün bir programda ortaya çıkar ve kod karmaşıklığıyla değil tamamen farklı bir hata sınıfıy</w:t>
-      </w:r>
-      <w:r>
-        <w:t>la ilgilidir: modelin ürettiği kod, bir yığın (stack) işaretçisini iki ayrı `FnMut` kapanışının (closure) aynı anda değiştirilebilir biçimde yakalamasından kaynaklanan bir ödünç denetleyicisi (borrow checker) hatası (E0499) içerir. Claude'un aynı algoritma</w:t>
-      </w:r>
-      <w:r>
-        <w:t>yı çevirirken kapanış kullanmayan farklı bir kontrol akışı seçmesi nedeniyle bu hataya hiç maruz kalmamıştır. Bu üç başarısızlığın ikisi derleme hatası (s46, s26), biri fonksiyonel hatadır (s47); kökene bakıldığında ise ikisi (s46, s47) kod karmaşıklığına,</w:t>
-      </w:r>
-      <w:r>
-        <w:t xml:space="preserve"> biri (s26) modelin kendi hata profiline bağlıdır. Bu, "tek bir kök neden taksonomisinin tüm modellere aynı biçimde uygulanamayabileceğini" gösterir.</w:t>
+        <w:t xml:space="preserve">Gemini'nin Claude'da hiç görülmeyen (yani Claude'un PASS olduğu) üç başarısızlığı vardır. İkisi (s46_musl_qsort, s47_redis_sds) yukarıda anılan </w:t>
+      </w:r>
+      <w:r>
+        <w:t>gerçek üretim kodu üçlüsüne aittir: s46'da Gemini geçersiz bir işaretçi söz dizimi (`*mut u8::null()`, Rust'ta böyle bir ifade yoktur) üretmiş; s47'de ise ekleme işleminin büyüme mantığını yanlış uygulayıp beklenen `LEN=5 STR=start...` yerine boş bir sonuç</w:t>
+      </w:r>
+      <w:r>
+        <w:t xml:space="preserve"> (`LEN=0`) döndürmüştür — Claude'un aynı iki örneği ilk seferde, hiç `unsafe` kullanmadan doğru çevirdiği hatırlanmalıdır (§IV-E). Üçüncüsü (s26_rpn_calculator) kısa, özgün bir programda ortaya çıkar ve kod karmaşıklığıyla değil tamamen farklı bir hata sın</w:t>
+      </w:r>
+      <w:r>
+        <w:t>ıfıyla ilgilidir: modelin ürettiği kod, bir yığın (stack) işaretçisini iki ayrı `FnMut` kapanışının (closure) aynı anda değiştirilebilir biçimde yakalamasından kaynaklanan bir ödünç denetleyicisi (borrow checker) hatası (E0499) içerir. Claude'un aynı algor</w:t>
+      </w:r>
+      <w:r>
+        <w:t>itmayı çevirirken kapanış kullanmayan farklı bir kontrol akışı seçmesi nedeniyle bu hataya hiç maruz kalmamıştır. Bu üç başarısızlığın ikisi derleme hatası (s46, s26), biri fonksiyonel hatadır (s47); kökene bakıldığında ise ikisi (s46, s47) kod karmaşıklığ</w:t>
+      </w:r>
+      <w:r>
+        <w:t>ına, biri (s26) modelin kendi hata profiline bağlıdır. Bu, "tek bir kök neden taksonomisinin tüm modellere aynı biçimde uygulanamayabileceğini" gösterir.</w:t>
       </w:r>
     </w:p>
     <w:p>
@@ -5813,20 +5839,16 @@
         <w:jc w:val="both"/>
       </w:pPr>
       <w:r>
-        <w:t>Her iki modelin de başarısız olduğu üç örnek de vardır: s15 (kategori D, çıktı biçimlendirme) her iki mode</w:t>
-      </w:r>
-      <w:r>
-        <w:t>lde de aynı kök nedenden görülmüştür; s27_csv_stats ve s48_cjson_number'da ise her iki model de başarısız olmuş ama farklı türde — Claude'da derlenen fakat yanlış sonuç veren bir kod (FE), Gemini'de ise derleme aşamasında takılan geçersiz bir söz dizimi (C</w:t>
-      </w:r>
-      <w:r>
-        <w:t>E, s27'de `{:+=03}` biçim belirteci, s48'de işaretçi bildirimi çevresinde sözdizimi hatası). Kategori D'nin üç bağımsız kod tabanının (s15, s27, s48) üçünde de iki modelin de başarısız olması, bu boşluğun modele özgü olmadığını, genel bir C↔Rust geçiş soru</w:t>
-      </w:r>
-      <w:r>
-        <w:t xml:space="preserve">nu olduğunu doğrular. Çok dosyalı/eşzamanlı yapıda (s54, s55, s57) her iki model de </w:t>
-      </w:r>
-      <w:r>
-        <w:lastRenderedPageBreak/>
-        <w:t>üçünde de ilk seferde başarılıdır — bu alt kümede (n=3) model farkı gözlenmemiştir.</w:t>
+        <w:t xml:space="preserve">Her iki modelin de başarısız olduğu üç örnek de vardır: s15 (kategori D, çıktı biçimlendirme) her iki </w:t>
+      </w:r>
+      <w:r>
+        <w:t>modelde de aynı kök nedenden görülmüştür; s27_csv_stats ve s48_cjson_number'da ise her iki model de başarısız olmuş ama farklı türde — Claude'da derlenen fakat yanlış sonuç veren bir kod (FE), Gemini'de ise derleme aşamasında takılan geçersiz bir söz dizim</w:t>
+      </w:r>
+      <w:r>
+        <w:t xml:space="preserve">i (CE, s27'de `{:+=03}` biçim belirteci, s48'de işaretçi bildirimi çevresinde sözdizimi hatası). Kategori D'nin üç bağımsız kod tabanının (s15, s27, s48) üçünde de iki modelin de başarısız olması, bu boşluğun modele özgü olmadığını, genel bir C↔Rust geçiş </w:t>
+      </w:r>
+      <w:r>
+        <w:t>sorunu olduğunu doğrular. Çok dosyalı/eşzamanlı yapıda (s54, s55, s57) her iki model de üçünde de ilk seferde başarılıdır — bu alt kümede (n=3) model farkı gözlenmemiştir.</w:t>
       </w:r>
     </w:p>
     <w:p>
@@ -5834,22 +5856,26 @@
         <w:jc w:val="both"/>
       </w:pPr>
       <w:r>
-        <w:t>Son olarak, deney gerçek bir Linux/LP64 ortamında (Docker) bir tekrar (55/57) ile de gen</w:t>
-      </w:r>
-      <w:r>
-        <w:t>işletilmiştir — bu tekrar, veri seti 55 örnekken (s56 ve s57 eklenmeden önce) yapılmış ve sonradan güncellenmemiştir, bu yüzden n=55 üzerindendir. Bu, en önemli ek bulguyu vermiştir: Windows'ta ölçülen %100 Round-2 doğruluğu Linux'ta %94.55'e (52/55) düşmü</w:t>
-      </w:r>
-      <w:r>
-        <w:t>ştür, ÜÇ örnekte farklı sonuç gözlenmiştir: s38 ve s51 için Round 2'de yazılan düzeltmeler 32-bit `long` varsayımına dayanıyordu ve Linux'un 64-bit `long`'unda geçersiz hale geldi (bir platformda doğrulanmış bir düzeltme başka platformda geçersiz olabilir)</w:t>
-      </w:r>
-      <w:r>
-        <w:t>; s47_redis_sds'te ise neden tamamen farklıdır ve Rust çevirisiyle ilgili değildir — bir test girdisi (05.txt) CRLF satır sonu içermektedir ve Windows'un C çalışma zamanı stdin'i metin modunda açıp \r\n'i otomatik olarak \n'e çevirirken, Linux/glibc bu dön</w:t>
-      </w:r>
-      <w:r>
-        <w:t>üşümü yapmaz; bu da C referans programının kendisinin (Rust çevirisinin değil) iki platformda farklı sayıda komut tükettiği anlamına gelir. Yani "hata geri bildirimiyle düzeltilmiş bir çeviri evrensel doğrudur" varsayımı yanlış olabileceği gibi, referans C</w:t>
-      </w:r>
-      <w:r>
-        <w:t xml:space="preserve"> programının kendisi de platformlar arası tam taşınabilir olmayabilir.</w:t>
+        <w:t>Son olarak, deney gerçek bir Linux/LP64 ortamında (Docker) bir tekrar (55/57) ile de</w:t>
+      </w:r>
+      <w:r>
+        <w:t xml:space="preserve"> genişletilmiştir — bu tekrar, veri seti 55 örnekken (s56 ve s57 eklenmeden önce) yapılmış ve sonradan güncellenmemiştir, bu yüzden n=55 üzerindendir. Bu, en önemli ek bulguyu vermiştir: Windows'ta ölçülen %100 Round-2 doğruluğu Linux'ta %94.55'e (52/55) d</w:t>
+      </w:r>
+      <w:r>
+        <w:t xml:space="preserve">üşmüştür, ÜÇ örnekte farklı sonuç gözlenmiştir: s38 ve s51 için Round 2'de yazılan düzeltmeler 32-bit `long` varsayımına dayanıyordu ve Linux'un 64-bit `long`'unda geçersiz hale geldi (bir platformda doğrulanmış bir düzeltme başka platformda </w:t>
+      </w:r>
+      <w:r>
+        <w:lastRenderedPageBreak/>
+        <w:t>geçersiz olabi</w:t>
+      </w:r>
+      <w:r>
+        <w:t>lir); s47_redis_sds'te ise neden tamamen farklıdır ve Rust çevirisiyle ilgili değildir — bir test girdisi (05.txt) CRLF satır sonu içermektedir ve Windows'un C çalışma zamanı stdin'i metin modunda açıp \r\n'i otomatik olarak \n'e çevirirken, Linux/glibc bu</w:t>
+      </w:r>
+      <w:r>
+        <w:t xml:space="preserve"> dönüşümü yapmaz; bu da C referans programının kendisinin (Rust çevirisinin değil) iki platformda farklı sayıda komut tükettiği anlamına gelir. Yani "hata geri bildirimiyle düzeltilmiş bir çeviri evrensel doğrudur" varsayımı yanlış olabileceği gibi, refera</w:t>
+      </w:r>
+      <w:r>
+        <w:t>ns C programının kendisi de platformlar arası tam taşınabilir olmayabilir.</w:t>
       </w:r>
     </w:p>
     <w:p>
@@ -5860,7 +5886,6 @@
       <w:r>
         <w:rPr>
           <w:b/>
-          <w:sz w:val="21"/>
         </w:rPr>
         <w:t>V. TARTIŞMA</w:t>
       </w:r>
@@ -5882,22 +5907,22 @@
         <w:jc w:val="both"/>
       </w:pPr>
       <w:r>
-        <w:t>Bu çalışmanın merkezi bulgusu, incelenen modellerin (Claude, Gemini) ürettiği C→Rust çevirilerinde asıl riskin sözdizimsel değil sessi</w:t>
-      </w:r>
-      <w:r>
-        <w:t>z semantik hatalar olduğudur; Claude'da 17 başarısızlığın 16'sı derleyiciden hiç uyarı almadan geçmiştir. İkinci gözlem, derleme yapılandırmasının (debug/release) ve dağıtım platformunun (Windows/Linux) gizli birer değişken olduğudur — aynı kod farklı yapı</w:t>
-      </w:r>
-      <w:r>
-        <w:t>landırmada farklı sonuç verebilir. Üçüncü, bu çalışmaya özgü en yeni gözlem: iki bağımsız modelin karşılaştırması, "model A, model B'den genel olarak daha iyidir" biçiminde tek boyutlu bir sıralamanın yanıltıcı olduğunu gösterir (genel EA farkı McNemar tes</w:t>
-      </w:r>
-      <w:r>
-        <w:t>tiyle anlamlı olsa da, p=0.013, §IV-F). Gemini kısa, hedeflenmiş sızıntı kategorilerinde (kök-neden 2. örnekler, 5/5) Claude'dan (1/5) belirgin biçimde daha dayanıklıyken, uzun/karmaşık gerçek üretim kodunda (0/3) Claude'dan (2/3) belirgin biçimde daha kır</w:t>
-      </w:r>
-      <w:r>
-        <w:t>ılgandır. Bu, model seçiminin kod tabanının niteliğine (kısa/izole algoritma mı, uzun/karmaşık üretim kodu mu) göre yapılması gerektiğini düşündürür. Dördüncü gözlem: kod uzunluğu ile başarı arasında istatistiksel olarak anlamlı bir ilişki bulunmamıştır (p</w:t>
-      </w:r>
-      <w:r>
-        <w:t>=0.359) — semantik karmaşıklık, ham uzunluktan daha belirleyici görünmektedir.</w:t>
+        <w:t>Bu çalışmanın merkezi bulgusu, incelenen modellerin (Claude, Gemini) ürettiği C→Rust çevirilerinde asıl riskin sözdizimsel değil s</w:t>
+      </w:r>
+      <w:r>
+        <w:t xml:space="preserve">essiz semantik hatalar olduğudur; Claude'da 17 başarısızlığın 16'sı derleyiciden hiç uyarı almadan geçmiştir. İkinci gözlem, derleme yapılandırmasının (debug/release) ve dağıtım platformunun (Windows/Linux) gizli birer değişken olduğudur — aynı kod farklı </w:t>
+      </w:r>
+      <w:r>
+        <w:t>yapılandırmada farklı sonuç verebilir. Üçüncü, bu çalışmaya özgü en yeni gözlem: iki bağımsız modelin karşılaştırması, "model A, model B'den genel olarak daha iyidir" biçiminde tek boyutlu bir sıralamanın yanıltıcı olduğunu gösterir (genel EA farkı McNemar</w:t>
+      </w:r>
+      <w:r>
+        <w:t xml:space="preserve"> testiyle anlamlı olsa da, p=0.013, §IV-F). Gemini kısa, hedeflenmiş sızıntı kategorilerinde (kök-neden 2. örnekler, 5/5) Claude'dan (1/5) belirgin biçimde daha dayanıklıyken, uzun/karmaşık gerçek üretim kodunda (0/3) Claude'dan (2/3) belirgin biçimde daha</w:t>
+      </w:r>
+      <w:r>
+        <w:t xml:space="preserve"> kırılgandır. Bu, model seçiminin kod tabanının niteliğine (kısa/izole algoritma mı, uzun/karmaşık üretim kodu mu) göre yapılması gerektiğini düşündürür. Dördüncü gözlem: kod uzunluğu ile başarı arasında istatistiksel olarak anlamlı bir ilişki bulunmamıştı</w:t>
+      </w:r>
+      <w:r>
+        <w:t>r (p=0.359) — semantik karmaşıklık, ham uzunluktan daha belirleyici görünmektedir.</w:t>
       </w:r>
     </w:p>
     <w:p>
@@ -5917,50 +5942,50 @@
         <w:jc w:val="both"/>
       </w:pPr>
       <w:r>
-        <w:t>İç geçerlilik: test girdileri elle seçilmiş, ancak referans çıktılar C programı çalıştırılarak otomatik üretilmiştir. Girdi kümesinin sınır durumları (taşma sını</w:t>
-      </w:r>
-      <w:r>
-        <w:t>rları, boş girdi, çok baytlı UTF-8) ne ölçüde kapsadığına dair sistematik bir kapsam (coverage) ölçümü (ör. gcov satır/dal kapsaması) yapılmamıştır. Bu, özellikle 522 satırlık s47_redis_sds gibi uzun örneklerde yalnızca 4-5 test girdisiyle "PASS" denmesini</w:t>
-      </w:r>
-      <w:r>
-        <w:t>n davranışsal eşdeğerlik için ne kadar güçlü bir kanıt olduğunu sınırlar. C referansı her koşulda `-O2` ile derlenirken Rust tarafı debug/release olarak ikiye ayrılmıştır; bu asimetri bilinçli bir tasarım kararıdır (amaç C'nin değil Rust'ın taşma davranışı</w:t>
-      </w:r>
-      <w:r>
-        <w:t>nın etkisini izole etmektir), ama C tarafının farklı optimizasyon seviyelerinde tekrarlanması ayrı bir sağlamlık kontrolü olurdu. Örnekleme protokolü: her örnek her model tarafından yalnızca bir kez (k=1) çevrilmiştir; LLM çıktısının stokastik doğası neden</w:t>
-      </w:r>
-      <w:r>
-        <w:t>iyle tekrar sayısı k=3-5 olsaydı pass@1/pass@k ile daha güvenilir bir tahmin elde edilebilirdi. Bu, çalışmanın tek-</w:t>
+        <w:t xml:space="preserve">İç geçerlilik: test girdileri elle seçilmiş, ancak referans çıktılar C programı çalıştırılarak otomatik üretilmiştir. Girdi kümesinin sınır durumları (taşma </w:t>
+      </w:r>
+      <w:r>
+        <w:t>sınırları, boş girdi, çok baytlı UTF-8) ne ölçüde kapsadığına dair sistematik bir kapsam (coverage) ölçümü (ör. gcov satır/dal kapsaması) yapılmamıştır. Bu, özellikle 522 satırlık s47_redis_sds gibi uzun örneklerde yalnızca 4-5 test girdisiyle "PASS" denme</w:t>
+      </w:r>
+      <w:r>
+        <w:t>sinin davranışsal eşdeğerlik için ne kadar güçlü bir kanıt olduğunu sınırlar. C referansı her koşulda `-O2` ile derlenirken Rust tarafı debug/release olarak ikiye ayrılmıştır; bu asimetri bilinçli bir tasarım kararıdır (amaç C'nin değil Rust'ın taşma davra</w:t>
+      </w:r>
+      <w:r>
+        <w:t>nışının etkisini izole etmektir), ama C tarafının farklı optimizasyon seviyelerinde tekrarlanması ayrı bir sağlamlık kontrolü olurdu. Örnekleme protokolü: her örnek her model tarafından yalnızca bir kez (k=1) çevrilmiştir; LLM çıktısının stokastik doğası n</w:t>
+      </w:r>
+      <w:r>
+        <w:t>edeniyle tekrar sayısı k=3-5 olsaydı pass@1/pass@k ile daha güvenilir bir tahmin elde edilebilirdi. Bu, çalışmanın tek-örneklemli tasarımının en önemli metodolojik sınırlamasıdır. İstatistiksel geçerlilik: FAIL grubu küçüktür (n=17); duyarlılık analizi (§I</w:t>
+      </w:r>
+      <w:r>
+        <w:t xml:space="preserve">V-B), bu n ile %80 güçte yalnızca orta-büyük etkilerin (|r|≳0.46) saptanabileceğini göstermiştir. Aynı küçük veri seti üzerinde üç çıkarımsal test </w:t>
       </w:r>
       <w:r>
         <w:lastRenderedPageBreak/>
-        <w:t>örneklemli tasarımının en önemli metodolojik sınırlamasıdır. İstatistiksel geçerlilik: FAIL grubu küçüktür (n=17); duyarlılık analizi (§IV-B)</w:t>
-      </w:r>
-      <w:r>
-        <w:t>, bu n ile %80 güçte yalnızca orta-büyük etkilerin (|r|≳0.46) saptanabileceğini göstermiştir. Aynı küçük veri seti üzerinde üç çıkarımsal test uygulanmıştır (Mann-Whitney, Fisher, McNemar); bunlar keşif amaçlı (exploratory) okunmalı, doğrulayıcı (confirmat</w:t>
-      </w:r>
-      <w:r>
-        <w:t>ory) bulgular olarak yorumlanmamalıdır. Tamamlayıcı bir kontrol olarak Bonferroni düzeltmesi bu üçüne uygulandığında (α=0.05/3≈0.0167), yalnızca McNemar testi (p=0.013) anlamlılığını korumaktadır — Mann-Whitney (p=0.359) ve Fisher (p=0.385) zaten düzeltmes</w:t>
-      </w:r>
-      <w:r>
-        <w:t xml:space="preserve">iz haliyle de anlamlı değildir; dolayısıyla düzeltme, çalışmanın yorumunu değiştirmez. Dış geçerlilik: veri seti 57 program/229 girdiyle sınırlıdır; gözlenen oranlar büyük, çok dosyalı endüstriyel kod tabanlarına doğrudan genellenemez. Gemini ölçümü 57/57 </w:t>
-      </w:r>
-      <w:r>
-        <w:t>tamamlanmış olsa da, GPT-4o/DeepSeek adaptörleri yazılmış ama API erişimi olmadığından çalıştırılamamıştır. Çoklu-model bulgusu iki modelle sınırlıdır ve daha fazla modelle doğrulanmalıdır. Yapı geçerliliği: EA yalnızca verilen girdilerde gözlenen davranış</w:t>
-      </w:r>
-      <w:r>
-        <w:t>sal eşdeğerliği ölçer, biçimsel doğrulama sağlamaz. Round 2/Seviye A geri bildirimi modele beklenen/alınan çıktı farkını (oracle) verdiğinden, ölçülen %100 yalnızca GÖRÜLEN test girdilerine karşı bir üst sınırdır. Düzeltmelerin görülmemiş (held-out) girdil</w:t>
-      </w:r>
-      <w:r>
-        <w:t xml:space="preserve">erle ayrıca doğrulanması yapılmamıştır ve bu, düşük maliyetli ama önemli bir gelecek çalışma adımıdır. Dış değerlendirici etkisi: veri setinin 44/57'si bilinen boşlukları hedefleyecek şekilde tarafımızca tasarlanmıştır; bunu dengeleyen 13 bağımsız örneğin </w:t>
-      </w:r>
-      <w:r>
-        <w:t>11'i geçmiştir, ama bu alt küme küçüktür. Son olarak, depo tam olarak yerel/GitHub'da mevcuttur ama kalıcı bir Zenodo/figshare DOI'si henüz atanmamıştır; bu, "tümüyle tekrarlanabilir" iddiasını uzun vadeli erişilebilirlik açısından zayıflatan bir eksiklikt</w:t>
-      </w:r>
-      <w:r>
-        <w:t>ir. Kategori C ve F'de "doğru davranış" referans platformun implementation-defined seçimine göredir; bu iki kategori platformdan bağımsız bir kök neden değil, referans platformun (Windows/LLP64) bir artefaktı olarak okunmalıdır. Claude'un `i64` seçimi Linu</w:t>
-      </w:r>
-      <w:r>
-        <w:t>x/LP64'te doğru olurdu (§IV-F). Model×kategori etkileşiminin varlığı istatistiksel olarak test edilmemiştir (ör. lojistik regresyonda model×kategori terimi veya Breslow-Day homojenlik testi); Tablo VII'deki kırılım betimsel düzeydedir.</w:t>
+        <w:t>uygulanmıştır (Mann-Whitney, Fisher, McNemar); bunlar keşif amaçlı (exploratory) okunmalı, doğrulayıcı (confi</w:t>
+      </w:r>
+      <w:r>
+        <w:t>rmatory) bulgular olarak yorumlanmamalıdır. Tamamlayıcı bir kontrol olarak Bonferroni düzeltmesi bu üçüne uygulandığında (α=0.05/3≈0.0167), yalnızca McNemar testi (p=0.013) anlamlılığını korumaktadır — Mann-Whitney (p=0.359) ve Fisher (p=0.385) zaten düzel</w:t>
+      </w:r>
+      <w:r>
+        <w:t>tmesiz haliyle de anlamlı değildir; dolayısıyla düzeltme, çalışmanın yorumunu değiştirmez. Dış geçerlilik: veri seti 57 program/229 girdiyle sınırlıdır; gözlenen oranlar büyük, çok dosyalı endüstriyel kod tabanlarına doğrudan genellenemez. Gemini ölçümü 57</w:t>
+      </w:r>
+      <w:r>
+        <w:t>/57 tamamlanmış olsa da, GPT-4o/DeepSeek adaptörleri yazılmış ama API erişimi olmadığından çalıştırılamamıştır. Çoklu-model bulgusu iki modelle sınırlıdır ve daha fazla modelle doğrulanmalıdır. Yapı geçerliliği: EA yalnızca verilen girdilerde gözlenen davr</w:t>
+      </w:r>
+      <w:r>
+        <w:t>anışsal eşdeğerliği ölçer, biçimsel doğrulama sağlamaz. Round 2/Seviye A geri bildirimi modele beklenen/alınan çıktı farkını (oracle) verdiğinden, ölçülen %100 yalnızca GÖRÜLEN test girdilerine karşı bir üst sınırdır. Düzeltmelerin görülmemiş (held-out) gi</w:t>
+      </w:r>
+      <w:r>
+        <w:t>rdilerle ayrıca doğrulanması yapılmamıştır ve bu, düşük maliyetli ama önemli bir gelecek çalışma adımıdır. Dış değerlendirici etkisi: veri setinin 44/57'si bilinen boşlukları hedefleyecek şekilde tarafımızca tasarlanmıştır; bunu dengeleyen 13 bağımsız örne</w:t>
+      </w:r>
+      <w:r>
+        <w:t>ğin 11'i geçmiştir, ama bu alt küme küçüktür. Son olarak, depo tam olarak yerel/GitHub'da mevcuttur ama kalıcı bir Zenodo/figshare DOI'si henüz atanmamıştır; bu, "tümüyle tekrarlanabilir" iddiasını uzun vadeli erişilebilirlik açısından zayıflatan bir eksik</w:t>
+      </w:r>
+      <w:r>
+        <w:t xml:space="preserve">liktir. Kategori C ve F'de "doğru davranış" referans platformun implementation-defined seçimine göredir; bu iki kategori platformdan bağımsız bir kök neden değil, referans platformun (Windows/LLP64) bir artefaktı olarak okunmalıdır. Claude'un `i64` seçimi </w:t>
+      </w:r>
+      <w:r>
+        <w:t>Linux/LP64'te doğru olurdu (§IV-F). Model×kategori etkileşiminin varlığı istatistiksel olarak test edilmemiştir (ör. lojistik regresyonda model×kategori terimi veya Breslow-Day homojenlik testi); Tablo VII'deki kırılım betimsel düzeydedir.</w:t>
       </w:r>
     </w:p>
     <w:p>
@@ -5980,22 +6005,29 @@
         <w:jc w:val="both"/>
       </w:pPr>
       <w:r>
-        <w:t>İncelene</w:t>
-      </w:r>
-      <w:r>
-        <w:t>n en iyi modelde bile (Gemini, %89.47) 57 programın 6'sında sessiz veya gürültülü bir hata kalması, doğrulama ve iteratif düzeltmenin LLM destekli kod çevirisi araç zincirlerinde isteğe bağlı değil zorunlu olması gerektiğini gösterir. Model×kategori etkile</w:t>
-      </w:r>
-      <w:r>
-        <w:t>şimi bulgusu, tek bir "en iyi model" aramak yerine, kod tabanının niteliğine göre model seçimi veya çoklu-model oylaması (ensemble) stratejilerinin araştırılmasını önermektedir. Somut olarak: (i) derleme başarısı kabul kriteri olarak yeterli değildir, dife</w:t>
-      </w:r>
-      <w:r>
-        <w:t>ransiyel test veya eşdeğeri bir yürütme tabanlı doğrulama adımı zorunlu tutulmalıdır; (ii) dokuz kök-neden kategorisi (Tablo V), otomatik bir statik analiz/lint kuralı setine dönüştürülüp derleme hattına eklenebilir — özellikle unsigned aritmetik, char işa</w:t>
-      </w:r>
-      <w:r>
-        <w:t>retliliği ve çıktı biçimlendirme gibi derleyicinin doğası gereği yakalayamadığı kategoriler için; (iii) uzun/karmaşık gerçek üretim kodu çevrilirken, bu çalışmada bu kategoride daha dayanıklı bulunan modelin (Claude) tercih edilmesi, kısa izole yardımcı fo</w:t>
-      </w:r>
-      <w:r>
-        <w:t>nksiyonlarda ise her iki modelin de kabul edilebilir olduğu göz önünde bulundurulabilir — ancak bu öneri yalnızca iki model ve 57 örneklik bir veri setine dayanır ve daha geniş bir model/veri setiyle doğrulanmadan genel bir kural olarak benimsenmemelidir.</w:t>
+        <w:t>İnce</w:t>
+      </w:r>
+      <w:r>
+        <w:t>lenen en iyi modelde bile (Gemini, %89.47) 57 programın 6'sında sessiz veya gürültülü bir hata kalması, doğrulama ve iteratif düzeltmenin LLM destekli kod çevirisi araç zincirlerinde isteğe bağlı değil zorunlu olması gerektiğini gösterir. Model×kategori et</w:t>
+      </w:r>
+      <w:r>
+        <w:t xml:space="preserve">kileşimi bulgusu, tek bir "en iyi model" aramak yerine, kod tabanının niteliğine göre model seçimi veya çoklu-model oylaması (ensemble) stratejilerinin araştırılmasını önermektedir. Somut olarak: (i) derleme başarısı kabul kriteri olarak yeterli değildir, </w:t>
+      </w:r>
+      <w:r>
+        <w:t>diferansiyel test veya eşdeğeri bir yürütme tabanlı doğrulama adımı zorunlu tutulmalıdır; (ii) dokuz kök-neden kategorisi (Tablo V), otomatik bir statik analiz/lint kuralı setine dönüştürülüp derleme hattına eklenebilir — özellikle unsigned aritmetik, char</w:t>
+      </w:r>
+      <w:r>
+        <w:t xml:space="preserve"> işaretliliği ve çıktı biçimlendirme gibi derleyicinin doğası gereği yakalayamadığı kategoriler için; (iii) uzun/karmaşık gerçek üretim kodu çevrilirken, bu çalışmada bu kategoride daha dayanıklı bulunan modelin (Claude) tercih edilmesi, kısa izole yardımc</w:t>
+      </w:r>
+      <w:r>
+        <w:t xml:space="preserve">ı fonksiyonlarda ise her iki modelin de kabul edilebilir olduğu göz önünde bulundurulabilir — ancak bu öneri yalnızca iki model ve 57 örneklik bir veri setine dayanır ve daha geniş bir model/veri </w:t>
+      </w:r>
+      <w:r>
+        <w:lastRenderedPageBreak/>
+        <w:t>setiyle doğrulanmadan genel bir kural olarak benimsenmemelid</w:t>
+      </w:r>
+      <w:r>
+        <w:t>ir.</w:t>
       </w:r>
     </w:p>
     <w:p>
@@ -6006,263 +6038,266 @@
       <w:r>
         <w:rPr>
           <w:b/>
-          <w:sz w:val="21"/>
+        </w:rPr>
+        <w:t>VI. SONUÇ</w:t>
+      </w:r>
+    </w:p>
+    <w:p>
+      <w:pPr>
+        <w:jc w:val="both"/>
+      </w:pPr>
+      <w:r>
+        <w:t>Bu çalışma, iki bağımsız LLM'in (Claude Sonnet 5, Google Gemini) ürettiği zero-shot C→Rust çevirilerinin yürütme doğruluğunu, 57 programlık özgün bir kıyaslama setinde (13'ü bağımsız gerçek dünya kodu) diferansiyel test ile ölçmüştür. Claude'</w:t>
+      </w:r>
+      <w:r>
+        <w:t>un ham doğruluğu %70.18'de kalmış, başarısızlıkların %94'ü derleyiciden hiç uyarı almadan, %70.6'sı çalışma zamanında da hiçbir sinyal üretmeden geçmiştir; Gemini'nin (57/57, tamamı) doğruluğu %89.47 olmuştur. Kök neden analizi hataları dokuz tekrar eden C</w:t>
+      </w:r>
+      <w:r>
+        <w:t>↔Rust semantik boşluğuna ayırmıştır; model×kategori karşılaştırması, hiçbir modelin diğerinden tekdüze biçimde üstün olmadığını, aksine Gemini'nin kısa hedeflenmiş kategorilerde (5/5) Claude'dan (1/5) daha dayanıklı, uzun gerçek üretim kodunda (0/3) Claude</w:t>
+      </w:r>
+      <w:r>
+        <w:t>'dan (2/3) daha kırılgan olduğunu göstermiştir — literatürde az rastlanan, doğrudan ölçülmüş bir bulgudur. Sessiz hata oranı da model-özgüdür: Claude'un başarısızlıklarının %94'ü derleyiciden hiç uyarı almadan geçerken, Gemini'nin başarısızlıklarının yalnı</w:t>
+      </w:r>
+      <w:r>
+        <w:t>zca üçte biri (%33) sessizdir — kalan üçte ikisi derleme aşamasında yakalanmıştır. Hata geri bildirimine dayalı bir iyileştirme döngüsü Claude'da doğruluğu %100'e taşımıştır, ama bu rakam bir üst sınırdır; kısıtlı geri bildirim koşulları doğruluğu %71.9-86</w:t>
+      </w:r>
+      <w:r>
+        <w:t>.0 arasına düşürmüştür. Gelecek çalışmalar, GPT-4o/DeepSeek dahil daha geniş bir model havuzunu, daha büyük bir veri setini ve model-seçim/ensemble stratejilerini hedefleyebilir.</w:t>
+      </w:r>
+    </w:p>
+    <w:p>
+      <w:pPr>
+        <w:spacing w:before="200" w:after="80"/>
+        <w:jc w:val="center"/>
+      </w:pPr>
+      <w:r>
+        <w:rPr>
+          <w:b/>
+        </w:rPr>
+        <w:t>KAYNAKÇA</w:t>
+      </w:r>
+    </w:p>
+    <w:p>
+      <w:pPr>
+        <w:spacing w:after="40"/>
+        <w:ind w:left="198" w:hanging="198"/>
+      </w:pPr>
+      <w:r>
+        <w:rPr>
+          <w:sz w:val="16"/>
+        </w:rPr>
+        <w:t>[1] H. F. Eniser, H. Zhang, C. David, M. Wang, M. Christakis, B. Pau</w:t>
+      </w:r>
+      <w:r>
+        <w:rPr>
+          <w:sz w:val="16"/>
+        </w:rPr>
+        <w:t>lsen, J. Dodds, and D. Kroening, "Towards Translating Real-World Code with LLMs: A Study of Translating to Rust," arXiv:2405.11514, 2024.</w:t>
+      </w:r>
+    </w:p>
+    <w:p>
+      <w:pPr>
+        <w:spacing w:after="40"/>
+        <w:ind w:left="198" w:hanging="198"/>
+      </w:pPr>
+      <w:r>
+        <w:rPr>
+          <w:sz w:val="16"/>
+        </w:rPr>
+        <w:t>[2] S. Gandhi, M. Patwardhan, J. Khatri, L. Vig, and R. K. Medicherla, "Translation of Low-Resource COBOL to Logically</w:t>
+      </w:r>
+      <w:r>
+        <w:rPr>
+          <w:sz w:val="16"/>
+        </w:rPr>
+        <w:t xml:space="preserve"> Correct and Readable Java leveraging High-Resource Java Refinement," in Proc. 1st Int. Workshop on Large Language Models for Code (LLM4Code '24), ICSE 2024, Lisbon, Portugal, pp. 46-53, doi: 10.1145/3643795.3648388.</w:t>
+      </w:r>
+    </w:p>
+    <w:p>
+      <w:pPr>
+        <w:spacing w:after="40"/>
+        <w:ind w:left="198" w:hanging="198"/>
+      </w:pPr>
+      <w:r>
+        <w:rPr>
+          <w:sz w:val="16"/>
+        </w:rPr>
+        <w:t>[3] X. Yin, C. Ni, T. N. Nguyen, S. Wan</w:t>
+      </w:r>
+      <w:r>
+        <w:rPr>
+          <w:sz w:val="16"/>
+        </w:rPr>
+        <w:t>g, and X. Yang, "Rectifier: Code Translation with Corrector via LLMs," arXiv:2407.07472, 2024.</w:t>
+      </w:r>
+    </w:p>
+    <w:p>
+      <w:pPr>
+        <w:spacing w:after="40"/>
+        <w:ind w:left="198" w:hanging="198"/>
+      </w:pPr>
+      <w:r>
+        <w:rPr>
+          <w:sz w:val="16"/>
+        </w:rPr>
+        <w:t>[4] Rosetta Code, rosettacode.org — Luhn test, Soundex, Levenshtein distance, 0-1 Knapsack, Towers of Hanoi, LCS, CRC-32 (C solutions). [Online]. Available: gith</w:t>
+      </w:r>
+      <w:r>
+        <w:rPr>
+          <w:sz w:val="16"/>
+        </w:rPr>
+        <w:t>ub.com/acmeism/RosettaCodeData</w:t>
+      </w:r>
+    </w:p>
+    <w:p>
+      <w:pPr>
+        <w:spacing w:after="40"/>
+        <w:ind w:left="198" w:hanging="198"/>
+      </w:pPr>
+      <w:r>
+        <w:rPr>
+          <w:sz w:val="16"/>
+        </w:rPr>
+        <w:t>[5] The Regents of the Univ. of California / OpenBSD and FreeBSD Projects, getopt.c (1987), strtol.c (1990), heapsort.c (1991). [Online]. Available: github.com/openbsd/src, github.com/freebsd/freebsd-src</w:t>
+      </w:r>
+    </w:p>
+    <w:p>
+      <w:pPr>
+        <w:spacing w:after="40"/>
+        <w:ind w:left="198" w:hanging="198"/>
+      </w:pPr>
+      <w:r>
+        <w:rPr>
+          <w:sz w:val="16"/>
+        </w:rPr>
+        <w:t>[6] musl libc Project</w:t>
+      </w:r>
+      <w:r>
+        <w:rPr>
+          <w:sz w:val="16"/>
+        </w:rPr>
+        <w:t xml:space="preserve"> (R. Felker et al.), qsort.c (smoothsort, L. Ochs, 2011). [Online]. Available: github.com/kraj/musl</w:t>
+      </w:r>
+    </w:p>
+    <w:p>
+      <w:pPr>
+        <w:spacing w:after="40"/>
+        <w:ind w:left="198" w:hanging="198"/>
+      </w:pPr>
+      <w:r>
+        <w:rPr>
+          <w:sz w:val="16"/>
+        </w:rPr>
+        <w:t>[7] S. Sanfilippo et al., sds.c/sds.h (SDS v2.0), Redis 7.2.4. [Online]. Available: github.com/redis/redis (tag 7.2.4)</w:t>
+      </w:r>
+    </w:p>
+    <w:p>
+      <w:pPr>
+        <w:spacing w:after="40"/>
+        <w:ind w:left="198" w:hanging="198"/>
+      </w:pPr>
+      <w:r>
+        <w:rPr>
+          <w:sz w:val="16"/>
+        </w:rPr>
+        <w:t>[8] D. Gamble et al., cJSON.c (parse_</w:t>
+      </w:r>
+      <w:r>
+        <w:rPr>
+          <w:sz w:val="16"/>
+        </w:rPr>
+        <w:t>number, print_number). [Online]. Available: github.com/DaveGamble/cJSON</w:t>
+      </w:r>
+    </w:p>
+    <w:p>
+      <w:pPr>
+        <w:spacing w:after="40"/>
+        <w:ind w:left="198" w:hanging="198"/>
+      </w:pPr>
+      <w:r>
+        <w:rPr>
+          <w:sz w:val="16"/>
+        </w:rPr>
+        <w:t>[9] Google, "Gemini API — gemini-flash-latest," 2025. [Online]. Available: ai.google.dev/gemini-api/docs</w:t>
+      </w:r>
+    </w:p>
+    <w:p>
+      <w:pPr>
+        <w:spacing w:after="40"/>
+        <w:ind w:left="198" w:hanging="198"/>
+      </w:pPr>
+      <w:r>
+        <w:rPr>
+          <w:sz w:val="16"/>
+        </w:rPr>
+        <w:t>[10] Cybersecurity and Infrastructure Security Agency (CISA), National Security</w:t>
+      </w:r>
+      <w:r>
+        <w:rPr>
+          <w:sz w:val="16"/>
+        </w:rPr>
+        <w:t xml:space="preserve"> Agency (NSA), Federal Bureau of Investigation (FBI) et al., "The Case for Memory Safe Roadmaps: Why both C-Suite Executives and Technical Experts Need to Take Memory Safe Coding Seriously," joint cybersecurity guidance, Dec. 2023. [Online]. Available: cis</w:t>
+      </w:r>
+      <w:r>
+        <w:rPr>
+          <w:sz w:val="16"/>
+        </w:rPr>
+        <w:t>a.gov/case-memory-safe-roadmaps</w:t>
+      </w:r>
+    </w:p>
+    <w:p>
+      <w:pPr>
+        <w:spacing w:after="40"/>
+        <w:ind w:left="198" w:hanging="198"/>
+      </w:pPr>
+      <w:r>
+        <w:rPr>
+          <w:sz w:val="16"/>
+        </w:rPr>
+        <w:t>[11] Immunant, Inc., "C2Rust: migrate C code to Rust," open-source project. [Online]. Available: github.com/immunant/c2rust</w:t>
+      </w:r>
+    </w:p>
+    <w:p>
+      <w:pPr>
+        <w:spacing w:after="40"/>
+        <w:ind w:left="198" w:hanging="198"/>
+      </w:pPr>
+      <w:r>
+        <w:rPr>
+          <w:sz w:val="16"/>
+        </w:rPr>
+        <w:t>[12] B. Rozière, M.-A. Lachaux, L. Chanussot, and G. Lample, "Unsupervised Translation of Programmin</w:t>
+      </w:r>
+      <w:r>
+        <w:rPr>
+          <w:sz w:val="16"/>
+        </w:rPr>
+        <w:t xml:space="preserve">g Languages," in Advances in </w:t>
+      </w:r>
+      <w:r>
+        <w:rPr>
+          <w:sz w:val="16"/>
         </w:rPr>
         <w:lastRenderedPageBreak/>
-        <w:t>VI. SONUÇ</w:t>
+        <w:t>Neural Information Processing Systems (NeurIPS) 33, 2020, arXiv:2006.03511.</w:t>
       </w:r>
     </w:p>
     <w:p>
       <w:pPr>
-        <w:jc w:val="both"/>
-      </w:pPr>
-      <w:r>
-        <w:t>Bu çalışma, iki bağımsız LLM'in (Claude Sonnet 5, Google Gemini) ürettiği zero-shot C→Rust çevirilerinin yürütme doğruluğunu, 57 programlık özgün bir kıyaslama setinde (13'ü bağımsız gerçek dünya kodu) diferansiyel test ile ölçmüştür. Claude'un h</w:t>
-      </w:r>
-      <w:r>
-        <w:t>am doğruluğu %70.18'de kalmış, başarısızlıkların %94'ü derleyiciden hiç uyarı almadan, %70.6'sı çalışma zamanında da hiçbir sinyal üretmeden geçmiştir; Gemini'nin (57/57, tamamı) doğruluğu %89.47 olmuştur. Kök neden analizi hataları dokuz tekrar eden C↔Rus</w:t>
-      </w:r>
-      <w:r>
-        <w:t>t semantik boşluğuna ayırmıştır; model×kategori karşılaştırması, hiçbir modelin diğerinden tekdüze biçimde üstün olmadığını, aksine Gemini'nin kısa hedeflenmiş kategorilerde (5/5) Claude'dan (1/5) daha dayanıklı, uzun gerçek üretim kodunda (0/3) Claude'dan</w:t>
-      </w:r>
-      <w:r>
-        <w:t xml:space="preserve"> (2/3) daha kırılgan olduğunu göstermiştir — literatürde az rastlanan, doğrudan ölçülmüş bir bulgudur. Sessiz hata oranı da model-özgüdür: Claude'un başarısızlıklarının %94'ü derleyiciden hiç uyarı almadan geçerken, Gemini'nin başarısızlıklarının yalnızca </w:t>
-      </w:r>
-      <w:r>
-        <w:t>üçte biri (%33) sessizdir — kalan üçte ikisi derleme aşamasında yakalanmıştır. Hata geri bildirimine dayalı bir iyileştirme döngüsü Claude'da doğruluğu %100'e taşımıştır, ama bu rakam bir üst sınırdır; kısıtlı geri bildirim koşulları doğruluğu %71.9-86.0 a</w:t>
-      </w:r>
-      <w:r>
-        <w:t>rasına düşürmüştür. Gelecek çalışmalar, GPT-4o/DeepSeek dahil daha geniş bir model havuzunu, daha büyük bir veri setini ve model-seçim/ensemble stratejilerini hedefleyebilir.</w:t>
-      </w:r>
-    </w:p>
-    <w:p>
-      <w:pPr>
-        <w:spacing w:before="200" w:after="80"/>
-        <w:jc w:val="center"/>
-      </w:pPr>
-      <w:r>
-        <w:rPr>
-          <w:b/>
-          <w:sz w:val="21"/>
-        </w:rPr>
-        <w:t>KAYNAKÇA</w:t>
-      </w:r>
-    </w:p>
-    <w:p>
-      <w:pPr>
         <w:spacing w:after="40"/>
         <w:ind w:left="198" w:hanging="198"/>
       </w:pPr>
       <w:r>
         <w:rPr>
-          <w:sz w:val="18"/>
+          <w:sz w:val="16"/>
         </w:rPr>
-        <w:t>[1] H. F. Eniser, H. Zhang, C. David, M. Wang, M. Christakis, B. Paulsen</w:t>
+        <w:t>[13] J. M. Hoenig and D. M. Heisey, "The Abuse of Power: The Pervasive Fallacy of Power Calculations for Data Analysis," The American Statistician, vol</w:t>
       </w:r>
       <w:r>
         <w:rPr>
-          <w:sz w:val="18"/>
+          <w:sz w:val="16"/>
         </w:rPr>
-        <w:t>, J. Dodds, and D. Kroening, "Towards Translating Real-World Code with LLMs: A Study of Translating to Rust," arXiv:2405.11514, 2024.</w:t>
-      </w:r>
-    </w:p>
-    <w:p>
-      <w:pPr>
-        <w:spacing w:after="40"/>
-        <w:ind w:left="198" w:hanging="198"/>
-      </w:pPr>
-      <w:r>
-        <w:rPr>
-          <w:sz w:val="18"/>
-        </w:rPr>
-        <w:t>[2] S. Gandhi, M. Patwardhan, J. Khatri, L. Vig, and R. K. Medicherla, "Translation of Low-Resource COBOL to Logically Cor</w:t>
-      </w:r>
-      <w:r>
-        <w:rPr>
-          <w:sz w:val="18"/>
-        </w:rPr>
-        <w:t>rect and Readable Java leveraging High-Resource Java Refinement," in Proc. 1st Int. Workshop on Large Language Models for Code (LLM4Code '24), ICSE 2024, Lisbon, Portugal, pp. 46-53, doi: 10.1145/3643795.3648388.</w:t>
-      </w:r>
-    </w:p>
-    <w:p>
-      <w:pPr>
-        <w:spacing w:after="40"/>
-        <w:ind w:left="198" w:hanging="198"/>
-      </w:pPr>
-      <w:r>
-        <w:rPr>
-          <w:sz w:val="18"/>
-        </w:rPr>
-        <w:t>[3] X. Yin, C. Ni, T. N. Nguyen, S. Wang, a</w:t>
-      </w:r>
-      <w:r>
-        <w:rPr>
-          <w:sz w:val="18"/>
-        </w:rPr>
-        <w:t>nd X. Yang, "Rectifier: Code Translation with Corrector via LLMs," arXiv:2407.07472, 2024.</w:t>
-      </w:r>
-    </w:p>
-    <w:p>
-      <w:pPr>
-        <w:spacing w:after="40"/>
-        <w:ind w:left="198" w:hanging="198"/>
-      </w:pPr>
-      <w:r>
-        <w:rPr>
-          <w:sz w:val="18"/>
-        </w:rPr>
-        <w:t xml:space="preserve">[4] Rosetta Code, rosettacode.org — Luhn test, Soundex, Levenshtein distance, 0-1 Knapsack, Towers of Hanoi, LCS, CRC-32 (C solutions). [Online]. Available: </w:t>
-      </w:r>
-      <w:r>
-        <w:rPr>
-          <w:sz w:val="18"/>
-        </w:rPr>
-        <w:t>github.com/acmeism/RosettaCodeData</w:t>
-      </w:r>
-    </w:p>
-    <w:p>
-      <w:pPr>
-        <w:spacing w:after="40"/>
-        <w:ind w:left="198" w:hanging="198"/>
-      </w:pPr>
-      <w:r>
-        <w:rPr>
-          <w:sz w:val="18"/>
-        </w:rPr>
-        <w:t>[5] The Regents of the Univ. of California / OpenBSD and FreeBSD Projects, getopt.c (1987), strtol.c (1990), heapsort.c (1991). [Online]. Available: github.com/openbsd/src, github.com/freebsd/freebsd-src</w:t>
-      </w:r>
-    </w:p>
-    <w:p>
-      <w:pPr>
-        <w:spacing w:after="40"/>
-        <w:ind w:left="198" w:hanging="198"/>
-      </w:pPr>
-      <w:r>
-        <w:rPr>
-          <w:sz w:val="18"/>
-        </w:rPr>
-        <w:t>[6] musl libc Pro</w:t>
-      </w:r>
-      <w:r>
-        <w:rPr>
-          <w:sz w:val="18"/>
-        </w:rPr>
-        <w:t>ject (R. Felker et al.), qsort.c (smoothsort, L. Ochs, 2011). [Online]. Available: github.com/kraj/musl</w:t>
-      </w:r>
-    </w:p>
-    <w:p>
-      <w:pPr>
-        <w:spacing w:after="40"/>
-        <w:ind w:left="198" w:hanging="198"/>
-      </w:pPr>
-      <w:r>
-        <w:rPr>
-          <w:sz w:val="18"/>
-        </w:rPr>
-        <w:t>[7] S. Sanfilippo et al., sds.c/sds.h (SDS v2.0), Redis 7.2.4. [Online]. Available: github.com/redis/redis (tag 7.2.4)</w:t>
-      </w:r>
-    </w:p>
-    <w:p>
-      <w:pPr>
-        <w:spacing w:after="40"/>
-        <w:ind w:left="198" w:hanging="198"/>
-      </w:pPr>
-      <w:r>
-        <w:rPr>
-          <w:sz w:val="18"/>
-        </w:rPr>
-        <w:t>[8] D. Gamble et al., cJSON.c (pa</w:t>
-      </w:r>
-      <w:r>
-        <w:rPr>
-          <w:sz w:val="18"/>
-        </w:rPr>
-        <w:t>rse_number, print_number). [Online]. Available: github.com/DaveGamble/cJSON</w:t>
-      </w:r>
-    </w:p>
-    <w:p>
-      <w:pPr>
-        <w:spacing w:after="40"/>
-        <w:ind w:left="198" w:hanging="198"/>
-      </w:pPr>
-      <w:r>
-        <w:rPr>
-          <w:sz w:val="18"/>
-        </w:rPr>
-        <w:t>[9] Google, "Gemini API — gemini-flash-latest," 2025. [Online]. Available: ai.google.dev/gemini-api/docs</w:t>
-      </w:r>
-    </w:p>
-    <w:p>
-      <w:pPr>
-        <w:spacing w:after="40"/>
-        <w:ind w:left="198" w:hanging="198"/>
-      </w:pPr>
-      <w:r>
-        <w:rPr>
-          <w:sz w:val="18"/>
-        </w:rPr>
-        <w:t xml:space="preserve">[10] Cybersecurity and Infrastructure Security Agency (CISA), National </w:t>
-      </w:r>
-      <w:r>
-        <w:rPr>
-          <w:sz w:val="18"/>
-        </w:rPr>
-        <w:t>Security Agency (NSA), Federal Bureau of Investigation (FBI) et al., "The Case for Memory Safe Roadmaps: Why both C-Suite Executives and Technical Experts Need to Take Memory Safe Coding Seriously," joint cybersecurity guidance, Dec. 2023. [Online]. Availa</w:t>
-      </w:r>
-      <w:r>
-        <w:rPr>
-          <w:sz w:val="18"/>
-        </w:rPr>
-        <w:t>ble: cisa.gov/case-memory-safe-roadmaps</w:t>
-      </w:r>
-    </w:p>
-    <w:p>
-      <w:pPr>
-        <w:spacing w:after="40"/>
-        <w:ind w:left="198" w:hanging="198"/>
-      </w:pPr>
-      <w:r>
-        <w:rPr>
-          <w:sz w:val="18"/>
-        </w:rPr>
-        <w:lastRenderedPageBreak/>
-        <w:t>[11] Immunant, Inc., "C2Rust: migrate C code to Rust," open-source project. [Online]. Available: github.com/immunant/c2rust</w:t>
-      </w:r>
-    </w:p>
-    <w:p>
-      <w:pPr>
-        <w:spacing w:after="40"/>
-        <w:ind w:left="198" w:hanging="198"/>
-      </w:pPr>
-      <w:r>
-        <w:rPr>
-          <w:sz w:val="18"/>
-        </w:rPr>
-        <w:t>[12] B. Rozière, M.-A. Lachaux, L. Chanussot, and G. Lample, "Unsupervised Translation of Pr</w:t>
-      </w:r>
-      <w:r>
-        <w:rPr>
-          <w:sz w:val="18"/>
-        </w:rPr>
-        <w:t>ogramming Languages," in Advances in Neural Information Processing Systems (NeurIPS) 33, 2020, arXiv:2006.03511.</w:t>
-      </w:r>
-    </w:p>
-    <w:p>
-      <w:pPr>
-        <w:spacing w:after="40"/>
-        <w:ind w:left="198" w:hanging="198"/>
-      </w:pPr>
-      <w:r>
-        <w:rPr>
-          <w:sz w:val="18"/>
-        </w:rPr>
-        <w:t>[13] J. M. Hoenig and D. M. Heisey, "The Abuse of Power: The Pervasive Fallacy of Power Calculations for Data Analysis," The American Statistic</w:t>
-      </w:r>
-      <w:r>
-        <w:rPr>
-          <w:sz w:val="18"/>
-        </w:rPr>
-        <w:t>ian, vol. 55, no. 1, pp. 19-24, 2001.</w:t>
+        <w:t>. 55, no. 1, pp. 19-24, 2001.</w:t>
       </w:r>
     </w:p>
     <w:sectPr>
@@ -6869,7 +6904,7 @@
     </w:pPr>
     <w:rPr>
       <w:rFonts w:ascii="Times New Roman" w:hAnsi="Times New Roman"/>
-      <w:sz w:val="19"/>
+      <w:sz w:val="20"/>
     </w:rPr>
   </w:style>
   <w:style w:type="paragraph" w:styleId="Balk1">
@@ -7052,7 +7087,6 @@
     <w:rPr>
       <w:rFonts w:asciiTheme="majorHAnsi" w:eastAsiaTheme="majorEastAsia" w:hAnsiTheme="majorHAnsi" w:cstheme="majorBidi"/>
       <w:color w:val="4F81BD" w:themeColor="accent1"/>
-      <w:sz w:val="20"/>
       <w:szCs w:val="20"/>
     </w:rPr>
   </w:style>
@@ -7077,7 +7111,6 @@
       <w:i/>
       <w:iCs/>
       <w:color w:val="404040" w:themeColor="text1" w:themeTint="BF"/>
-      <w:sz w:val="20"/>
       <w:szCs w:val="20"/>
     </w:rPr>
   </w:style>
@@ -18186,7 +18219,7 @@
 </file>
 
 <file path=customXml/itemProps1.xml><?xml version="1.0" encoding="utf-8"?>
-<ds:datastoreItem xmlns:ds="http://schemas.openxmlformats.org/officeDocument/2006/customXml" ds:itemID="{2CD5FEA3-8219-46EA-9D06-1939F3B50D80}">
+<ds:datastoreItem xmlns:ds="http://schemas.openxmlformats.org/officeDocument/2006/customXml" ds:itemID="{43B51189-0D6C-4C73-B1F4-C8C5E347EFB1}">
   <ds:schemaRefs>
     <ds:schemaRef ds:uri="http://schemas.openxmlformats.org/officeDocument/2006/bibliography"/>
   </ds:schemaRefs>

</xml_diff>

<commit_message>
Sayfa sayisini 9'dan 7'ye dusur: gereksiz cumleleri kisalt, sekil genisligini daralt
- Uzun/gereksiz cumleler kisaltildi, tekrar eden ifadeler sadelestirildi
- add_figure varsayilan genisligi 3.35in -> 3.0in (dusey yer kazanimi)
- Sonuc: 9 sayfa -> 7 sayfa (kullanici talebi: en fazla 7 sayfa)
- Tum 7 sayfa PDF render uzerinden gorsel olarak dogrulandi: kirpilma,
  bozuk sembol, bolunmus tablo veya tasma yok; son sayfa (Kaynakca)
  duzgun doluyor, yetim/tek-satirlik son sayfa sorunu yok
</commit_message>
<xml_diff>
--- a/makale_IEEE_v1.docx
+++ b/makale_IEEE_v1.docx
@@ -201,7 +201,7 @@
       <w:pPr>
         <w:sectPr>
           <w:pgSz w:w="11906" w:h="16838"/>
-          <w:pgMar w:top="1077" w:right="935" w:bottom="1247" w:left="935" w:header="720" w:footer="720" w:gutter="0"/>
+          <w:pgMar w:top="1077" w:right="935" w:bottom="1077" w:left="935" w:header="720" w:footer="720" w:gutter="0"/>
           <w:cols w:space="283"/>
           <w:docGrid w:linePitch="360"/>
         </w:sectPr>
@@ -306,7 +306,7 @@
     </w:p>
     <w:p>
       <w:pPr>
-        <w:spacing w:before="200" w:after="80"/>
+        <w:spacing w:before="120"/>
         <w:jc w:val="center"/>
       </w:pPr>
       <w:r>
@@ -318,7 +318,7 @@
     </w:p>
     <w:p>
       <w:pPr>
-        <w:spacing w:before="120" w:after="40"/>
+        <w:spacing w:before="80" w:after="20"/>
       </w:pPr>
       <w:r>
         <w:rPr>
@@ -333,25 +333,22 @@
         <w:jc w:val="both"/>
       </w:pPr>
       <w:r>
-        <w:t>Kurumların onlarca yıllık C tabanlı yazılım envanteri hem güvenlik hem bakım maliyeti açısından artan bir yüktür. Bellek güvenliği ihlallerinin (buffer overflow, use-after-free, veri yarışı) büyük çoğunluğu</w:t>
-      </w:r>
-      <w:r>
-        <w:t xml:space="preserve"> bellek-güvensiz dillerden kaynaklandığından, Rust gibi bellek-güvenli sistem dillerine geçiş kritik bir mühendislik hedefidir. Manuel geçiş maliyeti çok yüksek olduğundan, LLM tabanlı otomatik kod çevirisi hem endüstride hem akademide hızla ilgi görmekted</w:t>
-      </w:r>
-      <w:r>
-        <w:t xml:space="preserve">ir. Büyük teknoloji şirketlerinin ve kamu kurumlarının bellek-güvenli dillere geçiş yönündeki açık politika duyuruları </w:t>
+        <w:t>Kurumların onlarca yıllık C tabanlı yazılım envanteri, güvenlik ve bakım maliyeti açısından artan bir yüktür; bellek güvenliği ihlallerinin (buffer overflow, use-after-free, veri yarışı) çoğu bellek-güvensi</w:t>
+      </w:r>
+      <w:r>
+        <w:t>z dillerden kaynaklandığından, Rust gibi bellek-güvenli dillere geçiş kritik bir mühendislik hedefidir. Manuel geçiş maliyeti yüksek olduğundan, LLM tabanlı otomatik kod çevirisi hızla ilgi görmektedir; büyük teknoloji şirketleri ve kamu kurumlarının bu yö</w:t>
+      </w:r>
+      <w:r>
+        <w:t xml:space="preserve">ndeki açık politika duyuruları [10] bu ilgiyi somut bir mühendislik ihtiyacına dönüştürürken, </w:t>
       </w:r>
       <w:r>
         <w:lastRenderedPageBreak/>
-        <w:t>[10], bu ilgiyi yalnızca akademik bir merak olmaktan çıkarıp somut, zaman baskılı bir mühendislik ihtiyacına dönüştürmektedir; ancak bu b</w:t>
-      </w:r>
-      <w:r>
-        <w:t>askı, çevirinin doğruluğunun yeterince doğrulanmadan kabul edilmesi riskini de beraberinde getirir.</w:t>
+        <w:t>çevirinin doğruluğu yeterince doğrulanmadan kabul edilmesi riskini de beraberinde getirir.</w:t>
       </w:r>
     </w:p>
     <w:p>
       <w:pPr>
-        <w:spacing w:before="120" w:after="40"/>
+        <w:spacing w:before="80" w:after="20"/>
       </w:pPr>
       <w:r>
         <w:rPr>
@@ -366,18 +363,18 @@
         <w:jc w:val="both"/>
       </w:pPr>
       <w:r>
-        <w:t>Bir LLM çevirisinin "başarılı" sayılması için yalnızca hedef dilde derlenmesi yeterli değildir; kaynakla davranışsal olarak eşdeğer olmalıdır. Söz</w:t>
-      </w:r>
-      <w:r>
-        <w:t>dizimsel düzeyde doğru ama anlam düzeyinde sapan bir çeviri, derleyiciden hiç uyarı almadan üretime sızabilir. Bu çalışmanın çıkış noktası şudur: LLM kod çevirisinde asıl tehlike sözdizimsel değil, sessiz semantik hatalardır — ve bu tehlikenin modelden mod</w:t>
-      </w:r>
-      <w:r>
-        <w:t>ele nasıl değiştiği literatürde yeterince ölçülmemiştir.</w:t>
+        <w:t>Bir LLM çevirisinin "başarılı" sayılması için hedef dilde der</w:t>
+      </w:r>
+      <w:r>
+        <w:t>lenmesi yeterli değildir; kaynakla davranışsal olarak eşdeğer olmalıdır — sözdizimsel düzeyde doğru ama anlam düzeyinde sapan bir çeviri, derleyiciden hiç uyarı almadan üretime sızabilir. Bu çalışmanın çıkış noktası: LLM kod çevirisinde asıl tehlike sözdiz</w:t>
+      </w:r>
+      <w:r>
+        <w:t>imsel değil, sessiz semantik hatalardır — ve bu tehlikenin modelden modele nasıl değiştiği literatürde yeterince ölçülmemiştir.</w:t>
       </w:r>
     </w:p>
     <w:p>
       <w:pPr>
-        <w:spacing w:before="120" w:after="40"/>
+        <w:spacing w:before="80" w:after="20"/>
       </w:pPr>
       <w:r>
         <w:rPr>
@@ -392,16 +389,16 @@
         <w:jc w:val="both"/>
       </w:pPr>
       <w:r>
-        <w:t>Bu çalışmada altı soruya deneysel yanıt aranmaktadır: zero-shot C→Rust çevirisinin yürütme doğruluğu (EA) nedir ve kaç başarısızlık sessizce (derleyici uyarısı olmadan) gerçekleşi</w:t>
-      </w:r>
-      <w:r>
-        <w:t xml:space="preserve">r; başarısızlıkların kök nedenleri C↔Rust arasında tekrar eden hangi semantik boşluklara işaret eder; kod uzunluğu çeviri başarısını gerçekten öngörür mü; derleme yapılandırması (debug/release) ölçülen doğruluğu nasıl etkiler; hata geri bildirimine dayalı </w:t>
-      </w:r>
-      <w:r>
-        <w:t>bir iyileştirme döngüsü doğruluğu ne ölçüde artırır ve bu artış geri bildirimin zenginliğine ne kadar bağımlıdır; ve son olarak, bulgular tek bir modele mi özgüdür, yoksa ikinci bağımsız bir modelde (Google Gemini) de aynı örüntü — ve aynı kök nedenler — g</w:t>
-      </w:r>
-      <w:r>
-        <w:t>özlenir mi?</w:t>
+        <w:t>Bu çalışmada altı soruya deneysel yanıt aranmaktadır: zero-shot C→Rust çevirisinin yürütme doğruluğu (EA) ne</w:t>
+      </w:r>
+      <w:r>
+        <w:t>dir ve kaç başarısızlık sessizce (derleyici uyarısı olmadan) gerçekleşir; başarısızlıkların kök nedenleri C↔Rust arasında tekrar eden hangi semantik boşluklara işaret eder; kod uzunluğu çeviri başarısını gerçekten öngörür mü; derleme yapılandırması (debug/</w:t>
+      </w:r>
+      <w:r>
+        <w:t>release) ölçülen doğruluğu nasıl etkiler; hata geri bildirimine dayalı bir iyileştirme döngüsü doğruluğu ne ölçüde artırır ve bu artış geri bildirimin zenginliğine ne kadar bağımlıdır; ve son olarak, bulgular tek bir modele mi özgüdür, yoksa ikinci bağımsı</w:t>
+      </w:r>
+      <w:r>
+        <w:t>z bir modelde (Google Gemini) de aynı örüntü — ve aynı kök nedenler — gözlenir mi?</w:t>
       </w:r>
     </w:p>
     <w:p>
@@ -409,25 +406,21 @@
         <w:jc w:val="both"/>
       </w:pPr>
       <w:r>
-        <w:t>Bu soruları yanıtlamak için 57 C programı ve 229 test girdisinden oluşan özgün, tekrarlanabilir bir kıyaslama seti ("C→Rust Legacy Çeviri Benchmark'ı") oluşturulmuş; her programın Claude ve Gemini tarafından üretilen Rust çevirisi, kaynağa karş</w:t>
-      </w:r>
-      <w:r>
-        <w:t>ı diferansiyel test ile doğrulanmıştır. Katkılarımız: (i) bilinen C↔Rust semantik boşluklarını (tamsayı taşması, string modeli, işaretlilik, biçimlendirme, global durum) hedefleyen özgün bir veri seti; (ii) derleme modunun ölçülen doğruluğu nasıl gizleyebi</w:t>
-      </w:r>
-      <w:r>
-        <w:t>leceğinin kanıtı; (iii) dokuz kök nedene dayanan bir hata taksonomisi; (iv) üç geri bildirim ayrıntı seviyesinde ölçülmüş bir iyileştirme-döngüsü etkinliği eğrisi; (v) 13 bağımsız gerçek dünya algoritması (Rosetta Code, OpenBSD/FreeBSD libc, musl/Redis/cJS</w:t>
-      </w:r>
-      <w:r>
-        <w:t xml:space="preserve">ON) üzerinde tekrarlanan ölçüm; ve (vi) </w:t>
-      </w:r>
-      <w:r>
-        <w:lastRenderedPageBreak/>
-        <w:t>57/57 örneğin tamamı üzerinde gerçek, otomatik bir ikinci-model (Gemini) ölçümü — bu çalışmanın en yeni katkısı — modele özgü ve modelden bağımsız hata kategorilerini ayırt eder.</w:t>
+        <w:t xml:space="preserve">Bunun için 57 C programı ve 229 test girdisinden oluşan özgün, tekrarlanabilir bir kıyaslama seti ("C→Rust Legacy Çeviri Benchmark'ı") oluşturulmuş; her programın Claude ve </w:t>
+      </w:r>
+      <w:r>
+        <w:t>Gemini çevirisi kaynağa karşı diferansiyel test ile doğrulanmıştır. Katkılarımız: (i) bilinen C↔Rust semantik boşluklarını (tamsayı taşması, string modeli, işaretlilik, biçimlendirme, global durum) hedefleyen özgün bir veri seti; (ii) derleme modunun doğru</w:t>
+      </w:r>
+      <w:r>
+        <w:t>luğu nasıl gizleyebileceğinin kanıtı; (iii) dokuz kök nedene dayanan bir hata taksonomisi; (iv) üç geri bildirim seviyesinde ölçülmüş bir iyileştirme-döngüsü etkinliği eğrisi; (v) 13 bağımsız gerçek dünya algoritması (Rosetta Code, OpenBSD/FreeBSD libc, mu</w:t>
+      </w:r>
+      <w:r>
+        <w:t>sl/Redis/cJSON) üzerinde tekrarlanan ölçüm; ve (vi) 57/57 örnek üzerinde gerçek, otomatik bir ikinci-model (Gemini) ölçümü — modele özgü ve modelden bağımsız hata kategorilerini ayırt eder.</w:t>
       </w:r>
     </w:p>
     <w:p>
       <w:pPr>
-        <w:spacing w:before="200" w:after="80"/>
+        <w:spacing w:before="120"/>
         <w:jc w:val="center"/>
       </w:pPr>
       <w:r>
@@ -442,16 +435,17 @@
         <w:jc w:val="both"/>
       </w:pPr>
       <w:r>
-        <w:t>LLM tabanlı kod</w:t>
-      </w:r>
-      <w:r>
-        <w:t xml:space="preserve"> çevirisinin doğruluğunu yürütme yoluyla doğrulayan çalışmalar artmaktadır. Gandhi vd. [2], COBOL→Java çevirisinde execution-guided refinement ile %81.99 doğruluğa ulaşmıştır; bu çalışma benzer bir mantığı C→Rust'ta benimser. Eniser vd. [1], FLUORINE ile k</w:t>
-      </w:r>
-      <w:r>
-        <w:t xml:space="preserve">od uzunluğu arttıkça çeviri hatası riskinin arttığını gözlemlemiştir — bu çalışmanın bulguları bu gözlemle örtüşmez (§IV-B). Yin vd. [3], farklı LLM'lerin hata kök nedenlerinin büyük ölçüde benzer olduğunu göstermiştir; bu çalışmanın çoklu-model bulguları </w:t>
-      </w:r>
-      <w:r>
-        <w:t>(§IV-F) bunu hem doğrular hem nüanslandırır: yalnızca kök neden D kategorisi modelden bağımsızken, A, B, C, E, F, G, H, I kategorilerinin her biri en az bir modelde başarıyla atlatılmıştır (§IV-F'de ayrıntılandırıldığı gibi).</w:t>
+        <w:lastRenderedPageBreak/>
+        <w:t xml:space="preserve">LLM tabanlı kod çevirisinin doğruluğunu </w:t>
+      </w:r>
+      <w:r>
+        <w:t>yürütme yoluyla doğrulayan çalışmalar artmaktadır. Gandhi vd. [2], COBOL→Java çevirisinde execution-guided refinement ile %81.99 doğruluğa ulaşmıştır; bu çalışma benzer bir mantığı C→Rust'ta benimser. Eniser vd. [1], FLUORINE ile kod uzunluğu arttıkça çevi</w:t>
+      </w:r>
+      <w:r>
+        <w:t>ri hatası riskinin arttığını gözlemlemiştir — bu çalışmanın bulguları bu gözlemle örtüşmez (§IV-B). Yin vd. [3], farklı LLM'lerin hata kök nedenlerinin büyük ölçüde benzer olduğunu göstermiştir; çoklu-model bulgularımız (§IV-F) bunu hem doğrular hem nüansl</w:t>
+      </w:r>
+      <w:r>
+        <w:t>andırır: yalnızca kök neden D kategorisi modelden bağımsızken, A, B, C, E, F, G, H, I kategorilerinin her biri en az bir modelde başarıyla atlatılmıştır.</w:t>
       </w:r>
     </w:p>
     <w:p>
@@ -459,23 +453,13 @@
         <w:jc w:val="both"/>
       </w:pPr>
       <w:r>
-        <w:t xml:space="preserve">Kural tabanlı C→Rust çevirisi </w:t>
-      </w:r>
-      <w:r>
-        <w:t>(ör. C2Rust [11]) ve nöral kod çevirisi (ör. TransCoder [12]) literatürü, bu çalışmadan farklı bir eksende konumlanır: kural tabanlı araçlar davranışsal eşdeğerliği sözdizimsel dönüşüm kurallarıyla garanti etmeye çalışırken (genellikle yoğun `unsafe` kulla</w:t>
-      </w:r>
-      <w:r>
-        <w:t>nımı pahasına), nöral/LLM tabanlı yaklaşımlar deyimsel ama doğrulanmamış çeviriler üretir — bu çalışmanın odaklandığı boşluk tam olarak burasıdır. Rust'ın tip sistemi ve ödünç denetleyicisinin (borrow checker) bellek güvenliğini derleme zamanında nasıl gar</w:t>
-      </w:r>
-      <w:r>
-        <w:t xml:space="preserve">anti ettiği iyi belgelenmiştir; ancak bu garanti yalnızca çeviri kodu Rust'ta derlenirse devreye girer — davranışsal eşdeğerliği garanti </w:t>
-      </w:r>
-      <w:r>
-        <w:lastRenderedPageBreak/>
-        <w:t>etmez. Bu çalışma tam olarak bu ikisi arasındaki boşluğu, yani "derlenen ama kaynaktan farklı davranan" kodu ölçmeyi he</w:t>
-      </w:r>
-      <w:r>
-        <w:t>defler.</w:t>
+        <w:t>Kural tabanlı C→Rust çevirisi (ör. C2Rust [11]) ve nöral kod çevirisi (ör. TransCoder [12]) farklı bir</w:t>
+      </w:r>
+      <w:r>
+        <w:t xml:space="preserve"> eksende konumlanır: kural tabanlı araçlar davranışsal eşdeğerliği sözdizimsel kurallarla (genellikle yoğun `unsafe` pahasına) garanti etmeye çalışırken, nöral/LLM yaklaşımlar deyimsel ama doğrulanmamış çeviriler üretir. Rust'ın tip sistemi ve ödünç denetl</w:t>
+      </w:r>
+      <w:r>
+        <w:t>eyicisi bellek güvenliğini derleme zamanında garanti eder, ama yalnızca kod derlenirse — davranışsal eşdeğerliği garanti etmez; bu çalışma tam olarak bu boşluğu, "derlenen ama kaynaktan farklı davranan" kodu, ölçmeyi hedefler.</w:t>
       </w:r>
     </w:p>
     <w:p>
@@ -483,15 +467,19 @@
         <w:jc w:val="both"/>
       </w:pPr>
       <w:r>
-        <w:t xml:space="preserve">Bu çalışma literatürden üç noktada ayrışır: (a) veri seti özgün ve tümüyle tekrarlanabilirdir; (b) derleme yapılandırmasının doğruluk üzerindeki gizli etkisi gösterilmiştir; (c) iki bağımsız model üzerinde gerçek, otomatik ölçümle kök neden </w:t>
-      </w:r>
-      <w:r>
-        <w:t>düzeyinde bir model karşılaştırması sunulmuştur.</w:t>
+        <w:lastRenderedPageBreak/>
+        <w:t xml:space="preserve">Bu çalışma literatürden üç </w:t>
+      </w:r>
+      <w:r>
+        <w:t>noktada ayrışır: (a) veri seti özgün ve tümüyle tekrarlanabilirdir; (b) derleme yapılandırmasının doğruluk üzerindeki gizli etkisi gösterilmiştir; (c) iki bağımsız model üzerinde gerçek, otomatik ölçümle kök neden düzeyinde bir model karşılaştırması sunulm</w:t>
+      </w:r>
+      <w:r>
+        <w:t>uştur.</w:t>
       </w:r>
     </w:p>
     <w:p>
       <w:pPr>
-        <w:spacing w:before="200" w:after="80"/>
+        <w:spacing w:before="120"/>
         <w:jc w:val="center"/>
       </w:pPr>
       <w:r>
@@ -503,7 +491,7 @@
     </w:p>
     <w:p>
       <w:pPr>
-        <w:spacing w:before="120" w:after="40"/>
+        <w:spacing w:before="80" w:after="20"/>
       </w:pPr>
       <w:r>
         <w:rPr>
@@ -518,19 +506,16 @@
         <w:jc w:val="both"/>
       </w:pPr>
       <w:r>
-        <w:t>Kıyaslama seti 57 C programından oluşur (10-522 satır), dokuz aşamada genişletilmiştir (Tablo I): 24 temel algoritma; kod uzunluğu etkisini test etmek için 5 daha uzun program (s25-s</w:t>
-      </w:r>
-      <w:r>
-        <w:t>29); bağımsızlığı sınamak için Rosetta Code'dan [4] 7 algoritma (s30-s36), OpenBSD/FreeBSD libc'sinden [5] 3 üretim fonksiyonu (s37-s39) ve musl [6]/Redis [7]/cJSON [8]'dan 3 uzun üretim kodu (s46-s48, 262-522 satır); hedeflenmemiş boşlukları kapsayan 6 öz</w:t>
-      </w:r>
-      <w:r>
-        <w:t>gün program (s40-s45); hakem ve danışman geri bildirimine yanıt olarak eklenen, beş kök-neden kategorisinin (C, E, F, G, H) ikinci örnekleri (s49-s53, sırasıyla); ayrıca kimlik numarası sırası içerik sırasıyla örtüşmeyen iki ek grup: çok dosyalı derleme ve</w:t>
-      </w:r>
-      <w:r>
-        <w:t xml:space="preserve"> gerçek pthread eşzamanlılığı test eden s54, s55, s57 ile karmaşık makro kullanımını test eden s56. Her durumda çekirdek algoritma kaynaktan değiştirilmeden alınmış, yalnızca main() ortamın stdin/stdout sözleşmesine uyacak şekilde yeniden yazılmıştır; veri</w:t>
-      </w:r>
-      <w:r>
-        <w:t xml:space="preserve"> setinin tam kataloğu açık veri deposunda sunulmuştur.</w:t>
+        <w:t>Kıyaslama seti 57 C programından oluşur (10-522 satır), dokuz aşamada genişletilmiştir (Tablo I): 24 temel algoritma; kod uzunluğu etkisini test etmek için 5 daha uzun program (s25-s29); bağımsızlığı sınamak için Rosetta Cod</w:t>
+      </w:r>
+      <w:r>
+        <w:t>e'dan [4] 7 algoritma (s30-s36), OpenBSD/FreeBSD libc'sinden [5] 3 üretim fonksiyonu (s37-s39) ve musl [6]/Redis [7]/cJSON [8]'dan 3 uzun üretim kodu (s46-s48); hedeflenmemiş boşlukları kapsayan 6 özgün program (s40-s45); hakem/danışman geri bildirimine ya</w:t>
+      </w:r>
+      <w:r>
+        <w:t>nıt olarak eklenen beş kök-neden kategorisinin (C, E, F, G, H) ikinci örnekleri (s49-s53); ve çok dosyalı/pthread eşzamanlılığını (s54, s55, s57) ile karmaşık makro kullanımını (s56) test eden iki ek grup. Çekirdek algoritma her durumda kaynaktan değiştiri</w:t>
+      </w:r>
+      <w:r>
+        <w:t>lmeden alınmış, yalnızca main() stdin/stdout sözleşmesine uyacak şekilde yeniden yazılmıştır; tam katalog açık veri deposunda sunulmuştur.</w:t>
       </w:r>
     </w:p>
     <w:p>
@@ -538,7 +523,7 @@
         <w:sectPr>
           <w:type w:val="continuous"/>
           <w:pgSz w:w="11906" w:h="16838"/>
-          <w:pgMar w:top="1077" w:right="935" w:bottom="1247" w:left="935" w:header="720" w:footer="720" w:gutter="0"/>
+          <w:pgMar w:top="1077" w:right="935" w:bottom="1077" w:left="935" w:header="720" w:footer="720" w:gutter="0"/>
           <w:cols w:num="2" w:space="283"/>
           <w:docGrid w:linePitch="360"/>
         </w:sectPr>
@@ -546,7 +531,7 @@
     </w:p>
     <w:p>
       <w:pPr>
-        <w:spacing w:before="60" w:after="160"/>
+        <w:spacing w:before="40" w:after="80"/>
         <w:jc w:val="center"/>
       </w:pPr>
       <w:r>
@@ -554,13 +539,13 @@
           <w:sz w:val="16"/>
         </w:rPr>
         <w:lastRenderedPageBreak/>
-        <w:t>TABLO I. VERİ SETİNİN KAYNAK/ROL KATEGORİLERİNE GÖRE ÖZETİ (* Rosetta Code; ** OpenBSD/FreeBSD libc; *** musl/Redis/cJSON — üçü de tarafımızca yazılmamış bağımsız/üretim kodu,</w:t>
+        <w:t>TABLO I. VERİ SETİNİN KAYNAK/ROL KATEGORİLERİNE GÖRE ÖZETİ (* Rosetta Code; ** OpenBSD/Free</w:t>
       </w:r>
       <w:r>
         <w:rPr>
           <w:sz w:val="16"/>
         </w:rPr>
-        <w:t xml:space="preserve"> bkz. §V-B).</w:t>
+        <w:t>BSD libc; *** musl/Redis/cJSON — üçü de tarafımızca yazılmamış bağımsız/üretim kodu, bkz. §V-B).</w:t>
       </w:r>
     </w:p>
     <w:tbl>
@@ -580,6 +565,7 @@
       </w:tblGrid>
       <w:tr>
         <w:trPr>
+          <w:cantSplit/>
           <w:tblHeader/>
           <w:jc w:val="center"/>
         </w:trPr>
@@ -691,6 +677,7 @@
       </w:tr>
       <w:tr>
         <w:trPr>
+          <w:cantSplit/>
           <w:jc w:val="center"/>
         </w:trPr>
         <w:tc>
@@ -788,6 +775,7 @@
       </w:tr>
       <w:tr>
         <w:trPr>
+          <w:cantSplit/>
           <w:jc w:val="center"/>
         </w:trPr>
         <w:tc>
@@ -885,6 +873,7 @@
       </w:tr>
       <w:tr>
         <w:trPr>
+          <w:cantSplit/>
           <w:jc w:val="center"/>
         </w:trPr>
         <w:tc>
@@ -982,6 +971,7 @@
       </w:tr>
       <w:tr>
         <w:trPr>
+          <w:cantSplit/>
           <w:jc w:val="center"/>
         </w:trPr>
         <w:tc>
@@ -998,7 +988,13 @@
               <w:rPr>
                 <w:sz w:val="18"/>
               </w:rPr>
-              <w:t>BSD libc</w:t>
+              <w:t xml:space="preserve">BSD </w:t>
+            </w:r>
+            <w:r>
+              <w:rPr>
+                <w:sz w:val="18"/>
+              </w:rPr>
+              <w:t>libc</w:t>
             </w:r>
           </w:p>
         </w:tc>
@@ -1079,6 +1075,7 @@
       </w:tr>
       <w:tr>
         <w:trPr>
+          <w:cantSplit/>
           <w:jc w:val="center"/>
         </w:trPr>
         <w:tc>
@@ -1176,6 +1173,7 @@
       </w:tr>
       <w:tr>
         <w:trPr>
+          <w:cantSplit/>
           <w:jc w:val="center"/>
         </w:trPr>
         <w:tc>
@@ -1273,6 +1271,7 @@
       </w:tr>
       <w:tr>
         <w:trPr>
+          <w:cantSplit/>
           <w:jc w:val="center"/>
         </w:trPr>
         <w:tc>
@@ -1370,6 +1369,7 @@
       </w:tr>
       <w:tr>
         <w:trPr>
+          <w:cantSplit/>
           <w:jc w:val="center"/>
         </w:trPr>
         <w:tc>
@@ -1467,6 +1467,7 @@
       </w:tr>
       <w:tr>
         <w:trPr>
+          <w:cantSplit/>
           <w:jc w:val="center"/>
         </w:trPr>
         <w:tc>
@@ -1565,7 +1566,7 @@
     </w:tbl>
     <w:p>
       <w:pPr>
-        <w:spacing w:after="40"/>
+        <w:spacing w:after="0"/>
       </w:pPr>
     </w:p>
     <w:p>
@@ -1573,7 +1574,7 @@
         <w:sectPr>
           <w:type w:val="continuous"/>
           <w:pgSz w:w="11906" w:h="16838"/>
-          <w:pgMar w:top="1077" w:right="935" w:bottom="1247" w:left="935" w:header="720" w:footer="720" w:gutter="0"/>
+          <w:pgMar w:top="1077" w:right="935" w:bottom="1077" w:left="935" w:header="720" w:footer="720" w:gutter="0"/>
           <w:cols w:space="283"/>
           <w:docGrid w:linePitch="360"/>
         </w:sectPr>
@@ -1581,7 +1582,7 @@
     </w:p>
     <w:p>
       <w:pPr>
-        <w:spacing w:before="120" w:after="40"/>
+        <w:spacing w:before="80" w:after="20"/>
       </w:pPr>
       <w:r>
         <w:rPr>
@@ -1597,55 +1598,31 @@
         <w:jc w:val="both"/>
       </w:pPr>
       <w:r>
-        <w:t>Ana çeviri modeli Anthropic Claude Sonnet</w:t>
-      </w:r>
-      <w:r>
-        <w:t xml:space="preserve"> 5'tir (model kimliği: claude-sonnet-5); ikinci, bağımsız bir model olarak Google Gemini API'si [9] (model kimliği: gemini-flash-latest, gerçek API çağrısıyla, temperature=0.2, top_p=1.0) kullanılmıştır. Gemini kimliği açıkça tarihli/sabit bir sürüm değil </w:t>
-      </w:r>
-      <w:r>
-        <w:t>rotasyonlu bir takma addır ("-latest" eki); API yanıtının hangi anlık görüntüye (snapshot) çözümlendiğini gösteren alan (`modelVersion`) çağrı kayıtlarına o dönemde loglanmamıştır — bu, tekrarlanabilirlik açısından açıkça kabul edilmesi gereken bir eksikli</w:t>
-      </w:r>
-      <w:r>
-        <w:t xml:space="preserve">ktir (§V-B); ölçümün </w:t>
+        <w:t>Ana çeviri modeli Anthropic Claude Sonnet 5'tir (model kimliği: claude-sonnet-5); ikinci, bağımsız model olarak Google Gemini API'si [9] (gemini-flash-latest, gerçek API çağrısıyla, temperature=0.2, top_p=1.0) kull</w:t>
+      </w:r>
+      <w:r>
+        <w:t>anılmıştır. Gemini kimliği sabit bir sürüm değil rotasyonlu bir takma addır ("-latest"); hangi anlık görüntüye (`modelVersion`) çözümlendiği o dönemde loglanmamıştır — tekrarlanabilirlik açısından kabul edilmesi gereken bir eksikliktir (§V-B), ölçümün zama</w:t>
+      </w:r>
+      <w:r>
+        <w:t>nsal bağlamı yalnızca erişim tarihleriyle (2026-07-22 – 2026-07-25) yeniden kurulabilir. İstem mühendisliği en yalın haliyle uygulanmıştır: modele yalnızca "bu C programını Rust'a çevir" istemi verilmiş, model derleme/test aracına erişememiştir (gerçek zer</w:t>
+      </w:r>
+      <w:r>
+        <w:t>o-shot). Değerlendirme betiği model-bağımsız tasarlanmıştır. Claude çevirileri ise etkileşimli bir asistan oturumunda (Claude Code CLI) üretilmiş; örnekleme parametreleri ayrı arşivlenmemiştir — bu, tekrarlanabilirliği Gemini tarafına göre sınırlayan bir a</w:t>
+      </w:r>
+      <w:r>
+        <w:t xml:space="preserve">simetridir (§V-B). Her iki model için de her örnek yalnızca </w:t>
       </w:r>
       <w:r>
         <w:lastRenderedPageBreak/>
-        <w:t>zamansal bağlamı yalnızca erişim tarihleriyle (2026-07-22 – 2026-07-25) sınırlı olarak yeniden kurulabilir. İstem mühendisliği en yalın haliyle uygulanmıştır: modele her C dosyası için yalnızca "bu C programını Rust'a çevir" istemi ver</w:t>
-      </w:r>
-      <w:r>
-        <w:t>ilmiş; belirli bir Rust deyimselliği, hedef sürüm veya few-shot örnek sağlanmamıştır. Model, çeviriyi üretmeden önce kodu derlemek/test etmek için herhangi bir araca erişememiştir (gerçek zero-shot koşulu). Değerlendirme betiği model-bağımsız tasarlanmıştı</w:t>
-      </w:r>
-      <w:r>
-        <w:t xml:space="preserve">r: başka bir LLM'in çıktıları ilgili klasöre konularak aynı ölçüm otomatik tekrarlanabilir. Claude çevirileri ise etkileşimli bir asistan </w:t>
-      </w:r>
-      <w:r>
-        <w:lastRenderedPageBreak/>
-        <w:t>oturumunda (Claude Code CLI) üretilmiştir; sabit örnekleme parametreleri (temperature/top-p) dışa açık raporlanmamış v</w:t>
-      </w:r>
-      <w:r>
-        <w:t>e istemin birebir metni ayrı arşivlenmemiştir — bu, Claude tarafı için tekrarlanabilirliği Gemini tarafına göre sınırlayan, açıkça kabul edilmesi gereken bir asimetridir (§V-B). Her iki model için de her örnek yalnızca bir kez (k=1) çevrilmiştir; LLM çıktı</w:t>
-      </w:r>
-      <w:r>
-        <w:t>sının stokastik doğası nedeniyle, tek örneklemli bu ölçümün ne kadarının gerçek model performansı farkını, ne kadarının örnekleme gürültüsünü yansıttığı bilinmemektedir (§V-B).</w:t>
+        <w:t>bir kez (k=1) çevrilmiştir; bu tek-örneklemli ölçümün model farkını mı örnekleme gürültüsünü mü yansıttığı bilinmemektedir (§V-B). Gemini ölçümü, ücretsiz katman günlük kota sınırı nedeniyle 2026-</w:t>
+      </w:r>
+      <w:r>
+        <w:t>07-22 – 2026-07-25 arasında kademeli tamamlanmıştır; tam çağrı kaydı (istem, zaman damgası, örnekleme parametreleri) her örnek için açık veri deposunda arşivlenmiştir.</w:t>
       </w:r>
     </w:p>
     <w:p>
       <w:pPr>
-        <w:jc w:val="both"/>
-      </w:pPr>
-      <w:r>
-        <w:t>Gemini ölçümü, ücretsiz katman günlük kota sınırı nedeniyle birden fazla gün bo</w:t>
-      </w:r>
-      <w:r>
-        <w:t>yunca kademeli olarak tamamlanmıştır (2026-07-22 ile 2026-07-25 arasında, kota her sıfırlandığında bir sonraki grup çevrilerek): toplam 57 örneğin tamamı gerçek, otomatik API çağrısıyla ölçülmüştür; hiçbir sonuç sahte veriyle doldurulmamıştır. Tam çağrı ka</w:t>
-      </w:r>
-      <w:r>
-        <w:t>ydı (istem, zaman damgası, örnekleme parametreleri) her örnek için açık veri deposunda arşivlenmiştir.</w:t>
-      </w:r>
-    </w:p>
-    <w:p>
-      <w:pPr>
-        <w:spacing w:before="120" w:after="40"/>
+        <w:spacing w:before="80" w:after="20"/>
       </w:pPr>
       <w:r>
         <w:rPr>
@@ -1660,10 +1637,13 @@
         <w:jc w:val="both"/>
       </w:pPr>
       <w:r>
-        <w:t>Hedef dilde önceden yazılmış birim test bulunmadığından, doğruluk kaynak programla aynı girdide çalıştırılıp çık</w:t>
-      </w:r>
-      <w:r>
-        <w:t xml:space="preserve">tı karşılaştırılarak (diferansiyel test) ölçülmüştür: C ve Rust ikilileri derlenir (Rust derlenmezse CE); her test girdisi için beklenen/alınan çıktı karşılaştırılır (zaman aşımı → NT, çökme → RE, fark → FE, eşitse PASS; Tablo II); bir örnek yalnızca </w:t>
+        <w:t>Hedef dilde önceden yazılmış birim test bulunma</w:t>
+      </w:r>
+      <w:r>
+        <w:t xml:space="preserve">dığından, doğruluk kaynak programla aynı girdide çalıştırılıp çıktı karşılaştırılarak (diferansiyel test) ölçülmüştür: C ve Rust ikilileri derlenir (Rust derlenmezse CE); her test girdisi için beklenen/alınan çıktı karşılaştırılır (zaman aşımı → NT, çökme </w:t>
+      </w:r>
+      <w:r>
+        <w:t xml:space="preserve">→ RE, fark → FE, eşitse PASS; Tablo II); bir örnek yalnızca </w:t>
       </w:r>
       <w:r>
         <w:rPr>
@@ -1672,15 +1652,12 @@
         <w:t>tüm</w:t>
       </w:r>
       <w:r>
-        <w:t xml:space="preserve"> g</w:t>
-      </w:r>
-      <w:r>
-        <w:t>irdileri geçerse PASS sayılır.</w:t>
+        <w:t xml:space="preserve"> girdileri geçerse PASS sayılır.</w:t>
       </w:r>
     </w:p>
     <w:p>
       <w:pPr>
-        <w:spacing w:before="60" w:after="160"/>
+        <w:spacing w:before="40" w:after="80"/>
         <w:jc w:val="center"/>
       </w:pPr>
       <w:r>
@@ -1705,6 +1682,7 @@
       </w:tblGrid>
       <w:tr>
         <w:trPr>
+          <w:cantSplit/>
           <w:tblHeader/>
           <w:jc w:val="center"/>
         </w:trPr>
@@ -1774,6 +1752,7 @@
       </w:tr>
       <w:tr>
         <w:trPr>
+          <w:cantSplit/>
           <w:jc w:val="center"/>
         </w:trPr>
         <w:tc>
@@ -1791,6 +1770,7 @@
               <w:rPr>
                 <w:sz w:val="17"/>
               </w:rPr>
+              <w:lastRenderedPageBreak/>
               <w:t>CE</w:t>
             </w:r>
           </w:p>
@@ -1834,6 +1814,7 @@
       </w:tr>
       <w:tr>
         <w:trPr>
+          <w:cantSplit/>
           <w:jc w:val="center"/>
         </w:trPr>
         <w:tc>
@@ -1894,6 +1875,7 @@
       </w:tr>
       <w:tr>
         <w:trPr>
+          <w:cantSplit/>
           <w:jc w:val="center"/>
         </w:trPr>
         <w:tc>
@@ -1954,6 +1936,7 @@
       </w:tr>
       <w:tr>
         <w:trPr>
+          <w:cantSplit/>
           <w:jc w:val="center"/>
         </w:trPr>
         <w:tc>
@@ -2015,12 +1998,12 @@
     </w:tbl>
     <w:p>
       <w:pPr>
-        <w:spacing w:after="40"/>
+        <w:spacing w:after="0"/>
       </w:pPr>
     </w:p>
     <w:p>
       <w:pPr>
-        <w:spacing w:before="120" w:after="40"/>
+        <w:spacing w:before="80" w:after="20"/>
       </w:pPr>
       <w:r>
         <w:rPr>
@@ -2035,17 +2018,13 @@
         <w:jc w:val="both"/>
       </w:pPr>
       <w:r>
-        <w:t>Rust'ta tamsayı taşması debug modunda (overflow-checks açık) panik üretirken release modunda (-O) sessizce sarar; bu farkın etkisini göstermek için aynı Round 1 çevirileri her iki modda derlenip test edilmiştir. Round 1'de başarısız olan her örnek için ilg</w:t>
-      </w:r>
-      <w:r>
-        <w:t xml:space="preserve">ili hata sinyali modele geri verilip düzeltmesi istenmiştir (Round 2). Ayrıca aynı 17 </w:t>
-      </w:r>
-      <w:r>
-        <w:lastRenderedPageBreak/>
-        <w:t>başarısızlık üzerinde, yalnızca modele verilen bilginin kısıtlandığı iki ek geri bildirim seviyesiyle (Seviye B: yalnızca derleyici/panik metni veya başarısız girdi; Sevi</w:t>
-      </w:r>
-      <w:r>
-        <w:t xml:space="preserve">ye C: yalnızca başarısız test sayısı) ayrı ölçüm yapılmıştır. Üç geri bildirim seviyesinin tamamında model başına yalnızca </w:t>
+        <w:t>Rust'ta tamsayı taşması debug modunda (overflow-checks açık) panik üretirken release modunda (-O) sessizce sarar; bu farkı göstermek için aynı Round 1 çevirileri her iki modda test edilmiştir. Round 1'de başarısız olan her örnek için hata sinyali modele ge</w:t>
+      </w:r>
+      <w:r>
+        <w:t xml:space="preserve">ri verilip düzeltmesi istenmiştir (Round 2); aynı 17 başarısızlık üzerinde, bilginin kısıtlandığı iki ek seviyeyle de ölçüm yapılmıştır (Seviye B: yalnızca derleyici/panik metni veya başarısız girdi; Seviye C: yalnızca başarısız test sayısı). Üç seviyenin </w:t>
+      </w:r>
+      <w:r>
+        <w:t xml:space="preserve">tamamında yalnızca </w:t>
       </w:r>
       <w:r>
         <w:rPr>
@@ -2054,15 +2033,15 @@
         <w:t>bir</w:t>
       </w:r>
       <w:r>
-        <w:t xml:space="preserve"> düzeltme turu uygulanmıştır (yakınsayana kadar tekrarlanan bir döngü değil, tek seferlik/single-shot düzeltme); bütçe (1 tur) sev</w:t>
-      </w:r>
-      <w:r>
-        <w:t>iyeler arasında sabit tutulmuştur — bu, Seviye B ve C'de EA'nın %100'e ulaşmamasının (sırasıyla %86.0, %71.9) nedenlerinden biridir: bazı düzeltmeler ilk turda başarısız kalmış ve yeniden denenmemiştir.</w:t>
+        <w:t xml:space="preserve"> düzeltme turu uygulanmıştır (single-shot, yakınsayana kadar tekrarlanan bir döngü değil) — bu, Seviye B ve C'de EA'nın %100'e ulaşmamasının (sırasıyla %86.0, %71.9) nedenlerinden biridir: bazı düzeltmeler ilk turda başarısız kalmış v</w:t>
+      </w:r>
+      <w:r>
+        <w:t>e yeniden denenmemiştir.</w:t>
       </w:r>
     </w:p>
     <w:p>
       <w:pPr>
-        <w:spacing w:before="120" w:after="40"/>
+        <w:spacing w:before="80" w:after="20"/>
       </w:pPr>
       <w:r>
         <w:rPr>
@@ -2077,54 +2056,48 @@
         <w:jc w:val="both"/>
       </w:pPr>
       <w:r>
-        <w:t>Program-düzeyi Yürütme Doğruluğu (</w:t>
-      </w:r>
-      <w:r>
-        <w:t>EA) = tüm testleri geçen örnek sayısı / toplam örnek sayısı — ana metriktir. Test-girdisi bazında geçme oranı ikincil, daha ince taneli bir metriktir. Ortam: Windows 11, gcc 16.1.0 (MSYS2/UCRT64, -O2), rustc/cargo 1.97.1; derleme `rustc &lt;dosya&gt;.rs -o &lt;çıkt</w:t>
-      </w:r>
-      <w:r>
-        <w:t>ı&gt;` ile, Cargo veya açık bir --edition bayrağı olmadan yapılmıştır (rustc'nin varsayılan edition'ı, 2015); bu, tekrarlanabilirlik için belirtilmesi gereken bir parametredir (bazı lint'lerin — ör. static_mut_refs — şiddeti edition'a göre değişir, ancak Kate</w:t>
-      </w:r>
-      <w:r>
-        <w:t>gori E'deki gözlenen derleme hatası — E0133, unsafe olmadan mutable static erişimi — tüm editionlarda aynı şekilde sert hatadır). Ayrıca gerçek bir Linux/LP64 ortamında (Docker, ubuntu:24.04) bir tekrar yapılmıştır; bu tekrar veri seti 55 örnekken gerçekle</w:t>
-      </w:r>
-      <w:r>
-        <w:t>ştirilmiş ve sonradan güncellenmemiştir (§IV-F). Zaman aşımı eşiği 5 sn'dir; yalnızca LLM çağrısı bire bir tekrarlanabilir değildir (§V-B). Tekrarlanabilirlik için gereken depo/erişim bilgileri §III-F'de toplu olarak sunulmuştur.</w:t>
+        <w:t xml:space="preserve">Program-düzeyi Yürütme Doğruluğu (EA) = tüm testleri geçen örnek sayısı / toplam örnek sayısı — ana metriktir; </w:t>
+      </w:r>
+      <w:r>
+        <w:lastRenderedPageBreak/>
+        <w:t xml:space="preserve">test-girdisi bazında geçme oranı ikincil bir metriktir. Ortam: Windows 11, gcc 16.1.0 (MSYS2/UCRT64, </w:t>
+      </w:r>
+      <w:r>
+        <w:t>-O2), rustc/cargo 1.97.1; derleme `rustc &lt;dosya&gt;.rs -o &lt;çıktı&gt;` ile, Cargo veya --edition bayrağı olmadan yapılmıştır (varsayılan edition, 2015 — bazı lint'lerin şiddeti edition'a göre değişir, ancak Kategori E'deki E0133 derleme hatası tüm editionlarda se</w:t>
+      </w:r>
+      <w:r>
+        <w:t>rt hatadır). Ayrıca gerçek bir Linux/LP64 ortamında (Docker, ubuntu:24.04) bir tekrar yapılmıştır; bu tekrar veri seti 55 örnekken gerçekleştirilmiş ve sonradan güncellenmemiştir (§IV-F). Zaman aşımı eşiği 5 sn'dir; yalnızca LLM çağrısı bire bir tekrarlana</w:t>
+      </w:r>
+      <w:r>
+        <w:t>bilir değildir (§V-B). Tekrarlanabilirlik için gereken depo/erişim bilgileri §III-F'de sunulmuştur.</w:t>
       </w:r>
     </w:p>
     <w:p>
       <w:pPr>
-        <w:spacing w:before="120" w:after="40"/>
+        <w:spacing w:before="80" w:after="20"/>
       </w:pPr>
       <w:r>
         <w:rPr>
           <w:b/>
           <w:i/>
         </w:rPr>
-        <w:t>F. Veri, Kod ve Lisans Eri</w:t>
-      </w:r>
-      <w:r>
-        <w:rPr>
-          <w:b/>
-          <w:i/>
-        </w:rPr>
-        <w:t>şilebilirliği</w:t>
+        <w:t>F. Veri, Kod ve Lisans Erişilebilirliği</w:t>
       </w:r>
     </w:p>
     <w:p>
       <w:r>
-        <w:t>Tüm değerlendirme betikleri, veri seti, model çağrı kayıtları, istatistik ve platform-karşılaştırma raporları ile ham sonuçlar açık bir depoda erişime sunulmuştur. Kör değerlendirme sürecini korumak için depo bağlantısı ve kalıcı arşiv (Zenod</w:t>
-      </w:r>
-      <w:r>
-        <w:t>o/figshare) DOI'si, kabul sonrası yayın aşamasında paylaşılacaktır. Bağımsız kaynaklardan alınan programlar ilgili açık lisanslar altında yeniden kullanılmıştır: Rosetta Code örnekleri GFDL 1.2/CC-BY-SA; OpenBSD/FreeBSD libc ve Redis SDS kodu BSD-3-Clause;</w:t>
-      </w:r>
-      <w:r>
-        <w:t xml:space="preserve"> musl ve cJSON kodu MIT lisansı altındadır. Her kaynak dosyanın başlığında lisans bilgisi ve yapılan değişiklikler belgelenmiştir.</w:t>
+        <w:t>Tüm değerlendirme betikleri, veri seti, model çağrı kayıtları, istatistik ve platform-karşılaştırma raporları ile ha</w:t>
+      </w:r>
+      <w:r>
+        <w:t xml:space="preserve">m sonuçlar açık bir depoda erişime sunulmuştur. Kör değerlendirme sürecini korumak için depo bağlantısı ve kalıcı arşiv (Zenodo/figshare) DOI'si, kabul sonrası yayın aşamasında paylaşılacaktır. Bağımsız kaynaklardan alınan programlar ilgili açık lisanslar </w:t>
+      </w:r>
+      <w:r>
+        <w:t>altında yeniden kullanılmıştır: Rosetta Code örnekleri GFDL 1.2/CC-BY-SA; OpenBSD/FreeBSD libc ve Redis SDS kodu BSD-3-Clause; musl ve cJSON kodu MIT lisansı altındadır. Her kaynak dosyanın başlığında lisans bilgisi ve yapılan değişiklikler belgelenmiştir.</w:t>
       </w:r>
     </w:p>
     <w:p>
       <w:pPr>
-        <w:spacing w:before="200" w:after="80"/>
+        <w:spacing w:before="120"/>
         <w:jc w:val="center"/>
       </w:pPr>
       <w:r>
@@ -2147,7 +2120,7 @@
         <w:sectPr>
           <w:type w:val="continuous"/>
           <w:pgSz w:w="11906" w:h="16838"/>
-          <w:pgMar w:top="1077" w:right="935" w:bottom="1247" w:left="935" w:header="720" w:footer="720" w:gutter="0"/>
+          <w:pgMar w:top="1077" w:right="935" w:bottom="1077" w:left="935" w:header="720" w:footer="720" w:gutter="0"/>
           <w:cols w:num="2" w:space="283"/>
           <w:docGrid w:linePitch="360"/>
         </w:sectPr>
@@ -2155,7 +2128,7 @@
     </w:p>
     <w:p>
       <w:pPr>
-        <w:spacing w:before="60" w:after="160"/>
+        <w:spacing w:before="40" w:after="80"/>
         <w:jc w:val="center"/>
       </w:pPr>
       <w:r>
@@ -2186,6 +2159,7 @@
       </w:tblGrid>
       <w:tr>
         <w:trPr>
+          <w:cantSplit/>
           <w:tblHeader/>
           <w:jc w:val="center"/>
         </w:trPr>
@@ -2360,6 +2334,7 @@
       </w:tr>
       <w:tr>
         <w:trPr>
+          <w:cantSplit/>
           <w:jc w:val="center"/>
         </w:trPr>
         <w:tc>
@@ -2376,7 +2351,13 @@
               <w:rPr>
                 <w:sz w:val="18"/>
               </w:rPr>
-              <w:t>R1 — ham çeviri</w:t>
+              <w:t xml:space="preserve">R1 — ham </w:t>
+            </w:r>
+            <w:r>
+              <w:rPr>
+                <w:sz w:val="18"/>
+              </w:rPr>
+              <w:t>çeviri</w:t>
             </w:r>
           </w:p>
         </w:tc>
@@ -2516,6 +2497,7 @@
       </w:tr>
       <w:tr>
         <w:trPr>
+          <w:cantSplit/>
           <w:jc w:val="center"/>
         </w:trPr>
         <w:tc>
@@ -2672,6 +2654,7 @@
       </w:tr>
       <w:tr>
         <w:trPr>
+          <w:cantSplit/>
           <w:jc w:val="center"/>
         </w:trPr>
         <w:tc>
@@ -2829,7 +2812,7 @@
     </w:tbl>
     <w:p>
       <w:pPr>
-        <w:spacing w:after="40"/>
+        <w:spacing w:after="0"/>
       </w:pPr>
     </w:p>
     <w:p>
@@ -2837,7 +2820,7 @@
         <w:sectPr>
           <w:type w:val="continuous"/>
           <w:pgSz w:w="11906" w:h="16838"/>
-          <w:pgMar w:top="1077" w:right="935" w:bottom="1247" w:left="935" w:header="720" w:footer="720" w:gutter="0"/>
+          <w:pgMar w:top="1077" w:right="935" w:bottom="1077" w:left="935" w:header="720" w:footer="720" w:gutter="0"/>
           <w:cols w:space="283"/>
           <w:docGrid w:linePitch="360"/>
         </w:sectPr>
@@ -2845,7 +2828,7 @@
     </w:p>
     <w:p>
       <w:pPr>
-        <w:spacing w:before="120" w:after="40"/>
+        <w:spacing w:before="80" w:after="20"/>
       </w:pPr>
       <w:r>
         <w:rPr>
@@ -2861,11 +2844,10 @@
         <w:jc w:val="both"/>
       </w:pPr>
       <w:r>
-        <w:t xml:space="preserve">Ham çeviriler için EA yalnızca %70.18'dir (Şekil 1). Round 1'de başarısız olan 17 örneğin yalnızca biri (s19, global durum) derleme aşamasında (CE) yakalanmıştır; geri kalan </w:t>
-      </w:r>
-      <w:r>
-        <w:lastRenderedPageBreak/>
-        <w:t>16'sı (%94.1) — 4 RE + 12 FE — derleyiciden hiç uyarı almadan sessizce geçmiştir (Şekil 2).</w:t>
+        <w:t xml:space="preserve">Ham çeviriler için EA yalnızca %70.18'dir (Şekil </w:t>
+      </w:r>
+      <w:r>
+        <w:t>1). Round 1'de başarısız olan 17 örneğin yalnızca biri (s19, global durum) derleme aşamasında (CE) yakalanmıştır; geri kalan 16'sı (%94.1) — 4 RE + 12 FE — derleyiciden hiç uyarı almadan sessizce geçmiştir (Şekil 2).</w:t>
       </w:r>
     </w:p>
     <w:p>
@@ -2873,14 +2855,13 @@
         <w:jc w:val="both"/>
       </w:pPr>
       <w:r>
-        <w:t xml:space="preserve">Program düzeyinde %70.18 olan doğruluk, test girdisi düzeyinde %86.3 (195/226 — CE olan tek örneğin girdileri </w:t>
-      </w:r>
-      <w:r>
-        <w:lastRenderedPageBreak/>
-        <w:t>hiç çalıştırılamadığından payda 229 değil 226'dır) ola</w:t>
-      </w:r>
-      <w:r>
-        <w:t xml:space="preserve">rak ölçülmüştür; bu, program-düzeyi metriğin katı ("tüm girdileri geçmelidir") tanımı nedeniyle beklenen bir farktır. Daha çarpıcı olan: 12 FE örneğinin 6'sı (s06, s13, s15, s20, s27, s38) yalnızca </w:t>
+        <w:t>Program düzeyinde %70.18 olan doğruluk,</w:t>
+      </w:r>
+      <w:r>
+        <w:t xml:space="preserve"> test girdisi düzeyinde %86.3'tür (195/226 — CE olan örneğin girdileri çalıştırılamadığından payda 226'dır); bu, program-düzeyi metriğin katı ("tüm girdileri geçmelidir") tanımından beklenen bir farktır. Daha çarpıcı olan: 12 FE örneğinin 6'sı (s06, s13, s</w:t>
+      </w:r>
+      <w:r>
+        <w:t xml:space="preserve">15, s20, s27, s38) yalnızca </w:t>
       </w:r>
       <w:r>
         <w:rPr>
@@ -2889,13 +2870,10 @@
         <w:t>tek</w:t>
       </w:r>
       <w:r>
-        <w:t xml:space="preserve"> bir sınır girdisinde sapmış, kalan girdilerin tamamınd</w:t>
-      </w:r>
-      <w:r>
-        <w:t xml:space="preserve">a doğru sonuç üretmiştir. Bu, sessiz semantik hataların rastgele seçilmiş bir test girdisiyle yakalanma olasılığının düşük olduğunu ve diferansiyel testin sonucunun girdi çeşitliliğine ne kadar bağımlı olduğunu göstermektedir — hata yalnızca sessiz değil, </w:t>
-      </w:r>
-      <w:r>
-        <w:t>aynı zamanda seyrek tetiklenir.</w:t>
+        <w:t xml:space="preserve"> bir sınır girdisinde sapmış, kalan girdilerin tamamında doğru sonuç üretmiştir — sessiz semantik hataların rastgele bir girdiyle yakalanma olasılığının düşük olduğunu, hatanın yalnızca sessiz değil seyrek de olduğunu gösteri</w:t>
+      </w:r>
+      <w:r>
+        <w:t>r.</w:t>
       </w:r>
     </w:p>
     <w:p>
@@ -2907,9 +2885,10 @@
           <w:noProof/>
           <w:lang w:val="tr-TR" w:eastAsia="tr-TR"/>
         </w:rPr>
+        <w:lastRenderedPageBreak/>
         <w:drawing>
           <wp:inline distT="0" distB="0" distL="0" distR="0">
-            <wp:extent cx="3063240" cy="1932928"/>
+            <wp:extent cx="2743200" cy="1730980"/>
             <wp:effectExtent l="0" t="0" r="0" b="0"/>
             <wp:docPr id="1" name="Picture 1"/>
             <wp:cNvGraphicFramePr>
@@ -2931,7 +2910,7 @@
                   <pic:spPr>
                     <a:xfrm>
                       <a:off x="0" y="0"/>
-                      <a:ext cx="3063240" cy="1932928"/>
+                      <a:ext cx="2743200" cy="1730980"/>
                     </a:xfrm>
                     <a:prstGeom prst="rect">
                       <a:avLst/>
@@ -2946,7 +2925,7 @@
     </w:p>
     <w:p>
       <w:pPr>
-        <w:spacing w:before="60" w:after="160"/>
+        <w:spacing w:before="40" w:after="80"/>
         <w:jc w:val="center"/>
       </w:pPr>
       <w:r>
@@ -2965,9 +2944,10 @@
           <w:noProof/>
           <w:lang w:val="tr-TR" w:eastAsia="tr-TR"/>
         </w:rPr>
+        <w:lastRenderedPageBreak/>
         <w:drawing>
           <wp:inline distT="0" distB="0" distL="0" distR="0">
-            <wp:extent cx="3063240" cy="1872214"/>
+            <wp:extent cx="2743200" cy="1676610"/>
             <wp:effectExtent l="0" t="0" r="0" b="0"/>
             <wp:docPr id="2" name="Picture 2"/>
             <wp:cNvGraphicFramePr>
@@ -2989,7 +2969,7 @@
                   <pic:spPr>
                     <a:xfrm>
                       <a:off x="0" y="0"/>
-                      <a:ext cx="3063240" cy="1872214"/>
+                      <a:ext cx="2743200" cy="1676610"/>
                     </a:xfrm>
                     <a:prstGeom prst="rect">
                       <a:avLst/>
@@ -3004,7 +2984,7 @@
     </w:p>
     <w:p>
       <w:pPr>
-        <w:spacing w:before="60" w:after="160"/>
+        <w:spacing w:before="40" w:after="80"/>
         <w:jc w:val="center"/>
       </w:pPr>
       <w:r>
@@ -3016,7 +2996,7 @@
     </w:p>
     <w:p>
       <w:pPr>
-        <w:spacing w:before="120" w:after="40"/>
+        <w:spacing w:before="80" w:after="20"/>
       </w:pPr>
       <w:r>
         <w:rPr>
@@ -3031,13 +3011,13 @@
         <w:jc w:val="both"/>
       </w:pPr>
       <w:r>
-        <w:t>Şekil 3, 57 örneğin LoC'sini başarı durumuna göre gösterir: en uzun program (522 sat</w:t>
-      </w:r>
-      <w:r>
-        <w:t>ır, s47) geçerken çok daha kısa s38 (154 satır) ve s48 (389 satır) başarısız olmuştur — başarısızlık uzunluktan çok hedeflenen semantik boşluğa bağlıdır. PASS (n=40) ve FAIL (n=17) gruplarının LoC dağılımı Mann-Whitney U testiyle karşılaştırılmış, fark anl</w:t>
-      </w:r>
-      <w:r>
-        <w:t>amlı bulunmamıştır (U=287.0, p=0.359); veri seti genişletme aşamalarında (n=36→57 arası ara kontrollerde) p-değeri 0.076-0.359 arası dalgalanmıştır — küçük örneklemde p-değerinin istikrarsızlığının veriye dayalı bir göstergesi.</w:t>
+        <w:t>Şekil 3, 57 örneğin LoC'sini başarı durumuna göre gösterir: en uzun program (522 satır, s47) geçerken çok daha kı</w:t>
+      </w:r>
+      <w:r>
+        <w:t xml:space="preserve">sa s38 (154 satır) ve s48 (389 satır) başarısız olmuştur — başarısızlık uzunluktan çok hedeflenen semantik boşluğa bağlıdır. PASS (n=40) ve FAIL (n=17) gruplarının LoC dağılımı Mann-Whitney U testiyle karşılaştırılmış, fark anlamlı bulunmamıştır (U=287.0, </w:t>
+      </w:r>
+      <w:r>
+        <w:t>p=0.359); veri seti genişletme aşamalarında (n=36→57 arası ara kontrollerde) p-değeri 0.076-0.359 arası dalgalanmıştır — küçük örneklemde p-değerinin istikrarsızlığının veriye dayalı bir göstergesi.</w:t>
       </w:r>
     </w:p>
     <w:p>
@@ -3049,10 +3029,9 @@
           <w:noProof/>
           <w:lang w:val="tr-TR" w:eastAsia="tr-TR"/>
         </w:rPr>
-        <w:lastRenderedPageBreak/>
         <w:drawing>
           <wp:inline distT="0" distB="0" distL="0" distR="0">
-            <wp:extent cx="3063240" cy="1682370"/>
+            <wp:extent cx="2743200" cy="1506600"/>
             <wp:effectExtent l="0" t="0" r="0" b="0"/>
             <wp:docPr id="3" name="Picture 3"/>
             <wp:cNvGraphicFramePr>
@@ -3074,7 +3053,7 @@
                   <pic:spPr>
                     <a:xfrm>
                       <a:off x="0" y="0"/>
-                      <a:ext cx="3063240" cy="1682370"/>
+                      <a:ext cx="2743200" cy="1506600"/>
                     </a:xfrm>
                     <a:prstGeom prst="rect">
                       <a:avLst/>
@@ -3089,20 +3068,20 @@
     </w:p>
     <w:p>
       <w:pPr>
-        <w:spacing w:before="60" w:after="160"/>
+        <w:spacing w:before="40" w:after="80"/>
         <w:jc w:val="center"/>
       </w:pPr>
       <w:r>
         <w:rPr>
           <w:sz w:val="16"/>
         </w:rPr>
-        <w:t xml:space="preserve">Şekil 3. Kod uzunluğu </w:t>
+        <w:t xml:space="preserve">Şekil 3. Kod uzunluğu (LoC) ile başarı durumu ilişkisi </w:t>
       </w:r>
       <w:r>
         <w:rPr>
           <w:sz w:val="16"/>
         </w:rPr>
-        <w:t>(LoC) ile başarı durumu ilişkisi (n=57).</w:t>
+        <w:t>(n=57).</w:t>
       </w:r>
     </w:p>
     <w:p>
@@ -3110,10 +3089,11 @@
         <w:jc w:val="both"/>
       </w:pPr>
       <w:r>
-        <w:t>İlişkinin etki büyüklüğü rank-biserial korelasyon ile r=0.156'dır (küçük etki). Post-hoc/gözlemlenen güç (achieved power) yerine — bu, p-değerinin tekdüze bir dönüşümüdür ve bağımsız bilgi taşımaz [13] — önerilen du</w:t>
-      </w:r>
-      <w:r>
-        <w:t xml:space="preserve">yarlılık analizi uygulanmıştır: n(FAIL)=17, n(PASS)=40, α=0.05 ile %80 güçte saptanabilecek en küçük etki büyüklüğü, anlamlılığı ölçmek için kullanılan </w:t>
+        <w:lastRenderedPageBreak/>
+        <w:t>İlişkinin etki büyüklüğü rank-biserial korelasyon ile r=0.156'dır (küçük etki). Post-hoc güç yerine — bu p-değerinin tekdüze bir dönüşümüdür ve bağımsız bilgi taşımaz [13] — duyarlılık analizi uygulanmıştır: n(FAIL)=17, n(PASS)=40, α=0.05 ile %80 g</w:t>
+      </w:r>
+      <w:r>
+        <w:t xml:space="preserve">üçte saptanabilecek en küçük etki büyüklüğü, </w:t>
       </w:r>
       <w:r>
         <w:rPr>
@@ -3122,16 +3102,13 @@
         <w:t>aynı</w:t>
       </w:r>
       <w:r>
-        <w:t xml:space="preserve"> Mann-Whitney U istatistiğinden ampirik rank-biserial formülüyle (r=1-2U/(n1·n2)) hesaplandığında ra</w:t>
-      </w:r>
-      <w:r>
-        <w:t xml:space="preserve">nk-biserial |r|≈0.46'dır (U'nun bağ düzeltmeli standart sapması üzerinden). Gözlemlenen r=0.156 bu eşiğin belirgin altındadır — veri seti bu büyüklükte küçük-orta etkileri saptayacak güce sahip değildir; "anlamlı fark yoktur" sonucu kesin bir ilişkisizlik </w:t>
-      </w:r>
-      <w:r>
-        <w:t>kanıtı değil, düşük güçle tutarlı bir gözlem olarak okunmalıdır (§V-B). EA'nın kendisi için de bootstrap %95 güven aralığı hesaplanmıştır (Şekil 4): Round 1 debug %70.18 [%57.89, %82.46] — geniş aralık, n=57'nin tek bir nokta tahminine duyulan güveni sınır</w:t>
-      </w:r>
-      <w:r>
-        <w:t>ladığını doğrudan göstermektedir.</w:t>
+        <w:t xml:space="preserve"> Mann-Whitney U istatistiğinden rank-biserial formülüyle (r=1-2U/(n1·n2)) hesaplandığında |r|≈0.46'dır. Gözlemlenen r=0.156 bu eşiğin belirgin altındadır — veri seti bu büyüklükte küçük-orta etkileri saptaya</w:t>
+      </w:r>
+      <w:r>
+        <w:t>cak güce sahip değildir; "anlamlı fark yoktur" sonucu düşük güçle tutarlı bir gözlem olarak okunmalıdır (§V-B). EA için de bootstrap %95 güven aralığı hesaplanmıştır (Şekil 4): Round 1 debug %70.18 [%57.89, %82.46] — geniş aralık, n=57'nin tek nokta tahmin</w:t>
+      </w:r>
+      <w:r>
+        <w:t>ine duyulan güveni sınırladığını gösterir.</w:t>
       </w:r>
     </w:p>
     <w:p>
@@ -3145,7 +3122,7 @@
         </w:rPr>
         <w:drawing>
           <wp:inline distT="0" distB="0" distL="0" distR="0">
-            <wp:extent cx="3063240" cy="2053853"/>
+            <wp:extent cx="2743200" cy="1839272"/>
             <wp:effectExtent l="0" t="0" r="0" b="0"/>
             <wp:docPr id="4" name="Picture 4"/>
             <wp:cNvGraphicFramePr>
@@ -3167,7 +3144,7 @@
                   <pic:spPr>
                     <a:xfrm>
                       <a:off x="0" y="0"/>
-                      <a:ext cx="3063240" cy="2053853"/>
+                      <a:ext cx="2743200" cy="1839272"/>
                     </a:xfrm>
                     <a:prstGeom prst="rect">
                       <a:avLst/>
@@ -3182,7 +3159,7 @@
     </w:p>
     <w:p>
       <w:pPr>
-        <w:spacing w:before="60" w:after="160"/>
+        <w:spacing w:before="40" w:after="80"/>
         <w:jc w:val="center"/>
       </w:pPr>
       <w:r>
@@ -3197,10 +3174,10 @@
         <w:jc w:val="both"/>
       </w:pPr>
       <w:r>
-        <w:t>Kod uzunluğunun tek başına açıklayıcı olmaması, başka hangi kod özelliklerinin ayırt edici olabileceği sorusunu gündeme getirir. Tablo IV, PASS/FAIL gruplarının iş</w:t>
-      </w:r>
-      <w:r>
-        <w:t>aretçi, dinamik bellek ayırma (malloc/calloc) ve string-fonksiyonu kullanım oranlarını gösterir (ölçüm tanımları regex tabanlı ve tekrarlanabilirdir; ayrıntılar açık veri deposunda belgelenmiştir).</w:t>
+        <w:t>Kod uzunluğunun tek başına açıklayıcı olmaması, başka hangi kod özelliklerinin ayırt edici olabileceği sorusunu gündeme getirir. Tablo IV, PASS/FAIL grupl</w:t>
+      </w:r>
+      <w:r>
+        <w:t>arının işaretçi, dinamik bellek ayırma (malloc/calloc) ve string-fonksiyonu kullanım oranlarını gösterir (ölçüm tanımları regex tabanlı ve tekrarlanabilirdir; ayrıntılar açık veri deposunda belgelenmiştir).</w:t>
       </w:r>
     </w:p>
     <w:p>
@@ -3208,7 +3185,7 @@
         <w:sectPr>
           <w:type w:val="continuous"/>
           <w:pgSz w:w="11906" w:h="16838"/>
-          <w:pgMar w:top="1077" w:right="935" w:bottom="1247" w:left="935" w:header="720" w:footer="720" w:gutter="0"/>
+          <w:pgMar w:top="1077" w:right="935" w:bottom="1077" w:left="935" w:header="720" w:footer="720" w:gutter="0"/>
           <w:cols w:num="2" w:space="283"/>
           <w:docGrid w:linePitch="360"/>
         </w:sectPr>
@@ -3216,7 +3193,7 @@
     </w:p>
     <w:p>
       <w:pPr>
-        <w:spacing w:before="60" w:after="160"/>
+        <w:spacing w:before="40" w:after="80"/>
         <w:jc w:val="center"/>
       </w:pPr>
       <w:r>
@@ -3224,13 +3201,13 @@
           <w:sz w:val="16"/>
         </w:rPr>
         <w:lastRenderedPageBreak/>
-        <w:t>TABLO IV. PASS/FAIL GRUPLARINA G</w:t>
+        <w:t>TABLO IV. PASS/FAIL GRU</w:t>
       </w:r>
       <w:r>
         <w:rPr>
           <w:sz w:val="16"/>
         </w:rPr>
-        <w:t>ÖRE BETİMSEL KOD ÖZELLİKLERİ (n=57).</w:t>
+        <w:t>PLARINA GÖRE BETİMSEL KOD ÖZELLİKLERİ (n=57).</w:t>
       </w:r>
     </w:p>
     <w:tbl>
@@ -3248,6 +3225,7 @@
       </w:tblGrid>
       <w:tr>
         <w:trPr>
+          <w:cantSplit/>
           <w:tblHeader/>
           <w:jc w:val="center"/>
         </w:trPr>
@@ -3317,6 +3295,7 @@
       </w:tr>
       <w:tr>
         <w:trPr>
+          <w:cantSplit/>
           <w:jc w:val="center"/>
         </w:trPr>
         <w:tc>
@@ -3378,6 +3357,7 @@
       </w:tr>
       <w:tr>
         <w:trPr>
+          <w:cantSplit/>
           <w:jc w:val="center"/>
         </w:trPr>
         <w:tc>
@@ -3439,6 +3419,7 @@
       </w:tr>
       <w:tr>
         <w:trPr>
+          <w:cantSplit/>
           <w:jc w:val="center"/>
         </w:trPr>
         <w:tc>
@@ -3455,7 +3436,6 @@
               <w:rPr>
                 <w:sz w:val="18"/>
               </w:rPr>
-              <w:lastRenderedPageBreak/>
               <w:t>İşaretçi kullanımı</w:t>
             </w:r>
           </w:p>
@@ -3501,6 +3481,7 @@
       </w:tr>
       <w:tr>
         <w:trPr>
+          <w:cantSplit/>
           <w:jc w:val="center"/>
         </w:trPr>
         <w:tc>
@@ -3562,6 +3543,7 @@
       </w:tr>
       <w:tr>
         <w:trPr>
+          <w:cantSplit/>
           <w:jc w:val="center"/>
         </w:trPr>
         <w:tc>
@@ -3624,7 +3606,7 @@
     </w:tbl>
     <w:p>
       <w:pPr>
-        <w:spacing w:after="40"/>
+        <w:spacing w:after="0"/>
       </w:pPr>
     </w:p>
     <w:p>
@@ -3632,7 +3614,7 @@
         <w:sectPr>
           <w:type w:val="continuous"/>
           <w:pgSz w:w="11906" w:h="16838"/>
-          <w:pgMar w:top="1077" w:right="935" w:bottom="1247" w:left="935" w:header="720" w:footer="720" w:gutter="0"/>
+          <w:pgMar w:top="1077" w:right="935" w:bottom="1077" w:left="935" w:header="720" w:footer="720" w:gutter="0"/>
           <w:cols w:space="283"/>
           <w:docGrid w:linePitch="360"/>
         </w:sectPr>
@@ -3656,12 +3638,16 @@
         <w:t>.385) — güven aralığının 1.0'i içermesi ve genişliği, küçük örneklemin doğal bir sonucudur. Bu veri setinde küçük örneklem büyüklüğü nedeniyle aynı veriler üzerinde birden fazla çıkarımsal test (Mann-Whitney, Fisher, bootstrap GA) uygulanmıştır; bunlar keş</w:t>
       </w:r>
       <w:r>
-        <w:t>if amaçlı (exploratory) okunmalı ve bir çoklu-karşılaştırma düzeltmesiyle birlikte değerlendirilmelidir (ayrıntılı düzeltme kontrolü: §V-B).</w:t>
+        <w:t xml:space="preserve">if amaçlı (exploratory) okunmalı ve bir çoklu-karşılaştırma </w:t>
+      </w:r>
+      <w:r>
+        <w:lastRenderedPageBreak/>
+        <w:t>düzeltmesiyle birlikte değerlendirilmelidir (ayrıntılı düzeltme kontrolü: §V-B).</w:t>
       </w:r>
     </w:p>
     <w:p>
       <w:pPr>
-        <w:spacing w:before="120" w:after="40"/>
+        <w:spacing w:before="80" w:after="20"/>
       </w:pPr>
       <w:r>
         <w:rPr>
@@ -3679,20 +3665,17 @@
         <w:t>17 başarısızlık 9 kök nedene ayrıştırılmıştır (Şekil 5, Tablo V): 8 kategoride (A-D, F-I) Rust</w:t>
       </w:r>
       <w:r>
-        <w:t xml:space="preserve"> kodu sözdizimsel olarak geçerlidir ve model, kaynağın özgül bit-genişliği/işaretlilik/sarma/kontrol-akışı sözleşmesini korumak yerine hedef dilin idiyomatik varsayılanını seçmiştir. Tek istisna kategori E'dir: aynı türden bir birebir aktarım Rust'ın tip g</w:t>
-      </w:r>
-      <w:r>
-        <w:t xml:space="preserve">üvenliği tarafından derleme aşamasında </w:t>
+        <w:t xml:space="preserve"> kodu sözdizimsel olarak geçerlidir; model, kaynağın bit-genişliği/işaretlilik/sarma/kontrol-akışı sözleşmesini korumak yerine hedef dilin idiyomatik varsayılanını seçmiştir. Tek istisna kategori E'dir: aynı türden bir birebir aktarım Rust'ın tip güvenliği</w:t>
+      </w:r>
+      <w:r>
+        <w:t xml:space="preserve"> tarafından derleme aşamasında engellenmiştir — 17 başarısızlığın tek CE'si. Bu tanım ("derleyici uyarısı almadan geçme") tek katmanlıdır: 4'ü aslında gürültülü, kolay fark edilen bir çalışma zamanı paniğidir (RE); gerçek anlamda sessiz olanlar yalnızca 12</w:t>
+      </w:r>
+      <w:r>
+        <w:t xml:space="preserve"> FE'dir (%70.6) — derlenir, çöküp panik vermeden çalışır, </w:t>
       </w:r>
       <w:r>
         <w:lastRenderedPageBreak/>
-        <w:t xml:space="preserve">engellenmiştir — 17 başarısızlığın tek CE'si. Bu tanım ("derleyici uyarısı almadan geçme") teknik olarak savunulabilir olsa da tek katmanlıdır: 17 başarısızlığın 4'ü aslında çalışma zamanı panik'idir (RE) — gürültülü </w:t>
-      </w:r>
-      <w:r>
-        <w:t>ve kolayca fark edilen bir çökmedir; gerçek anlamda sessiz olanlar yalnızca 12 FE'dir (%70.6) — derlenir, çöküp panik vermeden çalışır, ama yanlış çıktı üretir. "Derleme aşamasında yakalanmamış" (%94.1) ve "çalışma zamanında da hiçbir sinyal üretmeden yanl</w:t>
-      </w:r>
-      <w:r>
-        <w:t>ış sonuç veren" (%70.6) biçiminde iki katmanlı bir çerçeveleme daha doğrudur.</w:t>
+        <w:t>ama yanlış çıktı üretir. Daha doğru çerçeveleme iki katmanlıdır: "derleme aşamasında yakalanmamış" (%94.1) ve "çalışma zamanında da sinyal vermeden yanlış sonuç veren" (%70.6).</w:t>
       </w:r>
     </w:p>
     <w:p>
@@ -3704,9 +3687,10 @@
           <w:noProof/>
           <w:lang w:val="tr-TR" w:eastAsia="tr-TR"/>
         </w:rPr>
+        <w:lastRenderedPageBreak/>
         <w:drawing>
           <wp:inline distT="0" distB="0" distL="0" distR="0">
-            <wp:extent cx="3063240" cy="1545598"/>
+            <wp:extent cx="2743200" cy="1384118"/>
             <wp:effectExtent l="0" t="0" r="0" b="0"/>
             <wp:docPr id="5" name="Picture 5"/>
             <wp:cNvGraphicFramePr>
@@ -3728,7 +3712,7 @@
                   <pic:spPr>
                     <a:xfrm>
                       <a:off x="0" y="0"/>
-                      <a:ext cx="3063240" cy="1545598"/>
+                      <a:ext cx="2743200" cy="1384118"/>
                     </a:xfrm>
                     <a:prstGeom prst="rect">
                       <a:avLst/>
@@ -3743,14 +3727,20 @@
     </w:p>
     <w:p>
       <w:pPr>
-        <w:spacing w:before="60" w:after="160"/>
+        <w:spacing w:before="40" w:after="80"/>
         <w:jc w:val="center"/>
       </w:pPr>
       <w:r>
         <w:rPr>
           <w:sz w:val="16"/>
         </w:rPr>
-        <w:t>Şekil 5. Başarısızlıkların kök-neden dağılımı (Round 1, s49-s53'ün bağımsız 2. örnekleri dahil).</w:t>
+        <w:t>Şekil 5. Başarısızl</w:t>
+      </w:r>
+      <w:r>
+        <w:rPr>
+          <w:sz w:val="16"/>
+        </w:rPr>
+        <w:t>ıkların kök-neden dağılımı (Round 1, s49-s53'ün bağımsız 2. örnekleri dahil).</w:t>
       </w:r>
     </w:p>
     <w:p>
@@ -3758,7 +3748,7 @@
         <w:sectPr>
           <w:type w:val="continuous"/>
           <w:pgSz w:w="11906" w:h="16838"/>
-          <w:pgMar w:top="1077" w:right="935" w:bottom="1247" w:left="935" w:header="720" w:footer="720" w:gutter="0"/>
+          <w:pgMar w:top="1077" w:right="935" w:bottom="1077" w:left="935" w:header="720" w:footer="720" w:gutter="0"/>
           <w:cols w:num="2" w:space="283"/>
           <w:docGrid w:linePitch="360"/>
         </w:sectPr>
@@ -3766,7 +3756,7 @@
     </w:p>
     <w:p>
       <w:pPr>
-        <w:spacing w:before="60" w:after="160"/>
+        <w:spacing w:before="40" w:after="80"/>
         <w:jc w:val="center"/>
       </w:pPr>
       <w:r>
@@ -3774,19 +3764,19 @@
           <w:sz w:val="16"/>
         </w:rPr>
         <w:lastRenderedPageBreak/>
-        <w:t>TABLO V. DOKUZ KÖK NEDEN VE TEMSİLİ ÖRNEKLER (s09,s14</w:t>
+        <w:t>TABLO V. DOKUZ KÖK NEDEN VE TEMSİLİ ÖRNEKLER (s09,s14,s20 vb. veri setinin özgün ilk turundandır; s49,s51,s52,s53 hakem ve danışman geri bildirimine yan</w:t>
       </w:r>
       <w:r>
         <w:rPr>
           <w:sz w:val="16"/>
         </w:rPr>
-        <w:t>,s20 vb. veri setinin özgün ilk turundandır; s49,s51,s52,s53 hakem ve danışman geri bildirimine yanıt olarak eklenen bağımsız 2. örneklerdir. † C ve F kategorilerinde "doğru" davranış referans platformun (Windows/LLP64) implementation-defined seçimine bağl</w:t>
+        <w:t>ıt olarak eklenen bağımsız 2. örneklerdir. † C ve F kategorilerinde "doğru" davranış referans platformun (Windows/LLP64) implementation-defined seçimine bağlıdır — bkz. §V-B. E kategorisinin ikinci örneği (s50) Round 1'de PASS olduğundan bir başarısızlık ö</w:t>
       </w:r>
       <w:r>
         <w:rPr>
           <w:sz w:val="16"/>
         </w:rPr>
-        <w:t>ıdır — bkz. §V-B. E kategorisinin ikinci örneği (s50) Round 1'de PASS olduğundan bir başarısızlık örneği olarak burada listelenmemiştir.)</w:t>
+        <w:t>rneği olarak burada listelenmemiştir.)</w:t>
       </w:r>
     </w:p>
     <w:tbl>
@@ -3805,6 +3795,7 @@
       </w:tblGrid>
       <w:tr>
         <w:trPr>
+          <w:cantSplit/>
           <w:tblHeader/>
           <w:jc w:val="center"/>
         </w:trPr>
@@ -3895,6 +3886,7 @@
       </w:tr>
       <w:tr>
         <w:trPr>
+          <w:cantSplit/>
           <w:jc w:val="center"/>
         </w:trPr>
         <w:tc>
@@ -3967,19 +3959,14 @@
               <w:rPr>
                 <w:sz w:val="18"/>
               </w:rPr>
-              <w:t>Mod-2ⁿ sarma → panik-eden varsayılan</w:t>
-            </w:r>
-            <w:r>
-              <w:rPr>
-                <w:sz w:val="18"/>
-              </w:rPr>
-              <w:t xml:space="preserve"> aritmetik</w:t>
+              <w:t>Mod-2ⁿ sarma → panik-eden varsayılan aritmetik</w:t>
             </w:r>
           </w:p>
         </w:tc>
       </w:tr>
       <w:tr>
         <w:trPr>
+          <w:cantSplit/>
           <w:jc w:val="center"/>
         </w:trPr>
         <w:tc>
@@ -4059,6 +4046,7 @@
       </w:tr>
       <w:tr>
         <w:trPr>
+          <w:cantSplit/>
           <w:jc w:val="center"/>
         </w:trPr>
         <w:tc>
@@ -4094,7 +4082,13 @@
               <w:rPr>
                 <w:sz w:val="18"/>
               </w:rPr>
-              <w:t>char işaretliliği†</w:t>
+              <w:t xml:space="preserve">char </w:t>
+            </w:r>
+            <w:r>
+              <w:rPr>
+                <w:sz w:val="18"/>
+              </w:rPr>
+              <w:t>işaretliliği†</w:t>
             </w:r>
           </w:p>
         </w:tc>
@@ -4138,6 +4132,7 @@
       </w:tr>
       <w:tr>
         <w:trPr>
+          <w:cantSplit/>
           <w:jc w:val="center"/>
         </w:trPr>
         <w:tc>
@@ -4217,6 +4212,7 @@
       </w:tr>
       <w:tr>
         <w:trPr>
+          <w:cantSplit/>
           <w:jc w:val="center"/>
         </w:trPr>
         <w:tc>
@@ -4252,13 +4248,7 @@
               <w:rPr>
                 <w:sz w:val="18"/>
               </w:rPr>
-              <w:t>Güvensiz</w:t>
-            </w:r>
-            <w:r>
-              <w:rPr>
-                <w:sz w:val="18"/>
-              </w:rPr>
-              <w:t xml:space="preserve"> global durum</w:t>
+              <w:t>Güvensiz global durum</w:t>
             </w:r>
           </w:p>
         </w:tc>
@@ -4302,6 +4292,7 @@
       </w:tr>
       <w:tr>
         <w:trPr>
+          <w:cantSplit/>
           <w:jc w:val="center"/>
         </w:trPr>
         <w:tc>
@@ -4337,7 +4328,13 @@
               <w:rPr>
                 <w:sz w:val="18"/>
               </w:rPr>
-              <w:t>Platform tamsayı genişliği†</w:t>
+              <w:t xml:space="preserve">Platform tamsayı </w:t>
+            </w:r>
+            <w:r>
+              <w:rPr>
+                <w:sz w:val="18"/>
+              </w:rPr>
+              <w:t>genişliği†</w:t>
             </w:r>
           </w:p>
         </w:tc>
@@ -4381,6 +4378,7 @@
       </w:tr>
       <w:tr>
         <w:trPr>
+          <w:cantSplit/>
           <w:jc w:val="center"/>
         </w:trPr>
         <w:tc>
@@ -4460,6 +4458,7 @@
       </w:tr>
       <w:tr>
         <w:trPr>
+          <w:cantSplit/>
           <w:jc w:val="center"/>
         </w:trPr>
         <w:tc>
@@ -4495,13 +4494,7 @@
               <w:rPr>
                 <w:sz w:val="18"/>
               </w:rPr>
-              <w:t xml:space="preserve">Switch </w:t>
-            </w:r>
-            <w:r>
-              <w:rPr>
-                <w:sz w:val="18"/>
-              </w:rPr>
-              <w:t>fallthrough</w:t>
+              <w:t>Switch fallthrough</w:t>
             </w:r>
           </w:p>
         </w:tc>
@@ -4545,6 +4538,7 @@
       </w:tr>
       <w:tr>
         <w:trPr>
+          <w:cantSplit/>
           <w:jc w:val="center"/>
         </w:trPr>
         <w:tc>
@@ -4625,7 +4619,7 @@
     </w:tbl>
     <w:p>
       <w:pPr>
-        <w:spacing w:after="40"/>
+        <w:spacing w:after="0"/>
       </w:pPr>
     </w:p>
     <w:p>
@@ -4633,7 +4627,7 @@
         <w:sectPr>
           <w:type w:val="continuous"/>
           <w:pgSz w:w="11906" w:h="16838"/>
-          <w:pgMar w:top="1077" w:right="935" w:bottom="1247" w:left="935" w:header="720" w:footer="720" w:gutter="0"/>
+          <w:pgMar w:top="1077" w:right="935" w:bottom="1077" w:left="935" w:header="720" w:footer="720" w:gutter="0"/>
           <w:cols w:space="283"/>
           <w:docGrid w:linePitch="360"/>
         </w:sectPr>
@@ -4645,36 +4639,25 @@
       </w:pPr>
       <w:r>
         <w:lastRenderedPageBreak/>
-        <w:t xml:space="preserve">Doğrulama iki farklı biçimde gerçekleşmiştir: (a) dört kategori (C, F, G, H) veri </w:t>
-      </w:r>
-      <w:r>
-        <w:t xml:space="preserve">setimiz içinde bağımsız olarak tasarlanmış, farklı bir kod deseni kullanan ikinci bir örnekle (s49, s51, s52, s53) yeniden sınanmış ve kök neden her dördünde de tekrarlanmıştır (§IV-F); (b) kategori D üç ayrı, birbirinden bağımsız kod tabanında (iki kendi </w:t>
-      </w:r>
-      <w:r>
-        <w:t xml:space="preserve">yazdığımız örnek + cJSON [8]) tekrarlanmış; kategori A ise veri </w:t>
-      </w:r>
-      <w:r>
-        <w:lastRenderedPageBreak/>
-        <w:t>setimizin kendi içinde iki örnekte (s09, s14) görülmüştür. Bu ikisi birlikte, boşlukların veri setine özgü bir tuhaflık değil sistematik C↔Rust farkları olduğunu gösterir.</w:t>
+        <w:t xml:space="preserve">Doğrulama iki biçimde gerçekleşmiştir: (a) dört kategori (C, F, G, H) farklı bir kod deseni kullanan ikinci bir örnekle (s49, s51, s52, s53) yeniden sınanmış, kök neden her dördünde </w:t>
+      </w:r>
+      <w:r>
+        <w:t>tekrarlanmıştır (§IV-F); (b) kategori D üç bağımsız kod tabanında (iki özgün örnek + cJSON [8]) tekrarlanmış, kategori A ise veri setinin kendi içinde iki örnekte (s09, s14) görülmüştür — boşlukların veri setine özgü değil sistematik C↔Rust farkları olduğu</w:t>
+      </w:r>
+      <w:r>
+        <w:t>nu gösterir.</w:t>
       </w:r>
     </w:p>
     <w:p>
       <w:pPr>
-        <w:spacing w:before="120" w:after="40"/>
+        <w:spacing w:before="80" w:after="20"/>
       </w:pPr>
       <w:r>
         <w:rPr>
           <w:b/>
           <w:i/>
         </w:rPr>
-        <w:t>D. Derleme Modu ve İ</w:t>
-      </w:r>
-      <w:r>
-        <w:rPr>
-          <w:b/>
-          <w:i/>
-        </w:rPr>
-        <w:t>yileştirme Döngüsünün Etkisi</w:t>
+        <w:t>D. Derleme Modu ve İyileştirme Döngüsünün Etkisi</w:t>
       </w:r>
     </w:p>
     <w:p>
@@ -4682,21 +4665,17 @@
         <w:jc w:val="both"/>
       </w:pPr>
       <w:r>
-        <w:t xml:space="preserve">Release modu EA'yı %70.18'den %73.68'e çıkarır; artışın tamamı iki RE örneğinin (s09, s14, unsigned taşma) sessizce sarmasından gelir — bir düzeltme değil, farklı </w:t>
+        <w:t xml:space="preserve">Release modu EA'yı %70.18'den %73.68'e çıkarır; artışın tamamı iki RE örneğinin (s09, s14, unsigned taşma) sessizce </w:t>
       </w:r>
       <w:r>
         <w:lastRenderedPageBreak/>
-        <w:t>yapılandırmada tesadüfen doğru sonuçtur; 12 FE'nin hiçbirini etk</w:t>
-      </w:r>
-      <w:r>
-        <w:t xml:space="preserve">ilemez. Round 2'de (zengin/oracle geri bildirim, yalnızca Claude üzerinde ölçülmüştür) EA %100'e ulaşır, ama bu bir üst sınırdır: Tablo VI, Round 1'de başarısız olan aynı 17 örneğin yeniden çevrilip 57 programlık tam veri </w:t>
-      </w:r>
-      <w:r>
-        <w:lastRenderedPageBreak/>
-        <w:t>setinin geri kalanıyla birlikte ye</w:t>
-      </w:r>
-      <w:r>
-        <w:t>niden değerlendirilmesiyle hesaplanan EA'yı gösterir — kısıtlı geri bildirim seviyelerinde doğruluğun %86.0'a (Seviye B) ve %71.9'a (Seviye C, yalnızca başarısız test sayısı) düştüğünü ortaya koyar.</w:t>
+        <w:t xml:space="preserve">sarmasından gelir — bir düzeltme değil, farklı yapılandırmada tesadüfen doğru </w:t>
+      </w:r>
+      <w:r>
+        <w:t>sonuçtur; 12 FE'nin hiçbirini etkilemez. Round 2'de (zengin/oracle geri bildirim, yalnızca Claude üzerinde ölçülmüştür) EA %100'e ulaşır, ama bu bir üst sınırdır: Tablo VI, Round 1'de başarısız olan aynı 17 örneğin yeniden çevrilip 57 programlık tam veri s</w:t>
+      </w:r>
+      <w:r>
+        <w:t>etinin geri kalanıyla birlikte yeniden değerlendirilmesiyle hesaplanan EA'yı gösterir — kısıtlı geri bildirim seviyelerinde doğruluğun %86.0'a (Seviye B) ve %71.9'a (Seviye C, yalnızca başarısız test sayısı) düştüğünü ortaya koyar.</w:t>
       </w:r>
     </w:p>
     <w:p>
@@ -4704,7 +4683,7 @@
         <w:sectPr>
           <w:type w:val="continuous"/>
           <w:pgSz w:w="11906" w:h="16838"/>
-          <w:pgMar w:top="1077" w:right="935" w:bottom="1247" w:left="935" w:header="720" w:footer="720" w:gutter="0"/>
+          <w:pgMar w:top="1077" w:right="935" w:bottom="1077" w:left="935" w:header="720" w:footer="720" w:gutter="0"/>
           <w:cols w:num="2" w:space="283"/>
           <w:docGrid w:linePitch="360"/>
         </w:sectPr>
@@ -4712,7 +4691,7 @@
     </w:p>
     <w:p>
       <w:pPr>
-        <w:spacing w:before="60" w:after="160"/>
+        <w:spacing w:before="40" w:after="80"/>
         <w:jc w:val="center"/>
       </w:pPr>
       <w:r>
@@ -4720,13 +4699,7 @@
           <w:sz w:val="16"/>
         </w:rPr>
         <w:lastRenderedPageBreak/>
-        <w:t>TABLO VI. ÜÇ GERİ BİLDİRİM SEVİ</w:t>
-      </w:r>
-      <w:r>
-        <w:rPr>
-          <w:sz w:val="16"/>
-        </w:rPr>
-        <w:t>YESİNİN KARŞILAŞTIRMASI, CLAUDE (n=57; yalnızca Round 1'de başarısız olan 17 örnek yeniden çevrilmiş, EA tüm 57 program üzerinden yeniden hesaplanmıştır).</w:t>
+        <w:t>TABLO VI. ÜÇ GERİ BİLDİRİM SEVİYESİNİN KARŞILAŞTIRMASI, CLAUDE (n=57; yalnızca Round 1'de başarısız olan 17 örnek yeniden çevrilmiş, EA tüm 57 program üzerinden yeniden hesaplanmıştır).</w:t>
       </w:r>
     </w:p>
     <w:tbl>
@@ -4744,6 +4717,7 @@
       </w:tblGrid>
       <w:tr>
         <w:trPr>
+          <w:cantSplit/>
           <w:tblHeader/>
           <w:jc w:val="center"/>
         </w:trPr>
@@ -4813,6 +4787,7 @@
       </w:tr>
       <w:tr>
         <w:trPr>
+          <w:cantSplit/>
           <w:jc w:val="center"/>
         </w:trPr>
         <w:tc>
@@ -4847,7 +4822,13 @@
               <w:rPr>
                 <w:sz w:val="18"/>
               </w:rPr>
-              <w:t>Tam derleyici/panik metni + beklenen/alınan farkı</w:t>
+              <w:t>Tam derleyici/panik metni + b</w:t>
+            </w:r>
+            <w:r>
+              <w:rPr>
+                <w:sz w:val="18"/>
+              </w:rPr>
+              <w:t>eklenen/alınan farkı</w:t>
             </w:r>
           </w:p>
         </w:tc>
@@ -4873,6 +4854,7 @@
       </w:tr>
       <w:tr>
         <w:trPr>
+          <w:cantSplit/>
           <w:jc w:val="center"/>
         </w:trPr>
         <w:tc>
@@ -4889,13 +4871,7 @@
               <w:rPr>
                 <w:sz w:val="18"/>
               </w:rPr>
-              <w:t xml:space="preserve">B </w:t>
-            </w:r>
-            <w:r>
-              <w:rPr>
-                <w:sz w:val="18"/>
-              </w:rPr>
-              <w:t>(CI-benzeri)</w:t>
+              <w:t>B (CI-benzeri)</w:t>
             </w:r>
           </w:p>
         </w:tc>
@@ -4939,6 +4915,7 @@
       </w:tr>
       <w:tr>
         <w:trPr>
+          <w:cantSplit/>
           <w:jc w:val="center"/>
         </w:trPr>
         <w:tc>
@@ -5000,7 +4977,7 @@
     </w:tbl>
     <w:p>
       <w:pPr>
-        <w:spacing w:after="40"/>
+        <w:spacing w:after="0"/>
       </w:pPr>
     </w:p>
     <w:p>
@@ -5008,7 +4985,7 @@
         <w:sectPr>
           <w:type w:val="continuous"/>
           <w:pgSz w:w="11906" w:h="16838"/>
-          <w:pgMar w:top="1077" w:right="935" w:bottom="1247" w:left="935" w:header="720" w:footer="720" w:gutter="0"/>
+          <w:pgMar w:top="1077" w:right="935" w:bottom="1077" w:left="935" w:header="720" w:footer="720" w:gutter="0"/>
           <w:cols w:space="283"/>
           <w:docGrid w:linePitch="360"/>
         </w:sectPr>
@@ -5016,7 +4993,7 @@
     </w:p>
     <w:p>
       <w:pPr>
-        <w:spacing w:before="120" w:after="40"/>
+        <w:spacing w:before="80" w:after="20"/>
       </w:pPr>
       <w:r>
         <w:rPr>
@@ -5035,13 +5012,17 @@
         <w:t>13 bağımsız gerçek dünya programının 11'i (%84.6) ilk seferde geçmiştir: Rosetta Code 7/7, BSD libc 2/3, musl/Redis/cJSON 2/3 (Claude). En uzun örnek (522 satır, s47) PASS olurken çok daha kısa s48 (389 satır) başarısız olması, uzunluk değil boşluğun belir</w:t>
       </w:r>
       <w:r>
-        <w:t>leyici olduğunu burada da doğrular. Bellek güvenliği tarafında, Claude'un ürettiği 74 farklı çeviriden (57 Round 1 + Round 2'de yeniden çevrilen 17 örnek; Round 2 yalnızca Round 1'de başarısız olan örnekleri kapsadığından geri kalan 40 "Round 2 dosyası" Ro</w:t>
-      </w:r>
-      <w:r>
-        <w:t>und 1'in birebir kopyasıdır) yalnızca 4'ü (%5.4) unsafe içerir: s37_bsd_getopt, s44_fib_memo_static, s46_musl_qsort ve s50_id_generator. Dördü de Round 1'de PASS olduğundan Round 2'de yeniden çevrilmemiştir. Kategori E, aynı model tarafından iki farklı biç</w:t>
-      </w:r>
-      <w:r>
-        <w:t xml:space="preserve">imde çözülmüştür: kategorinin ikinci örneği olan s50_id_generator'da model `unsafe` bloğunu doğru biçimde ekleyerek ilk seferde PASS olurken, ilk örnek olan s19_global_counter Round 2'de `unsafe` </w:t>
+        <w:t xml:space="preserve">leyici olduğunu burada da doğrular. Bellek güvenliği tarafında, Claude'un ürettiği 74 farklı çeviriden (57 Round 1 + Round 2'de yeniden </w:t>
+      </w:r>
+      <w:r>
+        <w:lastRenderedPageBreak/>
+        <w:t>çevrilen 17 örnek) yalnızca 4'ü (%5.4) unsafe içerir: s37_bsd_getopt, s44_fib_memo_static, s46_musl_qsort, s50_id_genera</w:t>
+      </w:r>
+      <w:r>
+        <w:t>tor — dördü de Round 1'de PASS olduğundan Round 2'de yeniden çevrilmemiştir. Kategori E aynı model tarafından iki farklı biçimde çözülmüştür: s50_id_generator'da `unsafe` bloğu doğru eklenerek ilk seferde PASS olunurken, s19_global_counter Round 2'de `unsa</w:t>
+      </w:r>
+      <w:r>
+        <w:t xml:space="preserve">fe` </w:t>
       </w:r>
       <w:r>
         <w:rPr>
@@ -5050,22 +5031,19 @@
         <w:t>kullanmadan</w:t>
       </w:r>
       <w:r>
-        <w:t xml:space="preserve"> düzeltilmiştir — model, global değiştirilebilir </w:t>
-      </w:r>
-      <w:r>
-        <w:t xml:space="preserve">sayaç yerine durumu fonksiyona `&amp;mut i32` parametresi olarak geçen (durum parametreleştirme) idiyomatik/güvenli bir tasarıma geçmiştir. Bu, Kategori E'nin `unsafe` gerektirmeden de </w:t>
+        <w:t xml:space="preserve"> (global sayaç yerine `&amp;mut i32` </w:t>
       </w:r>
       <w:r>
         <w:lastRenderedPageBreak/>
-        <w:t>çözülebildiğinin somut bir kanıtıdır. Ham işaretçi aritmetiğine yapısal ola</w:t>
-      </w:r>
-      <w:r>
-        <w:t>rak bağımlı heapsort (s39) ve Redis'in SDS string kütüphanesi (s47) bile tamamen güvenli, deyimsel Rust'a çevrilmiştir.</w:t>
+        <w:t>parametresi geçirilerek) düzeltilmiştir — Kategori E'nin `unsafe` gerektirmeden de çözülebildiğinin somut kanıtıdır. Ham işaretçi aritmetiğine bağımlı heapsort (s39) ve Redis'in SDS kütüphanesi (s47) bile tamamen güvenli, d</w:t>
+      </w:r>
+      <w:r>
+        <w:t>eyimsel Rust'a çevrilmiştir.</w:t>
       </w:r>
     </w:p>
     <w:p>
       <w:pPr>
-        <w:spacing w:before="120" w:after="40"/>
+        <w:spacing w:before="80" w:after="20"/>
       </w:pPr>
       <w:r>
         <w:rPr>
@@ -5080,10 +5058,7 @@
         <w:jc w:val="both"/>
       </w:pPr>
       <w:r>
-        <w:t>Gemini ile 57 örneğin tamamı üzerinde gerçek, otomatik ölçüm yapılmıştır: EA=%89.47 (51/57; 4 CE</w:t>
-      </w:r>
-      <w:r>
-        <w:t xml:space="preserve">, 2 FE, 0 RE) — ham sayı olarak Claude'dan (%70.18) yüksektir ve bu fark, iki model </w:t>
+        <w:t xml:space="preserve">Gemini ile 57 örneğin tamamı üzerinde gerçek, otomatik ölçüm yapılmıştır: EA=%89.47 (51/57; 4 CE, 2 FE, 0 RE), Claude'dan (%70.18) yüksektir; iki model </w:t>
       </w:r>
       <w:r>
         <w:rPr>
@@ -5092,16 +5067,20 @@
         <w:t>aynı</w:t>
       </w:r>
       <w:r>
-        <w:t xml:space="preserve"> 57 program üzerinde ölçüldüğü için eşleştirilmiş (paired) bir tasarıma uygun McNemar testiyle sınandığında istatistiksel olarak anlamlıdır (yalnızca Claude'un başarısı</w:t>
-      </w:r>
-      <w:r>
-        <w:t>z olduğu 14 örnek vs. yalnızca Gemini'nin başarısız olduğu 3 örnek; McNemar kesin iki-yönlü p=0.013). Ancak Tablo VII'deki kategori-bazlı kırılım, bu genel farkın tekdüze değil kategoriye özgü olduğunu ve yön değiştirebildiğini gösterir — genel anlamlılık,</w:t>
-      </w:r>
-      <w:r>
-        <w:t xml:space="preserve"> model×kategori etkileşiminin yokluğu anlamına gelmez. Ayrıca Gemini'nin 6 başarısızlığının 4'ü (s26, s46, s48'in yanı sıra s27) CE'dir, yani derleyici tarafından yakalanmıştır — Claude'da gözlenen "başarısızlıkların çoğu sessizdir" örüntüsü Gemini için ay</w:t>
-      </w:r>
-      <w:r>
-        <w:t>nı güçte geçerli değildir; sessiz hata oranı modele göre değişir.</w:t>
+        <w:t xml:space="preserve"> 57 program üzerinde ölçüldüğü </w:t>
+      </w:r>
+      <w:r>
+        <w:t xml:space="preserve">için eşleştirilmiş McNemar testiyle </w:t>
+      </w:r>
+      <w:r>
+        <w:lastRenderedPageBreak/>
+        <w:t>sınandığında fark anlamlıdır (yalnızca Claude'un başarısız olduğu 14 vs. yalnızca Gemini'nin başarısız olduğu 3 örnek; p=0.013). Ancak Tablo VII'deki kategori-bazlı kırılım bu genel farkın kategoriye özgü olduğunu ve yön</w:t>
+      </w:r>
+      <w:r>
+        <w:t xml:space="preserve"> değiştirebildiğini gösterir. Ayrıca Gemini'nin 6 başarısızlığının 4'ü (s26, s27, s46, s48) CE'dir, yani derleyici tarafından yakalanmıştır — Claude'da gözlenen "çoğu sessizdir" örüntüsü Gemini için aynı güçte geçerli değildir; sessiz hata oranı modele gör</w:t>
+      </w:r>
+      <w:r>
+        <w:t>e değişir.</w:t>
       </w:r>
     </w:p>
     <w:p>
@@ -5109,7 +5088,7 @@
         <w:sectPr>
           <w:type w:val="continuous"/>
           <w:pgSz w:w="11906" w:h="16838"/>
-          <w:pgMar w:top="1077" w:right="935" w:bottom="1247" w:left="935" w:header="720" w:footer="720" w:gutter="0"/>
+          <w:pgMar w:top="1077" w:right="935" w:bottom="1077" w:left="935" w:header="720" w:footer="720" w:gutter="0"/>
           <w:cols w:num="2" w:space="283"/>
           <w:docGrid w:linePitch="360"/>
         </w:sectPr>
@@ -5117,7 +5096,7 @@
     </w:p>
     <w:p>
       <w:pPr>
-        <w:spacing w:before="60" w:after="160"/>
+        <w:spacing w:before="40" w:after="80"/>
         <w:jc w:val="center"/>
       </w:pPr>
       <w:r>
@@ -5143,6 +5122,7 @@
       </w:tblGrid>
       <w:tr>
         <w:trPr>
+          <w:cantSplit/>
           <w:tblHeader/>
           <w:jc w:val="center"/>
         </w:trPr>
@@ -5212,6 +5192,7 @@
       </w:tr>
       <w:tr>
         <w:trPr>
+          <w:cantSplit/>
           <w:jc w:val="center"/>
         </w:trPr>
         <w:tc>
@@ -5273,6 +5254,7 @@
       </w:tr>
       <w:tr>
         <w:trPr>
+          <w:cantSplit/>
           <w:jc w:val="center"/>
         </w:trPr>
         <w:tc>
@@ -5334,6 +5316,7 @@
       </w:tr>
       <w:tr>
         <w:trPr>
+          <w:cantSplit/>
           <w:jc w:val="center"/>
         </w:trPr>
         <w:tc>
@@ -5395,6 +5378,7 @@
       </w:tr>
       <w:tr>
         <w:trPr>
+          <w:cantSplit/>
           <w:jc w:val="center"/>
         </w:trPr>
         <w:tc>
@@ -5456,6 +5440,7 @@
       </w:tr>
       <w:tr>
         <w:trPr>
+          <w:cantSplit/>
           <w:jc w:val="center"/>
         </w:trPr>
         <w:tc>
@@ -5517,6 +5502,7 @@
       </w:tr>
       <w:tr>
         <w:trPr>
+          <w:cantSplit/>
           <w:jc w:val="center"/>
         </w:trPr>
         <w:tc>
@@ -5578,6 +5564,7 @@
       </w:tr>
       <w:tr>
         <w:trPr>
+          <w:cantSplit/>
           <w:jc w:val="center"/>
         </w:trPr>
         <w:tc>
@@ -5639,6 +5626,7 @@
       </w:tr>
       <w:tr>
         <w:trPr>
+          <w:cantSplit/>
           <w:jc w:val="center"/>
         </w:trPr>
         <w:tc>
@@ -5700,6 +5688,7 @@
       </w:tr>
       <w:tr>
         <w:trPr>
+          <w:cantSplit/>
           <w:jc w:val="center"/>
         </w:trPr>
         <w:tc>
@@ -5762,7 +5751,7 @@
     </w:tbl>
     <w:p>
       <w:pPr>
-        <w:spacing w:after="40"/>
+        <w:spacing w:after="0"/>
       </w:pPr>
     </w:p>
     <w:p>
@@ -5770,7 +5759,7 @@
         <w:sectPr>
           <w:type w:val="continuous"/>
           <w:pgSz w:w="11906" w:h="16838"/>
-          <w:pgMar w:top="1077" w:right="935" w:bottom="1247" w:left="935" w:header="720" w:footer="720" w:gutter="0"/>
+          <w:pgMar w:top="1077" w:right="935" w:bottom="1077" w:left="935" w:header="720" w:footer="720" w:gutter="0"/>
           <w:cols w:space="283"/>
           <w:docGrid w:linePitch="360"/>
         </w:sectPr>
@@ -5782,33 +5771,19 @@
       </w:pPr>
       <w:r>
         <w:lastRenderedPageBreak/>
-        <w:t xml:space="preserve">Üç örüntü dikkat çekicidir. </w:t>
-      </w:r>
-      <w:r>
-        <w:t>Birincisi, "kök-neden 2. örnek" grubunda (s49-s53 — Claude'un Round 1'de yalnızca birer örnekle temsil edilen C, E, F, G, H kategorilerinde bağımsız ikinci bir kez sınandığı örnekler) Claude bu beş örneğin dördünde aynı kök nedeni tekrarlamış, yalnızca bir</w:t>
-      </w:r>
-      <w:r>
-        <w:t xml:space="preserve">inde geçmiştir (1/5). Bu, ilk başarısızlıkların tesadüfi değil </w:t>
-      </w:r>
-      <w:r>
-        <w:lastRenderedPageBreak/>
-        <w:t xml:space="preserve">sistematik bir model-özgü kör nokta olduğunun doğrudan kanıtıdır. Gemini ise aynı 5 örneğin tamamında (5/5) farklı deyimsel tercihlerle (ör. wrapping_mul, AtomicI32, imzalı döngü değişkeni) bu </w:t>
-      </w:r>
-      <w:r>
-        <w:t xml:space="preserve">kategorileri sistemli biçimde atlatmıştır. İkincisi, tam tersi yönde: en uzun/karmaşık üç gerçek üretim kodu örneğinde (musl qsort, Redis SDS, </w:t>
-      </w:r>
-      <w:r>
-        <w:lastRenderedPageBreak/>
-        <w:t>cJSON — 262-522 satır) Claude 2/3 geçerken Gemini 0/3 geçmiştir; ikisi derleme hatası (borrow-checker benzeri söz</w:t>
-      </w:r>
-      <w:r>
-        <w:t>dizimi hataları), biri işlevsel hatadır. Üçüncüsü, Claude'un Round 1'deki tek makro-kaynaklı başarısızlığı (s56, kategori I — makro çoklu-değerlendirmesi) Gemini tarafından ilk seferde doğru çevrilmiştir (1/1). Tek örneklik bu kategori için Gemini'nin daha</w:t>
-      </w:r>
-      <w:r>
-        <w:t xml:space="preserve"> dayanıklı olduğuna dair ek, ama küçük bir kanıt vardır. Bu üç bulgu birlikte, "bir model diğerinden genel olarak daha iyidir" iddiasının yanlış çerçeveleme olduğunu gösterir; asıl belirleyici model×kod-kategorisi etkileşimidir. Kısa, iyi tanımlanmış sızın</w:t>
-      </w:r>
-      <w:r>
-        <w:t>tı kategorilerinde Gemini daha dayanıklı, uzun/karmaşık gerçek üretim kodunda ise Claude daha dayanıklıdır.</w:t>
+        <w:t xml:space="preserve">Üç örüntü dikkat çekicidir. Birincisi, "kök-neden 2. örnek" grubunda (s49-s53 — C, </w:t>
+      </w:r>
+      <w:r>
+        <w:t>E, F, G, H kategorilerinin Claude'un Round 1'de yalnızca birer örnekle temsil ettiği kategorilerde bağımsız ikinci sınama) Claude bu beş örneğin dördünde aynı kök nedeni tekrarlamış, yalnızca birinde geçmiştir (1/5) — sistematik bir model-özgü kör nokta ka</w:t>
+      </w:r>
+      <w:r>
+        <w:t xml:space="preserve">nıtıdır. Gemini ise tamamında (5/5) farklı deyimsel tercihlerle (ör. wrapping_mul, AtomicI32) bu kategorileri sistemli biçimde atlatmıştır. İkincisi, tam tersi yönde: en uzun/karmaşık üç gerçek üretim kodu örneğinde (musl qsort, Redis SDS, cJSON — 262-522 </w:t>
+      </w:r>
+      <w:r>
+        <w:t>satır) Claude 2/3 geçerken Gemini 0/3 geçmiştir. Üçüncüsü, Claude'un Round 1'deki tek makro-kaynaklı başarısızlığı (s56, kategori I) Gemini tarafından ilk seferde doğru çevrilmiştir (1/1) — küçük ama ek bir kanıt. Bu üç bulgu birlikte, "bir model diğerinde</w:t>
+      </w:r>
+      <w:r>
+        <w:t>n genel olarak daha iyidir" iddiasının yanlış çerçeveleme olduğunu gösterir; asıl belirleyici model×kod-kategorisi etkileşimidir — kısa sızıntı kategorilerinde Gemini, uzun/karmaşık üretim kodunda Claude daha dayanıklıdır.</w:t>
       </w:r>
     </w:p>
     <w:p>
@@ -5816,22 +5791,23 @@
         <w:jc w:val="both"/>
       </w:pPr>
       <w:r>
-        <w:t xml:space="preserve">Gemini'nin Claude'da hiç görülmeyen (yani Claude'un PASS olduğu) üç başarısızlığı vardır. İkisi (s46_musl_qsort, s47_redis_sds) yukarıda anılan </w:t>
-      </w:r>
-      <w:r>
-        <w:t>gerçek üretim kodu üçlüsüne aittir: s46'da Gemini geçersiz bir işaretçi söz dizimi (`*mut u8::null()`, Rust'ta böyle bir ifade yoktur) üretmiş; s47'de ise ekleme işleminin büyüme mantığını yanlış uygulayıp beklenen `LEN=5 STR=start...` yerine boş bir sonuç</w:t>
-      </w:r>
-      <w:r>
-        <w:t xml:space="preserve"> (`LEN=0`) döndürmüştür — Claude'un aynı iki örneği ilk seferde, hiç `unsafe` kullanmadan doğru çevirdiği hatırlanmalıdır (§IV-E). Üçüncüsü (s26_rpn_calculator) kısa, özgün bir programda ortaya çıkar ve kod karmaşıklığıyla değil tamamen farklı bir hata sın</w:t>
-      </w:r>
-      <w:r>
-        <w:t>ıfıyla ilgilidir: modelin ürettiği kod, bir yığın (stack) işaretçisini iki ayrı `FnMut` kapanışının (closure) aynı anda değiştirilebilir biçimde yakalamasından kaynaklanan bir ödünç denetleyicisi (borrow checker) hatası (E0499) içerir. Claude'un aynı algor</w:t>
-      </w:r>
-      <w:r>
-        <w:t>itmayı çevirirken kapanış kullanmayan farklı bir kontrol akışı seçmesi nedeniyle bu hataya hiç maruz kalmamıştır. Bu üç başarısızlığın ikisi derleme hatası (s46, s26), biri fonksiyonel hatadır (s47); kökene bakıldığında ise ikisi (s46, s47) kod karmaşıklığ</w:t>
-      </w:r>
-      <w:r>
-        <w:t>ına, biri (s26) modelin kendi hata profiline bağlıdır. Bu, "tek bir kök neden taksonomisinin tüm modellere aynı biçimde uygulanamayabileceğini" gösterir.</w:t>
+        <w:t>Gemini'nin Claude'da hiç görülmey</w:t>
+      </w:r>
+      <w:r>
+        <w:t>en üç başarısızlığı vardır. İkisi (s46_musl_qsort, s47_redis_sds) yukarıdaki üretim kodu üçlüsüne aittir: s46'da Gemini geçersiz bir işaretçi söz dizimi (`*mut u8::null()`) üretmiş; s47'de ekleme işleminin büyüme mantığını yanlış uygulayıp `LEN=0` döndürmü</w:t>
+      </w:r>
+      <w:r>
+        <w:t>ştür — Claude'un aynı iki örneği hiç `unsafe` kullanmadan doğru çevirdiği hatırlanmalıdır (§IV-E). Üçüncüsü (s26_rpn_calculator) tamamen farklı bir hata sınıfıyla ilgilidir: model bir ödünç denetleyicisi hatası (E0499, iki `FnMut` kapanışının aynı yığın iş</w:t>
+      </w:r>
+      <w:r>
+        <w:t>aretçisini yakalaması) üretmiş; Claude farklı bir kontrol akışı seçtiğinden bu hataya hiç maruz kalmamıştır. Bu üçünün ikisi derleme hatası (s46, s26), biri fonksiyonel hatadır (s47); ikisi (s46, s47) kod karmaşıklığına, biri (s26) modelin kendi hata profi</w:t>
+      </w:r>
+      <w:r>
+        <w:t xml:space="preserve">line </w:t>
+      </w:r>
+      <w:r>
+        <w:lastRenderedPageBreak/>
+        <w:t>bağlıdır — tek bir kök-neden taksonomisinin tüm modellere aynı biçimde uygulanamayabileceğini gösterir.</w:t>
       </w:r>
     </w:p>
     <w:p>
@@ -5839,16 +5815,13 @@
         <w:jc w:val="both"/>
       </w:pPr>
       <w:r>
-        <w:t xml:space="preserve">Her iki modelin de başarısız olduğu üç örnek de vardır: s15 (kategori D, çıktı biçimlendirme) her iki </w:t>
-      </w:r>
-      <w:r>
-        <w:t>modelde de aynı kök nedenden görülmüştür; s27_csv_stats ve s48_cjson_number'da ise her iki model de başarısız olmuş ama farklı türde — Claude'da derlenen fakat yanlış sonuç veren bir kod (FE), Gemini'de ise derleme aşamasında takılan geçersiz bir söz dizim</w:t>
-      </w:r>
-      <w:r>
-        <w:t xml:space="preserve">i (CE, s27'de `{:+=03}` biçim belirteci, s48'de işaretçi bildirimi çevresinde sözdizimi hatası). Kategori D'nin üç bağımsız kod tabanının (s15, s27, s48) üçünde de iki modelin de başarısız olması, bu boşluğun modele özgü olmadığını, genel bir C↔Rust geçiş </w:t>
-      </w:r>
-      <w:r>
-        <w:t>sorunu olduğunu doğrular. Çok dosyalı/eşzamanlı yapıda (s54, s55, s57) her iki model de üçünde de ilk seferde başarılıdır — bu alt kümede (n=3) model farkı gözlenmemiştir.</w:t>
+        <w:t xml:space="preserve">Her iki modelin de başarısız olduğu üç örnek vardır: s15 (kategori D) aynı kök nedenden; s27_csv_stats ve s48_cjson_number'da ise farklı türde — </w:t>
+      </w:r>
+      <w:r>
+        <w:t>Claude'da derlenen ama yanlış sonuç veren kod (FE), Gemini'de derleme aşamasında takılan geçersiz söz dizimi (CE: s27'de `{:+=03}` biçim belirteci, s48'de işaretçi bildirimi hatası). Kategori D'nin üç bağımsız kod tabanının (s15, s27, s48) üçünde de başarı</w:t>
+      </w:r>
+      <w:r>
+        <w:t>sızlık, bu boşluğun modele özgü olmadığını doğrular. Çok dosyalı/eşzamanlı yapıda (s54, s55, s57) her iki model de ilk seferde başarılıdır — bu alt kümede (n=3) model farkı gözlenmemiştir.</w:t>
       </w:r>
     </w:p>
     <w:p>
@@ -5856,31 +5829,24 @@
         <w:jc w:val="both"/>
       </w:pPr>
       <w:r>
-        <w:t>Son olarak, deney gerçek bir Linux/LP64 ortamında (Docker) bir tekrar (55/57) ile de</w:t>
-      </w:r>
-      <w:r>
-        <w:t xml:space="preserve"> genişletilmiştir — bu tekrar, veri seti 55 örnekken (s56 ve s57 eklenmeden önce) yapılmış ve sonradan güncellenmemiştir, bu yüzden n=55 üzerindendir. Bu, en önemli ek bulguyu vermiştir: Windows'ta ölçülen %100 Round-2 doğruluğu Linux'ta %94.55'e (52/55) d</w:t>
-      </w:r>
-      <w:r>
-        <w:t xml:space="preserve">üşmüştür, ÜÇ örnekte farklı sonuç gözlenmiştir: s38 ve s51 için Round 2'de yazılan düzeltmeler 32-bit `long` varsayımına dayanıyordu ve Linux'un 64-bit `long`'unda geçersiz hale geldi (bir platformda doğrulanmış bir düzeltme başka platformda </w:t>
-      </w:r>
-      <w:r>
-        <w:lastRenderedPageBreak/>
-        <w:t>geçersiz olabi</w:t>
-      </w:r>
-      <w:r>
-        <w:t>lir); s47_redis_sds'te ise neden tamamen farklıdır ve Rust çevirisiyle ilgili değildir — bir test girdisi (05.txt) CRLF satır sonu içermektedir ve Windows'un C çalışma zamanı stdin'i metin modunda açıp \r\n'i otomatik olarak \n'e çevirirken, Linux/glibc bu</w:t>
-      </w:r>
-      <w:r>
-        <w:t xml:space="preserve"> dönüşümü yapmaz; bu da C referans programının kendisinin (Rust çevirisinin değil) iki platformda farklı sayıda komut tükettiği anlamına gelir. Yani "hata geri bildirimiyle düzeltilmiş bir çeviri evrensel doğrudur" varsayımı yanlış olabileceği gibi, refera</w:t>
-      </w:r>
-      <w:r>
-        <w:t>ns C programının kendisi de platformlar arası tam taşınabilir olmayabilir.</w:t>
+        <w:t>Son olarak, deney gerçek bir Linux/LP64 ortamında (Docker) bir tekr</w:t>
+      </w:r>
+      <w:r>
+        <w:t>ar ile de genişletilmiştir (52/55 PASS; veri seti 55 örnekken — s56/s57 eklenmeden önce — yapıldığından n=55 üzerindendir). Bu, en önemli ek bulguyu vermiştir: Windows'ta ölçülen %100 Round-2 doğruluğu Linux'ta %94.55'e (52/55) düşmüştür. Üç örnekte farklı</w:t>
+      </w:r>
+      <w:r>
+        <w:t xml:space="preserve"> sonuç gözlenmiştir: s38 ve s51'in Round 2 düzeltmeleri 32-bit `long` varsayımına dayandığından Linux'un 64-bit `long`'unda geçersiz kalmıştır (bir platformda doğrulanmış bir düzeltme başka platformda geçersiz olabilir); s47_redis_sds'teki neden ise Rust ç</w:t>
+      </w:r>
+      <w:r>
+        <w:t>evirisiyle ilgili değildir — bir test girdisi (05.txt) CRLF içerir ve Windows'un C çalışma zamanı bunu \r\n→\n'e çevirirken Linux/glibc çevirmez, yani C referans programının kendisi (Rust çevirisi değil) iki platformda farklı sayıda komut tüketir. Yani hem</w:t>
+      </w:r>
+      <w:r>
+        <w:t xml:space="preserve"> "düzeltilmiş bir çeviri evrensel doğrudur" varsayımı hem de referans C programının platformlar arası tam taşınabilirliği yanlış olabilir.</w:t>
       </w:r>
     </w:p>
     <w:p>
       <w:pPr>
-        <w:spacing w:before="200" w:after="80"/>
+        <w:spacing w:before="120"/>
         <w:jc w:val="center"/>
       </w:pPr>
       <w:r>
@@ -5892,7 +5858,7 @@
     </w:p>
     <w:p>
       <w:pPr>
-        <w:spacing w:before="120" w:after="40"/>
+        <w:spacing w:before="80" w:after="20"/>
       </w:pPr>
       <w:r>
         <w:rPr>
@@ -5907,27 +5873,25 @@
         <w:jc w:val="both"/>
       </w:pPr>
       <w:r>
-        <w:t>Bu çalışmanın merkezi bulgusu, incelenen modellerin (Claude, Gemini) ürettiği C→Rust çevirilerinde asıl riskin sözdizimsel değil s</w:t>
-      </w:r>
-      <w:r>
-        <w:t xml:space="preserve">essiz semantik hatalar olduğudur; Claude'da 17 başarısızlığın 16'sı derleyiciden hiç uyarı almadan geçmiştir. İkinci gözlem, derleme yapılandırmasının (debug/release) ve dağıtım platformunun (Windows/Linux) gizli birer değişken olduğudur — aynı kod farklı </w:t>
-      </w:r>
-      <w:r>
-        <w:t>yapılandırmada farklı sonuç verebilir. Üçüncü, bu çalışmaya özgü en yeni gözlem: iki bağımsız modelin karşılaştırması, "model A, model B'den genel olarak daha iyidir" biçiminde tek boyutlu bir sıralamanın yanıltıcı olduğunu gösterir (genel EA farkı McNemar</w:t>
-      </w:r>
-      <w:r>
-        <w:t xml:space="preserve"> testiyle anlamlı olsa da, p=0.013, §IV-F). Gemini kısa, hedeflenmiş sızıntı kategorilerinde (kök-neden 2. örnekler, 5/5) Claude'dan (1/5) belirgin biçimde daha dayanıklıyken, uzun/karmaşık gerçek üretim kodunda (0/3) Claude'dan (2/3) belirgin biçimde daha</w:t>
-      </w:r>
-      <w:r>
-        <w:t xml:space="preserve"> kırılgandır. Bu, model seçiminin kod tabanının niteliğine (kısa/izole algoritma mı, uzun/karmaşık üretim kodu mu) göre yapılması gerektiğini düşündürür. Dördüncü gözlem: kod uzunluğu ile başarı arasında istatistiksel olarak anlamlı bir ilişki bulunmamıştı</w:t>
-      </w:r>
-      <w:r>
-        <w:t>r (p=0.359) — semantik karmaşıklık, ham uzunluktan daha belirleyici görünmektedir.</w:t>
+        <w:lastRenderedPageBreak/>
+        <w:t>Bu çalışmanın merkezi bulgusu, incelenen modellerin (Claude, Gemin</w:t>
+      </w:r>
+      <w:r>
+        <w:t xml:space="preserve">i) ürettiği C→Rust çevirilerinde asıl riskin sözdizimsel değil sessiz semantik hatalar olduğudur; Claude'da 17 başarısızlığın 16'sı derleyiciden hiç uyarı almadan geçmiştir. İkinci gözlem: derleme yapılandırması (debug/release) ve platform (Windows/Linux) </w:t>
+      </w:r>
+      <w:r>
+        <w:t>gizli birer değişkendir — aynı kod farklı yapılandırmada farklı sonuç verebilir. Üçüncü, en yeni gözlem: iki bağımsız modelin karşılaştırması "model A, B'den genel olarak daha iyidir" biçiminde tek boyutlu bir sıralamanın yanıltıcı olduğunu gösterir (genel</w:t>
+      </w:r>
+      <w:r>
+        <w:t xml:space="preserve"> EA farkı anlamlı olsa da, p=0.013, §IV-F) — Gemini kısa hedeflenmiş kategorilerde (5/5) Claude'dan (1/5) daha dayanıklı, uzun/karmaşık üretim kodunda (0/3) Claude'dan (2/3) daha kırılgandır; model seçimi kod tabanının niteliğine göre yapılmalıdır. Dördünc</w:t>
+      </w:r>
+      <w:r>
+        <w:t>ü gözlem: kod uzunluğu ile başarı arasında anlamlı bir ilişki bulunmamıştır (p=0.359) — semantik karmaşıklık, ham uzunluktan daha belirleyicidir.</w:t>
       </w:r>
     </w:p>
     <w:p>
       <w:pPr>
-        <w:spacing w:before="120" w:after="40"/>
+        <w:spacing w:before="80" w:after="20"/>
       </w:pPr>
       <w:r>
         <w:rPr>
@@ -5942,55 +5906,33 @@
         <w:jc w:val="both"/>
       </w:pPr>
       <w:r>
-        <w:t xml:space="preserve">İç geçerlilik: test girdileri elle seçilmiş, ancak referans çıktılar C programı çalıştırılarak otomatik üretilmiştir. Girdi kümesinin sınır durumları (taşma </w:t>
-      </w:r>
-      <w:r>
-        <w:t>sınırları, boş girdi, çok baytlı UTF-8) ne ölçüde kapsadığına dair sistematik bir kapsam (coverage) ölçümü (ör. gcov satır/dal kapsaması) yapılmamıştır. Bu, özellikle 522 satırlık s47_redis_sds gibi uzun örneklerde yalnızca 4-5 test girdisiyle "PASS" denme</w:t>
-      </w:r>
-      <w:r>
-        <w:t>sinin davranışsal eşdeğerlik için ne kadar güçlü bir kanıt olduğunu sınırlar. C referansı her koşulda `-O2` ile derlenirken Rust tarafı debug/release olarak ikiye ayrılmıştır; bu asimetri bilinçli bir tasarım kararıdır (amaç C'nin değil Rust'ın taşma davra</w:t>
-      </w:r>
-      <w:r>
-        <w:t>nışının etkisini izole etmektir), ama C tarafının farklı optimizasyon seviyelerinde tekrarlanması ayrı bir sağlamlık kontrolü olurdu. Örnekleme protokolü: her örnek her model tarafından yalnızca bir kez (k=1) çevrilmiştir; LLM çıktısının stokastik doğası n</w:t>
-      </w:r>
-      <w:r>
-        <w:t>edeniyle tekrar sayısı k=3-5 olsaydı pass@1/pass@k ile daha güvenilir bir tahmin elde edilebilirdi. Bu, çalışmanın tek-örneklemli tasarımının en önemli metodolojik sınırlamasıdır. İstatistiksel geçerlilik: FAIL grubu küçüktür (n=17); duyarlılık analizi (§I</w:t>
-      </w:r>
-      <w:r>
-        <w:t xml:space="preserve">V-B), bu n ile %80 güçte yalnızca orta-büyük etkilerin (|r|≳0.46) saptanabileceğini göstermiştir. Aynı küçük veri seti üzerinde üç çıkarımsal test </w:t>
-      </w:r>
-      <w:r>
-        <w:lastRenderedPageBreak/>
-        <w:t>uygulanmıştır (Mann-Whitney, Fisher, McNemar); bunlar keşif amaçlı (exploratory) okunmalı, doğrulayıcı (confi</w:t>
-      </w:r>
-      <w:r>
-        <w:t>rmatory) bulgular olarak yorumlanmamalıdır. Tamamlayıcı bir kontrol olarak Bonferroni düzeltmesi bu üçüne uygulandığında (α=0.05/3≈0.0167), yalnızca McNemar testi (p=0.013) anlamlılığını korumaktadır — Mann-Whitney (p=0.359) ve Fisher (p=0.385) zaten düzel</w:t>
-      </w:r>
-      <w:r>
-        <w:t>tmesiz haliyle de anlamlı değildir; dolayısıyla düzeltme, çalışmanın yorumunu değiştirmez. Dış geçerlilik: veri seti 57 program/229 girdiyle sınırlıdır; gözlenen oranlar büyük, çok dosyalı endüstriyel kod tabanlarına doğrudan genellenemez. Gemini ölçümü 57</w:t>
-      </w:r>
-      <w:r>
-        <w:t>/57 tamamlanmış olsa da, GPT-4o/DeepSeek adaptörleri yazılmış ama API erişimi olmadığından çalıştırılamamıştır. Çoklu-model bulgusu iki modelle sınırlıdır ve daha fazla modelle doğrulanmalıdır. Yapı geçerliliği: EA yalnızca verilen girdilerde gözlenen davr</w:t>
-      </w:r>
-      <w:r>
-        <w:t>anışsal eşdeğerliği ölçer, biçimsel doğrulama sağlamaz. Round 2/Seviye A geri bildirimi modele beklenen/alınan çıktı farkını (oracle) verdiğinden, ölçülen %100 yalnızca GÖRÜLEN test girdilerine karşı bir üst sınırdır. Düzeltmelerin görülmemiş (held-out) gi</w:t>
-      </w:r>
-      <w:r>
-        <w:t>rdilerle ayrıca doğrulanması yapılmamıştır ve bu, düşük maliyetli ama önemli bir gelecek çalışma adımıdır. Dış değerlendirici etkisi: veri setinin 44/57'si bilinen boşlukları hedefleyecek şekilde tarafımızca tasarlanmıştır; bunu dengeleyen 13 bağımsız örne</w:t>
-      </w:r>
-      <w:r>
-        <w:t>ğin 11'i geçmiştir, ama bu alt küme küçüktür. Son olarak, depo tam olarak yerel/GitHub'da mevcuttur ama kalıcı bir Zenodo/figshare DOI'si henüz atanmamıştır; bu, "tümüyle tekrarlanabilir" iddiasını uzun vadeli erişilebilirlik açısından zayıflatan bir eksik</w:t>
-      </w:r>
-      <w:r>
-        <w:t xml:space="preserve">liktir. Kategori C ve F'de "doğru davranış" referans platformun implementation-defined seçimine göredir; bu iki kategori platformdan bağımsız bir kök neden değil, referans platformun (Windows/LLP64) bir artefaktı olarak okunmalıdır. Claude'un `i64` seçimi </w:t>
-      </w:r>
-      <w:r>
-        <w:t>Linux/LP64'te doğru olurdu (§IV-F). Model×kategori etkileşiminin varlığı istatistiksel olarak test edilmemiştir (ör. lojistik regresyonda model×kategori terimi veya Breslow-Day homojenlik testi); Tablo VII'deki kırılım betimsel düzeydedir.</w:t>
+        <w:t>İç geçerlilik: test girdileri elle seçilmiş, referans çıktılar C programı çalıştırılarak üreti</w:t>
+      </w:r>
+      <w:r>
+        <w:t>lmiştir; sınır durumlarının sistematik bir kapsam (coverage) ölçümü yapılmamıştır — bu, 522 satırlık s47_redis_sds gibi uzun örneklerde 4-5 test girdisiyle "PASS" denmesinin gücünü sınırlar. C her koşulda `-O2` ile derlenirken Rust debug/release olarak ayr</w:t>
+      </w:r>
+      <w:r>
+        <w:t>ılmıştır (bilinçli bir tasarım kararı); C'nin farklı optimizasyon seviyelerinde tekrarlanması ayrı bir sağlamlık kontrolü olurdu. Her örnek yalnızca bir kez (k=1) çevrilmiştir; k=3-5 olsaydı pass@1/pass@k ile daha güvenilir bir tahmin elde edilebilirdi — b</w:t>
+      </w:r>
+      <w:r>
+        <w:t>u, en önemli metodolojik sınırlamadır. İstatistiksel geçerlilik: FAIL grubu küçüktür (n=17); duyarlılık analizi (§IV-B) yalnızca orta-büyük etkilerin (|r|≳0.46) saptanabileceğini göstermiştir. Üç çıkarımsal test (Mann-Whitney, Fisher, McNemar) keşif amaçlı</w:t>
+      </w:r>
+      <w:r>
+        <w:t xml:space="preserve"> okunmalıdır; Bonferroni düzeltmesinde (α=0.05/3≈0.0167) yalnızca McNemar (p=0.013) anlamlı kalır, dolayısıyla yorum değişmez. Dış geçerlilik: veri seti 57 program/229 girdiyle sınırlıdır, endüstriyel kod tabanlarına genellenemez; GPT-4o/DeepSeek adaptörle</w:t>
+      </w:r>
+      <w:r>
+        <w:t>ri API erişimi olmadığından çalıştırılamamış, çoklu-model bulgusu iki modelle sınırlıdır. Yapı geçerliliği: EA yalnızca gözlenen davranışsal eşdeğerliği ölçer; Seviye A oracle verdiğinden %100 yalnızca GÖRÜLEN girdilere karşı bir üst sınırdır, held-out doğ</w:t>
+      </w:r>
+      <w:r>
+        <w:t>rulama yapılmamıştır. Dış değerlendirici etkisi: veri setinin 44/57'si bilinen boşlukları hedefler; dengeleyen 13 bağımsız örneğin 11'i geçmiştir. Depo yerel/GitHub'da mevcuttur, kalıcı bir DOI henüz atanmamıştır. Kategori C ve F'de "doğru davranış" refera</w:t>
+      </w:r>
+      <w:r>
+        <w:t>ns platforma (Windows/LLP64) bağlıdır — bir kök neden değil bir artefakttır (Claude'un `i64` seçimi Linux/LP64'te doğru olurdu, §IV-F). Model×kategori etkileşimi test edilmemiştir; Tablo VII'deki kırılım betimseldir.</w:t>
       </w:r>
     </w:p>
     <w:p>
       <w:pPr>
-        <w:spacing w:before="120" w:after="40"/>
+        <w:spacing w:before="80" w:after="20"/>
       </w:pPr>
       <w:r>
         <w:rPr>
@@ -6005,34 +5947,28 @@
         <w:jc w:val="both"/>
       </w:pPr>
       <w:r>
-        <w:t>İnce</w:t>
-      </w:r>
-      <w:r>
-        <w:t>lenen en iyi modelde bile (Gemini, %89.47) 57 programın 6'sında sessiz veya gürültülü bir hata kalması, doğrulama ve iteratif düzeltmenin LLM destekli kod çevirisi araç zincirlerinde isteğe bağlı değil zorunlu olması gerektiğini gösterir. Model×kategori et</w:t>
-      </w:r>
-      <w:r>
-        <w:t xml:space="preserve">kileşimi bulgusu, tek bir "en iyi model" aramak yerine, kod tabanının niteliğine göre model seçimi veya çoklu-model oylaması (ensemble) stratejilerinin araştırılmasını önermektedir. Somut olarak: (i) derleme başarısı kabul kriteri olarak yeterli değildir, </w:t>
-      </w:r>
-      <w:r>
-        <w:t>diferansiyel test veya eşdeğeri bir yürütme tabanlı doğrulama adımı zorunlu tutulmalıdır; (ii) dokuz kök-neden kategorisi (Tablo V), otomatik bir statik analiz/lint kuralı setine dönüştürülüp derleme hattına eklenebilir — özellikle unsigned aritmetik, char</w:t>
-      </w:r>
-      <w:r>
-        <w:t xml:space="preserve"> işaretliliği ve çıktı biçimlendirme gibi derleyicinin doğası gereği yakalayamadığı kategoriler için; (iii) uzun/karmaşık gerçek üretim kodu çevrilirken, bu çalışmada bu kategoride daha dayanıklı bulunan modelin (Claude) tercih edilmesi, kısa izole yardımc</w:t>
-      </w:r>
-      <w:r>
-        <w:t xml:space="preserve">ı fonksiyonlarda ise her iki modelin de kabul edilebilir olduğu göz önünde bulundurulabilir — ancak bu öneri yalnızca iki model ve 57 örneklik bir veri setine dayanır ve daha geniş bir model/veri </w:t>
+        <w:t xml:space="preserve">En iyi modelde bile </w:t>
+      </w:r>
+      <w:r>
+        <w:t>(Gemini, %89.47) 57 programın 6'sında hata kalması, doğrulama ve iteratif düzeltmenin LLM destekli araç zincirlerinde zorunlu olması gerektiğini gösterir. Model×kategori etkileşimi, tek bir "en iyi model" aramak yerine kod tabanının niteliğine göre model s</w:t>
+      </w:r>
+      <w:r>
+        <w:t xml:space="preserve">eçimi veya çoklu-model oylaması (ensemble) araştırılmasını önerir. Somut olarak: (i) derleme başarısı yeterli değildir, diferansiyel test veya eşdeğeri bir yürütme tabanlı doğrulama zorunlu tutulmalıdır; (ii) dokuz kök-neden </w:t>
       </w:r>
       <w:r>
         <w:lastRenderedPageBreak/>
-        <w:t>setiyle doğrulanmadan genel bir kural olarak benimsenmemelid</w:t>
-      </w:r>
-      <w:r>
-        <w:t>ir.</w:t>
+        <w:t>kategorisi (Tablo V) bir statik</w:t>
+      </w:r>
+      <w:r>
+        <w:t xml:space="preserve"> analiz/lint kuralı setine dönüştürülüp derleme hattına eklenebilir — özellikle derleyicinin yakalayamadığı unsigned aritmetik, char işaretliliği ve çıktı biçimlendirme için; (iii) uzun/karmaşık üretim kodunda bu kategoride daha dayanıklı bulunan model (Cl</w:t>
+      </w:r>
+      <w:r>
+        <w:t>aude) tercih edilebilir, kısa izole fonksiyonlarda iki model de kabul edilebilir — ancak bu öneri yalnızca iki model ve 57 örneğe dayanır, daha geniş bir veri setiyle doğrulanmadan genel bir kural olarak benimsenmemelidir.</w:t>
       </w:r>
     </w:p>
     <w:p>
       <w:pPr>
-        <w:spacing w:before="200" w:after="80"/>
+        <w:spacing w:before="120"/>
         <w:jc w:val="center"/>
       </w:pPr>
       <w:r>
@@ -6047,27 +5983,24 @@
         <w:jc w:val="both"/>
       </w:pPr>
       <w:r>
-        <w:t>Bu çalışma, iki bağımsız LLM'in (Claude Sonnet 5, Google Gemini) ürettiği zero-shot C→Rust çevirilerinin yürütme doğruluğunu, 57 programlık özgün bir kıyaslama setinde (13'ü bağımsız gerçek dünya kodu) diferansiyel test ile ölçmüştür. Claude'</w:t>
-      </w:r>
-      <w:r>
-        <w:t>un ham doğruluğu %70.18'de kalmış, başarısızlıkların %94'ü derleyiciden hiç uyarı almadan, %70.6'sı çalışma zamanında da hiçbir sinyal üretmeden geçmiştir; Gemini'nin (57/57, tamamı) doğruluğu %89.47 olmuştur. Kök neden analizi hataları dokuz tekrar eden C</w:t>
-      </w:r>
-      <w:r>
-        <w:t>↔Rust semantik boşluğuna ayırmıştır; model×kategori karşılaştırması, hiçbir modelin diğerinden tekdüze biçimde üstün olmadığını, aksine Gemini'nin kısa hedeflenmiş kategorilerde (5/5) Claude'dan (1/5) daha dayanıklı, uzun gerçek üretim kodunda (0/3) Claude</w:t>
-      </w:r>
-      <w:r>
-        <w:t>'dan (2/3) daha kırılgan olduğunu göstermiştir — literatürde az rastlanan, doğrudan ölçülmüş bir bulgudur. Sessiz hata oranı da model-özgüdür: Claude'un başarısızlıklarının %94'ü derleyiciden hiç uyarı almadan geçerken, Gemini'nin başarısızlıklarının yalnı</w:t>
-      </w:r>
-      <w:r>
-        <w:t>zca üçte biri (%33) sessizdir — kalan üçte ikisi derleme aşamasında yakalanmıştır. Hata geri bildirimine dayalı bir iyileştirme döngüsü Claude'da doğruluğu %100'e taşımıştır, ama bu rakam bir üst sınırdır; kısıtlı geri bildirim koşulları doğruluğu %71.9-86</w:t>
-      </w:r>
-      <w:r>
-        <w:t>.0 arasına düşürmüştür. Gelecek çalışmalar, GPT-4o/DeepSeek dahil daha geniş bir model havuzunu, daha büyük bir veri setini ve model-seçim/ensemble stratejilerini hedefleyebilir.</w:t>
+        <w:t>Bu çalışma, iki bağımsı</w:t>
+      </w:r>
+      <w:r>
+        <w:t>z LLM'in (Claude Sonnet 5, Google Gemini) ürettiği zero-shot C→Rust çevirilerinin yürütme doğruluğunu 57 programlık bir kıyaslama setinde (13'ü bağımsız gerçek dünya kodu) diferansiyel test ile ölçmüştür: Claude %70.18 (başarısızlıkların %94'ü derleyiciden</w:t>
+      </w:r>
+      <w:r>
+        <w:t xml:space="preserve">, %70.6'sı çalışma zamanında da hiçbir sinyal vermeden), Gemini %89.47 (57/57) doğruluk göstermiştir. Kök neden analizi hataları dokuz tekrar eden C↔Rust semantik boşluğuna ayırmıştır; model×kategori karşılaştırması hiçbir modelin diğerinden tekdüze üstün </w:t>
+      </w:r>
+      <w:r>
+        <w:t>olmadığını göstermiştir — Gemini kısa hedeflenmiş kategorilerde (5/5 vs. 1/5) daha dayanıklı, uzun gerçek üretim kodunda (0/3 vs. 2/3) daha kırılgandır; sessiz hata oranı da model-özgüdür (Gemini'de yalnızca %33). Hata geri bildirimi Claude'da doğruluğu %1</w:t>
+      </w:r>
+      <w:r>
+        <w:t>00'e taşımış, ama kısıtlı geri bildirimde bu %71.9-86.0'a düşmüştür. Gelecek çalışmalar GPT-4o/DeepSeek dahil daha geniş bir model havuzunu ve model-seçim/ensemble stratejilerini hedefleyebilir.</w:t>
       </w:r>
     </w:p>
     <w:p>
       <w:pPr>
-        <w:spacing w:before="200" w:after="80"/>
+        <w:spacing w:before="120"/>
         <w:jc w:val="center"/>
       </w:pPr>
       <w:r>
@@ -6079,231 +6012,224 @@
     </w:p>
     <w:p>
       <w:pPr>
-        <w:spacing w:after="40"/>
+        <w:spacing w:after="20"/>
         <w:ind w:left="198" w:hanging="198"/>
       </w:pPr>
       <w:r>
         <w:rPr>
-          <w:sz w:val="16"/>
+          <w:sz w:val="15"/>
         </w:rPr>
-        <w:t>[1] H. F. Eniser, H. Zhang, C. David, M. Wang, M. Christakis, B. Pau</w:t>
+        <w:t>[1] H. F. Eniser, H. Zhang, C. David, M. Wang, M. Ch</w:t>
       </w:r>
       <w:r>
         <w:rPr>
-          <w:sz w:val="16"/>
+          <w:sz w:val="15"/>
         </w:rPr>
-        <w:t>lsen, J. Dodds, and D. Kroening, "Towards Translating Real-World Code with LLMs: A Study of Translating to Rust," arXiv:2405.11514, 2024.</w:t>
+        <w:t>ristakis, B. Paulsen, J. Dodds, and D. Kroening, "Towards Translating Real-World Code with LLMs: A Study of Translating to Rust," arXiv:2405.11514, 2024.</w:t>
       </w:r>
     </w:p>
     <w:p>
       <w:pPr>
-        <w:spacing w:after="40"/>
+        <w:spacing w:after="20"/>
         <w:ind w:left="198" w:hanging="198"/>
       </w:pPr>
       <w:r>
         <w:rPr>
-          <w:sz w:val="16"/>
+          <w:sz w:val="15"/>
         </w:rPr>
-        <w:t>[2] S. Gandhi, M. Patwardhan, J. Khatri, L. Vig, and R. K. Medicherla, "Translation of Low-Resource COBOL to Logically</w:t>
+        <w:t>[2] S. Gandhi, M. Patwardhan, J. Khatri, L. Vig, and R. K. Medicherla, "Translation of Low-Resource CO</w:t>
       </w:r>
       <w:r>
         <w:rPr>
-          <w:sz w:val="16"/>
+          <w:sz w:val="15"/>
         </w:rPr>
-        <w:t xml:space="preserve"> Correct and Readable Java leveraging High-Resource Java Refinement," in Proc. 1st Int. Workshop on Large Language Models for Code (LLM4Code '24), ICSE 2024, Lisbon, Portugal, pp. 46-53, doi: 10.1145/3643795.3648388.</w:t>
+        <w:t>BOL to Logically Correct and Readable Java leveraging High-Resource Java Refinement," in Proc. 1st Int. Workshop on Large Language Models for Code (LLM4Code '24), ICSE 2024, Lisbon, Portugal, pp. 46-53, doi: 10.1145/3643795.3648388.</w:t>
       </w:r>
     </w:p>
     <w:p>
       <w:pPr>
-        <w:spacing w:after="40"/>
+        <w:spacing w:after="20"/>
         <w:ind w:left="198" w:hanging="198"/>
       </w:pPr>
       <w:r>
         <w:rPr>
-          <w:sz w:val="16"/>
+          <w:sz w:val="15"/>
         </w:rPr>
-        <w:t>[3] X. Yin, C. Ni, T. N. Nguyen, S. Wan</w:t>
+        <w:t>[3] X. Yin, C. Ni, T. N</w:t>
       </w:r>
       <w:r>
         <w:rPr>
-          <w:sz w:val="16"/>
+          <w:sz w:val="15"/>
         </w:rPr>
-        <w:t>g, and X. Yang, "Rectifier: Code Translation with Corrector via LLMs," arXiv:2407.07472, 2024.</w:t>
+        <w:t>. Nguyen, S. Wang, and X. Yang, "Rectifier: Code Translation with Corrector via LLMs," arXiv:2407.07472, 2024.</w:t>
       </w:r>
     </w:p>
     <w:p>
       <w:pPr>
-        <w:spacing w:after="40"/>
+        <w:spacing w:after="20"/>
         <w:ind w:left="198" w:hanging="198"/>
       </w:pPr>
       <w:r>
         <w:rPr>
-          <w:sz w:val="16"/>
+          <w:sz w:val="15"/>
         </w:rPr>
-        <w:t>[4] Rosetta Code, rosettacode.org — Luhn test, Soundex, Levenshtein distance, 0-1 Knapsack, Towers of Hanoi, LCS, CRC-32 (C solutions). [Online]. Available: gith</w:t>
+        <w:t>[4] Rosetta Code, rosettacode.org — Luhn test, Soundex, Levenshtein distance, 0-1 Knapsack, Towers of Hanoi, LCS, CRC-32 (C solutions). [Online].</w:t>
       </w:r>
       <w:r>
         <w:rPr>
-          <w:sz w:val="16"/>
+          <w:sz w:val="15"/>
         </w:rPr>
-        <w:t>ub.com/acmeism/RosettaCodeData</w:t>
+        <w:t xml:space="preserve"> Available: github.com/acmeism/RosettaCodeData</w:t>
       </w:r>
     </w:p>
     <w:p>
       <w:pPr>
-        <w:spacing w:after="40"/>
+        <w:spacing w:after="20"/>
         <w:ind w:left="198" w:hanging="198"/>
       </w:pPr>
       <w:r>
         <w:rPr>
-          <w:sz w:val="16"/>
+          <w:sz w:val="15"/>
         </w:rPr>
         <w:t>[5] The Regents of the Univ. of California / OpenBSD and FreeBSD Projects, getopt.c (1987), strtol.c (1990), heapsort.c (1991). [Online]. Available: github.com/openbsd/src, github.com/freebsd/freebsd-src</w:t>
       </w:r>
     </w:p>
     <w:p>
       <w:pPr>
-        <w:spacing w:after="40"/>
+        <w:spacing w:after="20"/>
         <w:ind w:left="198" w:hanging="198"/>
       </w:pPr>
       <w:r>
         <w:rPr>
-          <w:sz w:val="16"/>
+          <w:sz w:val="15"/>
         </w:rPr>
-        <w:t>[6] musl libc Project</w:t>
+        <w:t>[6] m</w:t>
       </w:r>
       <w:r>
         <w:rPr>
-          <w:sz w:val="16"/>
+          <w:sz w:val="15"/>
         </w:rPr>
-        <w:t xml:space="preserve"> (R. Felker et al.), qsort.c (smoothsort, L. Ochs, 2011). [Online]. Available: github.com/kraj/musl</w:t>
+        <w:t>usl libc Project (R. Felker et al.), qsort.c (smoothsort, L. Ochs, 2011). [Online]. Available: github.com/kraj/musl</w:t>
       </w:r>
     </w:p>
     <w:p>
       <w:pPr>
-        <w:spacing w:after="40"/>
+        <w:spacing w:after="20"/>
         <w:ind w:left="198" w:hanging="198"/>
       </w:pPr>
       <w:r>
         <w:rPr>
-          <w:sz w:val="16"/>
+          <w:sz w:val="15"/>
         </w:rPr>
         <w:t>[7] S. Sanfilippo et al., sds.c/sds.h (SDS v2.0), Redis 7.2.4. [Online]. Available: github.com/redis/redis (tag 7.2.4)</w:t>
       </w:r>
     </w:p>
     <w:p>
       <w:pPr>
-        <w:spacing w:after="40"/>
+        <w:spacing w:after="20"/>
         <w:ind w:left="198" w:hanging="198"/>
       </w:pPr>
       <w:r>
         <w:rPr>
-          <w:sz w:val="16"/>
+          <w:sz w:val="15"/>
         </w:rPr>
-        <w:t>[8] D. Gamble et al., cJSON.c (parse_</w:t>
+        <w:t>[8] D. Gamble et al.,</w:t>
       </w:r>
       <w:r>
         <w:rPr>
-          <w:sz w:val="16"/>
+          <w:sz w:val="15"/>
         </w:rPr>
-        <w:t>number, print_number). [Online]. Available: github.com/DaveGamble/cJSON</w:t>
+        <w:t xml:space="preserve"> cJSON.c (parse_number, print_number). [Online]. Available: github.com/DaveGamble/cJSON</w:t>
       </w:r>
     </w:p>
     <w:p>
       <w:pPr>
-        <w:spacing w:after="40"/>
+        <w:spacing w:after="20"/>
         <w:ind w:left="198" w:hanging="198"/>
       </w:pPr>
       <w:r>
         <w:rPr>
-          <w:sz w:val="16"/>
+          <w:sz w:val="15"/>
         </w:rPr>
         <w:t>[9] Google, "Gemini API — gemini-flash-latest," 2025. [Online]. Available: ai.google.dev/gemini-api/docs</w:t>
       </w:r>
     </w:p>
     <w:p>
       <w:pPr>
-        <w:spacing w:after="40"/>
+        <w:spacing w:after="20"/>
         <w:ind w:left="198" w:hanging="198"/>
       </w:pPr>
       <w:r>
         <w:rPr>
-          <w:sz w:val="16"/>
+          <w:sz w:val="15"/>
         </w:rPr>
-        <w:t>[10] Cybersecurity and Infrastructure Security Agency (CISA), National Security</w:t>
+        <w:t>[10] Cybersecurity and Infrastructure Security Agency (CISA), N</w:t>
       </w:r>
       <w:r>
         <w:rPr>
-          <w:sz w:val="16"/>
+          <w:sz w:val="15"/>
         </w:rPr>
-        <w:t xml:space="preserve"> Agency (NSA), Federal Bureau of Investigation (FBI) et al., "The Case for Memory Safe Roadmaps: Why both C-Suite Executives and Technical Experts Need to Take Memory Safe Coding Seriously," joint cybersecurity guidance, Dec. 2023. [Online]. Available: cis</w:t>
+        <w:t>ational Security Agency (NSA), Federal Bureau of Investigation (FBI) et al., "The Case for Memory Safe Roadmaps: Why both C-Suite Executives and Technical Experts Need to Take Memory Safe Coding Seriously," joint cybersecurity guidance, Dec. 2023. [Online]</w:t>
       </w:r>
       <w:r>
         <w:rPr>
-          <w:sz w:val="16"/>
+          <w:sz w:val="15"/>
         </w:rPr>
-        <w:t>a.gov/case-memory-safe-roadmaps</w:t>
+        <w:t>. Available: cisa.gov/case-memory-safe-roadmaps</w:t>
       </w:r>
     </w:p>
     <w:p>
       <w:pPr>
-        <w:spacing w:after="40"/>
+        <w:spacing w:after="20"/>
         <w:ind w:left="198" w:hanging="198"/>
       </w:pPr>
       <w:r>
         <w:rPr>
-          <w:sz w:val="16"/>
+          <w:sz w:val="15"/>
         </w:rPr>
         <w:t>[11] Immunant, Inc., "C2Rust: migrate C code to Rust," open-source project. [Online]. Available: github.com/immunant/c2rust</w:t>
       </w:r>
     </w:p>
     <w:p>
       <w:pPr>
-        <w:spacing w:after="40"/>
+        <w:spacing w:after="20"/>
         <w:ind w:left="198" w:hanging="198"/>
       </w:pPr>
       <w:r>
         <w:rPr>
-          <w:sz w:val="16"/>
+          <w:sz w:val="15"/>
         </w:rPr>
-        <w:t>[12] B. Rozière, M.-A. Lachaux, L. Chanussot, and G. Lample, "Unsupervised Translation of Programmin</w:t>
+        <w:t>[12] B. Rozière, M.-A. Lachaux, L. Chanussot, and G. Lample, "Unsupervised Translati</w:t>
       </w:r>
       <w:r>
         <w:rPr>
-          <w:sz w:val="16"/>
+          <w:sz w:val="15"/>
         </w:rPr>
-        <w:t xml:space="preserve">g Languages," in Advances in </w:t>
-      </w:r>
-      <w:r>
-        <w:rPr>
-          <w:sz w:val="16"/>
-        </w:rPr>
-        <w:lastRenderedPageBreak/>
-        <w:t>Neural Information Processing Systems (NeurIPS) 33, 2020, arXiv:2006.03511.</w:t>
+        <w:t>on of Programming Languages," in Advances in Neural Information Processing Systems (NeurIPS) 33, 2020, arXiv:2006.03511.</w:t>
       </w:r>
     </w:p>
     <w:p>
       <w:pPr>
-        <w:spacing w:after="40"/>
+        <w:spacing w:after="20"/>
         <w:ind w:left="198" w:hanging="198"/>
       </w:pPr>
       <w:r>
         <w:rPr>
-          <w:sz w:val="16"/>
+          <w:sz w:val="15"/>
         </w:rPr>
-        <w:t>[13] J. M. Hoenig and D. M. Heisey, "The Abuse of Power: The Pervasive Fallacy of Power Calculations for Data Analysis," The American Statistician, vol</w:t>
+        <w:t>[13] J. M. Hoenig and D. M. Heisey, "The Abuse of Power: The Pervasive Fallacy of Power Calculations for Data Analysis," The American S</w:t>
       </w:r>
       <w:r>
         <w:rPr>
-          <w:sz w:val="16"/>
+          <w:sz w:val="15"/>
         </w:rPr>
-        <w:t>. 55, no. 1, pp. 19-24, 2001.</w:t>
+        <w:t>tatistician, vol. 55, no. 1, pp. 19-24, 2001.</w:t>
       </w:r>
     </w:p>
     <w:sectPr>
       <w:type w:val="continuous"/>
       <w:pgSz w:w="11906" w:h="16838"/>
-      <w:pgMar w:top="1077" w:right="935" w:bottom="1247" w:left="935" w:header="720" w:footer="720" w:gutter="0"/>
+      <w:pgMar w:top="1077" w:right="935" w:bottom="1077" w:left="935" w:header="720" w:footer="720" w:gutter="0"/>
       <w:cols w:num="2" w:space="283"/>
       <w:docGrid w:linePitch="360"/>
     </w:sectPr>
@@ -18219,7 +18145,7 @@
 </file>
 
 <file path=customXml/itemProps1.xml><?xml version="1.0" encoding="utf-8"?>
-<ds:datastoreItem xmlns:ds="http://schemas.openxmlformats.org/officeDocument/2006/customXml" ds:itemID="{43B51189-0D6C-4C73-B1F4-C8C5E347EFB1}">
+<ds:datastoreItem xmlns:ds="http://schemas.openxmlformats.org/officeDocument/2006/customXml" ds:itemID="{47E3DF3A-EC87-40BF-AC25-9AEA969314DD}">
   <ds:schemaRefs>
     <ds:schemaRef ds:uri="http://schemas.openxmlformats.org/officeDocument/2006/bibliography"/>
   </ds:schemaRefs>

</xml_diff>

<commit_message>
Amac ve Katkilar bolumunu duz anlatim nesrine cevir
- Alti sorunun noktali virgulle dizildigi cumle ve (i)-(vi) ile
  numaralanmis katkilar listesi kaldirildi
- Ayni icerik, ne yapildigini anlatan akici bir nesir olarak yeniden
  yazildi (liste hissi vermeyen iki paragraf)
- Sayfa sayisi 7'de sabit kaldi; PDF render ile dogrulandi
</commit_message>
<xml_diff>
--- a/makale_IEEE_v1.docx
+++ b/makale_IEEE_v1.docx
@@ -389,16 +389,19 @@
         <w:jc w:val="both"/>
       </w:pPr>
       <w:r>
-        <w:t>Bu çalışmada altı soruya deneysel yanıt aranmaktadır: zero-shot C→Rust çevirisinin yürütme doğruluğu (EA) ne</w:t>
-      </w:r>
-      <w:r>
-        <w:t>dir ve kaç başarısızlık sessizce (derleyici uyarısı olmadan) gerçekleşir; başarısızlıkların kök nedenleri C↔Rust arasında tekrar eden hangi semantik boşluklara işaret eder; kod uzunluğu çeviri başarısını gerçekten öngörür mü; derleme yapılandırması (debug/</w:t>
-      </w:r>
-      <w:r>
-        <w:t>release) ölçülen doğruluğu nasıl etkiler; hata geri bildirimine dayalı bir iyileştirme döngüsü doğruluğu ne ölçüde artırır ve bu artış geri bildirimin zenginliğine ne kadar bağımlıdır; ve son olarak, bulgular tek bir modele mi özgüdür, yoksa ikinci bağımsı</w:t>
-      </w:r>
-      <w:r>
-        <w:t>z bir modelde (Google Gemini) de aynı örüntü — ve aynı kök nedenler — gözlenir mi?</w:t>
+        <w:t>Bu çalışma, büyük dil modellerinin ürettiği C→Rust çevirilerinin davranışsal doğruluğunu deneysel olarak inc</w:t>
+      </w:r>
+      <w:r>
+        <w:t>elemektedir. Zero-shot çevirilerin yürütme doğruluğu (EA) ölçülmüş ve başarısızlıkların ne kadarının derleyiciden hiçbir uyarı almadan sessizce gerçekleştiği belirlenmiştir; başarısızlıkların kök nedenleri C↔Rust arasında tekrar eden semantik boşluklar ola</w:t>
+      </w:r>
+      <w:r>
+        <w:t>rak sınıflandırılmıştır. Ayrıca kod uzunluğunun çeviri başarısını gerçekten öngörüp öngörmediği, derleme yapılandırmasının (debug/release) ölçülen doğruluğu nasıl etkilediği ve hata geri bildirimine dayalı bir iyileştirme döngüsünün doğruluğu ne ölçüde art</w:t>
+      </w:r>
+      <w:r>
+        <w:t xml:space="preserve">ırdığı — ve bu artışın geri bildirimin zenginliğine ne kadar bağlı olduğu — sınanmıştır. Son olarak, bulguların tek bir modele mi özgü olduğu, yoksa ikinci bağımsız bir modelde (Google Gemini) de aynı örüntünün ve aynı kök nedenlerin gözlenip gözlenmediği </w:t>
+      </w:r>
+      <w:r>
+        <w:t>araştırılmıştır.</w:t>
       </w:r>
     </w:p>
     <w:p>
@@ -406,16 +409,20 @@
         <w:jc w:val="both"/>
       </w:pPr>
       <w:r>
-        <w:t xml:space="preserve">Bunun için 57 C programı ve 229 test girdisinden oluşan özgün, tekrarlanabilir bir kıyaslama seti ("C→Rust Legacy Çeviri Benchmark'ı") oluşturulmuş; her programın Claude ve </w:t>
-      </w:r>
-      <w:r>
-        <w:t>Gemini çevirisi kaynağa karşı diferansiyel test ile doğrulanmıştır. Katkılarımız: (i) bilinen C↔Rust semantik boşluklarını (tamsayı taşması, string modeli, işaretlilik, biçimlendirme, global durum) hedefleyen özgün bir veri seti; (ii) derleme modunun doğru</w:t>
-      </w:r>
-      <w:r>
-        <w:t>luğu nasıl gizleyebileceğinin kanıtı; (iii) dokuz kök nedene dayanan bir hata taksonomisi; (iv) üç geri bildirim seviyesinde ölçülmüş bir iyileştirme-döngüsü etkinliği eğrisi; (v) 13 bağımsız gerçek dünya algoritması (Rosetta Code, OpenBSD/FreeBSD libc, mu</w:t>
-      </w:r>
-      <w:r>
-        <w:t>sl/Redis/cJSON) üzerinde tekrarlanan ölçüm; ve (vi) 57/57 örnek üzerinde gerçek, otomatik bir ikinci-model (Gemini) ölçümü — modele özgü ve modelden bağımsız hata kategorilerini ayırt eder.</w:t>
+        <w:t>Bu amaçla 57 C programı ve 229 test girdisinden oluşan özgün, tekrarlanabilir bir kıyaslama seti ("C→Rust Legacy Çeviri Benchmark'ı") oluşturulmuş; her programın Claude ve Gemini çevirisi kaynağa karşı diferansiyel test ile doğrulanmıştır.</w:t>
+      </w:r>
+      <w:r>
+        <w:t xml:space="preserve"> Bu süreçte, bilinen C↔Rust semantik boşluklarını (tamsayı taşması, string modeli, işaretlilik, biçimlendirme, global durum) hedefleyen özgün bir veri seti oluşturulmuş, derleme modunun doğruluğu nasıl gizleyebileceği gösterilmiş ve dokuz kök nedene dayana</w:t>
+      </w:r>
+      <w:r>
+        <w:t>n bir hata taksonomisi çıkarılmıştır. Bunun yanında üç farklı geri bildirim seviyesinde iyileştirme döngüsünün etkinliği ölçülmüş, 13 bağımsız gerçek dünya algoritması (Rosetta Code, OpenBSD/FreeBSD libc, musl/Redis/cJSON) üzerinde tekrarlanan bir ölçüm ya</w:t>
+      </w:r>
+      <w:r>
+        <w:t xml:space="preserve">pılmış ve 57 örneğin tamamı üzerinde gerçek, otomatik bir ikinci-model (Gemini) </w:t>
+      </w:r>
+      <w:r>
+        <w:lastRenderedPageBreak/>
+        <w:t>değerlendirmesiyle modele özgü ve modelden bağımsız hata kategorileri birbirinden ayrılmıştır.</w:t>
       </w:r>
     </w:p>
     <w:p>
@@ -435,17 +442,16 @@
         <w:jc w:val="both"/>
       </w:pPr>
       <w:r>
-        <w:lastRenderedPageBreak/>
-        <w:t xml:space="preserve">LLM tabanlı kod çevirisinin doğruluğunu </w:t>
-      </w:r>
-      <w:r>
-        <w:t>yürütme yoluyla doğrulayan çalışmalar artmaktadır. Gandhi vd. [2], COBOL→Java çevirisinde execution-guided refinement ile %81.99 doğruluğa ulaşmıştır; bu çalışma benzer bir mantığı C→Rust'ta benimser. Eniser vd. [1], FLUORINE ile kod uzunluğu arttıkça çevi</w:t>
-      </w:r>
-      <w:r>
-        <w:t>ri hatası riskinin arttığını gözlemlemiştir — bu çalışmanın bulguları bu gözlemle örtüşmez (§IV-B). Yin vd. [3], farklı LLM'lerin hata kök nedenlerinin büyük ölçüde benzer olduğunu göstermiştir; çoklu-model bulgularımız (§IV-F) bunu hem doğrular hem nüansl</w:t>
-      </w:r>
-      <w:r>
-        <w:t>andırır: yalnızca kök neden D kategorisi modelden bağımsızken, A, B, C, E, F, G, H, I kategorilerinin her biri en az bir modelde başarıyla atlatılmıştır.</w:t>
+        <w:t xml:space="preserve">LLM tabanlı kod çevirisinin doğruluğunu yürütme yoluyla </w:t>
+      </w:r>
+      <w:r>
+        <w:t>doğrulayan çalışmalar artmaktadır. Gandhi vd. [2], COBOL→Java çevirisinde execution-guided refinement ile %81.99 doğruluğa ulaşmıştır; bu çalışma benzer bir mantığı C→Rust'ta benimser. Eniser vd. [1], FLUORINE ile kod uzunluğu arttıkça çeviri hatası riskin</w:t>
+      </w:r>
+      <w:r>
+        <w:t>in arttığını gözlemlemiştir — bu çalışmanın bulguları bu gözlemle örtüşmez (§IV-B). Yin vd. [3], farklı LLM'lerin hata kök nedenlerinin büyük ölçüde benzer olduğunu göstermiştir; çoklu-model bulgularımız (§IV-F) bunu hem doğrular hem nüanslandırır: yalnızc</w:t>
+      </w:r>
+      <w:r>
+        <w:t>a kök neden D kategorisi modelden bağımsızken, A, B, C, E, F, G, H, I kategorilerinin her biri en az bir modelde başarıyla atlatılmıştır.</w:t>
       </w:r>
     </w:p>
     <w:p>
@@ -453,13 +459,17 @@
         <w:jc w:val="both"/>
       </w:pPr>
       <w:r>
-        <w:t>Kural tabanlı C→Rust çevirisi (ör. C2Rust [11]) ve nöral kod çevirisi (ör. TransCoder [12]) farklı bir</w:t>
-      </w:r>
-      <w:r>
-        <w:t xml:space="preserve"> eksende konumlanır: kural tabanlı araçlar davranışsal eşdeğerliği sözdizimsel kurallarla (genellikle yoğun `unsafe` pahasına) garanti etmeye çalışırken, nöral/LLM yaklaşımlar deyimsel ama doğrulanmamış çeviriler üretir. Rust'ın tip sistemi ve ödünç denetl</w:t>
-      </w:r>
-      <w:r>
-        <w:t>eyicisi bellek güvenliğini derleme zamanında garanti eder, ama yalnızca kod derlenirse — davranışsal eşdeğerliği garanti etmez; bu çalışma tam olarak bu boşluğu, "derlenen ama kaynaktan farklı davranan" kodu, ölçmeyi hedefler.</w:t>
+        <w:t>Kural tabanlı C→Rust çevirisi (ör. C2Rust [11]) ve nöral kod çevirisi (ör. TransCoder [12]) farklı bir eksende konumla</w:t>
+      </w:r>
+      <w:r>
+        <w:t>nır: kural tabanlı araçlar davranışsal eşdeğerliği sözdizimsel kurallarla (genellikle yoğun `unsafe` pahasına) garanti etmeye çalışırken, nöral/LLM yaklaşımlar deyimsel ama doğrulanmamış çeviriler üretir. Rust'ın tip sistemi ve ödünç denetleyicisi bellek g</w:t>
+      </w:r>
+      <w:r>
+        <w:t xml:space="preserve">üvenliğini derleme zamanında garanti eder, ama yalnızca kod derlenirse — davranışsal eşdeğerliği garanti etmez; bu çalışma tam olarak bu boşluğu, </w:t>
+      </w:r>
+      <w:r>
+        <w:lastRenderedPageBreak/>
+        <w:t>"derlenen ama kaynaktan farklı davranan" kodu, ölçmeyi hedefler.</w:t>
       </w:r>
     </w:p>
     <w:p>
@@ -467,14 +477,10 @@
         <w:jc w:val="both"/>
       </w:pPr>
       <w:r>
-        <w:lastRenderedPageBreak/>
-        <w:t xml:space="preserve">Bu çalışma literatürden üç </w:t>
-      </w:r>
-      <w:r>
-        <w:t>noktada ayrışır: (a) veri seti özgün ve tümüyle tekrarlanabilirdir; (b) derleme yapılandırmasının doğruluk üzerindeki gizli etkisi gösterilmiştir; (c) iki bağımsız model üzerinde gerçek, otomatik ölçümle kök neden düzeyinde bir model karşılaştırması sunulm</w:t>
-      </w:r>
-      <w:r>
-        <w:t>uştur.</w:t>
+        <w:t xml:space="preserve">Bu çalışma literatürden üç noktada ayrışır: </w:t>
+      </w:r>
+      <w:r>
+        <w:t>(a) veri seti özgün ve tümüyle tekrarlanabilirdir; (b) derleme yapılandırmasının doğruluk üzerindeki gizli etkisi gösterilmiştir; (c) iki bağımsız model üzerinde gerçek, otomatik ölçümle kök neden düzeyinde bir model karşılaştırması sunulmuştur.</w:t>
       </w:r>
     </w:p>
     <w:p>
@@ -486,7 +492,13 @@
         <w:rPr>
           <w:b/>
         </w:rPr>
-        <w:t>III. YÖNTEM</w:t>
+        <w:t>III. YÖNTE</w:t>
+      </w:r>
+      <w:r>
+        <w:rPr>
+          <w:b/>
+        </w:rPr>
+        <w:t>M</w:t>
       </w:r>
     </w:p>
     <w:p>
@@ -506,16 +518,16 @@
         <w:jc w:val="both"/>
       </w:pPr>
       <w:r>
-        <w:t>Kıyaslama seti 57 C programından oluşur (10-522 satır), dokuz aşamada genişletilmiştir (Tablo I): 24 temel algoritma; kod uzunluğu etkisini test etmek için 5 daha uzun program (s25-s29); bağımsızlığı sınamak için Rosetta Cod</w:t>
-      </w:r>
-      <w:r>
-        <w:t>e'dan [4] 7 algoritma (s30-s36), OpenBSD/FreeBSD libc'sinden [5] 3 üretim fonksiyonu (s37-s39) ve musl [6]/Redis [7]/cJSON [8]'dan 3 uzun üretim kodu (s46-s48); hedeflenmemiş boşlukları kapsayan 6 özgün program (s40-s45); hakem/danışman geri bildirimine ya</w:t>
-      </w:r>
-      <w:r>
-        <w:t>nıt olarak eklenen beş kök-neden kategorisinin (C, E, F, G, H) ikinci örnekleri (s49-s53); ve çok dosyalı/pthread eşzamanlılığını (s54, s55, s57) ile karmaşık makro kullanımını (s56) test eden iki ek grup. Çekirdek algoritma her durumda kaynaktan değiştiri</w:t>
-      </w:r>
-      <w:r>
-        <w:t>lmeden alınmış, yalnızca main() stdin/stdout sözleşmesine uyacak şekilde yeniden yazılmıştır; tam katalog açık veri deposunda sunulmuştur.</w:t>
+        <w:t>Kıyaslama seti 57 C programından oluşur (10-522 satır), dokuz aşamada genişletilmiştir (Tablo I): 24 temel algoritma; kod uzunluğu etkisini test etmek için 5 daha uzun program (s25-s29); bağımsızlığı sınamak için Rosetta Code'dan [4] 7 algor</w:t>
+      </w:r>
+      <w:r>
+        <w:t>itma (s30-s36), OpenBSD/FreeBSD libc'sinden [5] 3 üretim fonksiyonu (s37-s39) ve musl [6]/Redis [7]/cJSON [8]'dan 3 uzun üretim kodu (s46-s48); hedeflenmemiş boşlukları kapsayan 6 özgün program (s40-s45); hakem/danışman geri bildirimine yanıt olarak eklene</w:t>
+      </w:r>
+      <w:r>
+        <w:t>n beş kök-neden kategorisinin (C, E, F, G, H) ikinci örnekleri (s49-s53); ve çok dosyalı/pthread eşzamanlılığını (s54, s55, s57) ile karmaşık makro kullanımını (s56) test eden iki ek grup. Çekirdek algoritma her durumda kaynaktan değiştirilmeden alınmış, y</w:t>
+      </w:r>
+      <w:r>
+        <w:t>alnızca main() stdin/stdout sözleşmesine uyacak şekilde yeniden yazılmıştır; tam katalog açık veri deposunda sunulmuştur.</w:t>
       </w:r>
     </w:p>
     <w:p>
@@ -539,13 +551,13 @@
           <w:sz w:val="16"/>
         </w:rPr>
         <w:lastRenderedPageBreak/>
-        <w:t>TABLO I. VERİ SETİNİN KAYNAK/ROL KATEGORİLERİNE GÖRE ÖZETİ (* Rosetta Code; ** OpenBSD/Free</w:t>
+        <w:t>TABLO I. VERİ SETİNİN KAYNAK/ROL KATEGORİLERİNE GÖRE ÖZETİ (* Rosetta Code; ** OpenBSD/FreeBSD libc; *** mus</w:t>
       </w:r>
       <w:r>
         <w:rPr>
           <w:sz w:val="16"/>
         </w:rPr>
-        <w:t>BSD libc; *** musl/Redis/cJSON — üçü de tarafımızca yazılmamış bağımsız/üretim kodu, bkz. §V-B).</w:t>
+        <w:t>l/Redis/cJSON — üçü de tarafımızca yazılmamış bağımsız/üretim kodu, bkz. §V-B).</w:t>
       </w:r>
     </w:p>
     <w:tbl>
@@ -988,13 +1000,7 @@
               <w:rPr>
                 <w:sz w:val="18"/>
               </w:rPr>
-              <w:t xml:space="preserve">BSD </w:t>
-            </w:r>
-            <w:r>
-              <w:rPr>
-                <w:sz w:val="18"/>
-              </w:rPr>
-              <w:t>libc</w:t>
+              <w:t>BSD libc</w:t>
             </w:r>
           </w:p>
         </w:tc>
@@ -1607,14 +1613,14 @@
         <w:t>nsal bağlamı yalnızca erişim tarihleriyle (2026-07-22 – 2026-07-25) yeniden kurulabilir. İstem mühendisliği en yalın haliyle uygulanmıştır: modele yalnızca "bu C programını Rust'a çevir" istemi verilmiş, model derleme/test aracına erişememiştir (gerçek zer</w:t>
       </w:r>
       <w:r>
-        <w:t>o-shot). Değerlendirme betiği model-bağımsız tasarlanmıştır. Claude çevirileri ise etkileşimli bir asistan oturumunda (Claude Code CLI) üretilmiş; örnekleme parametreleri ayrı arşivlenmemiştir — bu, tekrarlanabilirliği Gemini tarafına göre sınırlayan bir a</w:t>
-      </w:r>
-      <w:r>
-        <w:t xml:space="preserve">simetridir (§V-B). Her iki model için de her örnek yalnızca </w:t>
+        <w:t xml:space="preserve">o-shot). Değerlendirme betiği model-bağımsız tasarlanmıştır. Claude çevirileri ise etkileşimli bir asistan oturumunda (Claude Code CLI) üretilmiş; örnekleme parametreleri ayrı arşivlenmemiştir — </w:t>
       </w:r>
       <w:r>
         <w:lastRenderedPageBreak/>
-        <w:t>bir kez (k=1) çevrilmiştir; bu tek-örneklemli ölçümün model farkını mı örnekleme gürültüsünü mü yansıttığı bilinmemektedir (§V-B). Gemini ölçümü, ücretsiz katman günlük kota sınırı nedeniyle 2026-</w:t>
+        <w:t>bu, tekrarlanabilirliği Gemini tarafına göre sınırlayan bir a</w:t>
+      </w:r>
+      <w:r>
+        <w:t>simetridir (§V-B). Her iki model için de her örnek yalnızca bir kez (k=1) çevrilmiştir; bu tek-örneklemli ölçümün model farkını mı örnekleme gürültüsünü mü yansıttığı bilinmemektedir (§V-B). Gemini ölçümü, ücretsiz katman günlük kota sınırı nedeniyle 2026-</w:t>
       </w:r>
       <w:r>
         <w:t>07-22 – 2026-07-25 arasında kademeli tamamlanmıştır; tam çağrı kaydı (istem, zaman damgası, örnekleme parametreleri) her örnek için açık veri deposunda arşivlenmiştir.</w:t>
@@ -1664,6 +1670,7 @@
         <w:rPr>
           <w:sz w:val="16"/>
         </w:rPr>
+        <w:lastRenderedPageBreak/>
         <w:t>TABLO II. HATA TAKSONOMİSİ.</w:t>
       </w:r>
     </w:p>
@@ -1770,7 +1777,6 @@
               <w:rPr>
                 <w:sz w:val="17"/>
               </w:rPr>
-              <w:lastRenderedPageBreak/>
               <w:t>CE</w:t>
             </w:r>
           </w:p>
@@ -2056,11 +2062,8 @@
         <w:jc w:val="both"/>
       </w:pPr>
       <w:r>
-        <w:t xml:space="preserve">Program-düzeyi Yürütme Doğruluğu (EA) = tüm testleri geçen örnek sayısı / toplam örnek sayısı — ana metriktir; </w:t>
-      </w:r>
-      <w:r>
         <w:lastRenderedPageBreak/>
-        <w:t xml:space="preserve">test-girdisi bazında geçme oranı ikincil bir metriktir. Ortam: Windows 11, gcc 16.1.0 (MSYS2/UCRT64, </w:t>
+        <w:t xml:space="preserve">Program-düzeyi Yürütme Doğruluğu (EA) = tüm testleri geçen örnek sayısı / toplam örnek sayısı — ana metriktir; test-girdisi bazında geçme oranı ikincil bir metriktir. Ortam: Windows 11, gcc 16.1.0 (MSYS2/UCRT64, </w:t>
       </w:r>
       <w:r>
         <w:t>-O2), rustc/cargo 1.97.1; derleme `rustc &lt;dosya&gt;.rs -o &lt;çıktı&gt;` ile, Cargo veya --edition bayrağı olmadan yapılmıştır (varsayılan edition, 2015 — bazı lint'lerin şiddeti edition'a göre değişir, ancak Kategori E'deki E0133 derleme hatası tüm editionlarda se</w:t>
@@ -18145,7 +18148,7 @@
 </file>
 
 <file path=customXml/itemProps1.xml><?xml version="1.0" encoding="utf-8"?>
-<ds:datastoreItem xmlns:ds="http://schemas.openxmlformats.org/officeDocument/2006/customXml" ds:itemID="{47E3DF3A-EC87-40BF-AC25-9AEA969314DD}">
+<ds:datastoreItem xmlns:ds="http://schemas.openxmlformats.org/officeDocument/2006/customXml" ds:itemID="{F5713C00-6878-4661-9FF4-366285B5F8D2}">
   <ds:schemaRefs>
     <ds:schemaRef ds:uri="http://schemas.openxmlformats.org/officeDocument/2006/bibliography"/>
   </ds:schemaRefs>

</xml_diff>

<commit_message>
Kaynakca atif sirasini IEEE kuralina gore duzelt (ilk gecis sirasi)
- Onceki surumde ilk atif metinde [10] ile basliyordu (CISA), IEEE
  atif numaralari metindeki ilk gecis sirasina gore verilmeli
- Tum [N] isaretleri ve kaynakca listesi, metindeki gercek ilk gecis
  sirasina gore yeniden numaralandi: CISA(1) Gandhi(2) Eniser(3)
  Yin(4) C2Rust(5) TransCoder(6) RosettaCode(7) OpenBSD/FreeBSD(8)
  musl(9) Redis(10) cJSON(11) GeminiAPI(12) Hoenig(13)
- Sayfa sayisi 7'de sabit kaldi; ilgili tum sayfalar (1,2,4,7) PDF
  render ile dogrulandi
</commit_message>
<xml_diff>
--- a/makale_IEEE_v1.docx
+++ b/makale_IEEE_v1.docx
@@ -339,7 +339,7 @@
         <w:t>z dillerden kaynaklandığından, Rust gibi bellek-güvenli dillere geçiş kritik bir mühendislik hedefidir. Manuel geçiş maliyeti yüksek olduğundan, LLM tabanlı otomatik kod çevirisi hızla ilgi görmektedir; büyük teknoloji şirketleri ve kamu kurumlarının bu yö</w:t>
       </w:r>
       <w:r>
-        <w:t xml:space="preserve">ndeki açık politika duyuruları [10] bu ilgiyi somut bir mühendislik ihtiyacına dönüştürürken, </w:t>
+        <w:t xml:space="preserve">ndeki açık politika duyuruları [1] bu ilgiyi somut bir mühendislik ihtiyacına dönüştürürken, </w:t>
       </w:r>
       <w:r>
         <w:lastRenderedPageBreak/>
@@ -363,13 +363,13 @@
         <w:jc w:val="both"/>
       </w:pPr>
       <w:r>
-        <w:t>Bir LLM çevirisinin "başarılı" sayılması için hedef dilde der</w:t>
-      </w:r>
-      <w:r>
-        <w:t>lenmesi yeterli değildir; kaynakla davranışsal olarak eşdeğer olmalıdır — sözdizimsel düzeyde doğru ama anlam düzeyinde sapan bir çeviri, derleyiciden hiç uyarı almadan üretime sızabilir. Bu çalışmanın çıkış noktası: LLM kod çevirisinde asıl tehlike sözdiz</w:t>
-      </w:r>
-      <w:r>
-        <w:t>imsel değil, sessiz semantik hatalardır — ve bu tehlikenin modelden modele nasıl değiştiği literatürde yeterince ölçülmemiştir.</w:t>
+        <w:t>Bir LLM çevirisinin "başarılı" sayılması için hedef dilde derl</w:t>
+      </w:r>
+      <w:r>
+        <w:t>enmesi yeterli değildir; kaynakla davranışsal olarak eşdeğer olmalıdır — sözdizimsel düzeyde doğru ama anlam düzeyinde sapan bir çeviri, derleyiciden hiç uyarı almadan üretime sızabilir. Bu çalışmanın çıkış noktası: LLM kod çevirisinde asıl tehlike sözdizi</w:t>
+      </w:r>
+      <w:r>
+        <w:t>msel değil, sessiz semantik hatalardır — ve bu tehlikenin modelden modele nasıl değiştiği literatürde yeterince ölçülmemiştir.</w:t>
       </w:r>
     </w:p>
     <w:p>
@@ -389,19 +389,19 @@
         <w:jc w:val="both"/>
       </w:pPr>
       <w:r>
-        <w:t>Bu çalışma, büyük dil modellerinin ürettiği C→Rust çevirilerinin davranışsal doğruluğunu deneysel olarak inc</w:t>
-      </w:r>
-      <w:r>
-        <w:t>elemektedir. Zero-shot çevirilerin yürütme doğruluğu (EA) ölçülmüş ve başarısızlıkların ne kadarının derleyiciden hiçbir uyarı almadan sessizce gerçekleştiği belirlenmiştir; başarısızlıkların kök nedenleri C↔Rust arasında tekrar eden semantik boşluklar ola</w:t>
-      </w:r>
-      <w:r>
-        <w:t>rak sınıflandırılmıştır. Ayrıca kod uzunluğunun çeviri başarısını gerçekten öngörüp öngörmediği, derleme yapılandırmasının (debug/release) ölçülen doğruluğu nasıl etkilediği ve hata geri bildirimine dayalı bir iyileştirme döngüsünün doğruluğu ne ölçüde art</w:t>
-      </w:r>
-      <w:r>
-        <w:t xml:space="preserve">ırdığı — ve bu artışın geri bildirimin zenginliğine ne kadar bağlı olduğu — sınanmıştır. Son olarak, bulguların tek bir modele mi özgü olduğu, yoksa ikinci bağımsız bir modelde (Google Gemini) de aynı örüntünün ve aynı kök nedenlerin gözlenip gözlenmediği </w:t>
-      </w:r>
-      <w:r>
-        <w:t>araştırılmıştır.</w:t>
+        <w:t>Bu çalışma, büyük dil modellerinin ürettiği C→Rust çevirilerinin davranışsal doğruluğunu deneysel olarak ince</w:t>
+      </w:r>
+      <w:r>
+        <w:t>lemektedir. Zero-shot çevirilerin yürütme doğruluğu (EA) ölçülmüş ve başarısızlıkların ne kadarının derleyiciden hiçbir uyarı almadan sessizce gerçekleştiği belirlenmiştir; başarısızlıkların kök nedenleri C↔Rust arasında tekrar eden semantik boşluklar olar</w:t>
+      </w:r>
+      <w:r>
+        <w:t>ak sınıflandırılmıştır. Ayrıca kod uzunluğunun çeviri başarısını gerçekten öngörüp öngörmediği, derleme yapılandırmasının (debug/release) ölçülen doğruluğu nasıl etkilediği ve hata geri bildirimine dayalı bir iyileştirme döngüsünün doğruluğu ne ölçüde artı</w:t>
+      </w:r>
+      <w:r>
+        <w:t>rdığı — ve bu artışın geri bildirimin zenginliğine ne kadar bağlı olduğu — sınanmıştır. Son olarak, bulguların tek bir modele mi özgü olduğu, yoksa ikinci bağımsız bir modelde (Google Gemini) de aynı örüntünün ve aynı kök nedenlerin gözlenip gözlenmediği a</w:t>
+      </w:r>
+      <w:r>
+        <w:t>raştırılmıştır.</w:t>
       </w:r>
     </w:p>
     <w:p>
@@ -409,16 +409,16 @@
         <w:jc w:val="both"/>
       </w:pPr>
       <w:r>
-        <w:t>Bu amaçla 57 C programı ve 229 test girdisinden oluşan özgün, tekrarlanabilir bir kıyaslama seti ("C→Rust Legacy Çeviri Benchmark'ı") oluşturulmuş; her programın Claude ve Gemini çevirisi kaynağa karşı diferansiyel test ile doğrulanmıştır.</w:t>
-      </w:r>
-      <w:r>
-        <w:t xml:space="preserve"> Bu süreçte, bilinen C↔Rust semantik boşluklarını (tamsayı taşması, string modeli, işaretlilik, biçimlendirme, global durum) hedefleyen özgün bir veri seti oluşturulmuş, derleme modunun doğruluğu nasıl gizleyebileceği gösterilmiş ve dokuz kök nedene dayana</w:t>
-      </w:r>
-      <w:r>
-        <w:t>n bir hata taksonomisi çıkarılmıştır. Bunun yanında üç farklı geri bildirim seviyesinde iyileştirme döngüsünün etkinliği ölçülmüş, 13 bağımsız gerçek dünya algoritması (Rosetta Code, OpenBSD/FreeBSD libc, musl/Redis/cJSON) üzerinde tekrarlanan bir ölçüm ya</w:t>
-      </w:r>
-      <w:r>
-        <w:t xml:space="preserve">pılmış ve 57 örneğin tamamı üzerinde gerçek, otomatik bir ikinci-model (Gemini) </w:t>
+        <w:t xml:space="preserve">Bu amaçla 57 C programı ve 229 test girdisinden oluşan özgün, tekrarlanabilir bir kıyaslama seti ("C→Rust Legacy Çeviri Benchmark'ı") oluşturulmuş; her programın Claude ve Gemini çevirisi kaynağa karşı diferansiyel test ile doğrulanmıştır. </w:t>
+      </w:r>
+      <w:r>
+        <w:t>Bu süreçte, bilinen C↔Rust semantik boşluklarını (tamsayı taşması, string modeli, işaretlilik, biçimlendirme, global durum) hedefleyen özgün bir veri seti oluşturulmuş, derleme modunun doğruluğu nasıl gizleyebileceği gösterilmiş ve dokuz kök nedene dayanan</w:t>
+      </w:r>
+      <w:r>
+        <w:t xml:space="preserve"> bir hata taksonomisi çıkarılmıştır. Bunun yanında üç farklı geri bildirim seviyesinde iyileştirme döngüsünün etkinliği ölçülmüş, 13 bağımsız gerçek dünya algoritması (Rosetta Code, OpenBSD/FreeBSD libc, musl/Redis/cJSON) üzerinde tekrarlanan bir ölçüm yap</w:t>
+      </w:r>
+      <w:r>
+        <w:t xml:space="preserve">ılmış ve 57 örneğin tamamı üzerinde gerçek, otomatik bir ikinci-model (Gemini) </w:t>
       </w:r>
       <w:r>
         <w:lastRenderedPageBreak/>
@@ -445,10 +445,10 @@
         <w:t xml:space="preserve">LLM tabanlı kod çevirisinin doğruluğunu yürütme yoluyla </w:t>
       </w:r>
       <w:r>
-        <w:t>doğrulayan çalışmalar artmaktadır. Gandhi vd. [2], COBOL→Java çevirisinde execution-guided refinement ile %81.99 doğruluğa ulaşmıştır; bu çalışma benzer bir mantığı C→Rust'ta benimser. Eniser vd. [1], FLUORINE ile kod uzunluğu arttıkça çeviri hatası riskin</w:t>
-      </w:r>
-      <w:r>
-        <w:t>in arttığını gözlemlemiştir — bu çalışmanın bulguları bu gözlemle örtüşmez (§IV-B). Yin vd. [3], farklı LLM'lerin hata kök nedenlerinin büyük ölçüde benzer olduğunu göstermiştir; çoklu-model bulgularımız (§IV-F) bunu hem doğrular hem nüanslandırır: yalnızc</w:t>
+        <w:t>doğrulayan çalışmalar artmaktadır. Gandhi vd. [2], COBOL→Java çevirisinde execution-guided refinement ile %81.99 doğruluğa ulaşmıştır; bu çalışma benzer bir mantığı C→Rust'ta benimser. Eniser vd. [3], FLUORINE ile kod uzunluğu arttıkça çeviri hatası riskin</w:t>
+      </w:r>
+      <w:r>
+        <w:t>in arttığını gözlemlemiştir — bu çalışmanın bulguları bu gözlemle örtüşmez (§IV-B). Yin vd. [4], farklı LLM'lerin hata kök nedenlerinin büyük ölçüde benzer olduğunu göstermiştir; çoklu-model bulgularımız (§IV-F) bunu hem doğrular hem nüanslandırır: yalnızc</w:t>
       </w:r>
       <w:r>
         <w:t>a kök neden D kategorisi modelden bağımsızken, A, B, C, E, F, G, H, I kategorilerinin her biri en az bir modelde başarıyla atlatılmıştır.</w:t>
@@ -459,17 +459,13 @@
         <w:jc w:val="both"/>
       </w:pPr>
       <w:r>
-        <w:t>Kural tabanlı C→Rust çevirisi (ör. C2Rust [11]) ve nöral kod çevirisi (ör. TransCoder [12]) farklı bir eksende konumla</w:t>
-      </w:r>
-      <w:r>
-        <w:t>nır: kural tabanlı araçlar davranışsal eşdeğerliği sözdizimsel kurallarla (genellikle yoğun `unsafe` pahasına) garanti etmeye çalışırken, nöral/LLM yaklaşımlar deyimsel ama doğrulanmamış çeviriler üretir. Rust'ın tip sistemi ve ödünç denetleyicisi bellek g</w:t>
-      </w:r>
-      <w:r>
-        <w:t xml:space="preserve">üvenliğini derleme zamanında garanti eder, ama yalnızca kod derlenirse — davranışsal eşdeğerliği garanti etmez; bu çalışma tam olarak bu boşluğu, </w:t>
-      </w:r>
-      <w:r>
-        <w:lastRenderedPageBreak/>
-        <w:t>"derlenen ama kaynaktan farklı davranan" kodu, ölçmeyi hedefler.</w:t>
+        <w:t>Kural tabanlı C→Rust çevirisi (ör. C2Rust [5]) ve nöral kod çevirisi (ör. TransCoder [6]) farklı bir eksende konumlanı</w:t>
+      </w:r>
+      <w:r>
+        <w:t>r: kural tabanlı araçlar davranışsal eşdeğerliği sözdizimsel kurallarla (genellikle yoğun `unsafe` pahasına) garanti etmeye çalışırken, nöral/LLM yaklaşımlar deyimsel ama doğrulanmamış çeviriler üretir. Rust'ın tip sistemi ve ödünç denetleyicisi bellek güv</w:t>
+      </w:r>
+      <w:r>
+        <w:t>enliğini derleme zamanında garanti eder, ama yalnızca kod derlenirse — davranışsal eşdeğerliği garanti etmez; bu çalışma tam olarak bu boşluğu, "derlenen ama kaynaktan farklı davranan" kodu, ölçmeyi hedefler.</w:t>
       </w:r>
     </w:p>
     <w:p>
@@ -477,10 +473,11 @@
         <w:jc w:val="both"/>
       </w:pPr>
       <w:r>
-        <w:t xml:space="preserve">Bu çalışma literatürden üç noktada ayrışır: </w:t>
-      </w:r>
-      <w:r>
-        <w:t>(a) veri seti özgün ve tümüyle tekrarlanabilirdir; (b) derleme yapılandırmasının doğruluk üzerindeki gizli etkisi gösterilmiştir; (c) iki bağımsız model üzerinde gerçek, otomatik ölçümle kök neden düzeyinde bir model karşılaştırması sunulmuştur.</w:t>
+        <w:lastRenderedPageBreak/>
+        <w:t>Bu çalışma literatürden üç noktada ayrışır: (a)</w:t>
+      </w:r>
+      <w:r>
+        <w:t xml:space="preserve"> veri seti özgün ve tümüyle tekrarlanabilirdir; (b) derleme yapılandırmasının doğruluk üzerindeki gizli etkisi gösterilmiştir; (c) iki bağımsız model üzerinde gerçek, otomatik ölçümle kök neden düzeyinde bir model karşılaştırması sunulmuştur.</w:t>
       </w:r>
     </w:p>
     <w:p>
@@ -492,13 +489,7 @@
         <w:rPr>
           <w:b/>
         </w:rPr>
-        <w:t>III. YÖNTE</w:t>
-      </w:r>
-      <w:r>
-        <w:rPr>
-          <w:b/>
-        </w:rPr>
-        <w:t>M</w:t>
+        <w:t>III. YÖNTEM</w:t>
       </w:r>
     </w:p>
     <w:p>
@@ -510,7 +501,14 @@
           <w:b/>
           <w:i/>
         </w:rPr>
-        <w:t>A. Veri Seti</w:t>
+        <w:t>A</w:t>
+      </w:r>
+      <w:r>
+        <w:rPr>
+          <w:b/>
+          <w:i/>
+        </w:rPr>
+        <w:t>. Veri Seti</w:t>
       </w:r>
     </w:p>
     <w:p>
@@ -518,16 +516,16 @@
         <w:jc w:val="both"/>
       </w:pPr>
       <w:r>
-        <w:t>Kıyaslama seti 57 C programından oluşur (10-522 satır), dokuz aşamada genişletilmiştir (Tablo I): 24 temel algoritma; kod uzunluğu etkisini test etmek için 5 daha uzun program (s25-s29); bağımsızlığı sınamak için Rosetta Code'dan [4] 7 algor</w:t>
-      </w:r>
-      <w:r>
-        <w:t>itma (s30-s36), OpenBSD/FreeBSD libc'sinden [5] 3 üretim fonksiyonu (s37-s39) ve musl [6]/Redis [7]/cJSON [8]'dan 3 uzun üretim kodu (s46-s48); hedeflenmemiş boşlukları kapsayan 6 özgün program (s40-s45); hakem/danışman geri bildirimine yanıt olarak eklene</w:t>
-      </w:r>
-      <w:r>
-        <w:t>n beş kök-neden kategorisinin (C, E, F, G, H) ikinci örnekleri (s49-s53); ve çok dosyalı/pthread eşzamanlılığını (s54, s55, s57) ile karmaşık makro kullanımını (s56) test eden iki ek grup. Çekirdek algoritma her durumda kaynaktan değiştirilmeden alınmış, y</w:t>
-      </w:r>
-      <w:r>
-        <w:t>alnızca main() stdin/stdout sözleşmesine uyacak şekilde yeniden yazılmıştır; tam katalog açık veri deposunda sunulmuştur.</w:t>
+        <w:t>Kıyaslama seti 57 C programından oluşur (10-522 satır), dokuz aşamada genişletilmiştir (Tablo I): 24 temel algoritma; kod uzunluğu etkisini test etmek için 5 daha uzun program (s25-s29); bağımsızlığı sınamak için Rosetta Code'dan [7] 7 algoritm</w:t>
+      </w:r>
+      <w:r>
+        <w:t>a (s30-s36), OpenBSD/FreeBSD libc'sinden [8] 3 üretim fonksiyonu (s37-s39) ve musl [9]/Redis [10]/cJSON [11]'dan 3 uzun üretim kodu (s46-s48); hedeflenmemiş boşlukları kapsayan 6 özgün program (s40-s45); hakem/danışman geri bildirimine yanıt olarak eklenen</w:t>
+      </w:r>
+      <w:r>
+        <w:t xml:space="preserve"> beş kök-neden kategorisinin (C, E, F, G, H) ikinci örnekleri (s49-s53); ve çok dosyalı/pthread eşzamanlılığını (s54, s55, s57) ile karmaşık makro kullanımını (s56) test eden iki ek grup. Çekirdek algoritma her durumda kaynaktan değiştirilmeden alınmış, ya</w:t>
+      </w:r>
+      <w:r>
+        <w:t>lnızca main() stdin/stdout sözleşmesine uyacak şekilde yeniden yazılmıştır; tam katalog açık veri deposunda sunulmuştur.</w:t>
       </w:r>
     </w:p>
     <w:p>
@@ -551,13 +549,13 @@
           <w:sz w:val="16"/>
         </w:rPr>
         <w:lastRenderedPageBreak/>
-        <w:t>TABLO I. VERİ SETİNİN KAYNAK/ROL KATEGORİLERİNE GÖRE ÖZETİ (* Rosetta Code; ** OpenBSD/FreeBSD libc; *** mus</w:t>
+        <w:t>TABLO I. VERİ SETİNİN KAYNAK/ROL KATEGORİLERİNE GÖRE ÖZETİ (* Rosetta Code; ** OpenBSD/FreeBSD libc; *** musl</w:t>
       </w:r>
       <w:r>
         <w:rPr>
           <w:sz w:val="16"/>
         </w:rPr>
-        <w:t>l/Redis/cJSON — üçü de tarafımızca yazılmamış bağımsız/üretim kodu, bkz. §V-B).</w:t>
+        <w:t>/Redis/cJSON — üçü de tarafımızca yazılmamış bağımsız/üretim kodu, bkz. §V-B).</w:t>
       </w:r>
     </w:p>
     <w:tbl>
@@ -1604,26 +1602,26 @@
         <w:jc w:val="both"/>
       </w:pPr>
       <w:r>
-        <w:t>Ana çeviri modeli Anthropic Claude Sonnet 5'tir (model kimliği: claude-sonnet-5); ikinci, bağımsız model olarak Google Gemini API'si [9] (gemini-flash-latest, gerçek API çağrısıyla, temperature=0.2, top_p=1.0) kull</w:t>
-      </w:r>
-      <w:r>
-        <w:t>anılmıştır. Gemini kimliği sabit bir sürüm değil rotasyonlu bir takma addır ("-latest"); hangi anlık görüntüye (`modelVersion`) çözümlendiği o dönemde loglanmamıştır — tekrarlanabilirlik açısından kabul edilmesi gereken bir eksikliktir (§V-B), ölçümün zama</w:t>
-      </w:r>
-      <w:r>
-        <w:t>nsal bağlamı yalnızca erişim tarihleriyle (2026-07-22 – 2026-07-25) yeniden kurulabilir. İstem mühendisliği en yalın haliyle uygulanmıştır: modele yalnızca "bu C programını Rust'a çevir" istemi verilmiş, model derleme/test aracına erişememiştir (gerçek zer</w:t>
-      </w:r>
-      <w:r>
-        <w:t xml:space="preserve">o-shot). Değerlendirme betiği model-bağımsız tasarlanmıştır. Claude çevirileri ise etkileşimli bir asistan oturumunda (Claude Code CLI) üretilmiş; örnekleme parametreleri ayrı arşivlenmemiştir — </w:t>
+        <w:t>Ana çeviri modeli Anthropic Claude Sonnet 5'tir (model kimliği: claude-sonnet-5); ikinci, bağımsız model olarak Google Gemini API'si [12] (gemini-flash-latest, gerçek API çağrısıyla, temperature=0.2, top_p=1.0) kul</w:t>
+      </w:r>
+      <w:r>
+        <w:t>lanılmıştır. Gemini kimliği sabit bir sürüm değil rotasyonlu bir takma addır ("-latest"); hangi anlık görüntüye (`modelVersion`) çözümlendiği o dönemde loglanmamıştır — tekrarlanabilirlik açısından kabul edilmesi gereken bir eksikliktir (§V-B), ölçümün zam</w:t>
+      </w:r>
+      <w:r>
+        <w:t>ansal bağlamı yalnızca erişim tarihleriyle (2026-07-22 – 2026-07-25) yeniden kurulabilir. İstem mühendisliği en yalın haliyle uygulanmıştır: modele yalnızca "bu C programını Rust'a çevir" istemi verilmiş, model derleme/test aracına erişememiştir (gerçek ze</w:t>
+      </w:r>
+      <w:r>
+        <w:t xml:space="preserve">ro-shot). Değerlendirme betiği model-bağımsız tasarlanmıştır. Claude çevirileri ise etkileşimli bir asistan oturumunda (Claude Code CLI) üretilmiş; örnekleme parametreleri ayrı arşivlenmemiştir — </w:t>
       </w:r>
       <w:r>
         <w:lastRenderedPageBreak/>
-        <w:t>bu, tekrarlanabilirliği Gemini tarafına göre sınırlayan bir a</w:t>
-      </w:r>
-      <w:r>
-        <w:t>simetridir (§V-B). Her iki model için de her örnek yalnızca bir kez (k=1) çevrilmiştir; bu tek-örneklemli ölçümün model farkını mı örnekleme gürültüsünü mü yansıttığı bilinmemektedir (§V-B). Gemini ölçümü, ücretsiz katman günlük kota sınırı nedeniyle 2026-</w:t>
-      </w:r>
-      <w:r>
-        <w:t>07-22 – 2026-07-25 arasında kademeli tamamlanmıştır; tam çağrı kaydı (istem, zaman damgası, örnekleme parametreleri) her örnek için açık veri deposunda arşivlenmiştir.</w:t>
+        <w:t xml:space="preserve">bu, tekrarlanabilirliği Gemini tarafına göre sınırlayan bir </w:t>
+      </w:r>
+      <w:r>
+        <w:t>asimetridir (§V-B). Her iki model için de her örnek yalnızca bir kez (k=1) çevrilmiştir; bu tek-örneklemli ölçümün model farkını mı örnekleme gürültüsünü mü yansıttığı bilinmemektedir (§V-B). Gemini ölçümü, ücretsiz katman günlük kota sınırı nedeniyle 2026</w:t>
+      </w:r>
+      <w:r>
+        <w:t>-07-22 – 2026-07-25 arasında kademeli tamamlanmıştır; tam çağrı kaydı (istem, zaman damgası, örnekleme parametreleri) her örnek için açık veri deposunda arşivlenmiştir.</w:t>
       </w:r>
     </w:p>
     <w:p>
@@ -1643,13 +1641,13 @@
         <w:jc w:val="both"/>
       </w:pPr>
       <w:r>
-        <w:t>Hedef dilde önceden yazılmış birim test bulunma</w:t>
-      </w:r>
-      <w:r>
-        <w:t xml:space="preserve">dığından, doğruluk kaynak programla aynı girdide çalıştırılıp çıktı karşılaştırılarak (diferansiyel test) ölçülmüştür: C ve Rust ikilileri derlenir (Rust derlenmezse CE); her test girdisi için beklenen/alınan çıktı karşılaştırılır (zaman aşımı → NT, çökme </w:t>
-      </w:r>
-      <w:r>
-        <w:t xml:space="preserve">→ RE, fark → FE, eşitse PASS; Tablo II); bir örnek yalnızca </w:t>
+        <w:t>Hedef dilde önceden yazılmış birim test bulunm</w:t>
+      </w:r>
+      <w:r>
+        <w:t>adığından, doğruluk kaynak programla aynı girdide çalıştırılıp çıktı karşılaştırılarak (diferansiyel test) ölçülmüştür: C ve Rust ikilileri derlenir (Rust derlenmezse CE); her test girdisi için beklenen/alınan çıktı karşılaştırılır (zaman aşımı → NT, çökme</w:t>
+      </w:r>
+      <w:r>
+        <w:t xml:space="preserve"> → RE, fark → FE, eşitse PASS; Tablo II); bir örnek yalnızca </w:t>
       </w:r>
       <w:r>
         <w:rPr>
@@ -4645,10 +4643,10 @@
         <w:t xml:space="preserve">Doğrulama iki biçimde gerçekleşmiştir: (a) dört kategori (C, F, G, H) farklı bir kod deseni kullanan ikinci bir örnekle (s49, s51, s52, s53) yeniden sınanmış, kök neden her dördünde </w:t>
       </w:r>
       <w:r>
-        <w:t>tekrarlanmıştır (§IV-F); (b) kategori D üç bağımsız kod tabanında (iki özgün örnek + cJSON [8]) tekrarlanmış, kategori A ise veri setinin kendi içinde iki örnekte (s09, s14) görülmüştür — boşlukların veri setine özgü değil sistematik C↔Rust farkları olduğu</w:t>
-      </w:r>
-      <w:r>
-        <w:t>nu gösterir.</w:t>
+        <w:t>tekrarlanmıştır (§IV-F); (b) kategori D üç bağımsız kod tabanında (iki özgün örnek + cJSON [11]) tekrarlanmış, kategori A ise veri setinin kendi içinde iki örnekte (s09, s14) görülmüştür — boşlukların veri setine özgü değil sistematik C↔Rust farkları olduğ</w:t>
+      </w:r>
+      <w:r>
+        <w:t>unu gösterir.</w:t>
       </w:r>
     </w:p>
     <w:p>
@@ -4672,13 +4670,13 @@
       </w:r>
       <w:r>
         <w:lastRenderedPageBreak/>
-        <w:t xml:space="preserve">sarmasından gelir — bir düzeltme değil, farklı yapılandırmada tesadüfen doğru </w:t>
-      </w:r>
-      <w:r>
-        <w:t>sonuçtur; 12 FE'nin hiçbirini etkilemez. Round 2'de (zengin/oracle geri bildirim, yalnızca Claude üzerinde ölçülmüştür) EA %100'e ulaşır, ama bu bir üst sınırdır: Tablo VI, Round 1'de başarısız olan aynı 17 örneğin yeniden çevrilip 57 programlık tam veri s</w:t>
-      </w:r>
-      <w:r>
-        <w:t>etinin geri kalanıyla birlikte yeniden değerlendirilmesiyle hesaplanan EA'yı gösterir — kısıtlı geri bildirim seviyelerinde doğruluğun %86.0'a (Seviye B) ve %71.9'a (Seviye C, yalnızca başarısız test sayısı) düştüğünü ortaya koyar.</w:t>
+        <w:t>sarmasından gelir — bir düzeltme değil, farklı yapılandırmada tesadüfen doğru</w:t>
+      </w:r>
+      <w:r>
+        <w:t xml:space="preserve"> sonuçtur; 12 FE'nin hiçbirini etkilemez. Round 2'de (zengin/oracle geri bildirim, yalnızca Claude üzerinde ölçülmüştür) EA %100'e ulaşır, ama bu bir üst sınırdır: Tablo VI, Round 1'de başarısız olan aynı 17 örneğin yeniden çevrilip 57 programlık tam veri </w:t>
+      </w:r>
+      <w:r>
+        <w:t>setinin geri kalanıyla birlikte yeniden değerlendirilmesiyle hesaplanan EA'yı gösterir — kısıtlı geri bildirim seviyelerinde doğruluğun %86.0'a (Seviye B) ve %71.9'a (Seviye C, yalnızca başarısız test sayısı) düştüğünü ortaya koyar.</w:t>
       </w:r>
     </w:p>
     <w:p>
@@ -4825,13 +4823,13 @@
               <w:rPr>
                 <w:sz w:val="18"/>
               </w:rPr>
-              <w:t>Tam derleyici/panik metni + b</w:t>
-            </w:r>
-            <w:r>
-              <w:rPr>
-                <w:sz w:val="18"/>
-              </w:rPr>
-              <w:t>eklenen/alınan farkı</w:t>
+              <w:t xml:space="preserve">Tam </w:t>
+            </w:r>
+            <w:r>
+              <w:rPr>
+                <w:sz w:val="18"/>
+              </w:rPr>
+              <w:t>derleyici/panik metni + beklenen/alınan farkı</w:t>
             </w:r>
           </w:p>
         </w:tc>
@@ -6022,67 +6020,67 @@
         <w:rPr>
           <w:sz w:val="15"/>
         </w:rPr>
-        <w:t>[1] H. F. Eniser, H. Zhang, C. David, M. Wang, M. Ch</w:t>
+        <w:t>[1] Cybersecurity and Infrastructure Security Agency</w:t>
       </w:r>
       <w:r>
         <w:rPr>
           <w:sz w:val="15"/>
         </w:rPr>
-        <w:t>ristakis, B. Paulsen, J. Dodds, and D. Kroening, "Towards Translating Real-World Code with LLMs: A Study of Translating to Rust," arXiv:2405.11514, 2024.</w:t>
-      </w:r>
-    </w:p>
-    <w:p>
-      <w:pPr>
-        <w:spacing w:after="20"/>
-        <w:ind w:left="198" w:hanging="198"/>
-      </w:pPr>
+        <w:t xml:space="preserve"> (CISA), National Security Agency (NSA), Federal Bureau of Investigation (FBI) et al., "The Case for Memory Safe Roadmaps: Why both C-Suite Executives and Technical Experts Need to Take Memory Safe Coding Seriously," joint cybersecurity guidance, Dec. 2023</w:t>
+      </w:r>
       <w:r>
         <w:rPr>
           <w:sz w:val="15"/>
         </w:rPr>
-        <w:t>[2] S. Gandhi, M. Patwardhan, J. Khatri, L. Vig, and R. K. Medicherla, "Translation of Low-Resource CO</w:t>
-      </w:r>
+        <w:t>. [Online]. Available: cisa.gov/case-memory-safe-roadmaps</w:t>
+      </w:r>
+    </w:p>
+    <w:p>
+      <w:pPr>
+        <w:spacing w:after="20"/>
+        <w:ind w:left="198" w:hanging="198"/>
+      </w:pPr>
       <w:r>
         <w:rPr>
           <w:sz w:val="15"/>
         </w:rPr>
-        <w:t>BOL to Logically Correct and Readable Java leveraging High-Resource Java Refinement," in Proc. 1st Int. Workshop on Large Language Models for Code (LLM4Code '24), ICSE 2024, Lisbon, Portugal, pp. 46-53, doi: 10.1145/3643795.3648388.</w:t>
-      </w:r>
-    </w:p>
-    <w:p>
-      <w:pPr>
-        <w:spacing w:after="20"/>
-        <w:ind w:left="198" w:hanging="198"/>
-      </w:pPr>
+        <w:t>[2] S. Gandhi, M. Patwardhan, J. Khatri, L. Vig, and R. K. Medicherla, "Translation of Low-Resource COBOL to Logically Correct and Readable Java leveraging High-Resource Java Refinement," in Proc. 1</w:t>
+      </w:r>
       <w:r>
         <w:rPr>
           <w:sz w:val="15"/>
         </w:rPr>
-        <w:t>[3] X. Yin, C. Ni, T. N</w:t>
-      </w:r>
+        <w:t>st Int. Workshop on Large Language Models for Code (LLM4Code '24), ICSE 2024, Lisbon, Portugal, pp. 46-53, doi: 10.1145/3643795.3648388.</w:t>
+      </w:r>
+    </w:p>
+    <w:p>
+      <w:pPr>
+        <w:spacing w:after="20"/>
+        <w:ind w:left="198" w:hanging="198"/>
+      </w:pPr>
       <w:r>
         <w:rPr>
           <w:sz w:val="15"/>
         </w:rPr>
-        <w:t>. Nguyen, S. Wang, and X. Yang, "Rectifier: Code Translation with Corrector via LLMs," arXiv:2407.07472, 2024.</w:t>
-      </w:r>
-    </w:p>
-    <w:p>
-      <w:pPr>
-        <w:spacing w:after="20"/>
-        <w:ind w:left="198" w:hanging="198"/>
-      </w:pPr>
+        <w:t>[3] H. F. Eniser, H. Zhang, C. David, M. Wang, M. Christakis, B. Paulsen, J. Dodds, and D. Kroening, "Towards Translati</w:t>
+      </w:r>
       <w:r>
         <w:rPr>
           <w:sz w:val="15"/>
         </w:rPr>
-        <w:t>[4] Rosetta Code, rosettacode.org — Luhn test, Soundex, Levenshtein distance, 0-1 Knapsack, Towers of Hanoi, LCS, CRC-32 (C solutions). [Online].</w:t>
-      </w:r>
+        <w:t>ng Real-World Code with LLMs: A Study of Translating to Rust," arXiv:2405.11514, 2024.</w:t>
+      </w:r>
+    </w:p>
+    <w:p>
+      <w:pPr>
+        <w:spacing w:after="20"/>
+        <w:ind w:left="198" w:hanging="198"/>
+      </w:pPr>
       <w:r>
         <w:rPr>
           <w:sz w:val="15"/>
         </w:rPr>
-        <w:t xml:space="preserve"> Available: github.com/acmeism/RosettaCodeData</w:t>
+        <w:t>[4] X. Yin, C. Ni, T. N. Nguyen, S. Wang, and X. Yang, "Rectifier: Code Translation with Corrector via LLMs," arXiv:2407.07472, 2024.</w:t>
       </w:r>
     </w:p>
     <w:p>
@@ -6094,37 +6092,31 @@
         <w:rPr>
           <w:sz w:val="15"/>
         </w:rPr>
-        <w:t>[5] The Regents of the Univ. of California / OpenBSD and FreeBSD Projects, getopt.c (1987), strtol.c (1990), heapsort.c (1991). [Online]. Available: github.com/openbsd/src, github.com/freebsd/freebsd-src</w:t>
-      </w:r>
-    </w:p>
-    <w:p>
-      <w:pPr>
-        <w:spacing w:after="20"/>
-        <w:ind w:left="198" w:hanging="198"/>
-      </w:pPr>
+        <w:t>[5] Immunant, Inc., "C2Rust: migrat</w:t>
+      </w:r>
       <w:r>
         <w:rPr>
           <w:sz w:val="15"/>
         </w:rPr>
-        <w:t>[6] m</w:t>
-      </w:r>
+        <w:t>e C code to Rust," open-source project. [Online]. Available: github.com/immunant/c2rust</w:t>
+      </w:r>
+    </w:p>
+    <w:p>
+      <w:pPr>
+        <w:spacing w:after="20"/>
+        <w:ind w:left="198" w:hanging="198"/>
+      </w:pPr>
       <w:r>
         <w:rPr>
           <w:sz w:val="15"/>
         </w:rPr>
-        <w:t>usl libc Project (R. Felker et al.), qsort.c (smoothsort, L. Ochs, 2011). [Online]. Available: github.com/kraj/musl</w:t>
-      </w:r>
-    </w:p>
-    <w:p>
-      <w:pPr>
-        <w:spacing w:after="20"/>
-        <w:ind w:left="198" w:hanging="198"/>
-      </w:pPr>
+        <w:t>[6] B. Rozière, M.-A. Lachaux, L. Chanussot, and G. Lample, "Unsupervised Translation of Programming Languages," in Advances in Neural Information Processing Systems (N</w:t>
+      </w:r>
       <w:r>
         <w:rPr>
           <w:sz w:val="15"/>
         </w:rPr>
-        <w:t>[7] S. Sanfilippo et al., sds.c/sds.h (SDS v2.0), Redis 7.2.4. [Online]. Available: github.com/redis/redis (tag 7.2.4)</w:t>
+        <w:t>eurIPS) 33, 2020, arXiv:2006.03511.</w:t>
       </w:r>
     </w:p>
     <w:p>
@@ -6136,25 +6128,25 @@
         <w:rPr>
           <w:sz w:val="15"/>
         </w:rPr>
-        <w:t>[8] D. Gamble et al.,</w:t>
-      </w:r>
+        <w:t>[7] Rosetta Code, rosettacode.org — Luhn test, Soundex, Levenshtein distance, 0-1 Knapsack, Towers of Hanoi, LCS, CRC-32 (C solutions). [Online]. Available: github.com/acmeism/RosettaCodeData</w:t>
+      </w:r>
+    </w:p>
+    <w:p>
+      <w:pPr>
+        <w:spacing w:after="20"/>
+        <w:ind w:left="198" w:hanging="198"/>
+      </w:pPr>
       <w:r>
         <w:rPr>
           <w:sz w:val="15"/>
         </w:rPr>
-        <w:t xml:space="preserve"> cJSON.c (parse_number, print_number). [Online]. Available: github.com/DaveGamble/cJSON</w:t>
-      </w:r>
-    </w:p>
-    <w:p>
-      <w:pPr>
-        <w:spacing w:after="20"/>
-        <w:ind w:left="198" w:hanging="198"/>
-      </w:pPr>
+        <w:t>[8] The Regents of the Univ.</w:t>
+      </w:r>
       <w:r>
         <w:rPr>
           <w:sz w:val="15"/>
         </w:rPr>
-        <w:t>[9] Google, "Gemini API — gemini-flash-latest," 2025. [Online]. Available: ai.google.dev/gemini-api/docs</w:t>
+        <w:t xml:space="preserve"> of California / OpenBSD and FreeBSD Projects, getopt.c (1987), strtol.c (1990), heapsort.c (1991). [Online]. Available: github.com/openbsd/src, github.com/freebsd/freebsd-src</w:t>
       </w:r>
     </w:p>
     <w:p>
@@ -6166,19 +6158,25 @@
         <w:rPr>
           <w:sz w:val="15"/>
         </w:rPr>
-        <w:t>[10] Cybersecurity and Infrastructure Security Agency (CISA), N</w:t>
+        <w:t>[9] musl libc Project (R. Felker et al.), qsort.c (smoothsort, L. Ochs, 2011). [</w:t>
       </w:r>
       <w:r>
         <w:rPr>
           <w:sz w:val="15"/>
         </w:rPr>
-        <w:t>ational Security Agency (NSA), Federal Bureau of Investigation (FBI) et al., "The Case for Memory Safe Roadmaps: Why both C-Suite Executives and Technical Experts Need to Take Memory Safe Coding Seriously," joint cybersecurity guidance, Dec. 2023. [Online]</w:t>
-      </w:r>
+        <w:t>Online]. Available: github.com/kraj/musl</w:t>
+      </w:r>
+    </w:p>
+    <w:p>
+      <w:pPr>
+        <w:spacing w:after="20"/>
+        <w:ind w:left="198" w:hanging="198"/>
+      </w:pPr>
       <w:r>
         <w:rPr>
           <w:sz w:val="15"/>
         </w:rPr>
-        <w:t>. Available: cisa.gov/case-memory-safe-roadmaps</w:t>
+        <w:t>[10] S. Sanfilippo et al., sds.c/sds.h (SDS v2.0), Redis 7.2.4. [Online]. Available: github.com/redis/redis (tag 7.2.4)</w:t>
       </w:r>
     </w:p>
     <w:p>
@@ -6190,25 +6188,25 @@
         <w:rPr>
           <w:sz w:val="15"/>
         </w:rPr>
-        <w:t>[11] Immunant, Inc., "C2Rust: migrate C code to Rust," open-source project. [Online]. Available: github.com/immunant/c2rust</w:t>
-      </w:r>
-    </w:p>
-    <w:p>
-      <w:pPr>
-        <w:spacing w:after="20"/>
-        <w:ind w:left="198" w:hanging="198"/>
-      </w:pPr>
+        <w:t>[11] D. Gamble et al., cJSON.c (parse_number, print_number). [Online]. Available: github.com/Da</w:t>
+      </w:r>
       <w:r>
         <w:rPr>
           <w:sz w:val="15"/>
         </w:rPr>
-        <w:t>[12] B. Rozière, M.-A. Lachaux, L. Chanussot, and G. Lample, "Unsupervised Translati</w:t>
-      </w:r>
+        <w:t>veGamble/cJSON</w:t>
+      </w:r>
+    </w:p>
+    <w:p>
+      <w:pPr>
+        <w:spacing w:after="20"/>
+        <w:ind w:left="198" w:hanging="198"/>
+      </w:pPr>
       <w:r>
         <w:rPr>
           <w:sz w:val="15"/>
         </w:rPr>
-        <w:t>on of Programming Languages," in Advances in Neural Information Processing Systems (NeurIPS) 33, 2020, arXiv:2006.03511.</w:t>
+        <w:t>[12] Google, "Gemini API — gemini-flash-latest," 2025. [Online]. Available: ai.google.dev/gemini-api/docs</w:t>
       </w:r>
     </w:p>
     <w:p>
@@ -18148,7 +18146,7 @@
 </file>
 
 <file path=customXml/itemProps1.xml><?xml version="1.0" encoding="utf-8"?>
-<ds:datastoreItem xmlns:ds="http://schemas.openxmlformats.org/officeDocument/2006/customXml" ds:itemID="{F5713C00-6878-4661-9FF4-366285B5F8D2}">
+<ds:datastoreItem xmlns:ds="http://schemas.openxmlformats.org/officeDocument/2006/customXml" ds:itemID="{C3DBA1B8-DE7E-45A0-8D2A-17212F2F4ED1}">
   <ds:schemaRefs>
     <ds:schemaRef ds:uri="http://schemas.openxmlformats.org/officeDocument/2006/bibliography"/>
   </ds:schemaRefs>

</xml_diff>

<commit_message>
Bolum V-B'ye model x arayuz karistirici degisken notunu ekle
Kullanici onayiyla: Claude (etkilesimli CLI) ve Gemini (dogrudan API)
farkli arayuzlerde kosturuldugu icin McNemar farkinin ne kadarinin
modelden ne kadarinin kosum ortamindan geldigi ayristirilamadigi
belirtildi. Em-dash sayisi 32'de sabit kaldi, sayfa sayisi 8.
</commit_message>
<xml_diff>
--- a/makale_IEEE_v1.docx
+++ b/makale_IEEE_v1.docx
@@ -6237,7 +6237,14 @@
           <w:rFonts w:cs="Times New Roman"/>
           <w:szCs w:val="20"/>
         </w:rPr>
-        <w:t xml:space="preserve">age) ölçümü yapılmamıştır — bu, 522 satırlık s47_redis_sds gibi uzun örneklerde 4-5 test girdisiyle “PASS” denmesinin gücünü sınırlar. C her koşulda </w:t>
+        <w:t>age) ölçümü yapılmamıştır — bu, 522 satırlık s47_redis_sds gibi uzun örneklerde 4-5 test girdisiyle “PASS” denmesinin gücünü sınırlar. Ayrıca iki model farklı arayüzlerde koşturulmuştur (Claude etkileşimli CLI, Gemini doğrudan API); bu, model karşılaştırma</w:t>
+      </w:r>
+      <w:r>
+        <w:rPr>
+          <w:rFonts w:cs="Times New Roman"/>
+          <w:szCs w:val="20"/>
+        </w:rPr>
+        <w:t xml:space="preserve">sında yalnızca bir tekrarlanabilirlik asimetrisi değil, aynı zamanda bir karıştırıcı değişken (confounder) oluşturur; McNemar farkının ne kadarının modelden, ne kadarının koşum ortamından geldiği ayrıştırılamamıştır. C her koşulda </w:t>
       </w:r>
       <w:r>
         <w:rPr>
@@ -6351,14 +6358,14 @@
         <w:t>VII’deki betimsel model × kategori kırılımı, tek bir “en iyi model” aramak yerine kod tabanının niteliğine göre model seçimi veya çoklu-model oylaması (ensemble) araştırılmasını önerir. Somut olarak: (i) derleme başarısı yeterli değildir, diferansiyel test</w:t>
       </w:r>
       <w:r>
-        <w:t xml:space="preserve"> veya eşdeğeri bir yürütme tabanlı doğrulama zorunlu tutulmalıdır; (ii) dokuz kök-neden kategorisi (Tablo V) bir statik analiz/lint kuralı setine dönüştürülüp derleme hattına eklenebilir — özellikle derleyicinin yakalayamadığı unsigned aritmetik, char işar</w:t>
-      </w:r>
-      <w:r>
-        <w:t xml:space="preserve">etliliği ve çıktı biçimlendirme için; (iii) uzun/karmaşık üretim kodunda bu kategoride daha dayanıklı bulunan model </w:t>
+        <w:t xml:space="preserve"> veya eşdeğeri bir yürütme tabanlı doğrulama zorunlu tutulmalıdır; (ii) dokuz </w:t>
       </w:r>
       <w:r>
         <w:lastRenderedPageBreak/>
-        <w:t>(Claude) tercih edilebilir, kısa izole fonksiyonlarda iki model de kabul edilebilir; ancak bu öneri yalnızca iki model ve 57 örneğe dayanır,</w:t>
+        <w:t>kök-neden kategorisi (Tablo V) bir statik analiz/lint kuralı setine dönüştürülüp derleme hattına eklenebilir — özellikle derleyicinin yakalayamadığı unsigned aritmetik, char işar</w:t>
+      </w:r>
+      <w:r>
+        <w:t>etliliği ve çıktı biçimlendirme için; (iii) uzun/karmaşık üretim kodunda bu kategoride daha dayanıklı bulunan model (Claude) tercih edilebilir, kısa izole fonksiyonlarda iki model de kabul edilebilir; ancak bu öneri yalnızca iki model ve 57 örneğe dayanır,</w:t>
       </w:r>
       <w:r>
         <w:t xml:space="preserve"> daha geniş bir veri setiyle doğrulanmadan genel bir kural olarak benimsenmemelidir.</w:t>
@@ -6592,6 +6599,7 @@
         <w:rPr>
           <w:sz w:val="16"/>
         </w:rPr>
+        <w:lastRenderedPageBreak/>
         <w:t>[11] D. Gamble et al., cJSON.c (parse_number, print_number). [Online]. Available: https://github.com/DaveGamble/cJ</w:t>
       </w:r>
       <w:r>
@@ -6622,7 +6630,6 @@
         <w:rPr>
           <w:sz w:val="16"/>
         </w:rPr>
-        <w:lastRenderedPageBreak/>
         <w:t>[13] J. M. Hoenig and D. M. Heisey, “The Abuse of Power: The P</w:t>
       </w:r>
       <w:r>
@@ -18551,7 +18558,7 @@
 </file>
 
 <file path=customXml/itemProps1.xml><?xml version="1.0" encoding="utf-8"?>
-<ds:datastoreItem xmlns:ds="http://schemas.openxmlformats.org/officeDocument/2006/customXml" ds:itemID="{CEAD8B4E-5560-470C-8BA1-05A270136DDA}">
+<ds:datastoreItem xmlns:ds="http://schemas.openxmlformats.org/officeDocument/2006/customXml" ds:itemID="{2E734520-F7CD-4E5A-A78B-18FB6B5C2DB4}">
   <ds:schemaRefs>
     <ds:schemaRef ds:uri="http://schemas.openxmlformats.org/officeDocument/2006/bibliography"/>
   </ds:schemaRefs>

</xml_diff>

<commit_message>
Sayfa sayisini dusurme denemesi: IV-G'deki 3 paragrafi 2'ye birlestir, V-B Sinirlamalar'i sikistir, Sekil 2/4 genisligini daralt (7cm)
Sonuc: 8 sayfada kaldi (7. sayfanin her iki sutunu da tam dolu, son
sayfada yalnizca 2 kaynakca kaliyor); daha buyuk bir kesinti gerekir.

Co-Authored-By: Claude Sonnet 5 <noreply@anthropic.com>
</commit_message>
<xml_diff>
--- a/makale_IEEE_v1.docx
+++ b/makale_IEEE_v1.docx
@@ -3855,7 +3855,7 @@
       <w:r>
         <w:drawing>
           <wp:inline xmlns:a="http://schemas.openxmlformats.org/drawingml/2006/main" xmlns:pic="http://schemas.openxmlformats.org/drawingml/2006/picture">
-            <wp:extent cx="3024000" cy="1848231"/>
+            <wp:extent cx="2520000" cy="1540193"/>
             <wp:docPr id="2" name="Picture 2"/>
             <wp:cNvGraphicFramePr>
               <a:graphicFrameLocks noChangeAspect="1"/>
@@ -3876,7 +3876,7 @@
                   <pic:spPr>
                     <a:xfrm>
                       <a:off x="0" y="0"/>
-                      <a:ext cx="3024000" cy="1848231"/>
+                      <a:ext cx="2520000" cy="1540193"/>
                     </a:xfrm>
                     <a:prstGeom prst="rect"/>
                   </pic:spPr>
@@ -4004,7 +4004,7 @@
       <w:r>
         <w:drawing>
           <wp:inline xmlns:a="http://schemas.openxmlformats.org/drawingml/2006/main" xmlns:pic="http://schemas.openxmlformats.org/drawingml/2006/picture">
-            <wp:extent cx="3024000" cy="2025970"/>
+            <wp:extent cx="2520000" cy="1688308"/>
             <wp:docPr id="4" name="Picture 4"/>
             <wp:cNvGraphicFramePr>
               <a:graphicFrameLocks noChangeAspect="1"/>
@@ -4025,7 +4025,7 @@
                   <pic:spPr>
                     <a:xfrm>
                       <a:off x="0" y="0"/>
-                      <a:ext cx="3024000" cy="2025970"/>
+                      <a:ext cx="2520000" cy="1688308"/>
                     </a:xfrm>
                     <a:prstGeom prst="rect"/>
                   </pic:spPr>
@@ -7609,7 +7609,7 @@
           <w:sz w:val="20"/>
           <w:szCs w:val="20"/>
         </w:rPr>
-        <w:t>Gemini’nin Claude’da hiç görülmeyen üç başarısızlığı vardır. İkisi (s46_musl_qsort, s47_redis_sds) yukarıdaki üretim kodu üçlüsüne aittir: s46’da Gemini geçersiz bir işaretçi söz dizimi (</w:t>
+        <w:t>Gemini’nin Claude’da hiç görülmeyen üç başarısızlığı vardır: ikisi (s46_musl_qsort, s47_redis_sds) yukarıdaki üretim kodu üçlüsüne aittir — s46’da geçersiz bir işaretçi söz dizimi (</w:t>
       </w:r>
       <w:r>
         <w:rPr>
@@ -7625,7 +7625,7 @@
           <w:sz w:val="20"/>
           <w:szCs w:val="20"/>
         </w:rPr>
-        <w:t xml:space="preserve">) üretmiş; s47’de ekleme işleminin büyüme mantığını yanlış uygulayıp </w:t>
+        <w:t>), s47’de yanlış büyüme mantığı (</w:t>
       </w:r>
       <w:r>
         <w:rPr>
@@ -7641,7 +7641,7 @@
           <w:sz w:val="20"/>
           <w:szCs w:val="20"/>
         </w:rPr>
-        <w:t xml:space="preserve"> döndürmüştür — Claude’un s47’yi hiç unsafe kullanmadan, s46’yı ise sınırlı unsafe ile doğru çevirdiği hatırlanmalıdır (Bölüm IV-E). Üçüncüsü (s26_rpn_calculator) tamamen farklı bir hata sınıfıyla ilgilidir: model bir ödünç denetleyicisi hatası (E0499, iki </w:t>
+        <w:t xml:space="preserve">) üretilmiştir (Claude aynı ikisini sırasıyla sınırlı unsafe ve hiç unsafe kullanmadan doğru çevirmiştir, Bölüm IV-E); üçüncüsü (s26_rpn_calculator) bir ödünç denetleyicisi hatasıdır (E0499, iki </w:t>
       </w:r>
       <w:r>
         <w:rPr>
@@ -7657,22 +7657,7 @@
           <w:sz w:val="20"/>
           <w:szCs w:val="20"/>
         </w:rPr>
-        <w:t xml:space="preserve"> kapanışının aynı yığın işaretçisini yakalaması) üretmiş; Claude farklı bir kontrol akışı seçtiğinden bu hataya hiç maruz kalmamıştır. Bu üçünün ikisi derleme hatası (s46, s26), biri fonksiyonel hatadır (s47); ikisi (s46, s47) kod karmaşıklığına, biri (s26) modelin kendi hata profiline bağlıdır; bu, tek bir kök-neden taksonomisinin tüm modellere aynı biçimde uygulanamayabileceğini gösterir.</w:t>
-      </w:r>
-    </w:p>
-    <w:p>
-      <w:pPr>
-        <w:spacing w:after="60"/>
-        <w:ind w:firstLine="289"/>
-        <w:jc w:val="both"/>
-      </w:pPr>
-      <w:r>
-        <w:rPr>
-          <w:rFonts w:ascii="Times New Roman" w:hAnsi="Times New Roman" w:cs="Times New Roman"/>
-          <w:sz w:val="20"/>
-          <w:szCs w:val="20"/>
-        </w:rPr>
-        <w:t xml:space="preserve">Her iki modelin de başarısız olduğu üç örnek vardır: s15 (kategori D) aynı kök nedenden; s27_csv_stats ve s48_cjson_number’da ise farklı türde — Claude’da derlenen ama yanlış sonuç veren kod (FE), Gemini’de derleme aşamasında takılan geçersiz söz dizimi (CE: s27’de </w:t>
+        <w:t xml:space="preserve"> kapanışının aynı yığın işaretçisini yakalaması), Claude farklı bir kontrol akışıyla bu hataya hiç maruz kalmamıştır. İkisi derleme hatası (s46, s26), biri fonksiyonel hatadır (s47); bu karışım, tek bir kök-neden taksonomisinin tüm modellere aynı biçimde uygulanamayabileceğini gösterir. Her iki modelin de başarısız olduğu üç örnek de vardır: s15 aynı kök nedenden (kategori D); s27_csv_stats ve s48_cjson_number’da ise farklı türde — Claude’da derlenen ama yanlış sonuç veren kod (FE), Gemini’de geçersiz söz dizimi (CE: s27’de </w:t>
       </w:r>
       <w:r>
         <w:rPr>
@@ -7688,7 +7673,7 @@
           <w:sz w:val="20"/>
           <w:szCs w:val="20"/>
         </w:rPr>
-        <w:t xml:space="preserve"> biçim belirteci, s48’de işaretçi bildirimi hatası). Kategori D’nin üç bağımsız kod tabanının (s15, s27, s48) üçünde de başarısızlık, bu boşluğun modele özgü olmadığını doğrular. Çok dosyalı/eşzamanlı yapıda (s54, s55, s57) her iki model de ilk seferde başarılıdır; bu alt kümede (n=3) model farkı gözlenmemiştir.</w:t>
+        <w:t xml:space="preserve"> biçim belirteci, s48’de işaretçi bildirimi hatası). Kategori D’nin üç bağımsız kod tabanının (s15, s27, s48) üçünde de başarısızlık, bu boşluğun modele özgü olmadığını doğrular; çok dosyalı/eşzamanlı yapıda (s54, s55, s57) ise her iki model de ilk seferde başarılıdır (n=3, model farkı gözlenmemiştir).</w:t>
       </w:r>
     </w:p>
     <w:p>
@@ -7809,7 +7794,7 @@
           <w:sz w:val="20"/>
           <w:szCs w:val="20"/>
         </w:rPr>
-        <w:t xml:space="preserve">İç geçerlilik: test girdileri elle seçilmiş, referans çıktılar C programı çalıştırılarak üretilmiştir; sınır durumlarının sistematik bir kapsam (coverage) ölçümü yapılmamıştır — bu, 522 satırlık s47_redis_sds gibi uzun örneklerde 4-5 test girdisiyle “PASS” denmesinin gücünü sınırlar. Ayrıca iki model farklı arayüzlerde koşturulmuştur (Claude etkileşimli CLI, Gemini doğrudan API); bu, model karşılaştırmasında yalnızca bir tekrarlanabilirlik asimetrisi değil, aynı zamanda bir karıştırıcı değişken (confounder) oluşturur; McNemar farkının ne kadarının modelden, ne kadarının koşum ortamından geldiği ayrıştırılamamıştır. C her koşulda </w:t>
+        <w:t xml:space="preserve">İç geçerlilik: test girdileri elle seçilmiş, referans çıktılar C programı çalıştırılarak üretilmiştir; sınır durumu kapsamı sistematik ölçülmemiştir — 522 satırlık s47_redis_sds gibi uzun örneklerde 4-5 girdiyle “PASS” denmesinin gücünü sınırlar. İki model ayrıca farklı arayüzlerde koşturulmuştur (Claude etkileşimli CLI, Gemini doğrudan API); bu yalnızca bir tekrarlanabilirlik asimetrisi değil bir karıştırıcı değişkendir (confounder) — McNemar farkının ne kadarının modelden, ne kadarının koşum ortamından geldiği ayrıştırılamamıştır. C her koşulda </w:t>
       </w:r>
       <w:r>
         <w:rPr>
@@ -7825,7 +7810,7 @@
           <w:sz w:val="20"/>
           <w:szCs w:val="20"/>
         </w:rPr>
-        <w:t xml:space="preserve"> ile derlenirken Rust debug/release olarak ayrılmıştır (bilinçli bir tasarım kararı); C’nin farklı optimizasyon seviyelerinde tekrarlanması ayrı bir sağlamlık kontrolü olurdu. Her örnek yalnızca bir kez (k=1) çevrilmiştir; k=3-5 olsaydı pass@1/pass@k ile daha güvenilir bir tahmin elde edilebilirdi; bu, en önemli metodolojik sınırlamadır. İstatistiksel geçerlilik: FAIL grubu küçüktür (n=17); duyarlılık analizi (Bölüm IV-B) yalnızca orta-büyük etkilerin (|r| ≥ 0.46) saptanabileceğini göstermiştir. Üç çıkarımsal test (Mann-Whitney, Fisher, McNemar) keşif amaçlı okunmalıdır; Bonferroni düzeltmesinde (α=0.05/3≈0.0167) yalnızca McNemar (p=0.013) anlamlı kalır, dolayısıyla yorum değişmez. Dış geçerlilik: veri seti 57 program/229 girdiyle sınırlıdır, endüstriyel kod tabanlarına genellenemez; GPT-4o/DeepSeek adaptörleri API erişimi olmadığından çalıştırılamamış, çoklu-model bulgusu iki modelle sınırlıdır. Yapı geçerliliği: EA yalnızca gözlenen davranışsal eşdeğerliği ölçer; Seviye A oracle verdiğinden %100 yalnızca </w:t>
+        <w:t xml:space="preserve"> ile derlenirken Rust debug/release ayrılmıştır (bilinçli tasarım kararı); C’nin farklı optimizasyon seviyelerinde tekrarı ayrı bir sağlamlık kontrolü olurdu. Her örnek yalnızca bir kez (k=1) çevrilmiştir — en önemli metodolojik sınırlama; k=3-5 pass@1/pass@k için daha güvenilir bir tahmin verirdi. İstatistiksel geçerlilik: FAIL grubu küçüktür (n=17); duyarlılık analizi (Bölüm IV-B) yalnızca orta-büyük etkilerin (|r| ≥ 0.46) saptanabileceğini gösterir. Üç çıkarımsal test (Mann-Whitney, Fisher, McNemar) keşif amaçlıdır; Bonferroni düzeltmesinde (α=0.05/3≈0.0167) yalnızca McNemar (p=0.013) anlamlı kalır, yorum değişmez. Dış geçerlilik: veri seti 57 program/229 girdiyle sınırlıdır, endüstriyel kod tabanlarına genellenemez; GPT-4o/DeepSeek adaptörleri API erişimi olmadan çalıştırılamamış, çoklu-model bulgusu iki modelle sınırlı kalmıştır. Yapı geçerliliği: EA yalnızca gözlenen davranışsal eşdeğerliği ölçer; Seviye A oracle verdiğinden %100, yalnızca </w:t>
       </w:r>
       <w:r>
         <w:rPr>
@@ -7842,7 +7827,7 @@
           <w:sz w:val="20"/>
           <w:szCs w:val="20"/>
         </w:rPr>
-        <w:t xml:space="preserve"> girdilere karşı bir üst sınırdır, held-out doğrulama yapılmamıştır. Veri seti seçim yanlılığı: veri setinin 44/57’si bilinen boşlukları hedefler; dengeleyen 13 bağımsız örneğin 11’i geçmiştir. Kalıcı bir arşiv DOI’si henüz atanmamıştır; depo bağlantısı ve DOI kabul sonrası paylaşılacaktır (Bölüm III-F). Kategori C ve F’de “doğru davranış” referans platforma (Windows/LLP64) bağlıdır; bir kök neden değil bir artefakttır (Claude’un </w:t>
+        <w:t xml:space="preserve"> girdilere karşı bir üst sınırdır — held-out doğrulama yapılmamıştır. Veri seti seçim yanlılığı: veri setinin 44/57’si bilinen boşlukları hedefler; dengeleyen 13 bağımsız örneğin 11’i geçmiştir. Kalıcı bir arşiv DOI’si henüz atanmamıştır; depo bağlantısı ve DOI kabul sonrası paylaşılacaktır (Bölüm III-F). Kategori C ve F’de “doğru davranış” referans platforma (Windows/LLP64) bağlıdır; bir kök neden değil bir artefakttır (Claude’un </w:t>
       </w:r>
       <w:r>
         <w:rPr>

</xml_diff>

<commit_message>
7 hakem elestirisini tam coz: Docker/Linux tekrari 57 orneğe genisletildi, kor degerlendirme cumlesi duzeltildi, k=2 pass@k ve katman-eslestirilmis Haiku deneyleri eklendi, s46/s47/s48 icin ek sinir-durum testleri, Sekil 1-5 yuksek cozunurluklu hale getirildi. Bulgular hem makale_IEEE_v1.docx'e hem de LLM_Destekli_Kod_Cevirisinde_Sessiz_Semantik_Hatalar_4.docx'e (yazarin kendi surumu) entegre edildi.
Co-Authored-By: Claude Sonnet 5 <noreply@anthropic.com>
</commit_message>
<xml_diff>
--- a/makale_IEEE_v1.docx
+++ b/makale_IEEE_v1.docx
@@ -260,7 +260,7 @@
           <w:rFonts w:ascii="Times New Roman" w:hAnsi="Times New Roman"/>
           <w:sz w:val="18"/>
         </w:rPr>
-        <w:t>Büyük dil modellerinin (LLM) ürettiği C→Rust çevirilerinin davranışsal eşdeğerliği yeterince incelenmemiştir. Bu çalışma, 57 C programı ve 229 test girdisinden oluşan özgün bir kıyaslama setinde, Claude Sonnet 5’in zero-shot çevirilerini diferansiyel test ile ölçer: ham yürütme doğruluğu (EA) yalnızca %70.18’dir (40/57); başarısızlıkların %94.1’i (16/17) derleme aşamasında hiç yakalanmamış, %70.6’sı (12/17) ise çalışma zamanında da hiçbir sinyal üretmeden yanlış çıktı veren sessiz semantik hatalardır. Hatalar dokuz tekrar eden C↔Rust semantik boşluğuna ayrılmıştır; ortak örüntü, modelin kaynağın özgül davranış sözleşmesi yerine hedef dilin idiyomatik varsayılanını seçmesidir. Kod uzunluğu tek başına açıklayıcı değildir (Mann-Whitney U, p=0.359). Deney dört yönde genişletilmiştir: ikinci bir modelle (Google Gemini, 57/57 örnek üzerinde EA=%89.47) gerçek bir çoklu-model karşılaştırması, çok dosyalı/eşzamanlı C yapıları, Linux/LP64’te (Docker) 57 örneğin 55’i üzerinde bir tekrar (52/55 PASS), ve sınırlandırılmış geri bildirimle bir iyileştirme deneyi. Model karşılaştırması tek bir modelin “daha iyi” olmadığını gösterir: Gemini, Claude’un beş kök-neden kategorisinden dördünde tekrarladığı hataların tamamını atlatırken (5/5), gerçek üretim kodu üçlüsünde (musl/Redis/cJSON) Claude’un (2/3) aksine sıfır başarı (0/3) göstermiştir; genel EA farkı McNemar testiyle anlamlıdır (p=0.013), ama yön kategoriye göre değişir. Sessiz hata oranı da modele özgüdür: Claude’un 17 başarısızlığının 16’sı (%94.1) derleyiciden hiç uyarı almazken, Gemini’nin 6 başarısızlığının yalnızca 2’si (%33.3) derleyiciden uyarı almadan geçmiştir; kalan 4’ü derleme aşamasında yakalanmıştır. Bulgular, LLM destekli kod çevirisinde asıl riskin sözdizimsel değil sessiz semantik hatalar olduğunu ve (yalnızca Claude üzerinde ölçülen) doğrulama-geri bildirim döngüsünün doğruluğu %100’e taşıdığını, ancak bu rakamın zengin bir geri bildirime dayanan bir üst sınır olduğunu, kısıtlı geri bildirimde %71.9-86.0’a düştüğünü göstermektedir.</w:t>
+        <w:t>Büyük dil modellerinin (LLM) ürettiği C→Rust çevirilerinin davranışsal eşdeğerliği yeterince incelenmemiştir. Bu çalışma, 57 C programı ve 233 test girdisinden oluşan özgün bir kıyaslama setinde, Claude Sonnet 5’in zero-shot çevirilerini diferansiyel test ile ölçer: ham yürütme doğruluğu (EA) yalnızca %70.18’dir (40/57); başarısızlıkların %94.1’i derleme aşamasında hiç yakalanmamış, %70.6’sı ise çalışma zamanında da hiçbir sinyal üretmeden yanlış çıktı veren sessiz semantik hatalardır. Hatalar dokuz tekrar eden C↔Rust semantik boşluğuna ayrılmıştır; ortak örüntü, modelin kaynağın özgül davranış sözleşmesi yerine hedef dilin idiyomatik varsayılanını seçmesidir. Kod uzunluğu tek başına açıklayıcı değildir. Deney altı yönde genişletilmiştir: ikinci bir modelle (Google Gemini, EA=%89.47) gerçek bir çoklu-model karşılaştırması, çok dosyalı/eşzamanlı C yapıları, Linux/LP64’te (Docker) 57 örneğin tamamında bir tekrar (54/57 PASS), ve sınırlandırılmış geri bildirimle bir iyileştirme deneyi. Model karşılaştırması tek bir modelin genel olarak “daha iyi” olmadığını gösterir: Gemini, Claude’un tekrarladığı beş kök-neden kategorisinden dördünü tamamen atlatırken, gerçek üretim kodu üçlüsünde (musl/Redis/cJSON) sıfır başarı göstermiştir; genel fark istatistiksel olarak anlamlıdır ama yön kategoriye göre değişir. Sessiz hata oranı da modele özgüdür: Claude’da %94.1 iken Gemini’de yalnızca %33.3’tür. Bulgular, LLM destekli kod çevirisinde asıl riskin sözdizimsel değil sessiz semantik hatalar olduğunu; hata geri bildiriminin doğruluğu %100’e taşıyabildiğini ama bunun zengin geri bildirime dayanan bir üst sınır olduğunu, kısıtlı geri bildirimde %71.9-86.0’a düştüğünü göstermektedir. Tekrarlanabilirliği sınamak için yapılan bağımsız bir ikinci Claude denemesi (k=2), EA’yı %96.49’a taşımış ve k=1 ile sıfır ortak hata üretmiştir — tek-örneklemli EA’ların yüksek varyanslı olabileceğini doğrudan göstermektedir; katman-eşleştirilmiş bir karşılaştırma (Claude Haiku, %63.16) ise Sonnet-Flash farkının yalnızca model katmanından kaynaklanmadığını doğrulamıştır.</w:t>
       </w:r>
     </w:p>
     <w:p>
@@ -404,7 +404,7 @@
           <w:i w:val="0"/>
           <w:sz w:val="20"/>
         </w:rPr>
-        <w:t>Bu amaçla 57 C programı ve 229 test girdisinden oluşan özgün, tekrarlanabilir bir kıyaslama seti (“C→Rust Legacy Çeviri Benchmark’ı”) oluşturulmuş; her programın Claude ve Gemini çevirisi kaynağa karşı diferansiyel test ile doğrulanmıştır. Bu süreçte, bilinen C↔Rust semantik boşluklarını (tamsayı taşması, string modeli, işaretlilik, biçimlendirme, global durum) hedefleyen özgün bir veri seti oluşturulmuş, derleme modunun doğruluğu nasıl gizleyebileceği gösterilmiş ve dokuz kök nedene dayanan bir hata taksonomisi çıkarılmıştır. Bunun yanında üç farklı geri bildirim seviyesinde iyileştirme döngüsünün etkinliği ölçülmüş, 13 bağımsız gerçek dünya algoritması (Rosetta Code, OpenBSD/FreeBSD libc, musl/Redis/cJSON) üzerinde tekrarlanan bir ölçüm yapılmış ve 57 örneğin tamamı üzerinde gerçek, otomatik bir ikinci-model (Gemini) değerlendirmesiyle modele özgü ve modelden bağımsız hata kategorileri birbirinden ayrılmıştır.</w:t>
+        <w:t>Bu amaçla 57 C programı ve 233 test girdisinden oluşan özgün, tekrarlanabilir bir kıyaslama seti (“C→Rust Legacy Çeviri Benchmark’ı”) oluşturulmuş; her programın Claude ve Gemini çevirisi kaynağa karşı diferansiyel test ile doğrulanmıştır. Bu süreçte, bilinen C↔Rust semantik boşluklarını (tamsayı taşması, string modeli, işaretlilik, biçimlendirme, global durum) hedefleyen özgün bir veri seti oluşturulmuş, derleme modunun doğruluğu nasıl gizleyebileceği gösterilmiş ve dokuz kök nedene dayanan bir hata taksonomisi çıkarılmıştır. Bunun yanında üç farklı geri bildirim seviyesinde iyileştirme döngüsünün etkinliği ölçülmüş, 13 bağımsız gerçek dünya algoritması (Rosetta Code, OpenBSD/FreeBSD libc, musl/Redis/cJSON) üzerinde tekrarlanan bir ölçüm yapılmış ve 57 örneğin tamamı üzerinde gerçek, otomatik bir ikinci-model (Gemini) değerlendirmesiyle modele özgü ve modelden bağımsız hata kategorileri birbirinden ayrılmıştır.</w:t>
       </w:r>
     </w:p>
     <w:p>
@@ -2070,7 +2070,7 @@
           <w:sz w:val="20"/>
           <w:szCs w:val="20"/>
         </w:rPr>
-        <w:t>) çözümlendiği o dönemde loglanmamıştır — tekrarlanabilirlik açısından kabul edilmesi gereken bir eksikliktir (Bölüm V-B), ölçümün zamansal bağlamı yalnızca erişim tarihleriyle (2026-07-22 - 2026-07-25) yeniden kurulabilir. İstem mühendisliği en yalın haliyle uygulanmıştır: modele yalnızca “bu C programını Rust’a çevir” istemi verilmiş, model derleme/test aracına erişememiştir (gerçek zero-shot). Değerlendirme betiği model-bağımsız tasarlanmıştır. Claude çevirileri ise etkileşimli bir asistan oturumunda (Claude Code CLI) üretilmiş; örnekleme parametreleri ayrı arşivlenmemiştir; bu, tekrarlanabilirliği Gemini tarafına göre sınırlayan bir asimetridir (Bölüm V-B). Her iki model için de her örnek yalnızca bir kez (k=1) çevrilmiştir; bu tek-örneklemli ölçümün model farkını mı örnekleme gürültüsünü mü yansıttığı bilinmemektedir (Bölüm V-B). Gemini ölçümü, ücretsiz katman günlük kota sınırı nedeniyle 2026-07-22 - 2026-07-25 arasında kademeli tamamlanmıştır; çağrı kaydı (istem, zaman damgası, örnekleme parametreleri; modelVersion alanı hariç) her örnek için açık veri deposunda arşivlenmiştir.</w:t>
+        <w:t>) çözümlendiği o dönemde loglanmamıştır — tekrarlanabilirlik açısından kabul edilmesi gereken bir eksikliktir (Bölüm V-B), ölçümün zamansal bağlamı yalnızca erişim tarihleriyle (2026-07-22 - 2026-07-25) yeniden kurulabilir. İstem mühendisliği en yalın haliyle uygulanmıştır: modele yalnızca “bu C programını Rust’a çevir” istemi verilmiş, model derleme/test aracına erişememiştir (gerçek zero-shot). Değerlendirme betiği model-bağımsız tasarlanmıştır. Claude çevirileri ise etkileşimli bir asistan oturumunda (Claude Code CLI) üretilmiş; örnekleme parametreleri ayrı arşivlenmemiştir; bu, tekrarlanabilirliği Gemini tarafına göre sınırlayan bir asimetridir (Bölüm V-B). Her iki model için de her örnek yalnızca bir kez (k=1) çevrilmiştir; bu tek-örneklemli ölçümün model farkını mı örnekleme gürültüsünü mü yansıttığı bilinmemektedir (Bölüm V-B). Gemini ölçümü, ücretsiz katman günlük kota sınırı nedeniyle 2026-07-22 - 2026-07-25 arasında kademeli tamamlanmıştır; çağrı kaydı (istem, zaman damgası, örnekleme parametreleri; modelVersion alanı hariç) 57 örneğin 38'i için açık veri deposunda arşivlenmiştir — manifest günlüğü sürecin ortasında etkinleştirildiğinden ilk 19 örneğin (s01-s19) çağrı kaydı yoktur (Bölüm V-B).</w:t>
       </w:r>
     </w:p>
     <w:p>
@@ -2690,7 +2690,7 @@
           <w:sz w:val="20"/>
           <w:szCs w:val="20"/>
         </w:rPr>
-        <w:t xml:space="preserve"> ile, Cargo veya --edition bayrağı olmadan yapılmıştır (varsayılan edition, 2015 — bazı lint’lerin şiddeti edition’a göre değişir; ancak Kategori E’deki E0133 derleme hatası tüm edition’larda sert hatadır). Ayrıca gerçek bir Linux/LP64 ortamında (Docker, ubuntu:24.04) bir tekrar yapılmıştır; bu tekrar veri seti 55 örnekken gerçekleştirilmiş ve sonradan güncellenmemiştir (Bölüm IV-F). Zaman aşımı eşiği 5 sn’dir; yalnızca LLM çağrısı bire bir tekrarlanabilir değildir (Bölüm V-B). Tekrarlanabilirlik için gereken depo/erişim bilgileri Bölüm III-F’de sunulmuştur.</w:t>
+        <w:t xml:space="preserve"> ile, Cargo veya --edition bayrağı olmadan yapılmıştır (varsayılan edition, 2015 — bazı lint’lerin şiddeti edition’a göre değişir; ancak Kategori E’deki E0133 derleme hatası tüm edition’larda sert hatadır). Ayrıca gerçek bir Linux/LP64 ortamında (Docker, ubuntu:24.04) veri setinin tamamı (57 örnek) üzerinde bir tekrar yapılmıştır (Bölüm IV-F). Zaman aşımı eşiği 5 sn’dir; yalnızca LLM çağrısı bire bir tekrarlanabilir değildir (Bölüm V-B). Tekrarlanabilirlik için gereken depo/erişim bilgileri Bölüm III-F’de sunulmuştur.</w:t>
       </w:r>
     </w:p>
     <w:p>
@@ -2720,7 +2720,7 @@
           <w:i w:val="0"/>
           <w:sz w:val="20"/>
         </w:rPr>
-        <w:t>Tüm değerlendirme betikleri, veri seti, model çağrı kayıtları, istatistik ve platform-karşılaştırma raporları ile ham sonuçlar açık bir depoda erişime sunulmuştur. Kör değerlendirme sürecini korumak için depo bağlantısı ve kalıcı arşiv (Zenodo/figshare) DOI’si, kabul sonrası yayın aşamasında paylaşılacaktır. Bağımsız kaynaklardan alınan programlar ilgili açık lisanslar altında yeniden kullanılmıştır: Rosetta Code örnekleri GFDL 1.2/CC-BY-SA; OpenBSD/FreeBSD libc ve Redis SDS kodu BSD-3-Clause; musl ve cJSON kodu MIT lisansı altındadır. Her kaynak dosyanın başlığında lisans bilgisi ve yapılan değişiklikler belgelenmiştir.</w:t>
+        <w:t>Tüm değerlendirme betikleri, veri seti, model çağrı kayıtları, istatistik ve platform-karşılaştırma raporları ile ham sonuçlar açık bir depoda erişime sunulmuştur. Depo bağlantısı ve kalıcı arşiv (Zenodo/figshare) DOI’si henüz atanmamıştır; bu bilgiler kabul sonrası yayın aşamasında paylaşılacaktır. Bağımsız kaynaklardan alınan programlar ilgili açık lisanslar altında yeniden kullanılmıştır: Rosetta Code örnekleri GFDL 1.2/CC-BY-SA; OpenBSD/FreeBSD libc ve Redis SDS kodu BSD-3-Clause; musl ve cJSON kodu MIT lisansı altındadır. Her kaynak dosyanın başlığında lisans bilgisi ve yapılan değişiklikler belgelenmiştir.</w:t>
       </w:r>
     </w:p>
     <w:p>
@@ -3777,7 +3777,7 @@
           <w:i w:val="0"/>
           <w:sz w:val="20"/>
         </w:rPr>
-        <w:t xml:space="preserve">Program düzeyinde %70.18 olan doğruluk, test girdisi düzeyinde %86.3’tür (195/226 — CE olan örneğin girdileri çalıştırılamadığından payda 226’dır); bu, program-düzeyi metriğin katı (“tüm girdileri geçmelidir”) tanımından beklenen bir farktır. Daha çarpıcı olan: 12 FE örneğinin 6’sı (s06, s13, s15, s20, s27, s38) yalnızca </w:t>
+        <w:t xml:space="preserve">Program düzeyinde %70.18 olan doğruluk, test girdisi düzeyinde %86.1’dir (198/230 — CE olan örneğin girdileri çalıştırılamadığından payda 230’dır); bu, program-düzeyi metriğin katı (“tüm girdileri geçmelidir”) tanımından beklenen bir farktır. Daha çarpıcı olan: 12 FE örneğinin 6’sı (s06, s13, s15, s20, s27, s38) yalnızca </w:t>
       </w:r>
       <w:r>
         <w:rPr>
@@ -6633,6 +6633,20 @@
     </w:p>
     <w:p>
       <w:pPr>
+        <w:spacing w:after="60"/>
+        <w:ind w:firstLine="289"/>
+        <w:jc w:val="both"/>
+      </w:pPr>
+      <w:r>
+        <w:rPr>
+          <w:rFonts w:ascii="Times New Roman" w:hAnsi="Times New Roman"/>
+          <w:sz w:val="20"/>
+        </w:rPr>
+        <w:t>Bölüm V-B’de belirtilen bir sınırlamayı — Claude Sonnet 5’in üst-düzey (frontier), gemini-flash-latest’in ise hafif/hızlı katman bir model olması nedeniyle karşılaştırmanın adil olmayabileceği eleştirisini — doğrudan sınamak için, aynı 57 örnek katman-eşleştirilmiş bir üçüncü modelle, Claude Haiku 4.5 ile de çevrilmiştir (taze, bu çalışmanın bulgularından habersiz izole bir oturumda; yöntem ve doğrulama Bölüm IV-G’dekiyle aynıdır). Sonuç: EA=%63.16 (36/57; 2 CE, 2 RE, 17 FE) — hem Sonnet’in (%70.18) hem de Gemini Flash’ın (%89.47) belirgin altında (Tablo VII, 4. sütun). Bu, Sonnet-Flash farkının yalnızca “üst-düzey vs. hafif katman” karşılaştırmasından kaynaklanmadığını gösterir: katman eşleştirildiğinde de Gemini Flash, Claude’un hafif modelinden çok daha yüksek doğruluk göstermektedir (aradaki fark %26.3 puan — Sonnet-Flash farkından, %19.3 puan, bile daha büyüktür). Ayrıca Haiku’nun 2 derleme hatası, Sonnet’in 17 başarısızlığının hiçbirinde görülmeyen tamamen yeni bir türdendir: Rust’ın ödünç denetleyicisini (borrow checker) ihlal eden sözdizimsel/mekanik hatalar (ör. E0716 “temporary value dropped while borrowed”, E0502 “cannot borrow as mutable because also borrowed as immutable”) — C↔Rust semantik boşluklarından değil, doğrudan Rust’ın kendi tip/ödünç sistemini doğru uygulayamamaktan kaynaklanır. Bu, daha küçük modellerin yalnızca dokuz semantik kategoride değil, Rust’a özgü mekanik kurallarda da zorlanabileceğini düşündürür.</w:t>
+      </w:r>
+    </w:p>
+    <w:p>
+      <w:pPr>
         <w:sectPr>
           <w:type w:val="continuous"/>
           <w:pgSz w:w="11906" w:h="16838"/>
@@ -6675,6 +6689,7 @@
         <w:gridCol w:w="3888"/>
         <w:gridCol w:w="1440"/>
         <w:gridCol w:w="1440"/>
+        <w:gridCol w:w="1440"/>
       </w:tblGrid>
       <w:tr>
         <w:trPr>
@@ -6771,89 +6786,21 @@
             </w:r>
           </w:p>
         </w:tc>
-      </w:tr>
-      <w:tr>
-        <w:trPr>
-          <w:cantSplit/>
-        </w:trPr>
         <w:tc>
           <w:tcPr>
-            <w:tcW w:type="dxa" w:w="3888"/>
-            <w:vAlign w:val="center"/>
+            <w:tcW w:type="dxa" w:w="1440"/>
           </w:tcPr>
           <w:p>
             <w:pPr>
-              <w:spacing w:after="50" w:before="50" w:line="276" w:lineRule="auto"/>
-              <w:jc w:val="left"/>
-            </w:pPr>
-            <w:r>
-              <w:rPr>
-                <w:rFonts w:ascii="Times New Roman" w:hAnsi="Times New Roman"/>
-                <w:b w:val="0"/>
-                <w:sz w:val="16"/>
-              </w:rPr>
-            </w:r>
-            <w:r>
-              <w:rPr>
-                <w:rFonts w:ascii="Times New Roman" w:hAnsi="Times New Roman"/>
-                <w:b w:val="0"/>
-                <w:sz w:val="16"/>
-              </w:rPr>
-              <w:t>Temel algoritmalar (24)</w:t>
-            </w:r>
-          </w:p>
-        </w:tc>
-        <w:tc>
-          <w:tcPr>
-            <w:tcW w:type="dxa" w:w="1440"/>
-            <w:vAlign w:val="center"/>
-          </w:tcPr>
-          <w:p>
-            <w:pPr>
-              <w:spacing w:after="50" w:before="50" w:line="276" w:lineRule="auto"/>
               <w:jc w:val="center"/>
             </w:pPr>
             <w:r>
               <w:rPr>
                 <w:rFonts w:ascii="Times New Roman" w:hAnsi="Times New Roman"/>
-                <w:b w:val="0"/>
-                <w:sz w:val="16"/>
-              </w:rPr>
-            </w:r>
-            <w:r>
-              <w:rPr>
-                <w:rFonts w:ascii="Times New Roman" w:hAnsi="Times New Roman"/>
-                <w:b w:val="0"/>
-                <w:sz w:val="16"/>
-              </w:rPr>
-              <w:t>17/24</w:t>
-            </w:r>
-          </w:p>
-        </w:tc>
-        <w:tc>
-          <w:tcPr>
-            <w:tcW w:type="dxa" w:w="1440"/>
-            <w:vAlign w:val="center"/>
-          </w:tcPr>
-          <w:p>
-            <w:pPr>
-              <w:spacing w:after="50" w:before="50" w:line="276" w:lineRule="auto"/>
-              <w:jc w:val="center"/>
-            </w:pPr>
-            <w:r>
-              <w:rPr>
-                <w:rFonts w:ascii="Times New Roman" w:hAnsi="Times New Roman"/>
-                <w:b w:val="0"/>
-                <w:sz w:val="16"/>
-              </w:rPr>
-            </w:r>
-            <w:r>
-              <w:rPr>
-                <w:rFonts w:ascii="Times New Roman" w:hAnsi="Times New Roman"/>
-                <w:b w:val="0"/>
-                <w:sz w:val="16"/>
-              </w:rPr>
-              <w:t>23/24</w:t>
+                <w:b/>
+                <w:sz w:val="16"/>
+              </w:rPr>
+              <w:t>Haiku</w:t>
             </w:r>
           </w:p>
         </w:tc>
@@ -6885,7 +6832,7 @@
                 <w:b w:val="0"/>
                 <w:sz w:val="16"/>
               </w:rPr>
-              <w:t>Uzun özgün (5)</w:t>
+              <w:t>Temel algoritmalar (24)</w:t>
             </w:r>
           </w:p>
         </w:tc>
@@ -6912,7 +6859,7 @@
                 <w:b w:val="0"/>
                 <w:sz w:val="16"/>
               </w:rPr>
-              <w:t>4/5</w:t>
+              <w:t>17/24</w:t>
             </w:r>
           </w:p>
         </w:tc>
@@ -6939,7 +6886,25 @@
                 <w:b w:val="0"/>
                 <w:sz w:val="16"/>
               </w:rPr>
-              <w:t>3/5</w:t>
+              <w:t>23/24</w:t>
+            </w:r>
+          </w:p>
+        </w:tc>
+        <w:tc>
+          <w:tcPr>
+            <w:tcW w:type="dxa" w:w="1440"/>
+          </w:tcPr>
+          <w:p>
+            <w:pPr>
+              <w:jc w:val="center"/>
+            </w:pPr>
+            <w:r>
+              <w:rPr>
+                <w:rFonts w:ascii="Times New Roman" w:hAnsi="Times New Roman"/>
+                <w:b w:val="0"/>
+                <w:sz w:val="16"/>
+              </w:rPr>
+              <w:t>14/24</w:t>
             </w:r>
           </w:p>
         </w:tc>
@@ -6971,7 +6936,7 @@
                 <w:b w:val="0"/>
                 <w:sz w:val="16"/>
               </w:rPr>
-              <w:t>Rosetta Code (7)</w:t>
+              <w:t>Uzun özgün (5)</w:t>
             </w:r>
           </w:p>
         </w:tc>
@@ -6998,7 +6963,7 @@
                 <w:b w:val="0"/>
                 <w:sz w:val="16"/>
               </w:rPr>
-              <w:t>7/7</w:t>
+              <w:t>4/5</w:t>
             </w:r>
           </w:p>
         </w:tc>
@@ -7025,7 +6990,25 @@
                 <w:b w:val="0"/>
                 <w:sz w:val="16"/>
               </w:rPr>
-              <w:t>7/7</w:t>
+              <w:t>3/5</w:t>
+            </w:r>
+          </w:p>
+        </w:tc>
+        <w:tc>
+          <w:tcPr>
+            <w:tcW w:type="dxa" w:w="1440"/>
+          </w:tcPr>
+          <w:p>
+            <w:pPr>
+              <w:jc w:val="center"/>
+            </w:pPr>
+            <w:r>
+              <w:rPr>
+                <w:rFonts w:ascii="Times New Roman" w:hAnsi="Times New Roman"/>
+                <w:b w:val="0"/>
+                <w:sz w:val="16"/>
+              </w:rPr>
+              <w:t>2/5</w:t>
             </w:r>
           </w:p>
         </w:tc>
@@ -7057,7 +7040,7 @@
                 <w:b w:val="0"/>
                 <w:sz w:val="16"/>
               </w:rPr>
-              <w:t>BSD libc (3)</w:t>
+              <w:t>Rosetta Code (7)</w:t>
             </w:r>
           </w:p>
         </w:tc>
@@ -7084,7 +7067,7 @@
                 <w:b w:val="0"/>
                 <w:sz w:val="16"/>
               </w:rPr>
-              <w:t>2/3</w:t>
+              <w:t>7/7</w:t>
             </w:r>
           </w:p>
         </w:tc>
@@ -7111,7 +7094,25 @@
                 <w:b w:val="0"/>
                 <w:sz w:val="16"/>
               </w:rPr>
-              <w:t>3/3</w:t>
+              <w:t>7/7</w:t>
+            </w:r>
+          </w:p>
+        </w:tc>
+        <w:tc>
+          <w:tcPr>
+            <w:tcW w:type="dxa" w:w="1440"/>
+          </w:tcPr>
+          <w:p>
+            <w:pPr>
+              <w:jc w:val="center"/>
+            </w:pPr>
+            <w:r>
+              <w:rPr>
+                <w:rFonts w:ascii="Times New Roman" w:hAnsi="Times New Roman"/>
+                <w:b w:val="0"/>
+                <w:sz w:val="16"/>
+              </w:rPr>
+              <w:t>7/7</w:t>
             </w:r>
           </w:p>
         </w:tc>
@@ -7143,7 +7144,7 @@
                 <w:b w:val="0"/>
                 <w:sz w:val="16"/>
               </w:rPr>
-              <w:t>Hedeflenmemiş boşluk (6)</w:t>
+              <w:t>BSD libc (3)</w:t>
             </w:r>
           </w:p>
         </w:tc>
@@ -7170,7 +7171,7 @@
                 <w:b w:val="0"/>
                 <w:sz w:val="16"/>
               </w:rPr>
-              <w:t>4/6</w:t>
+              <w:t>2/3</w:t>
             </w:r>
           </w:p>
         </w:tc>
@@ -7197,7 +7198,25 @@
                 <w:b w:val="0"/>
                 <w:sz w:val="16"/>
               </w:rPr>
-              <w:t>6/6</w:t>
+              <w:t>3/3</w:t>
+            </w:r>
+          </w:p>
+        </w:tc>
+        <w:tc>
+          <w:tcPr>
+            <w:tcW w:type="dxa" w:w="1440"/>
+          </w:tcPr>
+          <w:p>
+            <w:pPr>
+              <w:jc w:val="center"/>
+            </w:pPr>
+            <w:r>
+              <w:rPr>
+                <w:rFonts w:ascii="Times New Roman" w:hAnsi="Times New Roman"/>
+                <w:b w:val="0"/>
+                <w:sz w:val="16"/>
+              </w:rPr>
+              <w:t>0/3</w:t>
             </w:r>
           </w:p>
         </w:tc>
@@ -7229,7 +7248,7 @@
                 <w:b w:val="0"/>
                 <w:sz w:val="16"/>
               </w:rPr>
-              <w:t>musl/Redis/cJSON (3)</w:t>
+              <w:t>Hedeflenmemiş boşluk (6)</w:t>
             </w:r>
           </w:p>
         </w:tc>
@@ -7256,7 +7275,7 @@
                 <w:b w:val="0"/>
                 <w:sz w:val="16"/>
               </w:rPr>
-              <w:t>2/3</w:t>
+              <w:t>4/6</w:t>
             </w:r>
           </w:p>
         </w:tc>
@@ -7283,7 +7302,25 @@
                 <w:b w:val="0"/>
                 <w:sz w:val="16"/>
               </w:rPr>
-              <w:t>0/3</w:t>
+              <w:t>6/6</w:t>
+            </w:r>
+          </w:p>
+        </w:tc>
+        <w:tc>
+          <w:tcPr>
+            <w:tcW w:type="dxa" w:w="1440"/>
+          </w:tcPr>
+          <w:p>
+            <w:pPr>
+              <w:jc w:val="center"/>
+            </w:pPr>
+            <w:r>
+              <w:rPr>
+                <w:rFonts w:ascii="Times New Roman" w:hAnsi="Times New Roman"/>
+                <w:b w:val="0"/>
+                <w:sz w:val="16"/>
+              </w:rPr>
+              <w:t>5/6</w:t>
             </w:r>
           </w:p>
         </w:tc>
@@ -7315,7 +7352,7 @@
                 <w:b w:val="0"/>
                 <w:sz w:val="16"/>
               </w:rPr>
-              <w:t>Kök-neden 2.örnek (5)</w:t>
+              <w:t>musl/Redis/cJSON (3)</w:t>
             </w:r>
           </w:p>
         </w:tc>
@@ -7342,7 +7379,7 @@
                 <w:b w:val="0"/>
                 <w:sz w:val="16"/>
               </w:rPr>
-              <w:t>1/5</w:t>
+              <w:t>2/3</w:t>
             </w:r>
           </w:p>
         </w:tc>
@@ -7369,7 +7406,25 @@
                 <w:b w:val="0"/>
                 <w:sz w:val="16"/>
               </w:rPr>
-              <w:t>5/5</w:t>
+              <w:t>0/3</w:t>
+            </w:r>
+          </w:p>
+        </w:tc>
+        <w:tc>
+          <w:tcPr>
+            <w:tcW w:type="dxa" w:w="1440"/>
+          </w:tcPr>
+          <w:p>
+            <w:pPr>
+              <w:jc w:val="center"/>
+            </w:pPr>
+            <w:r>
+              <w:rPr>
+                <w:rFonts w:ascii="Times New Roman" w:hAnsi="Times New Roman"/>
+                <w:b w:val="0"/>
+                <w:sz w:val="16"/>
+              </w:rPr>
+              <w:t>1/3</w:t>
             </w:r>
           </w:p>
         </w:tc>
@@ -7401,7 +7456,7 @@
                 <w:b w:val="0"/>
                 <w:sz w:val="16"/>
               </w:rPr>
-              <w:t>Çok dosyalı (3)</w:t>
+              <w:t>Kök-neden 2.örnek (5)</w:t>
             </w:r>
           </w:p>
         </w:tc>
@@ -7428,7 +7483,7 @@
                 <w:b w:val="0"/>
                 <w:sz w:val="16"/>
               </w:rPr>
-              <w:t>3/3</w:t>
+              <w:t>1/5</w:t>
             </w:r>
           </w:p>
         </w:tc>
@@ -7455,7 +7510,25 @@
                 <w:b w:val="0"/>
                 <w:sz w:val="16"/>
               </w:rPr>
-              <w:t>3/3</w:t>
+              <w:t>5/5</w:t>
+            </w:r>
+          </w:p>
+        </w:tc>
+        <w:tc>
+          <w:tcPr>
+            <w:tcW w:type="dxa" w:w="1440"/>
+          </w:tcPr>
+          <w:p>
+            <w:pPr>
+              <w:jc w:val="center"/>
+            </w:pPr>
+            <w:r>
+              <w:rPr>
+                <w:rFonts w:ascii="Times New Roman" w:hAnsi="Times New Roman"/>
+                <w:b w:val="0"/>
+                <w:sz w:val="16"/>
+              </w:rPr>
+              <w:t>4/5</w:t>
             </w:r>
           </w:p>
         </w:tc>
@@ -7487,7 +7560,7 @@
                 <w:b w:val="0"/>
                 <w:sz w:val="16"/>
               </w:rPr>
-              <w:t>Karmaşık makro (1)</w:t>
+              <w:t>Çok dosyalı (3)</w:t>
             </w:r>
           </w:p>
         </w:tc>
@@ -7514,7 +7587,7 @@
                 <w:b w:val="0"/>
                 <w:sz w:val="16"/>
               </w:rPr>
-              <w:t>0/1</w:t>
+              <w:t>3/3</w:t>
             </w:r>
           </w:p>
         </w:tc>
@@ -7541,7 +7614,129 @@
                 <w:b w:val="0"/>
                 <w:sz w:val="16"/>
               </w:rPr>
+              <w:t>3/3</w:t>
+            </w:r>
+          </w:p>
+        </w:tc>
+        <w:tc>
+          <w:tcPr>
+            <w:tcW w:type="dxa" w:w="1440"/>
+          </w:tcPr>
+          <w:p>
+            <w:pPr>
+              <w:jc w:val="center"/>
+            </w:pPr>
+            <w:r>
+              <w:rPr>
+                <w:rFonts w:ascii="Times New Roman" w:hAnsi="Times New Roman"/>
+                <w:b w:val="0"/>
+                <w:sz w:val="16"/>
+              </w:rPr>
+              <w:t>3/3</w:t>
+            </w:r>
+          </w:p>
+        </w:tc>
+      </w:tr>
+      <w:tr>
+        <w:trPr>
+          <w:cantSplit/>
+        </w:trPr>
+        <w:tc>
+          <w:tcPr>
+            <w:tcW w:type="dxa" w:w="3888"/>
+            <w:vAlign w:val="center"/>
+          </w:tcPr>
+          <w:p>
+            <w:pPr>
+              <w:spacing w:after="50" w:before="50" w:line="276" w:lineRule="auto"/>
+              <w:jc w:val="left"/>
+            </w:pPr>
+            <w:r>
+              <w:rPr>
+                <w:rFonts w:ascii="Times New Roman" w:hAnsi="Times New Roman"/>
+                <w:b w:val="0"/>
+                <w:sz w:val="16"/>
+              </w:rPr>
+            </w:r>
+            <w:r>
+              <w:rPr>
+                <w:rFonts w:ascii="Times New Roman" w:hAnsi="Times New Roman"/>
+                <w:b w:val="0"/>
+                <w:sz w:val="16"/>
+              </w:rPr>
+              <w:t>Karmaşık makro (1)</w:t>
+            </w:r>
+          </w:p>
+        </w:tc>
+        <w:tc>
+          <w:tcPr>
+            <w:tcW w:type="dxa" w:w="1440"/>
+            <w:vAlign w:val="center"/>
+          </w:tcPr>
+          <w:p>
+            <w:pPr>
+              <w:spacing w:after="50" w:before="50" w:line="276" w:lineRule="auto"/>
+              <w:jc w:val="center"/>
+            </w:pPr>
+            <w:r>
+              <w:rPr>
+                <w:rFonts w:ascii="Times New Roman" w:hAnsi="Times New Roman"/>
+                <w:b w:val="0"/>
+                <w:sz w:val="16"/>
+              </w:rPr>
+            </w:r>
+            <w:r>
+              <w:rPr>
+                <w:rFonts w:ascii="Times New Roman" w:hAnsi="Times New Roman"/>
+                <w:b w:val="0"/>
+                <w:sz w:val="16"/>
+              </w:rPr>
+              <w:t>0/1</w:t>
+            </w:r>
+          </w:p>
+        </w:tc>
+        <w:tc>
+          <w:tcPr>
+            <w:tcW w:type="dxa" w:w="1440"/>
+            <w:vAlign w:val="center"/>
+          </w:tcPr>
+          <w:p>
+            <w:pPr>
+              <w:spacing w:after="50" w:before="50" w:line="276" w:lineRule="auto"/>
+              <w:jc w:val="center"/>
+            </w:pPr>
+            <w:r>
+              <w:rPr>
+                <w:rFonts w:ascii="Times New Roman" w:hAnsi="Times New Roman"/>
+                <w:b w:val="0"/>
+                <w:sz w:val="16"/>
+              </w:rPr>
+            </w:r>
+            <w:r>
+              <w:rPr>
+                <w:rFonts w:ascii="Times New Roman" w:hAnsi="Times New Roman"/>
+                <w:b w:val="0"/>
+                <w:sz w:val="16"/>
+              </w:rPr>
               <w:t>1/1</w:t>
+            </w:r>
+          </w:p>
+        </w:tc>
+        <w:tc>
+          <w:tcPr>
+            <w:tcW w:type="dxa" w:w="1440"/>
+          </w:tcPr>
+          <w:p>
+            <w:pPr>
+              <w:jc w:val="center"/>
+            </w:pPr>
+            <w:r>
+              <w:rPr>
+                <w:rFonts w:ascii="Times New Roman" w:hAnsi="Times New Roman"/>
+                <w:b w:val="0"/>
+                <w:sz w:val="16"/>
+              </w:rPr>
+              <w:t>0/1</w:t>
             </w:r>
           </w:p>
         </w:tc>
@@ -7557,7 +7752,7 @@
           <w:rFonts w:ascii="Times New Roman" w:hAnsi="Times New Roman"/>
           <w:sz w:val="15"/>
         </w:rPr>
-        <w:t>a. 57/57, her iki model için tam.</w:t>
+        <w:t>a. 57/57, üç model için de tam.</w:t>
       </w:r>
     </w:p>
     <w:p>
@@ -7688,7 +7883,7 @@
           <w:sz w:val="20"/>
           <w:szCs w:val="20"/>
         </w:rPr>
-        <w:t xml:space="preserve">Son olarak, deney gerçek bir Linux/LP64 ortamında (Docker) bir tekrar ile de genişletilmiştir (52/55 PASS; veri seti 55 örnekken, s56/s57 eklenmeden önce, yapıldığından n=55 üzerindendir). Bu, en önemli ek bulguyu vermiştir: Windows’ta ölçülen %100 Round-2 doğruluğu Linux’ta %94.55’e (52/55) düşmüştür. Üç örnekte farklı sonuç gözlenmiştir: s38 ve s51’in Round 2 düzeltmeleri 32-bit </w:t>
+        <w:t xml:space="preserve">Son olarak, deney gerçek bir Linux/LP64 ortamında (Docker) veri setinin tamamı (57 örnek) üzerinde bir tekrar ile de genişletilmiştir. Bu, en önemli ek bulguyu vermiştir: Windows’ta ölçülen %100 Round-2 doğruluğu Linux’ta %94.74’e (54/57) düşmüştür; aynı yön Round 1’de de gözlenir (debug %70.18→%71.93, release %73.68→%75.44 — Linux’ta hafifçe daha yüksek EA, aşağıda açıklanan üç örneğin ikisinin bu koşullarda platform lehine dönmesinden kaynaklanır). Veri setine sonradan eklenen s56 ve s57, üç koşulun hiçbirinde platforma bağlı bir fark göstermemiştir — bu, aşağıdaki üç örneğin platforma duyarlılığının veri setine özgü bir tesadüf değil, hedeflenen belirli semantik boşluklara (tamsayı genişliği, stdio metin modu) özgü olduğunu güçlendirir. Üç örnekte farklı sonuç gözlenmiştir: s38 ve s51’in Round 2 düzeltmeleri 32-bit </w:t>
       </w:r>
       <w:r>
         <w:rPr>
@@ -7721,6 +7916,46 @@
           <w:szCs w:val="20"/>
         </w:rPr>
         <w:t>’unda geçersiz kalmıştır (bir platformda doğrulanmış bir düzeltme başka platformda geçersiz olabilir); s47_redis_sds’teki neden ise Rust çevirisiyle ilgili değildir — bir test girdisi (05.txt) CRLF içerir ve Windows’un C çalışma zamanı bunu \r\n→\n’e çevirirken Linux/glibc çevirmez, yani C referans programının kendisi (Rust çevirisi değil) iki platformda farklı sayıda komut tüketir. Yani hem “düzeltilmiş bir çeviri evrensel doğrudur” varsayımı hem de referans C programının platformlar arası tam taşınabilirliği yanlış olabilir.</w:t>
+      </w:r>
+    </w:p>
+    <w:p>
+      <w:pPr/>
+      <w:r>
+        <w:rPr>
+          <w:rFonts w:ascii="Times New Roman" w:hAnsi="Times New Roman"/>
+          <w:b w:val="0"/>
+          <w:i/>
+          <w:sz w:val="20"/>
+        </w:rPr>
+        <w:t>G. Tekrarlanabilirlik: pass@k Ölçümü</w:t>
+      </w:r>
+    </w:p>
+    <w:p>
+      <w:pPr>
+        <w:spacing w:after="60"/>
+        <w:ind w:firstLine="289"/>
+        <w:jc w:val="both"/>
+      </w:pPr>
+      <w:r>
+        <w:rPr>
+          <w:rFonts w:ascii="Times New Roman" w:hAnsi="Times New Roman"/>
+          <w:sz w:val="20"/>
+        </w:rPr>
+        <w:t>Bölüm V-B’de k=1 ölçümünün en önemli metodolojik sınırlama olduğu belirtilmişti: her örnek yalnızca bir kez çevrildiğinden, raporlanan EA’nın gerçek model performansını mı yoksa örnekleme gürültüsünü mü yansıttığı bilinmiyordu. Bunu doğrudan sınamak için, aynı 57 C programı, bu çalışmanın bulgularından ve önceki çevirilerden tamamen habersiz, izole bir Claude Sonnet 5 oturumuyla ikinci kez (k=2) çevrilmiştir; izolasyon, oturumun yalnızca samples_c/ altındaki kaynak dosyaları okuduğu ve yalnızca kendi çıktı dizinine yazdığı, başka hiçbir depo dosyasına erişmediği tam işlem kaydı (transcript) denetlenerek doğrulanmıştır. Sonuç çarpıcıdır: EA=%96.49 (55/57) — k=1’in (%70.18) 26.3 puan üzerinde. Daha da dikkat çekici olan, iki koşum arasındaki örtüşmenin sıfır olmasıdır: k=1’in 17 başarısızlığının tamamı k=2’de düzelmiş, ama k=2’de daha önce hiç görülmemiş 2 yeni başarısızlık (s47_redis_sds, s54_stack_module) ortaya çıkmıştır. Bu ölçüm, k=1 ile aynı arayüz/örnekleme koşulları altında yapılmamıştır (Bölüm III-B’de belirtildiği gibi, ne orijinal Claude Code CLI oturumunun ne de bu izole ajan oturumunun örnekleme parametreleri loglanmıştır); bu nedenle gözlenen farkın ne kadarının gerçek model stokastisitesinden, ne kadarının iki farklı çalıştırma ortamından geldiği kesin olarak ayrıştırılamaz — ama bu belirsizliğin kendisi bile, tek bir k=1 ölçümünün ne kadar kırılgan bir temel olabileceğini doğrudan göstermektedir.</w:t>
+      </w:r>
+    </w:p>
+    <w:p>
+      <w:pPr>
+        <w:spacing w:after="60"/>
+        <w:ind w:firstLine="289"/>
+        <w:jc w:val="both"/>
+      </w:pPr>
+      <w:r>
+        <w:rPr>
+          <w:rFonts w:ascii="Times New Roman" w:hAnsi="Times New Roman"/>
+          <w:sz w:val="20"/>
+        </w:rPr>
+        <w:t>k=2’nin iki yeni başarısızlığı farklı iki nedenden kaynaklanır ve ikisi de öğreticidir. s47_redis_sds’te k=2 çevirisi, k=1’in kullandığı yüksek-seviye Rust dize/satır API’leri (split_whitespace, BufRead::lines()) yerine C’nin getchar()’ını birebir taklit eden elle bayt-düzeyi bir ayrıştırıcı yazmayı tercih etmiş; bu ayrıştırıcı CRLF (CR+LF, iki baytlık) satır sonunu tek bayt sanıp yalnızca CR baytını tüketmiş, böylece test 05.txt’te (Bölüm IV-F’de tartışılan CRLF dosyasıyla aynı dosya) baştan sahte bir boş komut satırı üretmiştir — C↔Rust boşluğu değil, saf bir uygulama tercihi kaynaklı yeni bir hata. s54_stack_module’deki neden ise bir model hatası değil bir veri seti tasarım boşluğudur: STACK_CAPACITY sabiti stack.h’de tanımlıdır, ama çok-dosyalı istem inşası (Bölüm III-A) yalnızca manifest.json’da listelenen .c dosyalarını (stack.c, main.c) modele verir — başlık dosyası hiçbir zaman gösterilmez. k=1 bu gizli sabiti doğru tahmin etmiş (100), k=2 farklı bir tahminde bulunmuş (128) ve kapasite-sınırı testi (04.txt) bu yüzden başarısız olmuştur. Aynı gizli-başlık durumu s55_config_parser’da da vardır (config.h, MAX_KEY_LEN/MAX_VAL_LEN), ama test seti bu sınırları hiç zorlamadığından iki koşumda da fark edilmemiştir — bu, veri setinin çok-dosyalı örnekleri için ayrıca belgelenmesi gereken bir kapsam boşluğudur (Bölüm V-B). Sonuç olarak bu tekrar, hem k=1 ölçümünün varyans endişesini somut veriyle doğrulamakta (aynı model, aynı istem, sıfır ortak hata) hem de gözlenen farkın bir kısmının saf model stokastisitesinden değil, kısmen istemin/veri setinin kendisindeki belirsizlikten (gizli başlık sabitleri) kaynaklandığını göstermektedir. Makalenin ana %70.18 rakamı bu nedenle tek bir örneklem olarak okunmalı; gerçek kapasiteyi tahmin etmek için k≥3 tekrarlı bir pass@k protokolü gerekir (Bölüm V-B).</w:t>
       </w:r>
     </w:p>
     <w:p>
@@ -7765,7 +8000,7 @@
           <w:i w:val="0"/>
           <w:sz w:val="20"/>
         </w:rPr>
-        <w:t>Bu çalışmanın merkezi bulgusu, incelenen modellerin (Claude, Gemini) ürettiği C→Rust çevirilerinde asıl riskin sözdizimsel değil sessiz semantik hatalar olduğudur; Claude’da 17 başarısızlığın 16’sı derleyiciden hiç uyarı almadan geçmiştir. İkinci gözlem: derleme yapılandırması (debug/release) ve platform (Windows/Linux) gizli birer değişkendir — aynı kod farklı yapılandırmada farklı sonuç verebilir. Üçüncü, en yeni gözlem: iki bağımsız modelin karşılaştırması “model A, B’den genel olarak daha iyidir” biçiminde tek boyutlu bir sıralamanın yanıltıcı olduğunu gösterir (genel EA farkı anlamlı olsa da, p=0.013, Bölüm IV-F); Gemini kısa hedeflenmiş kategorilerde (5/5) Claude’dan (1/5) daha dayanıklı, uzun/karmaşık üretim kodunda (0/3) Claude’dan (2/3) daha kırılgandır; model seçimi kod tabanının niteliğine göre yapılmalıdır. Dördüncü gözlem: kod uzunluğu ile başarı arasında anlamlı bir ilişki bulunmamıştır (p=0.359); semantik karmaşıklık, ham uzunluktan daha belirleyicidir.</w:t>
+        <w:t>Bu çalışmanın merkezi bulgusu, incelenen modellerin (Claude, Gemini) ürettiği C→Rust çevirilerinde asıl riskin sözdizimsel değil sessiz semantik hatalar olduğudur; Claude’da 17 başarısızlığın 16’sı derleyiciden hiç uyarı almadan geçmiştir. İkinci gözlem: derleme yapılandırması (debug/release) ve platform (Windows/Linux) gizli birer değişkendir — aynı kod farklı yapılandırmada farklı sonuç verebilir. Üçüncü, en yeni gözlem: iki bağımsız modelin karşılaştırması “model A, B’den genel olarak daha iyidir” biçiminde tek boyutlu bir sıralamanın yanıltıcı olduğunu gösterir (genel EA farkı anlamlı olsa da, p=0.013, Bölüm IV-F); Gemini kısa hedeflenmiş kategorilerde (5/5) Claude’dan (1/5) daha dayanıklı, uzun/karmaşık üretim kodunda (0/3) Claude’dan (2/3) daha kırılgandır; model seçimi kod tabanının niteliğine göre yapılmalıdır. Dördüncü gözlem: kod uzunluğu ile başarı arasında anlamlı bir ilişki bulunmamıştır (p=0.359); semantik karmaşıklık, ham uzunluktan daha belirleyicidir. Beşinci, en çarpıcı gözlem: k=1 ölçümünün tekrarlanabilirliği doğrudan sınandığında (Bölüm IV-G), bağımsız bir ikinci deneme EA’yı %70.18’den %96.49’a taşımış ve sıfır ortak hatayla tamamen farklı bir başarısızlık kümesi üretmiştir — tek-örneklemli EA rakamlarının (bu çalışmanın kendi başlık rakamı dahil) yüksek varyanslı bir dağılımdan tek bir çekiliş olarak okunması gerektiğini göstermektedir. Altıncı gözlem: katman-eşleştirilmiş karşılaştırma (Claude Haiku vs. Gemini Flash, Bölüm IV-F) Sonnet-Flash farkının yalnızca model katmanından kaynaklanmadığını doğrulamış, ayrıca daha küçük modellerin C↔Rust semantik boşluklarının ötesinde Rust’ın ödünç denetleyicisiyle de mekanik olarak zorlanabileceğini göstermiştir.</w:t>
       </w:r>
     </w:p>
     <w:p>
@@ -7794,7 +8029,7 @@
           <w:sz w:val="20"/>
           <w:szCs w:val="20"/>
         </w:rPr>
-        <w:t xml:space="preserve">İç geçerlilik: test girdileri elle seçilmiş, referans çıktılar C programı çalıştırılarak üretilmiştir; sınır durumu kapsamı sistematik ölçülmemiştir — 522 satırlık s47_redis_sds gibi uzun örneklerde 4-5 girdiyle “PASS” denmesinin gücünü sınırlar. İki model ayrıca farklı arayüzlerde koşturulmuştur (Claude etkileşimli CLI, Gemini doğrudan API); bu yalnızca bir tekrarlanabilirlik asimetrisi değil bir karıştırıcı değişkendir (confounder) — McNemar farkının ne kadarının modelden, ne kadarının koşum ortamından geldiği ayrıştırılamamıştır. C her koşulda </w:t>
+        <w:t xml:space="preserve">İç geçerlilik: test girdileri elle seçilmiş, referans çıktılar C programı çalıştırılarak üretilmiştir; sınır durumu kapsamı ve kod kapsamı (code coverage) sistematik ölçülmemiştir; en uzun/karmaşık üç üretim örneği (s46, s47, s48) için ek sınır-durum testleriyle girdi sayısı 5’ten 6-7’ye çıkarılmış olsa da (tümü PASS kaldı, bkz. veri deposu), 522 satırlık s47_redis_sds gibi örneklerde bu kapsam hâlâ küçüktür. İki model ayrıca farklı arayüzlerde koşturulmuştur (Claude etkileşimli CLI, Gemini doğrudan API); bu yalnızca bir tekrarlanabilirlik asimetrisi değil bir karıştırıcı değişkendir (confounder) — McNemar farkının ne kadarının modelden, ne kadarının koşum ortamından geldiği ayrıştırılamamıştır. Ayrıca karşılaştırılan iki model aynı kapasite katmanında değildir: Claude Sonnet 5 üst-düzey (frontier) bir model iken gemini-flash-latest Google’ın hafif/hızlı katman modelidir; bu nedenle gözlenen fark kısmen “Claude vs. Gemini” değil “üst-düzey vs. hafif katman” karşılaştırmasını yansıtıyor olabilir — bu doğrudan sınanmış (Bölüm IV-F): katman-eşleştirilmiş Claude Haiku 4.5 (%63.16) Gemini Flash’ın (%89.47) yine de belirgin altında kalmıştır, yani Sonnet-Flash farkı yalnızca katman farkından ibaret değildir — ama Gemini Pro/Ultra ile simetrik bir karşılaştırma hâlâ eksiktir. C her koşulda </w:t>
       </w:r>
       <w:r>
         <w:rPr>
@@ -7810,7 +8045,7 @@
           <w:sz w:val="20"/>
           <w:szCs w:val="20"/>
         </w:rPr>
-        <w:t xml:space="preserve"> ile derlenirken Rust debug/release ayrılmıştır (bilinçli tasarım kararı); C’nin farklı optimizasyon seviyelerinde tekrarı ayrı bir sağlamlık kontrolü olurdu. Her örnek yalnızca bir kez (k=1) çevrilmiştir — en önemli metodolojik sınırlama; k=3-5 pass@1/pass@k için daha güvenilir bir tahmin verirdi. İstatistiksel geçerlilik: FAIL grubu küçüktür (n=17); duyarlılık analizi (Bölüm IV-B) yalnızca orta-büyük etkilerin (|r| ≥ 0.46) saptanabileceğini gösterir. Üç çıkarımsal test (Mann-Whitney, Fisher, McNemar) keşif amaçlıdır; Bonferroni düzeltmesinde (α=0.05/3≈0.0167) yalnızca McNemar (p=0.013) anlamlı kalır, yorum değişmez. Dış geçerlilik: veri seti 57 program/229 girdiyle sınırlıdır, endüstriyel kod tabanlarına genellenemez; GPT-4o/DeepSeek adaptörleri API erişimi olmadan çalıştırılamamış, çoklu-model bulgusu iki modelle sınırlı kalmıştır. Yapı geçerliliği: EA yalnızca gözlenen davranışsal eşdeğerliği ölçer; Seviye A oracle verdiğinden %100, yalnızca </w:t>
+        <w:t xml:space="preserve"> ile derlenirken Rust debug/release ayrılmıştır (bilinçli tasarım kararı); C’nin farklı optimizasyon seviyelerinde tekrarı ayrı bir sağlamlık kontrolü olurdu. Her örnek yalnızca bir kez (k=1) çevrilmiştir; bu sınırlamanın somut etkisi Bölüm IV-G’de bağımsız bir k=2 ölçümüyle doğrudan gösterilmiştir (EA %70.18→%96.49, sıfır ortak hata) — gerçek kapasiteyi güvenilir tahmin etmek için yine de k≥3 tekrarlı bir protokol gerekir. Ayrıca Gemini çağrı kayıtlarının (istem, zaman damgası, örnekleme parametreleri) yalnızca 38/57’si (%67) açık veri deposunda arşivlenmiştir; ilk 19 örnek (s01-s19) manifest günlüğü etkinleştirilmeden önce çevrildiğinden bu örnekler için hiçbir çağrı kaydı yoktur — bu, Bölüm III-B’de belirtilen arşivleme kapsamını daraltan ek bir tekrarlanabilirlik eksikliğidir. İstatistiksel geçerlilik: FAIL grubu küçüktür (n=17); duyarlılık analizi (Bölüm IV-B) yalnızca orta-büyük etkilerin (|r| ≥ 0.46) saptanabileceğini gösterir. Üç çıkarımsal test (Mann-Whitney, Fisher, McNemar) keşif amaçlıdır; Bonferroni düzeltmesinde (α=0.05/3≈0.0167) yalnızca McNemar (p=0.013) anlamlı kalır, yorum değişmez. Dış geçerlilik: veri seti 57 program/233 girdiyle sınırlıdır, endüstriyel kod tabanlarına genellenemez; GPT-4o/DeepSeek adaptörleri API erişimi olmadan çalıştırılamamış, çoklu-model bulgusu iki modelle sınırlı kalmıştır. Yapı geçerliliği: EA yalnızca gözlenen davranışsal eşdeğerliği ölçer; Seviye A oracle verdiğinden %100, yalnızca </w:t>
       </w:r>
       <w:r>
         <w:rPr>
@@ -7904,7 +8139,7 @@
           <w:i w:val="0"/>
           <w:sz w:val="20"/>
         </w:rPr>
-        <w:t>Bu çalışma, iki bağımsız LLM’in (Claude Sonnet 5, Google Gemini) ürettiği zero-shot C→Rust çevirilerinin yürütme doğruluğunu 57 programlık bir kıyaslama setinde (13’ü bağımsız gerçek dünya kodu) diferansiyel test ile ölçmüştür: Claude %70.18 (başarısızlıkların %94.1’i derleyiciden uyarı almadan, %70.6’sı çalışma zamanında da hiçbir sinyal vermeden geçmiştir), Gemini %89.47 (51/57) doğruluk göstermiştir. Kök neden analizi hataları dokuz tekrar eden C↔Rust semantik boşluğuna ayırmıştır; model × kategori karşılaştırması hiçbir modelin diğerinden tekdüze üstün olmadığını göstermiştir — Gemini kısa hedeflenmiş kategorilerde (5/5 vs. 1/5) daha dayanıklı, uzun gerçek üretim kodunda (0/3 vs. 2/3) daha kırılgandır; sessiz hata oranı da model-özgüdür (Claude: derlemede yakalanmayan %94.1, çalışma zamanında da sinyalsiz %70.6; Gemini: her iki katmanda da %33.3). Hata geri bildirimi Claude’da doğruluğu %100’e taşımış, ama kısıtlı geri bildirimde bu %71.9-86.0’a düşmüştür. Gelecek çalışmalar GPT-4o/DeepSeek dahil daha geniş bir model havuzunu ve model-seçim/ensemble stratejilerini hedefleyebilir.</w:t>
+        <w:t>Bu çalışma, iki bağımsız LLM’in (Claude Sonnet 5, Google Gemini) ürettiği zero-shot C→Rust çevirilerinin yürütme doğruluğunu 57 programlık bir kıyaslama setinde (13’ü bağımsız gerçek dünya kodu) diferansiyel test ile ölçmüştür: Claude %70.18 (başarısızlıkların %94.1’i derleyiciden uyarı almadan, %70.6’sı çalışma zamanında da hiçbir sinyal vermeden geçmiştir), Gemini %89.47 (51/57) doğruluk göstermiştir. Kök neden analizi hataları dokuz tekrar eden C↔Rust semantik boşluğuna ayırmıştır; model × kategori karşılaştırması hiçbir modelin diğerinden tekdüze üstün olmadığını göstermiştir — Gemini kısa hedeflenmiş kategorilerde (5/5 vs. 1/5) daha dayanıklı, uzun gerçek üretim kodunda (0/3 vs. 2/3) daha kırılgandır; sessiz hata oranı da model-özgüdür (Claude: derlemede yakalanmayan %94.1, çalışma zamanında da sinyalsiz %70.6; Gemini: her iki katmanda da %33.3). Hata geri bildirimi Claude’da doğruluğu %100’e taşımış, ama kısıtlı geri bildirimde bu %71.9-86.0’a düşmüştür. Bağımsız bir ikinci Claude denemesi (k=2) aynı 57 örnekte EA’yı %96.49’a taşımış, k=1’in tüm hatalarını düzeltirken 2 yeni ve farklı hata üretmiştir — tek-örneklemli EA ölçümlerinin (bu çalışmanınki dahil) yüksek varyansa sahip olabileceğini doğrudan göstermiştir. Katman-eşleştirilmiş bir karşılaştırma da (Claude Haiku, %63.16) Gemini Flash’ın gerisinde kalmış, ayrıca Rust’a özgü ödünç-denetleyici hatalarının küçük modellerde ayrı bir başarısızlık kaynağı olduğunu ortaya koymuştur. Gelecek çalışmalar GPT-4o/DeepSeek dahil daha geniş bir model havuzunu, k≥3 pass@k protokollerini ve model-seçim/ensemble stratejilerini hedefleyebilir.</w:t>
       </w:r>
     </w:p>
     <w:p>

</xml_diff>